<commit_message>
Article revision Feature is added
</commit_message>
<xml_diff>
--- a/blogPost/DB Quries/blogPost.docx
+++ b/blogPost/DB Quries/blogPost.docx
@@ -3,20 +3,613 @@
 <w:document xmlns:wpc="http://schemas.microsoft.com/office/word/2010/wordprocessingCanvas" xmlns:cx="http://schemas.microsoft.com/office/drawing/2014/chartex" xmlns:cx1="http://schemas.microsoft.com/office/drawing/2015/9/8/chartex" xmlns:cx2="http://schemas.microsoft.com/office/drawing/2015/10/21/chartex" xmlns:cx3="http://schemas.microsoft.com/office/drawing/2016/5/9/chartex" xmlns:cx4="http://schemas.microsoft.com/office/drawing/2016/5/10/chartex" xmlns:cx5="http://schemas.microsoft.com/office/drawing/2016/5/11/chartex" xmlns:cx6="http://schemas.microsoft.com/office/drawing/2016/5/12/chartex" xmlns:cx7="http://schemas.microsoft.com/office/drawing/2016/5/13/chartex" xmlns:cx8="http://schemas.microsoft.com/office/drawing/2016/5/14/chartex" xmlns:mc="http://schemas.openxmlformats.org/markup-compatibility/2006" xmlns:aink="http://schemas.microsoft.com/office/drawing/2016/ink" xmlns:am3d="http://schemas.microsoft.com/office/drawing/2017/model3d" xmlns:o="urn:schemas-microsoft-com:office:office" xmlns:oel="http://schemas.microsoft.com/office/2019/extlst" xmlns:r="http://schemas.openxmlformats.org/officeDocument/2006/relationships" xmlns:m="http://schemas.openxmlformats.org/officeDocument/2006/math" xmlns:v="urn:schemas-microsoft-com:vml" xmlns:wp14="http://schemas.microsoft.com/office/word/2010/wordprocessingDrawing" xmlns:wp="http://schemas.openxmlformats.org/drawingml/2006/wordprocessingDrawing" xmlns:w10="urn:schemas-microsoft-com:office:word" xmlns:w="http://schemas.openxmlformats.org/wordprocessingml/2006/main" xmlns:w14="http://schemas.microsoft.com/office/word/2010/wordml" xmlns:w15="http://schemas.microsoft.com/office/word/2012/wordml" xmlns:w16cex="http://schemas.microsoft.com/office/word/2018/wordml/cex" xmlns:w16cid="http://schemas.microsoft.com/office/word/2016/wordml/cid" xmlns:w16="http://schemas.microsoft.com/office/word/2018/wordml" xmlns:w16du="http://schemas.microsoft.com/office/word/2023/wordml/word16du" xmlns:w16sdtdh="http://schemas.microsoft.com/office/word/2020/wordml/sdtdatahash" xmlns:w16sdtfl="http://schemas.microsoft.com/office/word/2024/wordml/sdtformatlock" xmlns:w16se="http://schemas.microsoft.com/office/word/2015/wordml/symex" xmlns:wpg="http://schemas.microsoft.com/office/word/2010/wordprocessingGroup" xmlns:wpi="http://schemas.microsoft.com/office/word/2010/wordprocessingInk" xmlns:wne="http://schemas.microsoft.com/office/word/2006/wordml" xmlns:wps="http://schemas.microsoft.com/office/word/2010/wordprocessingShape" mc:Ignorable="w14 w15 w16se w16cid w16 w16cex w16sdtdh w16sdtfl w16du wp14">
   <w:body>
     <w:p>
-      <w:proofErr w:type="spellStart"/>
-      <w:r>
-        <w:t>blogPost</w:t>
-      </w:r>
-      <w:proofErr w:type="spellEnd"/>
-    </w:p>
-    <w:p>
-      <w:r>
-        <w:t xml:space="preserve">Article Table: </w:t>
-      </w:r>
-    </w:p>
-    <w:p>
-      <w:r>
-        <w:t xml:space="preserve">CREATE TABLE articles( id INT PRIMARY KEY AUTO_INCREMENT, </w:t>
+      <w:pPr>
+        <w:spacing w:after="0" w:line="240" w:lineRule="auto"/>
+        <w:rPr>
+          <w:b/>
+          <w:bCs/>
+          <w:u w:val="single"/>
+        </w:rPr>
+      </w:pPr>
+      <w:r>
+        <w:rPr>
+          <w:b/>
+          <w:bCs/>
+          <w:u w:val="single"/>
+        </w:rPr>
+        <w:t>1.</w:t>
+      </w:r>
+      <w:r>
+        <w:rPr>
+          <w:b/>
+          <w:bCs/>
+          <w:u w:val="single"/>
+        </w:rPr>
+        <w:t>User Table</w:t>
+      </w:r>
+    </w:p>
+    <w:p>
+      <w:pPr>
+        <w:spacing w:after="0" w:line="240" w:lineRule="auto"/>
+        <w:rPr>
+          <w:b/>
+          <w:bCs/>
+          <w:u w:val="single"/>
+        </w:rPr>
+      </w:pPr>
+    </w:p>
+    <w:p>
+      <w:pPr>
+        <w:spacing w:after="0" w:line="240" w:lineRule="auto"/>
+      </w:pPr>
+      <w:r>
+        <w:t xml:space="preserve">CREATE TABLE </w:t>
+      </w:r>
+      <w:proofErr w:type="gramStart"/>
+      <w:r>
+        <w:t>users(</w:t>
+      </w:r>
+      <w:proofErr w:type="gramEnd"/>
+    </w:p>
+    <w:p>
+      <w:pPr>
+        <w:spacing w:after="0" w:line="240" w:lineRule="auto"/>
+      </w:pPr>
+    </w:p>
+    <w:p>
+      <w:pPr>
+        <w:spacing w:after="0" w:line="240" w:lineRule="auto"/>
+      </w:pPr>
+      <w:r>
+        <w:t xml:space="preserve">    id INT PRIMARY KEY AUTO_INCREMENT,</w:t>
+      </w:r>
+    </w:p>
+    <w:p>
+      <w:pPr>
+        <w:spacing w:after="0" w:line="240" w:lineRule="auto"/>
+      </w:pPr>
+    </w:p>
+    <w:p>
+      <w:pPr>
+        <w:spacing w:after="0" w:line="240" w:lineRule="auto"/>
+      </w:pPr>
+      <w:r>
+        <w:t xml:space="preserve">    name </w:t>
+      </w:r>
+      <w:proofErr w:type="gramStart"/>
+      <w:r>
+        <w:t>VARCHAR(</w:t>
+      </w:r>
+      <w:proofErr w:type="gramEnd"/>
+      <w:r>
+        <w:t>100) NOT NULL,</w:t>
+      </w:r>
+    </w:p>
+    <w:p>
+      <w:pPr>
+        <w:spacing w:after="0" w:line="240" w:lineRule="auto"/>
+      </w:pPr>
+    </w:p>
+    <w:p>
+      <w:pPr>
+        <w:spacing w:after="0" w:line="240" w:lineRule="auto"/>
+      </w:pPr>
+      <w:r>
+        <w:t xml:space="preserve">    username </w:t>
+      </w:r>
+      <w:proofErr w:type="gramStart"/>
+      <w:r>
+        <w:t>VARCHAR(</w:t>
+      </w:r>
+      <w:proofErr w:type="gramEnd"/>
+      <w:r>
+        <w:t>100) UNIQUE NOT NULL,</w:t>
+      </w:r>
+    </w:p>
+    <w:p>
+      <w:pPr>
+        <w:spacing w:after="0" w:line="240" w:lineRule="auto"/>
+      </w:pPr>
+    </w:p>
+    <w:p>
+      <w:pPr>
+        <w:spacing w:after="0" w:line="240" w:lineRule="auto"/>
+      </w:pPr>
+      <w:r>
+        <w:t xml:space="preserve">    email </w:t>
+      </w:r>
+      <w:proofErr w:type="gramStart"/>
+      <w:r>
+        <w:t>VARCHAR(</w:t>
+      </w:r>
+      <w:proofErr w:type="gramEnd"/>
+      <w:r>
+        <w:t>100) UNIQUE NOT NULL,</w:t>
+      </w:r>
+    </w:p>
+    <w:p>
+      <w:pPr>
+        <w:spacing w:after="0" w:line="240" w:lineRule="auto"/>
+      </w:pPr>
+    </w:p>
+    <w:p>
+      <w:pPr>
+        <w:spacing w:after="0" w:line="240" w:lineRule="auto"/>
+      </w:pPr>
+      <w:r>
+        <w:t xml:space="preserve">    </w:t>
+      </w:r>
+      <w:proofErr w:type="spellStart"/>
+      <w:r>
+        <w:t>password_hash</w:t>
+      </w:r>
+      <w:proofErr w:type="spellEnd"/>
+      <w:r>
+        <w:t xml:space="preserve"> </w:t>
+      </w:r>
+      <w:proofErr w:type="gramStart"/>
+      <w:r>
+        <w:t>VARCHAR(</w:t>
+      </w:r>
+      <w:proofErr w:type="gramEnd"/>
+      <w:r>
+        <w:t>255) NOT NULL,</w:t>
+      </w:r>
+    </w:p>
+    <w:p>
+      <w:pPr>
+        <w:spacing w:after="0" w:line="240" w:lineRule="auto"/>
+      </w:pPr>
+    </w:p>
+    <w:p>
+      <w:pPr>
+        <w:spacing w:after="0" w:line="240" w:lineRule="auto"/>
+      </w:pPr>
+      <w:r>
+        <w:t xml:space="preserve">    role </w:t>
+      </w:r>
+      <w:proofErr w:type="gramStart"/>
+      <w:r>
+        <w:t>ENUM(</w:t>
+      </w:r>
+      <w:proofErr w:type="gramEnd"/>
+    </w:p>
+    <w:p>
+      <w:pPr>
+        <w:spacing w:after="0" w:line="240" w:lineRule="auto"/>
+      </w:pPr>
+      <w:r>
+        <w:t xml:space="preserve">        'reader',</w:t>
+      </w:r>
+    </w:p>
+    <w:p>
+      <w:pPr>
+        <w:spacing w:after="0" w:line="240" w:lineRule="auto"/>
+      </w:pPr>
+      <w:r>
+        <w:t xml:space="preserve">        'author',</w:t>
+      </w:r>
+    </w:p>
+    <w:p>
+      <w:pPr>
+        <w:spacing w:after="0" w:line="240" w:lineRule="auto"/>
+      </w:pPr>
+      <w:r>
+        <w:t xml:space="preserve">        'editor',</w:t>
+      </w:r>
+    </w:p>
+    <w:p>
+      <w:pPr>
+        <w:spacing w:after="0" w:line="240" w:lineRule="auto"/>
+      </w:pPr>
+      <w:r>
+        <w:t xml:space="preserve">        'admin'</w:t>
+      </w:r>
+    </w:p>
+    <w:p>
+      <w:pPr>
+        <w:spacing w:after="0" w:line="240" w:lineRule="auto"/>
+      </w:pPr>
+      <w:r>
+        <w:t xml:space="preserve">    ) DEFAULT 'reader',</w:t>
+      </w:r>
+    </w:p>
+    <w:p>
+      <w:pPr>
+        <w:spacing w:after="0" w:line="240" w:lineRule="auto"/>
+      </w:pPr>
+    </w:p>
+    <w:p>
+      <w:pPr>
+        <w:spacing w:after="0" w:line="240" w:lineRule="auto"/>
+      </w:pPr>
+      <w:r>
+        <w:t xml:space="preserve">    </w:t>
+      </w:r>
+      <w:proofErr w:type="gramStart"/>
+      <w:r>
+        <w:t>bio TEXT</w:t>
+      </w:r>
+      <w:proofErr w:type="gramEnd"/>
+      <w:r>
+        <w:t>,</w:t>
+      </w:r>
+    </w:p>
+    <w:p>
+      <w:pPr>
+        <w:spacing w:after="0" w:line="240" w:lineRule="auto"/>
+      </w:pPr>
+    </w:p>
+    <w:p>
+      <w:pPr>
+        <w:spacing w:after="0" w:line="240" w:lineRule="auto"/>
+      </w:pPr>
+      <w:r>
+        <w:t xml:space="preserve">    </w:t>
+      </w:r>
+      <w:proofErr w:type="spellStart"/>
+      <w:r>
+        <w:t>profile_pic</w:t>
+      </w:r>
+      <w:proofErr w:type="spellEnd"/>
+      <w:r>
+        <w:t xml:space="preserve"> </w:t>
+      </w:r>
+      <w:proofErr w:type="gramStart"/>
+      <w:r>
+        <w:t>VARCHAR(</w:t>
+      </w:r>
+      <w:proofErr w:type="gramEnd"/>
+      <w:r>
+        <w:t>255),</w:t>
+      </w:r>
+    </w:p>
+    <w:p>
+      <w:pPr>
+        <w:spacing w:after="0" w:line="240" w:lineRule="auto"/>
+      </w:pPr>
+    </w:p>
+    <w:p>
+      <w:pPr>
+        <w:spacing w:after="0" w:line="240" w:lineRule="auto"/>
+      </w:pPr>
+      <w:r>
+        <w:t xml:space="preserve">    </w:t>
+      </w:r>
+      <w:proofErr w:type="spellStart"/>
+      <w:r>
+        <w:t>social_links</w:t>
+      </w:r>
+      <w:proofErr w:type="spellEnd"/>
+      <w:r>
+        <w:t xml:space="preserve"> JSON,</w:t>
+      </w:r>
+    </w:p>
+    <w:p>
+      <w:pPr>
+        <w:spacing w:after="0" w:line="240" w:lineRule="auto"/>
+      </w:pPr>
+    </w:p>
+    <w:p>
+      <w:pPr>
+        <w:spacing w:after="0" w:line="240" w:lineRule="auto"/>
+      </w:pPr>
+      <w:r>
+        <w:t xml:space="preserve">    </w:t>
+      </w:r>
+      <w:proofErr w:type="spellStart"/>
+      <w:r>
+        <w:t>is_active</w:t>
+      </w:r>
+      <w:proofErr w:type="spellEnd"/>
+      <w:r>
+        <w:t xml:space="preserve"> BOOLEAN DEFAULT TRUE,</w:t>
+      </w:r>
+    </w:p>
+    <w:p>
+      <w:pPr>
+        <w:spacing w:after="0" w:line="240" w:lineRule="auto"/>
+      </w:pPr>
+    </w:p>
+    <w:p>
+      <w:pPr>
+        <w:spacing w:after="0" w:line="240" w:lineRule="auto"/>
+      </w:pPr>
+      <w:r>
+        <w:t xml:space="preserve">    </w:t>
+      </w:r>
+      <w:proofErr w:type="spellStart"/>
+      <w:r>
+        <w:t>is_author_approved</w:t>
+      </w:r>
+      <w:proofErr w:type="spellEnd"/>
+      <w:r>
+        <w:t xml:space="preserve"> BOOLEAN DEFAULT FALSE,</w:t>
+      </w:r>
+    </w:p>
+    <w:p>
+      <w:pPr>
+        <w:spacing w:after="0" w:line="240" w:lineRule="auto"/>
+      </w:pPr>
+    </w:p>
+    <w:p>
+      <w:pPr>
+        <w:spacing w:after="0" w:line="240" w:lineRule="auto"/>
+      </w:pPr>
+      <w:r>
+        <w:t xml:space="preserve">    </w:t>
+      </w:r>
+      <w:proofErr w:type="spellStart"/>
+      <w:r>
+        <w:t>created_at</w:t>
+      </w:r>
+      <w:proofErr w:type="spellEnd"/>
+      <w:r>
+        <w:t xml:space="preserve"> TIMESTAMP DEFAULT CURRENT_TIMESTAMP</w:t>
+      </w:r>
+    </w:p>
+    <w:p>
+      <w:pPr>
+        <w:spacing w:after="0" w:line="240" w:lineRule="auto"/>
+      </w:pPr>
+    </w:p>
+    <w:p>
+      <w:pPr>
+        <w:spacing w:after="0" w:line="240" w:lineRule="auto"/>
+      </w:pPr>
+      <w:r>
+        <w:t>) ENGINE=</w:t>
+      </w:r>
+      <w:proofErr w:type="spellStart"/>
+      <w:r>
+        <w:t>InnoDB</w:t>
+      </w:r>
+      <w:proofErr w:type="spellEnd"/>
+      <w:r>
+        <w:t>;</w:t>
+      </w:r>
+    </w:p>
+    <w:p>
+      <w:pPr>
+        <w:spacing w:after="0" w:line="240" w:lineRule="auto"/>
+      </w:pPr>
+    </w:p>
+    <w:p>
+      <w:pPr>
+        <w:spacing w:after="0" w:line="240" w:lineRule="auto"/>
+        <w:rPr>
+          <w:b/>
+          <w:bCs/>
+          <w:u w:val="single"/>
+        </w:rPr>
+      </w:pPr>
+      <w:r>
+        <w:rPr>
+          <w:b/>
+          <w:bCs/>
+          <w:u w:val="single"/>
+        </w:rPr>
+        <w:t>2.Categories</w:t>
+      </w:r>
+    </w:p>
+    <w:p>
+      <w:pPr>
+        <w:spacing w:after="0" w:line="240" w:lineRule="auto"/>
+        <w:rPr>
+          <w:b/>
+          <w:bCs/>
+          <w:u w:val="single"/>
+        </w:rPr>
+      </w:pPr>
+    </w:p>
+    <w:p>
+      <w:pPr>
+        <w:spacing w:after="0" w:line="240" w:lineRule="auto"/>
+      </w:pPr>
+      <w:r>
+        <w:t xml:space="preserve">CREATE TABLE </w:t>
+      </w:r>
+      <w:proofErr w:type="gramStart"/>
+      <w:r>
+        <w:t>categories(</w:t>
+      </w:r>
+      <w:proofErr w:type="gramEnd"/>
+    </w:p>
+    <w:p>
+      <w:pPr>
+        <w:spacing w:after="0" w:line="240" w:lineRule="auto"/>
+      </w:pPr>
+    </w:p>
+    <w:p>
+      <w:pPr>
+        <w:spacing w:after="0" w:line="240" w:lineRule="auto"/>
+      </w:pPr>
+      <w:r>
+        <w:t xml:space="preserve">    id INT PRIMARY KEY AUTO_INCREMENT,</w:t>
+      </w:r>
+    </w:p>
+    <w:p>
+      <w:pPr>
+        <w:spacing w:after="0" w:line="240" w:lineRule="auto"/>
+      </w:pPr>
+    </w:p>
+    <w:p>
+      <w:pPr>
+        <w:spacing w:after="0" w:line="240" w:lineRule="auto"/>
+      </w:pPr>
+      <w:r>
+        <w:t xml:space="preserve">    name </w:t>
+      </w:r>
+      <w:proofErr w:type="gramStart"/>
+      <w:r>
+        <w:t>VARCHAR(</w:t>
+      </w:r>
+      <w:proofErr w:type="gramEnd"/>
+      <w:r>
+        <w:t>100) NOT NULL,</w:t>
+      </w:r>
+    </w:p>
+    <w:p>
+      <w:pPr>
+        <w:spacing w:after="0" w:line="240" w:lineRule="auto"/>
+      </w:pPr>
+    </w:p>
+    <w:p>
+      <w:pPr>
+        <w:spacing w:after="0" w:line="240" w:lineRule="auto"/>
+      </w:pPr>
+      <w:r>
+        <w:t xml:space="preserve">    slug </w:t>
+      </w:r>
+      <w:proofErr w:type="gramStart"/>
+      <w:r>
+        <w:t>VARCHAR(</w:t>
+      </w:r>
+      <w:proofErr w:type="gramEnd"/>
+      <w:r>
+        <w:t>100) UNIQUE NOT NULL,</w:t>
+      </w:r>
+    </w:p>
+    <w:p>
+      <w:pPr>
+        <w:spacing w:after="0" w:line="240" w:lineRule="auto"/>
+      </w:pPr>
+    </w:p>
+    <w:p>
+      <w:pPr>
+        <w:spacing w:after="0" w:line="240" w:lineRule="auto"/>
+      </w:pPr>
+      <w:r>
+        <w:t xml:space="preserve">    description TEXT,</w:t>
+      </w:r>
+    </w:p>
+    <w:p>
+      <w:pPr>
+        <w:spacing w:after="0" w:line="240" w:lineRule="auto"/>
+      </w:pPr>
+    </w:p>
+    <w:p>
+      <w:pPr>
+        <w:spacing w:after="0" w:line="240" w:lineRule="auto"/>
+      </w:pPr>
+      <w:r>
+        <w:t xml:space="preserve">    </w:t>
+      </w:r>
+      <w:proofErr w:type="spellStart"/>
+      <w:r>
+        <w:t>created_by</w:t>
+      </w:r>
+      <w:proofErr w:type="spellEnd"/>
+      <w:r>
+        <w:t xml:space="preserve"> INT</w:t>
+      </w:r>
+    </w:p>
+    <w:p>
+      <w:pPr>
+        <w:spacing w:after="0" w:line="240" w:lineRule="auto"/>
+      </w:pPr>
+    </w:p>
+    <w:p>
+      <w:pPr>
+        <w:spacing w:after="0" w:line="240" w:lineRule="auto"/>
+      </w:pPr>
+      <w:r>
+        <w:t>) ENGINE=</w:t>
+      </w:r>
+      <w:proofErr w:type="spellStart"/>
+      <w:r>
+        <w:t>InnoDB</w:t>
+      </w:r>
+      <w:proofErr w:type="spellEnd"/>
+      <w:r>
+        <w:t>;</w:t>
+      </w:r>
+    </w:p>
+    <w:p>
+      <w:pPr>
+        <w:spacing w:after="0" w:line="240" w:lineRule="auto"/>
+      </w:pPr>
+    </w:p>
+    <w:p>
+      <w:pPr>
+        <w:spacing w:after="0" w:line="240" w:lineRule="auto"/>
+      </w:pPr>
+    </w:p>
+    <w:p>
+      <w:pPr>
+        <w:spacing w:after="0" w:line="240" w:lineRule="auto"/>
+        <w:rPr>
+          <w:b/>
+          <w:bCs/>
+          <w:u w:val="single"/>
+        </w:rPr>
+      </w:pPr>
+      <w:r>
+        <w:rPr>
+          <w:b/>
+          <w:bCs/>
+          <w:u w:val="single"/>
+        </w:rPr>
+        <w:t>3.Series</w:t>
+      </w:r>
+    </w:p>
+    <w:p>
+      <w:pPr>
+        <w:spacing w:after="0" w:line="240" w:lineRule="auto"/>
+        <w:rPr>
+          <w:b/>
+          <w:bCs/>
+          <w:u w:val="single"/>
+        </w:rPr>
+      </w:pPr>
+    </w:p>
+    <w:p>
+      <w:pPr>
+        <w:spacing w:after="0" w:line="240" w:lineRule="auto"/>
+        <w:rPr>
+          <w:b/>
+          <w:bCs/>
+          <w:u w:val="single"/>
+        </w:rPr>
+      </w:pPr>
+    </w:p>
+    <w:p>
+      <w:pPr>
+        <w:spacing w:after="0" w:line="240" w:lineRule="auto"/>
+      </w:pPr>
+      <w:r>
+        <w:t xml:space="preserve">CREATE TABLE </w:t>
+      </w:r>
+      <w:proofErr w:type="gramStart"/>
+      <w:r>
+        <w:t>series(</w:t>
+      </w:r>
+      <w:proofErr w:type="gramEnd"/>
+    </w:p>
+    <w:p>
+      <w:pPr>
+        <w:spacing w:after="0" w:line="240" w:lineRule="auto"/>
+      </w:pPr>
+    </w:p>
+    <w:p>
+      <w:pPr>
+        <w:spacing w:after="0" w:line="240" w:lineRule="auto"/>
+      </w:pPr>
+      <w:r>
+        <w:t xml:space="preserve">    id INT PRIMARY KEY AUTO_INCREMENT,</w:t>
+      </w:r>
+    </w:p>
+    <w:p>
+      <w:pPr>
+        <w:spacing w:after="0" w:line="240" w:lineRule="auto"/>
+      </w:pPr>
+    </w:p>
+    <w:p>
+      <w:pPr>
+        <w:spacing w:after="0" w:line="240" w:lineRule="auto"/>
+      </w:pPr>
+      <w:r>
+        <w:t xml:space="preserve">    </w:t>
       </w:r>
       <w:proofErr w:type="spellStart"/>
       <w:r>
@@ -24,7 +617,247 @@
       </w:r>
       <w:proofErr w:type="spellEnd"/>
       <w:r>
-        <w:t xml:space="preserve"> INT NOT NULL, </w:t>
+        <w:t xml:space="preserve"> INT NOT NULL,</w:t>
+      </w:r>
+    </w:p>
+    <w:p>
+      <w:pPr>
+        <w:spacing w:after="0" w:line="240" w:lineRule="auto"/>
+      </w:pPr>
+    </w:p>
+    <w:p>
+      <w:pPr>
+        <w:spacing w:after="0" w:line="240" w:lineRule="auto"/>
+      </w:pPr>
+      <w:r>
+        <w:t xml:space="preserve">    title </w:t>
+      </w:r>
+      <w:proofErr w:type="gramStart"/>
+      <w:r>
+        <w:t>VARCHAR(</w:t>
+      </w:r>
+      <w:proofErr w:type="gramEnd"/>
+      <w:r>
+        <w:t>255) NOT NULL,</w:t>
+      </w:r>
+    </w:p>
+    <w:p>
+      <w:pPr>
+        <w:spacing w:after="0" w:line="240" w:lineRule="auto"/>
+      </w:pPr>
+    </w:p>
+    <w:p>
+      <w:pPr>
+        <w:spacing w:after="0" w:line="240" w:lineRule="auto"/>
+      </w:pPr>
+      <w:r>
+        <w:t xml:space="preserve">    description TEXT,</w:t>
+      </w:r>
+    </w:p>
+    <w:p>
+      <w:pPr>
+        <w:spacing w:after="0" w:line="240" w:lineRule="auto"/>
+      </w:pPr>
+    </w:p>
+    <w:p>
+      <w:pPr>
+        <w:spacing w:after="0" w:line="240" w:lineRule="auto"/>
+      </w:pPr>
+      <w:r>
+        <w:t xml:space="preserve">    </w:t>
+      </w:r>
+      <w:proofErr w:type="spellStart"/>
+      <w:r>
+        <w:t>cover_image_path</w:t>
+      </w:r>
+      <w:proofErr w:type="spellEnd"/>
+      <w:r>
+        <w:t xml:space="preserve"> </w:t>
+      </w:r>
+      <w:proofErr w:type="gramStart"/>
+      <w:r>
+        <w:t>VARCHAR(</w:t>
+      </w:r>
+      <w:proofErr w:type="gramEnd"/>
+      <w:r>
+        <w:t>255),</w:t>
+      </w:r>
+    </w:p>
+    <w:p>
+      <w:pPr>
+        <w:spacing w:after="0" w:line="240" w:lineRule="auto"/>
+      </w:pPr>
+    </w:p>
+    <w:p>
+      <w:pPr>
+        <w:spacing w:after="0" w:line="240" w:lineRule="auto"/>
+      </w:pPr>
+      <w:r>
+        <w:t xml:space="preserve">    </w:t>
+      </w:r>
+      <w:proofErr w:type="spellStart"/>
+      <w:r>
+        <w:t>created_at</w:t>
+      </w:r>
+      <w:proofErr w:type="spellEnd"/>
+      <w:r>
+        <w:t xml:space="preserve"> TIMESTAMP DEFAULT CURRENT_TIMESTAMP,</w:t>
+      </w:r>
+    </w:p>
+    <w:p>
+      <w:pPr>
+        <w:spacing w:after="0" w:line="240" w:lineRule="auto"/>
+      </w:pPr>
+    </w:p>
+    <w:p>
+      <w:pPr>
+        <w:spacing w:after="0" w:line="240" w:lineRule="auto"/>
+      </w:pPr>
+      <w:r>
+        <w:t xml:space="preserve">    FOREIGN </w:t>
+      </w:r>
+      <w:proofErr w:type="gramStart"/>
+      <w:r>
+        <w:t>KEY(</w:t>
+      </w:r>
+      <w:proofErr w:type="spellStart"/>
+      <w:proofErr w:type="gramEnd"/>
+      <w:r>
+        <w:t>author_id</w:t>
+      </w:r>
+      <w:proofErr w:type="spellEnd"/>
+      <w:r>
+        <w:t>)</w:t>
+      </w:r>
+    </w:p>
+    <w:p>
+      <w:pPr>
+        <w:spacing w:after="0" w:line="240" w:lineRule="auto"/>
+      </w:pPr>
+      <w:r>
+        <w:t xml:space="preserve">    REFERENCES users(id)</w:t>
+      </w:r>
+    </w:p>
+    <w:p>
+      <w:pPr>
+        <w:spacing w:after="0" w:line="240" w:lineRule="auto"/>
+      </w:pPr>
+      <w:r>
+        <w:t xml:space="preserve">    ON DELETE CASCADE</w:t>
+      </w:r>
+    </w:p>
+    <w:p>
+      <w:pPr>
+        <w:spacing w:after="0" w:line="240" w:lineRule="auto"/>
+      </w:pPr>
+    </w:p>
+    <w:p>
+      <w:pPr>
+        <w:spacing w:after="0" w:line="240" w:lineRule="auto"/>
+      </w:pPr>
+      <w:r>
+        <w:t>) ENGINE=</w:t>
+      </w:r>
+      <w:proofErr w:type="spellStart"/>
+      <w:r>
+        <w:t>InnoDB</w:t>
+      </w:r>
+      <w:proofErr w:type="spellEnd"/>
+      <w:r>
+        <w:t>;</w:t>
+      </w:r>
+    </w:p>
+    <w:p>
+      <w:pPr>
+        <w:spacing w:after="0" w:line="240" w:lineRule="auto"/>
+      </w:pPr>
+    </w:p>
+    <w:p>
+      <w:pPr>
+        <w:spacing w:after="0" w:line="240" w:lineRule="auto"/>
+      </w:pPr>
+    </w:p>
+    <w:p>
+      <w:pPr>
+        <w:spacing w:after="0" w:line="240" w:lineRule="auto"/>
+        <w:rPr>
+          <w:b/>
+          <w:bCs/>
+          <w:u w:val="single"/>
+        </w:rPr>
+      </w:pPr>
+      <w:r>
+        <w:rPr>
+          <w:b/>
+          <w:bCs/>
+          <w:u w:val="single"/>
+        </w:rPr>
+        <w:t>4.Articles</w:t>
+      </w:r>
+    </w:p>
+    <w:p>
+      <w:pPr>
+        <w:spacing w:after="0" w:line="240" w:lineRule="auto"/>
+      </w:pPr>
+    </w:p>
+    <w:p>
+      <w:pPr>
+        <w:spacing w:after="0" w:line="240" w:lineRule="auto"/>
+      </w:pPr>
+      <w:r>
+        <w:t xml:space="preserve">CREATE TABLE </w:t>
+      </w:r>
+      <w:proofErr w:type="gramStart"/>
+      <w:r>
+        <w:t>articles(</w:t>
+      </w:r>
+      <w:proofErr w:type="gramEnd"/>
+    </w:p>
+    <w:p>
+      <w:pPr>
+        <w:spacing w:after="0" w:line="240" w:lineRule="auto"/>
+      </w:pPr>
+    </w:p>
+    <w:p>
+      <w:pPr>
+        <w:spacing w:after="0" w:line="240" w:lineRule="auto"/>
+      </w:pPr>
+      <w:r>
+        <w:t xml:space="preserve">    id INT PRIMARY KEY AUTO_INCREMENT,</w:t>
+      </w:r>
+    </w:p>
+    <w:p>
+      <w:pPr>
+        <w:spacing w:after="0" w:line="240" w:lineRule="auto"/>
+      </w:pPr>
+    </w:p>
+    <w:p>
+      <w:pPr>
+        <w:spacing w:after="0" w:line="240" w:lineRule="auto"/>
+      </w:pPr>
+      <w:r>
+        <w:t xml:space="preserve">    </w:t>
+      </w:r>
+      <w:proofErr w:type="spellStart"/>
+      <w:r>
+        <w:t>author_id</w:t>
+      </w:r>
+      <w:proofErr w:type="spellEnd"/>
+      <w:r>
+        <w:t xml:space="preserve"> INT NOT NULL,</w:t>
+      </w:r>
+    </w:p>
+    <w:p>
+      <w:pPr>
+        <w:spacing w:after="0" w:line="240" w:lineRule="auto"/>
+      </w:pPr>
+    </w:p>
+    <w:p>
+      <w:pPr>
+        <w:spacing w:after="0" w:line="240" w:lineRule="auto"/>
+      </w:pPr>
+      <w:r>
+        <w:t xml:space="preserve">    </w:t>
       </w:r>
       <w:proofErr w:type="spellStart"/>
       <w:r>
@@ -32,7 +865,20 @@
       </w:r>
       <w:proofErr w:type="spellEnd"/>
       <w:r>
-        <w:t xml:space="preserve"> INT NULL, </w:t>
+        <w:t xml:space="preserve"> INT NULL,</w:t>
+      </w:r>
+    </w:p>
+    <w:p>
+      <w:pPr>
+        <w:spacing w:after="0" w:line="240" w:lineRule="auto"/>
+      </w:pPr>
+    </w:p>
+    <w:p>
+      <w:pPr>
+        <w:spacing w:after="0" w:line="240" w:lineRule="auto"/>
+      </w:pPr>
+      <w:r>
+        <w:t xml:space="preserve">    </w:t>
       </w:r>
       <w:proofErr w:type="spellStart"/>
       <w:r>
@@ -40,7 +886,21 @@
       </w:r>
       <w:proofErr w:type="spellEnd"/>
       <w:r>
-        <w:t xml:space="preserve"> INT NOT NULL, </w:t>
+        <w:t xml:space="preserve"> INT NOT NULL,</w:t>
+      </w:r>
+    </w:p>
+    <w:p>
+      <w:pPr>
+        <w:spacing w:after="0" w:line="240" w:lineRule="auto"/>
+      </w:pPr>
+    </w:p>
+    <w:p>
+      <w:pPr>
+        <w:spacing w:after="0" w:line="240" w:lineRule="auto"/>
+      </w:pPr>
+      <w:r>
+        <w:lastRenderedPageBreak/>
+        <w:t xml:space="preserve">    </w:t>
       </w:r>
       <w:proofErr w:type="spellStart"/>
       <w:r>
@@ -48,7 +908,88 @@
       </w:r>
       <w:proofErr w:type="spellEnd"/>
       <w:r>
-        <w:t xml:space="preserve"> INT NULL, title VARCHAR(255) NOT NULL, slug VARCHAR(255) UNIQUE NOT NULL, body LONGTEXT NOT NULL, excerpt TEXT, </w:t>
+        <w:t xml:space="preserve"> INT NULL,</w:t>
+      </w:r>
+    </w:p>
+    <w:p>
+      <w:pPr>
+        <w:spacing w:after="0" w:line="240" w:lineRule="auto"/>
+      </w:pPr>
+    </w:p>
+    <w:p>
+      <w:pPr>
+        <w:spacing w:after="0" w:line="240" w:lineRule="auto"/>
+      </w:pPr>
+      <w:r>
+        <w:t xml:space="preserve">    title </w:t>
+      </w:r>
+      <w:proofErr w:type="gramStart"/>
+      <w:r>
+        <w:t>VARCHAR(</w:t>
+      </w:r>
+      <w:proofErr w:type="gramEnd"/>
+      <w:r>
+        <w:t>255) NOT NULL,</w:t>
+      </w:r>
+    </w:p>
+    <w:p>
+      <w:pPr>
+        <w:spacing w:after="0" w:line="240" w:lineRule="auto"/>
+      </w:pPr>
+    </w:p>
+    <w:p>
+      <w:pPr>
+        <w:spacing w:after="0" w:line="240" w:lineRule="auto"/>
+      </w:pPr>
+      <w:r>
+        <w:t xml:space="preserve">    slug </w:t>
+      </w:r>
+      <w:proofErr w:type="gramStart"/>
+      <w:r>
+        <w:t>VARCHAR(</w:t>
+      </w:r>
+      <w:proofErr w:type="gramEnd"/>
+      <w:r>
+        <w:t>255) UNIQUE NOT NULL,</w:t>
+      </w:r>
+    </w:p>
+    <w:p>
+      <w:pPr>
+        <w:spacing w:after="0" w:line="240" w:lineRule="auto"/>
+      </w:pPr>
+    </w:p>
+    <w:p>
+      <w:pPr>
+        <w:spacing w:after="0" w:line="240" w:lineRule="auto"/>
+      </w:pPr>
+      <w:r>
+        <w:t xml:space="preserve">    body LONGTEXT NOT NULL,</w:t>
+      </w:r>
+    </w:p>
+    <w:p>
+      <w:pPr>
+        <w:spacing w:after="0" w:line="240" w:lineRule="auto"/>
+      </w:pPr>
+    </w:p>
+    <w:p>
+      <w:pPr>
+        <w:spacing w:after="0" w:line="240" w:lineRule="auto"/>
+      </w:pPr>
+      <w:r>
+        <w:t xml:space="preserve">    excerpt TEXT,</w:t>
+      </w:r>
+    </w:p>
+    <w:p>
+      <w:pPr>
+        <w:spacing w:after="0" w:line="240" w:lineRule="auto"/>
+      </w:pPr>
+    </w:p>
+    <w:p>
+      <w:pPr>
+        <w:spacing w:after="0" w:line="240" w:lineRule="auto"/>
+      </w:pPr>
+      <w:r>
+        <w:t xml:space="preserve">    </w:t>
       </w:r>
       <w:proofErr w:type="spellStart"/>
       <w:r>
@@ -56,15 +997,115 @@
       </w:r>
       <w:proofErr w:type="spellEnd"/>
       <w:r>
-        <w:t xml:space="preserve"> VARCHAR(255), status ENUM( 'draft', 'submitted', '</w:t>
-      </w:r>
-      <w:proofErr w:type="spellStart"/>
-      <w:r>
-        <w:t>revision_requested</w:t>
-      </w:r>
-      <w:proofErr w:type="spellEnd"/>
-      <w:r>
-        <w:t xml:space="preserve">', 'approved', 'published', 'unpublished' ) DEFAULT 'draft', </w:t>
+        <w:t xml:space="preserve"> </w:t>
+      </w:r>
+      <w:proofErr w:type="gramStart"/>
+      <w:r>
+        <w:t>VARCHAR(</w:t>
+      </w:r>
+      <w:proofErr w:type="gramEnd"/>
+      <w:r>
+        <w:t>255),</w:t>
+      </w:r>
+    </w:p>
+    <w:p>
+      <w:pPr>
+        <w:spacing w:after="0" w:line="240" w:lineRule="auto"/>
+      </w:pPr>
+    </w:p>
+    <w:p>
+      <w:pPr>
+        <w:spacing w:after="0" w:line="240" w:lineRule="auto"/>
+      </w:pPr>
+      <w:r>
+        <w:t xml:space="preserve">    status </w:t>
+      </w:r>
+      <w:proofErr w:type="gramStart"/>
+      <w:r>
+        <w:t>ENUM(</w:t>
+      </w:r>
+      <w:proofErr w:type="gramEnd"/>
+    </w:p>
+    <w:p>
+      <w:pPr>
+        <w:spacing w:after="0" w:line="240" w:lineRule="auto"/>
+      </w:pPr>
+      <w:r>
+        <w:t xml:space="preserve">        'draft',</w:t>
+      </w:r>
+    </w:p>
+    <w:p>
+      <w:pPr>
+        <w:spacing w:after="0" w:line="240" w:lineRule="auto"/>
+      </w:pPr>
+      <w:r>
+        <w:t xml:space="preserve">        'submitted',</w:t>
+      </w:r>
+    </w:p>
+    <w:p>
+      <w:pPr>
+        <w:spacing w:after="0" w:line="240" w:lineRule="auto"/>
+      </w:pPr>
+      <w:r>
+        <w:t xml:space="preserve">        '</w:t>
+      </w:r>
+      <w:proofErr w:type="spellStart"/>
+      <w:proofErr w:type="gramStart"/>
+      <w:r>
+        <w:t>revision</w:t>
+      </w:r>
+      <w:proofErr w:type="gramEnd"/>
+      <w:r>
+        <w:t>_requested</w:t>
+      </w:r>
+      <w:proofErr w:type="spellEnd"/>
+      <w:r>
+        <w:t>',</w:t>
+      </w:r>
+    </w:p>
+    <w:p>
+      <w:pPr>
+        <w:spacing w:after="0" w:line="240" w:lineRule="auto"/>
+      </w:pPr>
+      <w:r>
+        <w:t xml:space="preserve">        'approved',</w:t>
+      </w:r>
+    </w:p>
+    <w:p>
+      <w:pPr>
+        <w:spacing w:after="0" w:line="240" w:lineRule="auto"/>
+      </w:pPr>
+      <w:r>
+        <w:t xml:space="preserve">        'published',</w:t>
+      </w:r>
+    </w:p>
+    <w:p>
+      <w:pPr>
+        <w:spacing w:after="0" w:line="240" w:lineRule="auto"/>
+      </w:pPr>
+      <w:r>
+        <w:t xml:space="preserve">        'unpublished'</w:t>
+      </w:r>
+    </w:p>
+    <w:p>
+      <w:pPr>
+        <w:spacing w:after="0" w:line="240" w:lineRule="auto"/>
+      </w:pPr>
+      <w:r>
+        <w:t xml:space="preserve">    ) DEFAULT 'draft',</w:t>
+      </w:r>
+    </w:p>
+    <w:p>
+      <w:pPr>
+        <w:spacing w:after="0" w:line="240" w:lineRule="auto"/>
+      </w:pPr>
+    </w:p>
+    <w:p>
+      <w:pPr>
+        <w:spacing w:after="0" w:line="240" w:lineRule="auto"/>
+      </w:pPr>
+      <w:r>
+        <w:t xml:space="preserve">    </w:t>
       </w:r>
       <w:proofErr w:type="spellStart"/>
       <w:r>
@@ -72,7 +1113,20 @@
       </w:r>
       <w:proofErr w:type="spellEnd"/>
       <w:r>
-        <w:t xml:space="preserve"> TEXT, </w:t>
+        <w:t xml:space="preserve"> TEXT,</w:t>
+      </w:r>
+    </w:p>
+    <w:p>
+      <w:pPr>
+        <w:spacing w:after="0" w:line="240" w:lineRule="auto"/>
+      </w:pPr>
+    </w:p>
+    <w:p>
+      <w:pPr>
+        <w:spacing w:after="0" w:line="240" w:lineRule="auto"/>
+      </w:pPr>
+      <w:r>
+        <w:t xml:space="preserve">    </w:t>
       </w:r>
       <w:proofErr w:type="spellStart"/>
       <w:r>
@@ -80,7 +1134,20 @@
       </w:r>
       <w:proofErr w:type="spellEnd"/>
       <w:r>
-        <w:t xml:space="preserve"> DATETIME NULL, </w:t>
+        <w:t xml:space="preserve"> DATETIME NULL,</w:t>
+      </w:r>
+    </w:p>
+    <w:p>
+      <w:pPr>
+        <w:spacing w:after="0" w:line="240" w:lineRule="auto"/>
+      </w:pPr>
+    </w:p>
+    <w:p>
+      <w:pPr>
+        <w:spacing w:after="0" w:line="240" w:lineRule="auto"/>
+      </w:pPr>
+      <w:r>
+        <w:t xml:space="preserve">    </w:t>
       </w:r>
       <w:proofErr w:type="spellStart"/>
       <w:r>
@@ -88,7 +1155,20 @@
       </w:r>
       <w:proofErr w:type="spellEnd"/>
       <w:r>
-        <w:t xml:space="preserve"> DATETIME NULL, </w:t>
+        <w:t xml:space="preserve"> DATETIME NULL,</w:t>
+      </w:r>
+    </w:p>
+    <w:p>
+      <w:pPr>
+        <w:spacing w:after="0" w:line="240" w:lineRule="auto"/>
+      </w:pPr>
+    </w:p>
+    <w:p>
+      <w:pPr>
+        <w:spacing w:after="0" w:line="240" w:lineRule="auto"/>
+      </w:pPr>
+      <w:r>
+        <w:t xml:space="preserve">    </w:t>
       </w:r>
       <w:proofErr w:type="spellStart"/>
       <w:r>
@@ -96,7 +1176,20 @@
       </w:r>
       <w:proofErr w:type="spellEnd"/>
       <w:r>
-        <w:t xml:space="preserve"> INT DEFAULT 0, </w:t>
+        <w:t xml:space="preserve"> INT DEFAULT 0,</w:t>
+      </w:r>
+    </w:p>
+    <w:p>
+      <w:pPr>
+        <w:spacing w:after="0" w:line="240" w:lineRule="auto"/>
+      </w:pPr>
+    </w:p>
+    <w:p>
+      <w:pPr>
+        <w:spacing w:after="0" w:line="240" w:lineRule="auto"/>
+      </w:pPr>
+      <w:r>
+        <w:t xml:space="preserve">    </w:t>
       </w:r>
       <w:proofErr w:type="spellStart"/>
       <w:r>
@@ -104,7 +1197,20 @@
       </w:r>
       <w:proofErr w:type="spellEnd"/>
       <w:r>
-        <w:t xml:space="preserve"> TIMESTAMP DEFAULT CURRENT_TIMESTAMP, </w:t>
+        <w:t xml:space="preserve"> TIMESTAMP DEFAULT CURRENT_TIMESTAMP,</w:t>
+      </w:r>
+    </w:p>
+    <w:p>
+      <w:pPr>
+        <w:spacing w:after="0" w:line="240" w:lineRule="auto"/>
+      </w:pPr>
+    </w:p>
+    <w:p>
+      <w:pPr>
+        <w:spacing w:after="0" w:line="240" w:lineRule="auto"/>
+      </w:pPr>
+      <w:r>
+        <w:t xml:space="preserve">    </w:t>
       </w:r>
       <w:proofErr w:type="spellStart"/>
       <w:r>
@@ -112,8 +1218,1372 @@
       </w:r>
       <w:proofErr w:type="spellEnd"/>
       <w:r>
-        <w:t xml:space="preserve"> TIMESTAMP DEFAULT CURRENT_TIMESTAMP ON UPDATE CURRENT_TIMESTAMP );</w:t>
-      </w:r>
+        <w:t xml:space="preserve"> TIMESTAMP DEFAULT CURRENT_TIMESTAMP</w:t>
+      </w:r>
+    </w:p>
+    <w:p>
+      <w:pPr>
+        <w:spacing w:after="0" w:line="240" w:lineRule="auto"/>
+      </w:pPr>
+      <w:r>
+        <w:t xml:space="preserve">    ON UPDATE CURRENT_TIMESTAMP,</w:t>
+      </w:r>
+    </w:p>
+    <w:p>
+      <w:pPr>
+        <w:spacing w:after="0" w:line="240" w:lineRule="auto"/>
+      </w:pPr>
+    </w:p>
+    <w:p>
+      <w:pPr>
+        <w:spacing w:after="0" w:line="240" w:lineRule="auto"/>
+      </w:pPr>
+      <w:r>
+        <w:t xml:space="preserve">    FOREIGN </w:t>
+      </w:r>
+      <w:proofErr w:type="gramStart"/>
+      <w:r>
+        <w:t>KEY(</w:t>
+      </w:r>
+      <w:proofErr w:type="spellStart"/>
+      <w:proofErr w:type="gramEnd"/>
+      <w:r>
+        <w:t>author_id</w:t>
+      </w:r>
+      <w:proofErr w:type="spellEnd"/>
+      <w:r>
+        <w:t>)</w:t>
+      </w:r>
+    </w:p>
+    <w:p>
+      <w:pPr>
+        <w:spacing w:after="0" w:line="240" w:lineRule="auto"/>
+      </w:pPr>
+      <w:r>
+        <w:t xml:space="preserve">    REFERENCES users(id)</w:t>
+      </w:r>
+    </w:p>
+    <w:p>
+      <w:pPr>
+        <w:spacing w:after="0" w:line="240" w:lineRule="auto"/>
+      </w:pPr>
+      <w:r>
+        <w:t xml:space="preserve">    ON DELETE CASCADE,</w:t>
+      </w:r>
+    </w:p>
+    <w:p>
+      <w:pPr>
+        <w:spacing w:after="0" w:line="240" w:lineRule="auto"/>
+      </w:pPr>
+    </w:p>
+    <w:p>
+      <w:pPr>
+        <w:spacing w:after="0" w:line="240" w:lineRule="auto"/>
+      </w:pPr>
+      <w:r>
+        <w:t xml:space="preserve">    FOREIGN </w:t>
+      </w:r>
+      <w:proofErr w:type="gramStart"/>
+      <w:r>
+        <w:t>KEY(</w:t>
+      </w:r>
+      <w:proofErr w:type="spellStart"/>
+      <w:proofErr w:type="gramEnd"/>
+      <w:r>
+        <w:t>editor_id</w:t>
+      </w:r>
+      <w:proofErr w:type="spellEnd"/>
+      <w:r>
+        <w:t>)</w:t>
+      </w:r>
+    </w:p>
+    <w:p>
+      <w:pPr>
+        <w:spacing w:after="0" w:line="240" w:lineRule="auto"/>
+      </w:pPr>
+      <w:r>
+        <w:t xml:space="preserve">    REFERENCES users(id)</w:t>
+      </w:r>
+    </w:p>
+    <w:p>
+      <w:pPr>
+        <w:spacing w:after="0" w:line="240" w:lineRule="auto"/>
+      </w:pPr>
+      <w:r>
+        <w:t xml:space="preserve">    ON DELETE SET NULL,</w:t>
+      </w:r>
+    </w:p>
+    <w:p>
+      <w:pPr>
+        <w:spacing w:after="0" w:line="240" w:lineRule="auto"/>
+      </w:pPr>
+    </w:p>
+    <w:p>
+      <w:pPr>
+        <w:spacing w:after="0" w:line="240" w:lineRule="auto"/>
+      </w:pPr>
+      <w:r>
+        <w:t xml:space="preserve">    FOREIGN </w:t>
+      </w:r>
+      <w:proofErr w:type="gramStart"/>
+      <w:r>
+        <w:t>KEY(</w:t>
+      </w:r>
+      <w:proofErr w:type="spellStart"/>
+      <w:proofErr w:type="gramEnd"/>
+      <w:r>
+        <w:t>category_id</w:t>
+      </w:r>
+      <w:proofErr w:type="spellEnd"/>
+      <w:r>
+        <w:t>)</w:t>
+      </w:r>
+    </w:p>
+    <w:p>
+      <w:pPr>
+        <w:spacing w:after="0" w:line="240" w:lineRule="auto"/>
+      </w:pPr>
+      <w:r>
+        <w:t xml:space="preserve">    REFERENCES categories(id)</w:t>
+      </w:r>
+    </w:p>
+    <w:p>
+      <w:pPr>
+        <w:spacing w:after="0" w:line="240" w:lineRule="auto"/>
+      </w:pPr>
+      <w:r>
+        <w:lastRenderedPageBreak/>
+        <w:t xml:space="preserve">    ON DELETE CASCADE,</w:t>
+      </w:r>
+    </w:p>
+    <w:p>
+      <w:pPr>
+        <w:spacing w:after="0" w:line="240" w:lineRule="auto"/>
+      </w:pPr>
+    </w:p>
+    <w:p>
+      <w:pPr>
+        <w:spacing w:after="0" w:line="240" w:lineRule="auto"/>
+      </w:pPr>
+      <w:r>
+        <w:t xml:space="preserve">    FOREIGN </w:t>
+      </w:r>
+      <w:proofErr w:type="gramStart"/>
+      <w:r>
+        <w:t>KEY(</w:t>
+      </w:r>
+      <w:proofErr w:type="spellStart"/>
+      <w:proofErr w:type="gramEnd"/>
+      <w:r>
+        <w:t>series_id</w:t>
+      </w:r>
+      <w:proofErr w:type="spellEnd"/>
+      <w:r>
+        <w:t>)</w:t>
+      </w:r>
+    </w:p>
+    <w:p>
+      <w:pPr>
+        <w:spacing w:after="0" w:line="240" w:lineRule="auto"/>
+      </w:pPr>
+      <w:r>
+        <w:t xml:space="preserve">    REFERENCES series(id)</w:t>
+      </w:r>
+    </w:p>
+    <w:p>
+      <w:pPr>
+        <w:spacing w:after="0" w:line="240" w:lineRule="auto"/>
+      </w:pPr>
+      <w:r>
+        <w:t xml:space="preserve">    ON DELETE SET NULL</w:t>
+      </w:r>
+    </w:p>
+    <w:p>
+      <w:pPr>
+        <w:spacing w:after="0" w:line="240" w:lineRule="auto"/>
+      </w:pPr>
+    </w:p>
+    <w:p>
+      <w:pPr>
+        <w:spacing w:after="0" w:line="240" w:lineRule="auto"/>
+      </w:pPr>
+      <w:r>
+        <w:t>) ENGINE=</w:t>
+      </w:r>
+      <w:proofErr w:type="spellStart"/>
+      <w:r>
+        <w:t>InnoDB</w:t>
+      </w:r>
+      <w:proofErr w:type="spellEnd"/>
+      <w:r>
+        <w:t>;</w:t>
+      </w:r>
+    </w:p>
+    <w:p>
+      <w:pPr>
+        <w:spacing w:after="0" w:line="240" w:lineRule="auto"/>
+      </w:pPr>
+    </w:p>
+    <w:p>
+      <w:pPr>
+        <w:spacing w:after="0" w:line="240" w:lineRule="auto"/>
+        <w:rPr>
+          <w:b/>
+          <w:bCs/>
+          <w:u w:val="single"/>
+        </w:rPr>
+      </w:pPr>
+      <w:r>
+        <w:rPr>
+          <w:b/>
+          <w:bCs/>
+          <w:u w:val="single"/>
+        </w:rPr>
+        <w:t xml:space="preserve">5. </w:t>
+      </w:r>
+      <w:proofErr w:type="spellStart"/>
+      <w:r>
+        <w:rPr>
+          <w:b/>
+          <w:bCs/>
+          <w:u w:val="single"/>
+        </w:rPr>
+        <w:t>Aricle</w:t>
+      </w:r>
+      <w:proofErr w:type="spellEnd"/>
+      <w:r>
+        <w:rPr>
+          <w:b/>
+          <w:bCs/>
+          <w:u w:val="single"/>
+        </w:rPr>
+        <w:t xml:space="preserve"> Revision</w:t>
+      </w:r>
+    </w:p>
+    <w:p>
+      <w:pPr>
+        <w:spacing w:after="0" w:line="240" w:lineRule="auto"/>
+        <w:rPr>
+          <w:b/>
+          <w:bCs/>
+          <w:u w:val="single"/>
+        </w:rPr>
+      </w:pPr>
+    </w:p>
+    <w:p>
+      <w:pPr>
+        <w:spacing w:after="0" w:line="240" w:lineRule="auto"/>
+        <w:rPr>
+          <w:u w:val="single"/>
+        </w:rPr>
+      </w:pPr>
+      <w:r>
+        <w:rPr>
+          <w:u w:val="single"/>
+        </w:rPr>
+        <w:t xml:space="preserve">CREATE TABLE </w:t>
+      </w:r>
+      <w:proofErr w:type="spellStart"/>
+      <w:r>
+        <w:rPr>
+          <w:u w:val="single"/>
+        </w:rPr>
+        <w:t>article_</w:t>
+      </w:r>
+      <w:proofErr w:type="gramStart"/>
+      <w:r>
+        <w:rPr>
+          <w:u w:val="single"/>
+        </w:rPr>
+        <w:t>revisions</w:t>
+      </w:r>
+      <w:proofErr w:type="spellEnd"/>
+      <w:r>
+        <w:rPr>
+          <w:u w:val="single"/>
+        </w:rPr>
+        <w:t>(</w:t>
+      </w:r>
+      <w:proofErr w:type="gramEnd"/>
+    </w:p>
+    <w:p>
+      <w:pPr>
+        <w:spacing w:after="0" w:line="240" w:lineRule="auto"/>
+        <w:rPr>
+          <w:u w:val="single"/>
+        </w:rPr>
+      </w:pPr>
+    </w:p>
+    <w:p>
+      <w:pPr>
+        <w:spacing w:after="0" w:line="240" w:lineRule="auto"/>
+        <w:rPr>
+          <w:u w:val="single"/>
+        </w:rPr>
+      </w:pPr>
+      <w:r>
+        <w:rPr>
+          <w:u w:val="single"/>
+        </w:rPr>
+        <w:t xml:space="preserve">    id INT PRIMARY KEY AUTO_INCREMENT,</w:t>
+      </w:r>
+    </w:p>
+    <w:p>
+      <w:pPr>
+        <w:spacing w:after="0" w:line="240" w:lineRule="auto"/>
+        <w:rPr>
+          <w:u w:val="single"/>
+        </w:rPr>
+      </w:pPr>
+    </w:p>
+    <w:p>
+      <w:pPr>
+        <w:spacing w:after="0" w:line="240" w:lineRule="auto"/>
+        <w:rPr>
+          <w:u w:val="single"/>
+        </w:rPr>
+      </w:pPr>
+      <w:r>
+        <w:rPr>
+          <w:u w:val="single"/>
+        </w:rPr>
+        <w:t xml:space="preserve">    </w:t>
+      </w:r>
+      <w:proofErr w:type="spellStart"/>
+      <w:r>
+        <w:rPr>
+          <w:u w:val="single"/>
+        </w:rPr>
+        <w:t>article_id</w:t>
+      </w:r>
+      <w:proofErr w:type="spellEnd"/>
+      <w:r>
+        <w:rPr>
+          <w:u w:val="single"/>
+        </w:rPr>
+        <w:t xml:space="preserve"> INT NOT NULL,</w:t>
+      </w:r>
+    </w:p>
+    <w:p>
+      <w:pPr>
+        <w:spacing w:after="0" w:line="240" w:lineRule="auto"/>
+        <w:rPr>
+          <w:u w:val="single"/>
+        </w:rPr>
+      </w:pPr>
+    </w:p>
+    <w:p>
+      <w:pPr>
+        <w:spacing w:after="0" w:line="240" w:lineRule="auto"/>
+        <w:rPr>
+          <w:u w:val="single"/>
+        </w:rPr>
+      </w:pPr>
+      <w:r>
+        <w:rPr>
+          <w:u w:val="single"/>
+        </w:rPr>
+        <w:t xml:space="preserve">    </w:t>
+      </w:r>
+      <w:proofErr w:type="spellStart"/>
+      <w:r>
+        <w:rPr>
+          <w:u w:val="single"/>
+        </w:rPr>
+        <w:t>author_id</w:t>
+      </w:r>
+      <w:proofErr w:type="spellEnd"/>
+      <w:r>
+        <w:rPr>
+          <w:u w:val="single"/>
+        </w:rPr>
+        <w:t xml:space="preserve"> INT NOT NULL,</w:t>
+      </w:r>
+    </w:p>
+    <w:p>
+      <w:pPr>
+        <w:spacing w:after="0" w:line="240" w:lineRule="auto"/>
+        <w:rPr>
+          <w:u w:val="single"/>
+        </w:rPr>
+      </w:pPr>
+    </w:p>
+    <w:p>
+      <w:pPr>
+        <w:spacing w:after="0" w:line="240" w:lineRule="auto"/>
+        <w:rPr>
+          <w:u w:val="single"/>
+        </w:rPr>
+      </w:pPr>
+      <w:r>
+        <w:rPr>
+          <w:u w:val="single"/>
+        </w:rPr>
+        <w:t xml:space="preserve">    </w:t>
+      </w:r>
+      <w:proofErr w:type="spellStart"/>
+      <w:r>
+        <w:rPr>
+          <w:u w:val="single"/>
+        </w:rPr>
+        <w:t>body_snapshot</w:t>
+      </w:r>
+      <w:proofErr w:type="spellEnd"/>
+      <w:r>
+        <w:rPr>
+          <w:u w:val="single"/>
+        </w:rPr>
+        <w:t xml:space="preserve"> LONGTEXT,</w:t>
+      </w:r>
+    </w:p>
+    <w:p>
+      <w:pPr>
+        <w:spacing w:after="0" w:line="240" w:lineRule="auto"/>
+        <w:rPr>
+          <w:u w:val="single"/>
+        </w:rPr>
+      </w:pPr>
+    </w:p>
+    <w:p>
+      <w:pPr>
+        <w:spacing w:after="0" w:line="240" w:lineRule="auto"/>
+        <w:rPr>
+          <w:u w:val="single"/>
+        </w:rPr>
+      </w:pPr>
+      <w:r>
+        <w:rPr>
+          <w:u w:val="single"/>
+        </w:rPr>
+        <w:t xml:space="preserve">    </w:t>
+      </w:r>
+      <w:proofErr w:type="spellStart"/>
+      <w:r>
+        <w:rPr>
+          <w:u w:val="single"/>
+        </w:rPr>
+        <w:t>saved_at</w:t>
+      </w:r>
+      <w:proofErr w:type="spellEnd"/>
+      <w:r>
+        <w:rPr>
+          <w:u w:val="single"/>
+        </w:rPr>
+        <w:t xml:space="preserve"> TIMESTAMP DEFAULT CURRENT_TIMESTAMP,</w:t>
+      </w:r>
+    </w:p>
+    <w:p>
+      <w:pPr>
+        <w:spacing w:after="0" w:line="240" w:lineRule="auto"/>
+        <w:rPr>
+          <w:u w:val="single"/>
+        </w:rPr>
+      </w:pPr>
+    </w:p>
+    <w:p>
+      <w:pPr>
+        <w:spacing w:after="0" w:line="240" w:lineRule="auto"/>
+        <w:rPr>
+          <w:u w:val="single"/>
+        </w:rPr>
+      </w:pPr>
+      <w:r>
+        <w:rPr>
+          <w:u w:val="single"/>
+        </w:rPr>
+        <w:t xml:space="preserve">    FOREIGN </w:t>
+      </w:r>
+      <w:proofErr w:type="gramStart"/>
+      <w:r>
+        <w:rPr>
+          <w:u w:val="single"/>
+        </w:rPr>
+        <w:t>KEY(</w:t>
+      </w:r>
+      <w:proofErr w:type="spellStart"/>
+      <w:proofErr w:type="gramEnd"/>
+      <w:r>
+        <w:rPr>
+          <w:u w:val="single"/>
+        </w:rPr>
+        <w:t>article_id</w:t>
+      </w:r>
+      <w:proofErr w:type="spellEnd"/>
+      <w:r>
+        <w:rPr>
+          <w:u w:val="single"/>
+        </w:rPr>
+        <w:t>)</w:t>
+      </w:r>
+    </w:p>
+    <w:p>
+      <w:pPr>
+        <w:spacing w:after="0" w:line="240" w:lineRule="auto"/>
+        <w:rPr>
+          <w:u w:val="single"/>
+        </w:rPr>
+      </w:pPr>
+      <w:r>
+        <w:rPr>
+          <w:u w:val="single"/>
+        </w:rPr>
+        <w:t xml:space="preserve">    REFERENCES articles(id)</w:t>
+      </w:r>
+    </w:p>
+    <w:p>
+      <w:pPr>
+        <w:spacing w:after="0" w:line="240" w:lineRule="auto"/>
+        <w:rPr>
+          <w:u w:val="single"/>
+        </w:rPr>
+      </w:pPr>
+      <w:r>
+        <w:rPr>
+          <w:u w:val="single"/>
+        </w:rPr>
+        <w:t xml:space="preserve">    ON DELETE CASCADE,</w:t>
+      </w:r>
+    </w:p>
+    <w:p>
+      <w:pPr>
+        <w:spacing w:after="0" w:line="240" w:lineRule="auto"/>
+        <w:rPr>
+          <w:u w:val="single"/>
+        </w:rPr>
+      </w:pPr>
+    </w:p>
+    <w:p>
+      <w:pPr>
+        <w:spacing w:after="0" w:line="240" w:lineRule="auto"/>
+        <w:rPr>
+          <w:u w:val="single"/>
+        </w:rPr>
+      </w:pPr>
+      <w:r>
+        <w:rPr>
+          <w:u w:val="single"/>
+        </w:rPr>
+        <w:t xml:space="preserve">    FOREIGN </w:t>
+      </w:r>
+      <w:proofErr w:type="gramStart"/>
+      <w:r>
+        <w:rPr>
+          <w:u w:val="single"/>
+        </w:rPr>
+        <w:t>KEY(</w:t>
+      </w:r>
+      <w:proofErr w:type="spellStart"/>
+      <w:proofErr w:type="gramEnd"/>
+      <w:r>
+        <w:rPr>
+          <w:u w:val="single"/>
+        </w:rPr>
+        <w:t>author_id</w:t>
+      </w:r>
+      <w:proofErr w:type="spellEnd"/>
+      <w:r>
+        <w:rPr>
+          <w:u w:val="single"/>
+        </w:rPr>
+        <w:t>)</w:t>
+      </w:r>
+    </w:p>
+    <w:p>
+      <w:pPr>
+        <w:spacing w:after="0" w:line="240" w:lineRule="auto"/>
+        <w:rPr>
+          <w:u w:val="single"/>
+        </w:rPr>
+      </w:pPr>
+      <w:r>
+        <w:rPr>
+          <w:u w:val="single"/>
+        </w:rPr>
+        <w:t xml:space="preserve">    REFERENCES users(id)</w:t>
+      </w:r>
+    </w:p>
+    <w:p>
+      <w:pPr>
+        <w:spacing w:after="0" w:line="240" w:lineRule="auto"/>
+        <w:rPr>
+          <w:u w:val="single"/>
+        </w:rPr>
+      </w:pPr>
+      <w:r>
+        <w:rPr>
+          <w:u w:val="single"/>
+        </w:rPr>
+        <w:t xml:space="preserve">    ON DELETE CASCADE</w:t>
+      </w:r>
+    </w:p>
+    <w:p>
+      <w:pPr>
+        <w:spacing w:after="0" w:line="240" w:lineRule="auto"/>
+        <w:rPr>
+          <w:u w:val="single"/>
+        </w:rPr>
+      </w:pPr>
+    </w:p>
+    <w:p>
+      <w:pPr>
+        <w:spacing w:after="0" w:line="240" w:lineRule="auto"/>
+        <w:rPr>
+          <w:u w:val="single"/>
+        </w:rPr>
+      </w:pPr>
+      <w:r>
+        <w:rPr>
+          <w:u w:val="single"/>
+        </w:rPr>
+        <w:t>) ENGINE=</w:t>
+      </w:r>
+      <w:proofErr w:type="spellStart"/>
+      <w:r>
+        <w:rPr>
+          <w:u w:val="single"/>
+        </w:rPr>
+        <w:t>InnoDB</w:t>
+      </w:r>
+      <w:proofErr w:type="spellEnd"/>
+      <w:r>
+        <w:rPr>
+          <w:u w:val="single"/>
+        </w:rPr>
+        <w:t>;</w:t>
+      </w:r>
+    </w:p>
+    <w:p>
+      <w:pPr>
+        <w:spacing w:after="0" w:line="240" w:lineRule="auto"/>
+        <w:rPr>
+          <w:u w:val="single"/>
+        </w:rPr>
+      </w:pPr>
+    </w:p>
+    <w:p>
+      <w:pPr>
+        <w:spacing w:after="0" w:line="240" w:lineRule="auto"/>
+        <w:rPr>
+          <w:u w:val="single"/>
+        </w:rPr>
+      </w:pPr>
+    </w:p>
+    <w:p>
+      <w:pPr>
+        <w:spacing w:after="0" w:line="240" w:lineRule="auto"/>
+        <w:rPr>
+          <w:u w:val="single"/>
+        </w:rPr>
+      </w:pPr>
+    </w:p>
+    <w:p>
+      <w:pPr>
+        <w:spacing w:after="0" w:line="240" w:lineRule="auto"/>
+        <w:rPr>
+          <w:u w:val="single"/>
+        </w:rPr>
+      </w:pPr>
+    </w:p>
+    <w:p>
+      <w:pPr>
+        <w:spacing w:after="0" w:line="240" w:lineRule="auto"/>
+        <w:rPr>
+          <w:u w:val="single"/>
+        </w:rPr>
+      </w:pPr>
+    </w:p>
+    <w:p>
+      <w:pPr>
+        <w:spacing w:after="0" w:line="240" w:lineRule="auto"/>
+        <w:rPr>
+          <w:u w:val="single"/>
+        </w:rPr>
+      </w:pPr>
+    </w:p>
+    <w:p>
+      <w:pPr>
+        <w:spacing w:after="0" w:line="240" w:lineRule="auto"/>
+        <w:rPr>
+          <w:u w:val="single"/>
+        </w:rPr>
+      </w:pPr>
+    </w:p>
+    <w:p>
+      <w:pPr>
+        <w:spacing w:after="0" w:line="240" w:lineRule="auto"/>
+        <w:rPr>
+          <w:u w:val="single"/>
+        </w:rPr>
+      </w:pPr>
+    </w:p>
+    <w:p>
+      <w:pPr>
+        <w:spacing w:after="0" w:line="240" w:lineRule="auto"/>
+        <w:rPr>
+          <w:u w:val="single"/>
+        </w:rPr>
+      </w:pPr>
+    </w:p>
+    <w:p>
+      <w:pPr>
+        <w:spacing w:after="0" w:line="240" w:lineRule="auto"/>
+        <w:rPr>
+          <w:u w:val="single"/>
+        </w:rPr>
+      </w:pPr>
+    </w:p>
+    <w:p>
+      <w:pPr>
+        <w:spacing w:after="0" w:line="240" w:lineRule="auto"/>
+        <w:rPr>
+          <w:u w:val="single"/>
+        </w:rPr>
+      </w:pPr>
+    </w:p>
+    <w:p>
+      <w:pPr>
+        <w:spacing w:after="0" w:line="240" w:lineRule="auto"/>
+        <w:rPr>
+          <w:u w:val="single"/>
+        </w:rPr>
+      </w:pPr>
+    </w:p>
+    <w:p>
+      <w:pPr>
+        <w:spacing w:after="0" w:line="240" w:lineRule="auto"/>
+        <w:rPr>
+          <w:u w:val="single"/>
+        </w:rPr>
+      </w:pPr>
+    </w:p>
+    <w:p>
+      <w:pPr>
+        <w:spacing w:after="0" w:line="240" w:lineRule="auto"/>
+        <w:rPr>
+          <w:u w:val="single"/>
+        </w:rPr>
+      </w:pPr>
+      <w:r>
+        <w:rPr>
+          <w:u w:val="single"/>
+        </w:rPr>
+        <w:lastRenderedPageBreak/>
+        <w:sym w:font="Wingdings" w:char="F0E0"/>
+      </w:r>
+    </w:p>
+    <w:p>
+      <w:pPr>
+        <w:spacing w:after="0" w:line="240" w:lineRule="auto"/>
+        <w:rPr>
+          <w:u w:val="single"/>
+        </w:rPr>
+      </w:pPr>
+    </w:p>
+    <w:p>
+      <w:pPr>
+        <w:spacing w:after="0" w:line="240" w:lineRule="auto"/>
+        <w:rPr>
+          <w:u w:val="single"/>
+        </w:rPr>
+      </w:pPr>
+      <w:r>
+        <w:rPr>
+          <w:u w:val="single"/>
+        </w:rPr>
+        <w:t xml:space="preserve">INSERT INTO </w:t>
+      </w:r>
+      <w:proofErr w:type="gramStart"/>
+      <w:r>
+        <w:rPr>
+          <w:u w:val="single"/>
+        </w:rPr>
+        <w:t>categories(</w:t>
+      </w:r>
+      <w:proofErr w:type="gramEnd"/>
+    </w:p>
+    <w:p>
+      <w:pPr>
+        <w:spacing w:after="0" w:line="240" w:lineRule="auto"/>
+        <w:rPr>
+          <w:u w:val="single"/>
+        </w:rPr>
+      </w:pPr>
+      <w:r>
+        <w:rPr>
+          <w:u w:val="single"/>
+        </w:rPr>
+        <w:t>name,</w:t>
+      </w:r>
+    </w:p>
+    <w:p>
+      <w:pPr>
+        <w:spacing w:after="0" w:line="240" w:lineRule="auto"/>
+        <w:rPr>
+          <w:u w:val="single"/>
+        </w:rPr>
+      </w:pPr>
+      <w:r>
+        <w:rPr>
+          <w:u w:val="single"/>
+        </w:rPr>
+        <w:t>slug</w:t>
+      </w:r>
+    </w:p>
+    <w:p>
+      <w:pPr>
+        <w:spacing w:after="0" w:line="240" w:lineRule="auto"/>
+        <w:rPr>
+          <w:u w:val="single"/>
+        </w:rPr>
+      </w:pPr>
+      <w:r>
+        <w:rPr>
+          <w:u w:val="single"/>
+        </w:rPr>
+        <w:t>)</w:t>
+      </w:r>
+    </w:p>
+    <w:p>
+      <w:pPr>
+        <w:spacing w:after="0" w:line="240" w:lineRule="auto"/>
+        <w:rPr>
+          <w:u w:val="single"/>
+        </w:rPr>
+      </w:pPr>
+    </w:p>
+    <w:p>
+      <w:pPr>
+        <w:spacing w:after="0" w:line="240" w:lineRule="auto"/>
+        <w:rPr>
+          <w:u w:val="single"/>
+        </w:rPr>
+      </w:pPr>
+      <w:r>
+        <w:rPr>
+          <w:u w:val="single"/>
+        </w:rPr>
+        <w:t>VALUES</w:t>
+      </w:r>
+    </w:p>
+    <w:p>
+      <w:pPr>
+        <w:spacing w:after="0" w:line="240" w:lineRule="auto"/>
+        <w:rPr>
+          <w:u w:val="single"/>
+        </w:rPr>
+      </w:pPr>
+      <w:r>
+        <w:rPr>
+          <w:u w:val="single"/>
+        </w:rPr>
+        <w:t>('</w:t>
+      </w:r>
+      <w:proofErr w:type="spellStart"/>
+      <w:r>
+        <w:rPr>
+          <w:u w:val="single"/>
+        </w:rPr>
+        <w:t>Technology','technology</w:t>
+      </w:r>
+      <w:proofErr w:type="spellEnd"/>
+      <w:r>
+        <w:rPr>
+          <w:u w:val="single"/>
+        </w:rPr>
+        <w:t>'),</w:t>
+      </w:r>
+    </w:p>
+    <w:p>
+      <w:pPr>
+        <w:spacing w:after="0" w:line="240" w:lineRule="auto"/>
+        <w:rPr>
+          <w:u w:val="single"/>
+        </w:rPr>
+      </w:pPr>
+      <w:r>
+        <w:rPr>
+          <w:u w:val="single"/>
+        </w:rPr>
+        <w:t>('</w:t>
+      </w:r>
+      <w:proofErr w:type="spellStart"/>
+      <w:r>
+        <w:rPr>
+          <w:u w:val="single"/>
+        </w:rPr>
+        <w:t>Sports','sports</w:t>
+      </w:r>
+      <w:proofErr w:type="spellEnd"/>
+      <w:r>
+        <w:rPr>
+          <w:u w:val="single"/>
+        </w:rPr>
+        <w:t>'),</w:t>
+      </w:r>
+    </w:p>
+    <w:p>
+      <w:pPr>
+        <w:spacing w:after="0" w:line="240" w:lineRule="auto"/>
+        <w:rPr>
+          <w:u w:val="single"/>
+        </w:rPr>
+      </w:pPr>
+      <w:r>
+        <w:rPr>
+          <w:u w:val="single"/>
+        </w:rPr>
+        <w:t>('</w:t>
+      </w:r>
+      <w:proofErr w:type="spellStart"/>
+      <w:r>
+        <w:rPr>
+          <w:u w:val="single"/>
+        </w:rPr>
+        <w:t>News','news</w:t>
+      </w:r>
+      <w:proofErr w:type="spellEnd"/>
+      <w:r>
+        <w:rPr>
+          <w:u w:val="single"/>
+        </w:rPr>
+        <w:t>');</w:t>
+      </w:r>
+    </w:p>
+    <w:p>
+      <w:pPr>
+        <w:spacing w:after="0" w:line="240" w:lineRule="auto"/>
+        <w:rPr>
+          <w:u w:val="single"/>
+        </w:rPr>
+      </w:pPr>
+    </w:p>
+    <w:p>
+      <w:pPr>
+        <w:spacing w:after="0" w:line="240" w:lineRule="auto"/>
+        <w:rPr>
+          <w:u w:val="single"/>
+        </w:rPr>
+      </w:pPr>
+      <w:r>
+        <w:rPr>
+          <w:u w:val="single"/>
+        </w:rPr>
+        <w:sym w:font="Wingdings" w:char="F0E0"/>
+      </w:r>
+    </w:p>
+    <w:p>
+      <w:pPr>
+        <w:spacing w:after="0" w:line="240" w:lineRule="auto"/>
+        <w:rPr>
+          <w:u w:val="single"/>
+        </w:rPr>
+      </w:pPr>
+    </w:p>
+    <w:p>
+      <w:pPr>
+        <w:spacing w:after="0" w:line="240" w:lineRule="auto"/>
+        <w:rPr>
+          <w:u w:val="single"/>
+        </w:rPr>
+      </w:pPr>
+      <w:r>
+        <w:rPr>
+          <w:u w:val="single"/>
+        </w:rPr>
+        <w:t xml:space="preserve">INSERT INTO </w:t>
+      </w:r>
+      <w:proofErr w:type="gramStart"/>
+      <w:r>
+        <w:rPr>
+          <w:u w:val="single"/>
+        </w:rPr>
+        <w:t>users(</w:t>
+      </w:r>
+      <w:proofErr w:type="gramEnd"/>
+    </w:p>
+    <w:p>
+      <w:pPr>
+        <w:spacing w:after="0" w:line="240" w:lineRule="auto"/>
+        <w:rPr>
+          <w:u w:val="single"/>
+        </w:rPr>
+      </w:pPr>
+    </w:p>
+    <w:p>
+      <w:pPr>
+        <w:spacing w:after="0" w:line="240" w:lineRule="auto"/>
+        <w:rPr>
+          <w:u w:val="single"/>
+        </w:rPr>
+      </w:pPr>
+      <w:r>
+        <w:rPr>
+          <w:u w:val="single"/>
+        </w:rPr>
+        <w:t>name,</w:t>
+      </w:r>
+    </w:p>
+    <w:p>
+      <w:pPr>
+        <w:spacing w:after="0" w:line="240" w:lineRule="auto"/>
+        <w:rPr>
+          <w:u w:val="single"/>
+        </w:rPr>
+      </w:pPr>
+      <w:r>
+        <w:rPr>
+          <w:u w:val="single"/>
+        </w:rPr>
+        <w:t>username,</w:t>
+      </w:r>
+    </w:p>
+    <w:p>
+      <w:pPr>
+        <w:spacing w:after="0" w:line="240" w:lineRule="auto"/>
+        <w:rPr>
+          <w:u w:val="single"/>
+        </w:rPr>
+      </w:pPr>
+      <w:r>
+        <w:rPr>
+          <w:u w:val="single"/>
+        </w:rPr>
+        <w:t>email,</w:t>
+      </w:r>
+    </w:p>
+    <w:p>
+      <w:pPr>
+        <w:spacing w:after="0" w:line="240" w:lineRule="auto"/>
+        <w:rPr>
+          <w:u w:val="single"/>
+        </w:rPr>
+      </w:pPr>
+      <w:proofErr w:type="spellStart"/>
+      <w:r>
+        <w:rPr>
+          <w:u w:val="single"/>
+        </w:rPr>
+        <w:t>password_hash</w:t>
+      </w:r>
+      <w:proofErr w:type="spellEnd"/>
+      <w:r>
+        <w:rPr>
+          <w:u w:val="single"/>
+        </w:rPr>
+        <w:t>,</w:t>
+      </w:r>
+    </w:p>
+    <w:p>
+      <w:pPr>
+        <w:spacing w:after="0" w:line="240" w:lineRule="auto"/>
+        <w:rPr>
+          <w:u w:val="single"/>
+        </w:rPr>
+      </w:pPr>
+      <w:r>
+        <w:rPr>
+          <w:u w:val="single"/>
+        </w:rPr>
+        <w:t>role</w:t>
+      </w:r>
+    </w:p>
+    <w:p>
+      <w:pPr>
+        <w:spacing w:after="0" w:line="240" w:lineRule="auto"/>
+        <w:rPr>
+          <w:u w:val="single"/>
+        </w:rPr>
+      </w:pPr>
+    </w:p>
+    <w:p>
+      <w:pPr>
+        <w:spacing w:after="0" w:line="240" w:lineRule="auto"/>
+        <w:rPr>
+          <w:u w:val="single"/>
+        </w:rPr>
+      </w:pPr>
+      <w:r>
+        <w:rPr>
+          <w:u w:val="single"/>
+        </w:rPr>
+        <w:t>)</w:t>
+      </w:r>
+    </w:p>
+    <w:p>
+      <w:pPr>
+        <w:spacing w:after="0" w:line="240" w:lineRule="auto"/>
+        <w:rPr>
+          <w:u w:val="single"/>
+        </w:rPr>
+      </w:pPr>
+    </w:p>
+    <w:p>
+      <w:pPr>
+        <w:spacing w:after="0" w:line="240" w:lineRule="auto"/>
+        <w:rPr>
+          <w:u w:val="single"/>
+        </w:rPr>
+      </w:pPr>
+      <w:proofErr w:type="gramStart"/>
+      <w:r>
+        <w:rPr>
+          <w:u w:val="single"/>
+        </w:rPr>
+        <w:t>VALUES(</w:t>
+      </w:r>
+      <w:proofErr w:type="gramEnd"/>
+    </w:p>
+    <w:p>
+      <w:pPr>
+        <w:spacing w:after="0" w:line="240" w:lineRule="auto"/>
+        <w:rPr>
+          <w:u w:val="single"/>
+        </w:rPr>
+      </w:pPr>
+    </w:p>
+    <w:p>
+      <w:pPr>
+        <w:spacing w:after="0" w:line="240" w:lineRule="auto"/>
+        <w:rPr>
+          <w:u w:val="single"/>
+        </w:rPr>
+      </w:pPr>
+      <w:r>
+        <w:rPr>
+          <w:u w:val="single"/>
+        </w:rPr>
+        <w:t>'Nahid',</w:t>
+      </w:r>
+    </w:p>
+    <w:p>
+      <w:pPr>
+        <w:spacing w:after="0" w:line="240" w:lineRule="auto"/>
+        <w:rPr>
+          <w:u w:val="single"/>
+        </w:rPr>
+      </w:pPr>
+      <w:r>
+        <w:rPr>
+          <w:u w:val="single"/>
+        </w:rPr>
+        <w:t>'nahid123',</w:t>
+      </w:r>
+    </w:p>
+    <w:p>
+      <w:pPr>
+        <w:spacing w:after="0" w:line="240" w:lineRule="auto"/>
+        <w:rPr>
+          <w:u w:val="single"/>
+        </w:rPr>
+      </w:pPr>
+      <w:r>
+        <w:rPr>
+          <w:u w:val="single"/>
+        </w:rPr>
+        <w:t>'nahid@gmail.com',</w:t>
+      </w:r>
+    </w:p>
+    <w:p>
+      <w:pPr>
+        <w:spacing w:after="0" w:line="240" w:lineRule="auto"/>
+        <w:rPr>
+          <w:u w:val="single"/>
+        </w:rPr>
+      </w:pPr>
+      <w:r>
+        <w:rPr>
+          <w:u w:val="single"/>
+        </w:rPr>
+        <w:t>'123456',</w:t>
+      </w:r>
+    </w:p>
+    <w:p>
+      <w:pPr>
+        <w:spacing w:after="0" w:line="240" w:lineRule="auto"/>
+        <w:rPr>
+          <w:u w:val="single"/>
+        </w:rPr>
+      </w:pPr>
+      <w:r>
+        <w:rPr>
+          <w:u w:val="single"/>
+        </w:rPr>
+        <w:t>'author'</w:t>
+      </w:r>
+    </w:p>
+    <w:p>
+      <w:pPr>
+        <w:spacing w:after="0" w:line="240" w:lineRule="auto"/>
+        <w:rPr>
+          <w:u w:val="single"/>
+        </w:rPr>
+      </w:pPr>
+    </w:p>
+    <w:p>
+      <w:pPr>
+        <w:spacing w:after="0" w:line="240" w:lineRule="auto"/>
+        <w:rPr>
+          <w:u w:val="single"/>
+        </w:rPr>
+      </w:pPr>
+      <w:r>
+        <w:rPr>
+          <w:u w:val="single"/>
+        </w:rPr>
+        <w:t>);</w:t>
+      </w:r>
+    </w:p>
+    <w:p>
+      <w:pPr>
+        <w:spacing w:after="0" w:line="240" w:lineRule="auto"/>
+        <w:rPr>
+          <w:u w:val="single"/>
+        </w:rPr>
+      </w:pPr>
+    </w:p>
+    <w:p>
+      <w:pPr>
+        <w:spacing w:after="0" w:line="240" w:lineRule="auto"/>
+        <w:rPr>
+          <w:u w:val="single"/>
+        </w:rPr>
+      </w:pPr>
+      <w:r>
+        <w:rPr>
+          <w:u w:val="single"/>
+        </w:rPr>
+        <w:sym w:font="Wingdings" w:char="F0E0"/>
+      </w:r>
+    </w:p>
+    <w:p>
+      <w:pPr>
+        <w:spacing w:after="0" w:line="240" w:lineRule="auto"/>
+        <w:rPr>
+          <w:u w:val="single"/>
+        </w:rPr>
+      </w:pPr>
+    </w:p>
+    <w:p>
+      <w:pPr>
+        <w:spacing w:after="0" w:line="240" w:lineRule="auto"/>
+        <w:rPr>
+          <w:u w:val="single"/>
+        </w:rPr>
+      </w:pPr>
+      <w:r>
+        <w:rPr>
+          <w:u w:val="single"/>
+        </w:rPr>
+        <w:t xml:space="preserve">INSERT INTO </w:t>
+      </w:r>
+      <w:proofErr w:type="gramStart"/>
+      <w:r>
+        <w:rPr>
+          <w:u w:val="single"/>
+        </w:rPr>
+        <w:t>series(</w:t>
+      </w:r>
+      <w:proofErr w:type="gramEnd"/>
+    </w:p>
+    <w:p>
+      <w:pPr>
+        <w:spacing w:after="0" w:line="240" w:lineRule="auto"/>
+        <w:rPr>
+          <w:u w:val="single"/>
+        </w:rPr>
+      </w:pPr>
+      <w:proofErr w:type="spellStart"/>
+      <w:r>
+        <w:rPr>
+          <w:u w:val="single"/>
+        </w:rPr>
+        <w:t>author_id</w:t>
+      </w:r>
+      <w:proofErr w:type="spellEnd"/>
+      <w:r>
+        <w:rPr>
+          <w:u w:val="single"/>
+        </w:rPr>
+        <w:t>,</w:t>
+      </w:r>
+    </w:p>
+    <w:p>
+      <w:pPr>
+        <w:spacing w:after="0" w:line="240" w:lineRule="auto"/>
+        <w:rPr>
+          <w:u w:val="single"/>
+        </w:rPr>
+      </w:pPr>
+      <w:r>
+        <w:rPr>
+          <w:u w:val="single"/>
+        </w:rPr>
+        <w:t>title</w:t>
+      </w:r>
+    </w:p>
+    <w:p>
+      <w:pPr>
+        <w:spacing w:after="0" w:line="240" w:lineRule="auto"/>
+        <w:rPr>
+          <w:u w:val="single"/>
+        </w:rPr>
+      </w:pPr>
+      <w:r>
+        <w:rPr>
+          <w:u w:val="single"/>
+        </w:rPr>
+        <w:t>)</w:t>
+      </w:r>
+    </w:p>
+    <w:p>
+      <w:pPr>
+        <w:spacing w:after="0" w:line="240" w:lineRule="auto"/>
+        <w:rPr>
+          <w:u w:val="single"/>
+        </w:rPr>
+      </w:pPr>
+      <w:r>
+        <w:rPr>
+          <w:u w:val="single"/>
+        </w:rPr>
+        <w:t>VALUES</w:t>
+      </w:r>
+    </w:p>
+    <w:p>
+      <w:pPr>
+        <w:spacing w:after="0" w:line="240" w:lineRule="auto"/>
+        <w:rPr>
+          <w:u w:val="single"/>
+        </w:rPr>
+      </w:pPr>
+      <w:r>
+        <w:rPr>
+          <w:u w:val="single"/>
+        </w:rPr>
+        <w:t>(1,'Web Development'),</w:t>
+      </w:r>
+    </w:p>
+    <w:p>
+      <w:pPr>
+        <w:spacing w:after="0" w:line="240" w:lineRule="auto"/>
+        <w:rPr>
+          <w:u w:val="single"/>
+        </w:rPr>
+      </w:pPr>
+      <w:r>
+        <w:rPr>
+          <w:u w:val="single"/>
+        </w:rPr>
+        <w:t>(1,'Programming');</w:t>
+      </w:r>
+    </w:p>
+    <w:p>
+      <w:pPr>
+        <w:spacing w:after="0" w:line="240" w:lineRule="auto"/>
+        <w:rPr>
+          <w:u w:val="single"/>
+        </w:rPr>
+      </w:pPr>
     </w:p>
     <w:sectPr>
       <w:pgSz w:w="12240" w:h="15840"/>

</xml_diff>

<commit_message>
Article revision Feature is added (#1)
</commit_message>
<xml_diff>
--- a/blogPost/DB Quries/blogPost.docx
+++ b/blogPost/DB Quries/blogPost.docx
@@ -3,20 +3,613 @@
 <w:document xmlns:wpc="http://schemas.microsoft.com/office/word/2010/wordprocessingCanvas" xmlns:cx="http://schemas.microsoft.com/office/drawing/2014/chartex" xmlns:cx1="http://schemas.microsoft.com/office/drawing/2015/9/8/chartex" xmlns:cx2="http://schemas.microsoft.com/office/drawing/2015/10/21/chartex" xmlns:cx3="http://schemas.microsoft.com/office/drawing/2016/5/9/chartex" xmlns:cx4="http://schemas.microsoft.com/office/drawing/2016/5/10/chartex" xmlns:cx5="http://schemas.microsoft.com/office/drawing/2016/5/11/chartex" xmlns:cx6="http://schemas.microsoft.com/office/drawing/2016/5/12/chartex" xmlns:cx7="http://schemas.microsoft.com/office/drawing/2016/5/13/chartex" xmlns:cx8="http://schemas.microsoft.com/office/drawing/2016/5/14/chartex" xmlns:mc="http://schemas.openxmlformats.org/markup-compatibility/2006" xmlns:aink="http://schemas.microsoft.com/office/drawing/2016/ink" xmlns:am3d="http://schemas.microsoft.com/office/drawing/2017/model3d" xmlns:o="urn:schemas-microsoft-com:office:office" xmlns:oel="http://schemas.microsoft.com/office/2019/extlst" xmlns:r="http://schemas.openxmlformats.org/officeDocument/2006/relationships" xmlns:m="http://schemas.openxmlformats.org/officeDocument/2006/math" xmlns:v="urn:schemas-microsoft-com:vml" xmlns:wp14="http://schemas.microsoft.com/office/word/2010/wordprocessingDrawing" xmlns:wp="http://schemas.openxmlformats.org/drawingml/2006/wordprocessingDrawing" xmlns:w10="urn:schemas-microsoft-com:office:word" xmlns:w="http://schemas.openxmlformats.org/wordprocessingml/2006/main" xmlns:w14="http://schemas.microsoft.com/office/word/2010/wordml" xmlns:w15="http://schemas.microsoft.com/office/word/2012/wordml" xmlns:w16cex="http://schemas.microsoft.com/office/word/2018/wordml/cex" xmlns:w16cid="http://schemas.microsoft.com/office/word/2016/wordml/cid" xmlns:w16="http://schemas.microsoft.com/office/word/2018/wordml" xmlns:w16du="http://schemas.microsoft.com/office/word/2023/wordml/word16du" xmlns:w16sdtdh="http://schemas.microsoft.com/office/word/2020/wordml/sdtdatahash" xmlns:w16sdtfl="http://schemas.microsoft.com/office/word/2024/wordml/sdtformatlock" xmlns:w16se="http://schemas.microsoft.com/office/word/2015/wordml/symex" xmlns:wpg="http://schemas.microsoft.com/office/word/2010/wordprocessingGroup" xmlns:wpi="http://schemas.microsoft.com/office/word/2010/wordprocessingInk" xmlns:wne="http://schemas.microsoft.com/office/word/2006/wordml" xmlns:wps="http://schemas.microsoft.com/office/word/2010/wordprocessingShape" mc:Ignorable="w14 w15 w16se w16cid w16 w16cex w16sdtdh w16sdtfl w16du wp14">
   <w:body>
     <w:p>
-      <w:proofErr w:type="spellStart"/>
-      <w:r>
-        <w:t>blogPost</w:t>
-      </w:r>
-      <w:proofErr w:type="spellEnd"/>
-    </w:p>
-    <w:p>
-      <w:r>
-        <w:t xml:space="preserve">Article Table: </w:t>
-      </w:r>
-    </w:p>
-    <w:p>
-      <w:r>
-        <w:t xml:space="preserve">CREATE TABLE articles( id INT PRIMARY KEY AUTO_INCREMENT, </w:t>
+      <w:pPr>
+        <w:spacing w:after="0" w:line="240" w:lineRule="auto"/>
+        <w:rPr>
+          <w:b/>
+          <w:bCs/>
+          <w:u w:val="single"/>
+        </w:rPr>
+      </w:pPr>
+      <w:r>
+        <w:rPr>
+          <w:b/>
+          <w:bCs/>
+          <w:u w:val="single"/>
+        </w:rPr>
+        <w:t>1.</w:t>
+      </w:r>
+      <w:r>
+        <w:rPr>
+          <w:b/>
+          <w:bCs/>
+          <w:u w:val="single"/>
+        </w:rPr>
+        <w:t>User Table</w:t>
+      </w:r>
+    </w:p>
+    <w:p>
+      <w:pPr>
+        <w:spacing w:after="0" w:line="240" w:lineRule="auto"/>
+        <w:rPr>
+          <w:b/>
+          <w:bCs/>
+          <w:u w:val="single"/>
+        </w:rPr>
+      </w:pPr>
+    </w:p>
+    <w:p>
+      <w:pPr>
+        <w:spacing w:after="0" w:line="240" w:lineRule="auto"/>
+      </w:pPr>
+      <w:r>
+        <w:t xml:space="preserve">CREATE TABLE </w:t>
+      </w:r>
+      <w:proofErr w:type="gramStart"/>
+      <w:r>
+        <w:t>users(</w:t>
+      </w:r>
+      <w:proofErr w:type="gramEnd"/>
+    </w:p>
+    <w:p>
+      <w:pPr>
+        <w:spacing w:after="0" w:line="240" w:lineRule="auto"/>
+      </w:pPr>
+    </w:p>
+    <w:p>
+      <w:pPr>
+        <w:spacing w:after="0" w:line="240" w:lineRule="auto"/>
+      </w:pPr>
+      <w:r>
+        <w:t xml:space="preserve">    id INT PRIMARY KEY AUTO_INCREMENT,</w:t>
+      </w:r>
+    </w:p>
+    <w:p>
+      <w:pPr>
+        <w:spacing w:after="0" w:line="240" w:lineRule="auto"/>
+      </w:pPr>
+    </w:p>
+    <w:p>
+      <w:pPr>
+        <w:spacing w:after="0" w:line="240" w:lineRule="auto"/>
+      </w:pPr>
+      <w:r>
+        <w:t xml:space="preserve">    name </w:t>
+      </w:r>
+      <w:proofErr w:type="gramStart"/>
+      <w:r>
+        <w:t>VARCHAR(</w:t>
+      </w:r>
+      <w:proofErr w:type="gramEnd"/>
+      <w:r>
+        <w:t>100) NOT NULL,</w:t>
+      </w:r>
+    </w:p>
+    <w:p>
+      <w:pPr>
+        <w:spacing w:after="0" w:line="240" w:lineRule="auto"/>
+      </w:pPr>
+    </w:p>
+    <w:p>
+      <w:pPr>
+        <w:spacing w:after="0" w:line="240" w:lineRule="auto"/>
+      </w:pPr>
+      <w:r>
+        <w:t xml:space="preserve">    username </w:t>
+      </w:r>
+      <w:proofErr w:type="gramStart"/>
+      <w:r>
+        <w:t>VARCHAR(</w:t>
+      </w:r>
+      <w:proofErr w:type="gramEnd"/>
+      <w:r>
+        <w:t>100) UNIQUE NOT NULL,</w:t>
+      </w:r>
+    </w:p>
+    <w:p>
+      <w:pPr>
+        <w:spacing w:after="0" w:line="240" w:lineRule="auto"/>
+      </w:pPr>
+    </w:p>
+    <w:p>
+      <w:pPr>
+        <w:spacing w:after="0" w:line="240" w:lineRule="auto"/>
+      </w:pPr>
+      <w:r>
+        <w:t xml:space="preserve">    email </w:t>
+      </w:r>
+      <w:proofErr w:type="gramStart"/>
+      <w:r>
+        <w:t>VARCHAR(</w:t>
+      </w:r>
+      <w:proofErr w:type="gramEnd"/>
+      <w:r>
+        <w:t>100) UNIQUE NOT NULL,</w:t>
+      </w:r>
+    </w:p>
+    <w:p>
+      <w:pPr>
+        <w:spacing w:after="0" w:line="240" w:lineRule="auto"/>
+      </w:pPr>
+    </w:p>
+    <w:p>
+      <w:pPr>
+        <w:spacing w:after="0" w:line="240" w:lineRule="auto"/>
+      </w:pPr>
+      <w:r>
+        <w:t xml:space="preserve">    </w:t>
+      </w:r>
+      <w:proofErr w:type="spellStart"/>
+      <w:r>
+        <w:t>password_hash</w:t>
+      </w:r>
+      <w:proofErr w:type="spellEnd"/>
+      <w:r>
+        <w:t xml:space="preserve"> </w:t>
+      </w:r>
+      <w:proofErr w:type="gramStart"/>
+      <w:r>
+        <w:t>VARCHAR(</w:t>
+      </w:r>
+      <w:proofErr w:type="gramEnd"/>
+      <w:r>
+        <w:t>255) NOT NULL,</w:t>
+      </w:r>
+    </w:p>
+    <w:p>
+      <w:pPr>
+        <w:spacing w:after="0" w:line="240" w:lineRule="auto"/>
+      </w:pPr>
+    </w:p>
+    <w:p>
+      <w:pPr>
+        <w:spacing w:after="0" w:line="240" w:lineRule="auto"/>
+      </w:pPr>
+      <w:r>
+        <w:t xml:space="preserve">    role </w:t>
+      </w:r>
+      <w:proofErr w:type="gramStart"/>
+      <w:r>
+        <w:t>ENUM(</w:t>
+      </w:r>
+      <w:proofErr w:type="gramEnd"/>
+    </w:p>
+    <w:p>
+      <w:pPr>
+        <w:spacing w:after="0" w:line="240" w:lineRule="auto"/>
+      </w:pPr>
+      <w:r>
+        <w:t xml:space="preserve">        'reader',</w:t>
+      </w:r>
+    </w:p>
+    <w:p>
+      <w:pPr>
+        <w:spacing w:after="0" w:line="240" w:lineRule="auto"/>
+      </w:pPr>
+      <w:r>
+        <w:t xml:space="preserve">        'author',</w:t>
+      </w:r>
+    </w:p>
+    <w:p>
+      <w:pPr>
+        <w:spacing w:after="0" w:line="240" w:lineRule="auto"/>
+      </w:pPr>
+      <w:r>
+        <w:t xml:space="preserve">        'editor',</w:t>
+      </w:r>
+    </w:p>
+    <w:p>
+      <w:pPr>
+        <w:spacing w:after="0" w:line="240" w:lineRule="auto"/>
+      </w:pPr>
+      <w:r>
+        <w:t xml:space="preserve">        'admin'</w:t>
+      </w:r>
+    </w:p>
+    <w:p>
+      <w:pPr>
+        <w:spacing w:after="0" w:line="240" w:lineRule="auto"/>
+      </w:pPr>
+      <w:r>
+        <w:t xml:space="preserve">    ) DEFAULT 'reader',</w:t>
+      </w:r>
+    </w:p>
+    <w:p>
+      <w:pPr>
+        <w:spacing w:after="0" w:line="240" w:lineRule="auto"/>
+      </w:pPr>
+    </w:p>
+    <w:p>
+      <w:pPr>
+        <w:spacing w:after="0" w:line="240" w:lineRule="auto"/>
+      </w:pPr>
+      <w:r>
+        <w:t xml:space="preserve">    </w:t>
+      </w:r>
+      <w:proofErr w:type="gramStart"/>
+      <w:r>
+        <w:t>bio TEXT</w:t>
+      </w:r>
+      <w:proofErr w:type="gramEnd"/>
+      <w:r>
+        <w:t>,</w:t>
+      </w:r>
+    </w:p>
+    <w:p>
+      <w:pPr>
+        <w:spacing w:after="0" w:line="240" w:lineRule="auto"/>
+      </w:pPr>
+    </w:p>
+    <w:p>
+      <w:pPr>
+        <w:spacing w:after="0" w:line="240" w:lineRule="auto"/>
+      </w:pPr>
+      <w:r>
+        <w:t xml:space="preserve">    </w:t>
+      </w:r>
+      <w:proofErr w:type="spellStart"/>
+      <w:r>
+        <w:t>profile_pic</w:t>
+      </w:r>
+      <w:proofErr w:type="spellEnd"/>
+      <w:r>
+        <w:t xml:space="preserve"> </w:t>
+      </w:r>
+      <w:proofErr w:type="gramStart"/>
+      <w:r>
+        <w:t>VARCHAR(</w:t>
+      </w:r>
+      <w:proofErr w:type="gramEnd"/>
+      <w:r>
+        <w:t>255),</w:t>
+      </w:r>
+    </w:p>
+    <w:p>
+      <w:pPr>
+        <w:spacing w:after="0" w:line="240" w:lineRule="auto"/>
+      </w:pPr>
+    </w:p>
+    <w:p>
+      <w:pPr>
+        <w:spacing w:after="0" w:line="240" w:lineRule="auto"/>
+      </w:pPr>
+      <w:r>
+        <w:t xml:space="preserve">    </w:t>
+      </w:r>
+      <w:proofErr w:type="spellStart"/>
+      <w:r>
+        <w:t>social_links</w:t>
+      </w:r>
+      <w:proofErr w:type="spellEnd"/>
+      <w:r>
+        <w:t xml:space="preserve"> JSON,</w:t>
+      </w:r>
+    </w:p>
+    <w:p>
+      <w:pPr>
+        <w:spacing w:after="0" w:line="240" w:lineRule="auto"/>
+      </w:pPr>
+    </w:p>
+    <w:p>
+      <w:pPr>
+        <w:spacing w:after="0" w:line="240" w:lineRule="auto"/>
+      </w:pPr>
+      <w:r>
+        <w:t xml:space="preserve">    </w:t>
+      </w:r>
+      <w:proofErr w:type="spellStart"/>
+      <w:r>
+        <w:t>is_active</w:t>
+      </w:r>
+      <w:proofErr w:type="spellEnd"/>
+      <w:r>
+        <w:t xml:space="preserve"> BOOLEAN DEFAULT TRUE,</w:t>
+      </w:r>
+    </w:p>
+    <w:p>
+      <w:pPr>
+        <w:spacing w:after="0" w:line="240" w:lineRule="auto"/>
+      </w:pPr>
+    </w:p>
+    <w:p>
+      <w:pPr>
+        <w:spacing w:after="0" w:line="240" w:lineRule="auto"/>
+      </w:pPr>
+      <w:r>
+        <w:t xml:space="preserve">    </w:t>
+      </w:r>
+      <w:proofErr w:type="spellStart"/>
+      <w:r>
+        <w:t>is_author_approved</w:t>
+      </w:r>
+      <w:proofErr w:type="spellEnd"/>
+      <w:r>
+        <w:t xml:space="preserve"> BOOLEAN DEFAULT FALSE,</w:t>
+      </w:r>
+    </w:p>
+    <w:p>
+      <w:pPr>
+        <w:spacing w:after="0" w:line="240" w:lineRule="auto"/>
+      </w:pPr>
+    </w:p>
+    <w:p>
+      <w:pPr>
+        <w:spacing w:after="0" w:line="240" w:lineRule="auto"/>
+      </w:pPr>
+      <w:r>
+        <w:t xml:space="preserve">    </w:t>
+      </w:r>
+      <w:proofErr w:type="spellStart"/>
+      <w:r>
+        <w:t>created_at</w:t>
+      </w:r>
+      <w:proofErr w:type="spellEnd"/>
+      <w:r>
+        <w:t xml:space="preserve"> TIMESTAMP DEFAULT CURRENT_TIMESTAMP</w:t>
+      </w:r>
+    </w:p>
+    <w:p>
+      <w:pPr>
+        <w:spacing w:after="0" w:line="240" w:lineRule="auto"/>
+      </w:pPr>
+    </w:p>
+    <w:p>
+      <w:pPr>
+        <w:spacing w:after="0" w:line="240" w:lineRule="auto"/>
+      </w:pPr>
+      <w:r>
+        <w:t>) ENGINE=</w:t>
+      </w:r>
+      <w:proofErr w:type="spellStart"/>
+      <w:r>
+        <w:t>InnoDB</w:t>
+      </w:r>
+      <w:proofErr w:type="spellEnd"/>
+      <w:r>
+        <w:t>;</w:t>
+      </w:r>
+    </w:p>
+    <w:p>
+      <w:pPr>
+        <w:spacing w:after="0" w:line="240" w:lineRule="auto"/>
+      </w:pPr>
+    </w:p>
+    <w:p>
+      <w:pPr>
+        <w:spacing w:after="0" w:line="240" w:lineRule="auto"/>
+        <w:rPr>
+          <w:b/>
+          <w:bCs/>
+          <w:u w:val="single"/>
+        </w:rPr>
+      </w:pPr>
+      <w:r>
+        <w:rPr>
+          <w:b/>
+          <w:bCs/>
+          <w:u w:val="single"/>
+        </w:rPr>
+        <w:t>2.Categories</w:t>
+      </w:r>
+    </w:p>
+    <w:p>
+      <w:pPr>
+        <w:spacing w:after="0" w:line="240" w:lineRule="auto"/>
+        <w:rPr>
+          <w:b/>
+          <w:bCs/>
+          <w:u w:val="single"/>
+        </w:rPr>
+      </w:pPr>
+    </w:p>
+    <w:p>
+      <w:pPr>
+        <w:spacing w:after="0" w:line="240" w:lineRule="auto"/>
+      </w:pPr>
+      <w:r>
+        <w:t xml:space="preserve">CREATE TABLE </w:t>
+      </w:r>
+      <w:proofErr w:type="gramStart"/>
+      <w:r>
+        <w:t>categories(</w:t>
+      </w:r>
+      <w:proofErr w:type="gramEnd"/>
+    </w:p>
+    <w:p>
+      <w:pPr>
+        <w:spacing w:after="0" w:line="240" w:lineRule="auto"/>
+      </w:pPr>
+    </w:p>
+    <w:p>
+      <w:pPr>
+        <w:spacing w:after="0" w:line="240" w:lineRule="auto"/>
+      </w:pPr>
+      <w:r>
+        <w:t xml:space="preserve">    id INT PRIMARY KEY AUTO_INCREMENT,</w:t>
+      </w:r>
+    </w:p>
+    <w:p>
+      <w:pPr>
+        <w:spacing w:after="0" w:line="240" w:lineRule="auto"/>
+      </w:pPr>
+    </w:p>
+    <w:p>
+      <w:pPr>
+        <w:spacing w:after="0" w:line="240" w:lineRule="auto"/>
+      </w:pPr>
+      <w:r>
+        <w:t xml:space="preserve">    name </w:t>
+      </w:r>
+      <w:proofErr w:type="gramStart"/>
+      <w:r>
+        <w:t>VARCHAR(</w:t>
+      </w:r>
+      <w:proofErr w:type="gramEnd"/>
+      <w:r>
+        <w:t>100) NOT NULL,</w:t>
+      </w:r>
+    </w:p>
+    <w:p>
+      <w:pPr>
+        <w:spacing w:after="0" w:line="240" w:lineRule="auto"/>
+      </w:pPr>
+    </w:p>
+    <w:p>
+      <w:pPr>
+        <w:spacing w:after="0" w:line="240" w:lineRule="auto"/>
+      </w:pPr>
+      <w:r>
+        <w:t xml:space="preserve">    slug </w:t>
+      </w:r>
+      <w:proofErr w:type="gramStart"/>
+      <w:r>
+        <w:t>VARCHAR(</w:t>
+      </w:r>
+      <w:proofErr w:type="gramEnd"/>
+      <w:r>
+        <w:t>100) UNIQUE NOT NULL,</w:t>
+      </w:r>
+    </w:p>
+    <w:p>
+      <w:pPr>
+        <w:spacing w:after="0" w:line="240" w:lineRule="auto"/>
+      </w:pPr>
+    </w:p>
+    <w:p>
+      <w:pPr>
+        <w:spacing w:after="0" w:line="240" w:lineRule="auto"/>
+      </w:pPr>
+      <w:r>
+        <w:t xml:space="preserve">    description TEXT,</w:t>
+      </w:r>
+    </w:p>
+    <w:p>
+      <w:pPr>
+        <w:spacing w:after="0" w:line="240" w:lineRule="auto"/>
+      </w:pPr>
+    </w:p>
+    <w:p>
+      <w:pPr>
+        <w:spacing w:after="0" w:line="240" w:lineRule="auto"/>
+      </w:pPr>
+      <w:r>
+        <w:t xml:space="preserve">    </w:t>
+      </w:r>
+      <w:proofErr w:type="spellStart"/>
+      <w:r>
+        <w:t>created_by</w:t>
+      </w:r>
+      <w:proofErr w:type="spellEnd"/>
+      <w:r>
+        <w:t xml:space="preserve"> INT</w:t>
+      </w:r>
+    </w:p>
+    <w:p>
+      <w:pPr>
+        <w:spacing w:after="0" w:line="240" w:lineRule="auto"/>
+      </w:pPr>
+    </w:p>
+    <w:p>
+      <w:pPr>
+        <w:spacing w:after="0" w:line="240" w:lineRule="auto"/>
+      </w:pPr>
+      <w:r>
+        <w:t>) ENGINE=</w:t>
+      </w:r>
+      <w:proofErr w:type="spellStart"/>
+      <w:r>
+        <w:t>InnoDB</w:t>
+      </w:r>
+      <w:proofErr w:type="spellEnd"/>
+      <w:r>
+        <w:t>;</w:t>
+      </w:r>
+    </w:p>
+    <w:p>
+      <w:pPr>
+        <w:spacing w:after="0" w:line="240" w:lineRule="auto"/>
+      </w:pPr>
+    </w:p>
+    <w:p>
+      <w:pPr>
+        <w:spacing w:after="0" w:line="240" w:lineRule="auto"/>
+      </w:pPr>
+    </w:p>
+    <w:p>
+      <w:pPr>
+        <w:spacing w:after="0" w:line="240" w:lineRule="auto"/>
+        <w:rPr>
+          <w:b/>
+          <w:bCs/>
+          <w:u w:val="single"/>
+        </w:rPr>
+      </w:pPr>
+      <w:r>
+        <w:rPr>
+          <w:b/>
+          <w:bCs/>
+          <w:u w:val="single"/>
+        </w:rPr>
+        <w:t>3.Series</w:t>
+      </w:r>
+    </w:p>
+    <w:p>
+      <w:pPr>
+        <w:spacing w:after="0" w:line="240" w:lineRule="auto"/>
+        <w:rPr>
+          <w:b/>
+          <w:bCs/>
+          <w:u w:val="single"/>
+        </w:rPr>
+      </w:pPr>
+    </w:p>
+    <w:p>
+      <w:pPr>
+        <w:spacing w:after="0" w:line="240" w:lineRule="auto"/>
+        <w:rPr>
+          <w:b/>
+          <w:bCs/>
+          <w:u w:val="single"/>
+        </w:rPr>
+      </w:pPr>
+    </w:p>
+    <w:p>
+      <w:pPr>
+        <w:spacing w:after="0" w:line="240" w:lineRule="auto"/>
+      </w:pPr>
+      <w:r>
+        <w:t xml:space="preserve">CREATE TABLE </w:t>
+      </w:r>
+      <w:proofErr w:type="gramStart"/>
+      <w:r>
+        <w:t>series(</w:t>
+      </w:r>
+      <w:proofErr w:type="gramEnd"/>
+    </w:p>
+    <w:p>
+      <w:pPr>
+        <w:spacing w:after="0" w:line="240" w:lineRule="auto"/>
+      </w:pPr>
+    </w:p>
+    <w:p>
+      <w:pPr>
+        <w:spacing w:after="0" w:line="240" w:lineRule="auto"/>
+      </w:pPr>
+      <w:r>
+        <w:t xml:space="preserve">    id INT PRIMARY KEY AUTO_INCREMENT,</w:t>
+      </w:r>
+    </w:p>
+    <w:p>
+      <w:pPr>
+        <w:spacing w:after="0" w:line="240" w:lineRule="auto"/>
+      </w:pPr>
+    </w:p>
+    <w:p>
+      <w:pPr>
+        <w:spacing w:after="0" w:line="240" w:lineRule="auto"/>
+      </w:pPr>
+      <w:r>
+        <w:t xml:space="preserve">    </w:t>
       </w:r>
       <w:proofErr w:type="spellStart"/>
       <w:r>
@@ -24,7 +617,247 @@
       </w:r>
       <w:proofErr w:type="spellEnd"/>
       <w:r>
-        <w:t xml:space="preserve"> INT NOT NULL, </w:t>
+        <w:t xml:space="preserve"> INT NOT NULL,</w:t>
+      </w:r>
+    </w:p>
+    <w:p>
+      <w:pPr>
+        <w:spacing w:after="0" w:line="240" w:lineRule="auto"/>
+      </w:pPr>
+    </w:p>
+    <w:p>
+      <w:pPr>
+        <w:spacing w:after="0" w:line="240" w:lineRule="auto"/>
+      </w:pPr>
+      <w:r>
+        <w:t xml:space="preserve">    title </w:t>
+      </w:r>
+      <w:proofErr w:type="gramStart"/>
+      <w:r>
+        <w:t>VARCHAR(</w:t>
+      </w:r>
+      <w:proofErr w:type="gramEnd"/>
+      <w:r>
+        <w:t>255) NOT NULL,</w:t>
+      </w:r>
+    </w:p>
+    <w:p>
+      <w:pPr>
+        <w:spacing w:after="0" w:line="240" w:lineRule="auto"/>
+      </w:pPr>
+    </w:p>
+    <w:p>
+      <w:pPr>
+        <w:spacing w:after="0" w:line="240" w:lineRule="auto"/>
+      </w:pPr>
+      <w:r>
+        <w:t xml:space="preserve">    description TEXT,</w:t>
+      </w:r>
+    </w:p>
+    <w:p>
+      <w:pPr>
+        <w:spacing w:after="0" w:line="240" w:lineRule="auto"/>
+      </w:pPr>
+    </w:p>
+    <w:p>
+      <w:pPr>
+        <w:spacing w:after="0" w:line="240" w:lineRule="auto"/>
+      </w:pPr>
+      <w:r>
+        <w:t xml:space="preserve">    </w:t>
+      </w:r>
+      <w:proofErr w:type="spellStart"/>
+      <w:r>
+        <w:t>cover_image_path</w:t>
+      </w:r>
+      <w:proofErr w:type="spellEnd"/>
+      <w:r>
+        <w:t xml:space="preserve"> </w:t>
+      </w:r>
+      <w:proofErr w:type="gramStart"/>
+      <w:r>
+        <w:t>VARCHAR(</w:t>
+      </w:r>
+      <w:proofErr w:type="gramEnd"/>
+      <w:r>
+        <w:t>255),</w:t>
+      </w:r>
+    </w:p>
+    <w:p>
+      <w:pPr>
+        <w:spacing w:after="0" w:line="240" w:lineRule="auto"/>
+      </w:pPr>
+    </w:p>
+    <w:p>
+      <w:pPr>
+        <w:spacing w:after="0" w:line="240" w:lineRule="auto"/>
+      </w:pPr>
+      <w:r>
+        <w:t xml:space="preserve">    </w:t>
+      </w:r>
+      <w:proofErr w:type="spellStart"/>
+      <w:r>
+        <w:t>created_at</w:t>
+      </w:r>
+      <w:proofErr w:type="spellEnd"/>
+      <w:r>
+        <w:t xml:space="preserve"> TIMESTAMP DEFAULT CURRENT_TIMESTAMP,</w:t>
+      </w:r>
+    </w:p>
+    <w:p>
+      <w:pPr>
+        <w:spacing w:after="0" w:line="240" w:lineRule="auto"/>
+      </w:pPr>
+    </w:p>
+    <w:p>
+      <w:pPr>
+        <w:spacing w:after="0" w:line="240" w:lineRule="auto"/>
+      </w:pPr>
+      <w:r>
+        <w:t xml:space="preserve">    FOREIGN </w:t>
+      </w:r>
+      <w:proofErr w:type="gramStart"/>
+      <w:r>
+        <w:t>KEY(</w:t>
+      </w:r>
+      <w:proofErr w:type="spellStart"/>
+      <w:proofErr w:type="gramEnd"/>
+      <w:r>
+        <w:t>author_id</w:t>
+      </w:r>
+      <w:proofErr w:type="spellEnd"/>
+      <w:r>
+        <w:t>)</w:t>
+      </w:r>
+    </w:p>
+    <w:p>
+      <w:pPr>
+        <w:spacing w:after="0" w:line="240" w:lineRule="auto"/>
+      </w:pPr>
+      <w:r>
+        <w:t xml:space="preserve">    REFERENCES users(id)</w:t>
+      </w:r>
+    </w:p>
+    <w:p>
+      <w:pPr>
+        <w:spacing w:after="0" w:line="240" w:lineRule="auto"/>
+      </w:pPr>
+      <w:r>
+        <w:t xml:space="preserve">    ON DELETE CASCADE</w:t>
+      </w:r>
+    </w:p>
+    <w:p>
+      <w:pPr>
+        <w:spacing w:after="0" w:line="240" w:lineRule="auto"/>
+      </w:pPr>
+    </w:p>
+    <w:p>
+      <w:pPr>
+        <w:spacing w:after="0" w:line="240" w:lineRule="auto"/>
+      </w:pPr>
+      <w:r>
+        <w:t>) ENGINE=</w:t>
+      </w:r>
+      <w:proofErr w:type="spellStart"/>
+      <w:r>
+        <w:t>InnoDB</w:t>
+      </w:r>
+      <w:proofErr w:type="spellEnd"/>
+      <w:r>
+        <w:t>;</w:t>
+      </w:r>
+    </w:p>
+    <w:p>
+      <w:pPr>
+        <w:spacing w:after="0" w:line="240" w:lineRule="auto"/>
+      </w:pPr>
+    </w:p>
+    <w:p>
+      <w:pPr>
+        <w:spacing w:after="0" w:line="240" w:lineRule="auto"/>
+      </w:pPr>
+    </w:p>
+    <w:p>
+      <w:pPr>
+        <w:spacing w:after="0" w:line="240" w:lineRule="auto"/>
+        <w:rPr>
+          <w:b/>
+          <w:bCs/>
+          <w:u w:val="single"/>
+        </w:rPr>
+      </w:pPr>
+      <w:r>
+        <w:rPr>
+          <w:b/>
+          <w:bCs/>
+          <w:u w:val="single"/>
+        </w:rPr>
+        <w:t>4.Articles</w:t>
+      </w:r>
+    </w:p>
+    <w:p>
+      <w:pPr>
+        <w:spacing w:after="0" w:line="240" w:lineRule="auto"/>
+      </w:pPr>
+    </w:p>
+    <w:p>
+      <w:pPr>
+        <w:spacing w:after="0" w:line="240" w:lineRule="auto"/>
+      </w:pPr>
+      <w:r>
+        <w:t xml:space="preserve">CREATE TABLE </w:t>
+      </w:r>
+      <w:proofErr w:type="gramStart"/>
+      <w:r>
+        <w:t>articles(</w:t>
+      </w:r>
+      <w:proofErr w:type="gramEnd"/>
+    </w:p>
+    <w:p>
+      <w:pPr>
+        <w:spacing w:after="0" w:line="240" w:lineRule="auto"/>
+      </w:pPr>
+    </w:p>
+    <w:p>
+      <w:pPr>
+        <w:spacing w:after="0" w:line="240" w:lineRule="auto"/>
+      </w:pPr>
+      <w:r>
+        <w:t xml:space="preserve">    id INT PRIMARY KEY AUTO_INCREMENT,</w:t>
+      </w:r>
+    </w:p>
+    <w:p>
+      <w:pPr>
+        <w:spacing w:after="0" w:line="240" w:lineRule="auto"/>
+      </w:pPr>
+    </w:p>
+    <w:p>
+      <w:pPr>
+        <w:spacing w:after="0" w:line="240" w:lineRule="auto"/>
+      </w:pPr>
+      <w:r>
+        <w:t xml:space="preserve">    </w:t>
+      </w:r>
+      <w:proofErr w:type="spellStart"/>
+      <w:r>
+        <w:t>author_id</w:t>
+      </w:r>
+      <w:proofErr w:type="spellEnd"/>
+      <w:r>
+        <w:t xml:space="preserve"> INT NOT NULL,</w:t>
+      </w:r>
+    </w:p>
+    <w:p>
+      <w:pPr>
+        <w:spacing w:after="0" w:line="240" w:lineRule="auto"/>
+      </w:pPr>
+    </w:p>
+    <w:p>
+      <w:pPr>
+        <w:spacing w:after="0" w:line="240" w:lineRule="auto"/>
+      </w:pPr>
+      <w:r>
+        <w:t xml:space="preserve">    </w:t>
       </w:r>
       <w:proofErr w:type="spellStart"/>
       <w:r>
@@ -32,7 +865,20 @@
       </w:r>
       <w:proofErr w:type="spellEnd"/>
       <w:r>
-        <w:t xml:space="preserve"> INT NULL, </w:t>
+        <w:t xml:space="preserve"> INT NULL,</w:t>
+      </w:r>
+    </w:p>
+    <w:p>
+      <w:pPr>
+        <w:spacing w:after="0" w:line="240" w:lineRule="auto"/>
+      </w:pPr>
+    </w:p>
+    <w:p>
+      <w:pPr>
+        <w:spacing w:after="0" w:line="240" w:lineRule="auto"/>
+      </w:pPr>
+      <w:r>
+        <w:t xml:space="preserve">    </w:t>
       </w:r>
       <w:proofErr w:type="spellStart"/>
       <w:r>
@@ -40,7 +886,21 @@
       </w:r>
       <w:proofErr w:type="spellEnd"/>
       <w:r>
-        <w:t xml:space="preserve"> INT NOT NULL, </w:t>
+        <w:t xml:space="preserve"> INT NOT NULL,</w:t>
+      </w:r>
+    </w:p>
+    <w:p>
+      <w:pPr>
+        <w:spacing w:after="0" w:line="240" w:lineRule="auto"/>
+      </w:pPr>
+    </w:p>
+    <w:p>
+      <w:pPr>
+        <w:spacing w:after="0" w:line="240" w:lineRule="auto"/>
+      </w:pPr>
+      <w:r>
+        <w:lastRenderedPageBreak/>
+        <w:t xml:space="preserve">    </w:t>
       </w:r>
       <w:proofErr w:type="spellStart"/>
       <w:r>
@@ -48,7 +908,88 @@
       </w:r>
       <w:proofErr w:type="spellEnd"/>
       <w:r>
-        <w:t xml:space="preserve"> INT NULL, title VARCHAR(255) NOT NULL, slug VARCHAR(255) UNIQUE NOT NULL, body LONGTEXT NOT NULL, excerpt TEXT, </w:t>
+        <w:t xml:space="preserve"> INT NULL,</w:t>
+      </w:r>
+    </w:p>
+    <w:p>
+      <w:pPr>
+        <w:spacing w:after="0" w:line="240" w:lineRule="auto"/>
+      </w:pPr>
+    </w:p>
+    <w:p>
+      <w:pPr>
+        <w:spacing w:after="0" w:line="240" w:lineRule="auto"/>
+      </w:pPr>
+      <w:r>
+        <w:t xml:space="preserve">    title </w:t>
+      </w:r>
+      <w:proofErr w:type="gramStart"/>
+      <w:r>
+        <w:t>VARCHAR(</w:t>
+      </w:r>
+      <w:proofErr w:type="gramEnd"/>
+      <w:r>
+        <w:t>255) NOT NULL,</w:t>
+      </w:r>
+    </w:p>
+    <w:p>
+      <w:pPr>
+        <w:spacing w:after="0" w:line="240" w:lineRule="auto"/>
+      </w:pPr>
+    </w:p>
+    <w:p>
+      <w:pPr>
+        <w:spacing w:after="0" w:line="240" w:lineRule="auto"/>
+      </w:pPr>
+      <w:r>
+        <w:t xml:space="preserve">    slug </w:t>
+      </w:r>
+      <w:proofErr w:type="gramStart"/>
+      <w:r>
+        <w:t>VARCHAR(</w:t>
+      </w:r>
+      <w:proofErr w:type="gramEnd"/>
+      <w:r>
+        <w:t>255) UNIQUE NOT NULL,</w:t>
+      </w:r>
+    </w:p>
+    <w:p>
+      <w:pPr>
+        <w:spacing w:after="0" w:line="240" w:lineRule="auto"/>
+      </w:pPr>
+    </w:p>
+    <w:p>
+      <w:pPr>
+        <w:spacing w:after="0" w:line="240" w:lineRule="auto"/>
+      </w:pPr>
+      <w:r>
+        <w:t xml:space="preserve">    body LONGTEXT NOT NULL,</w:t>
+      </w:r>
+    </w:p>
+    <w:p>
+      <w:pPr>
+        <w:spacing w:after="0" w:line="240" w:lineRule="auto"/>
+      </w:pPr>
+    </w:p>
+    <w:p>
+      <w:pPr>
+        <w:spacing w:after="0" w:line="240" w:lineRule="auto"/>
+      </w:pPr>
+      <w:r>
+        <w:t xml:space="preserve">    excerpt TEXT,</w:t>
+      </w:r>
+    </w:p>
+    <w:p>
+      <w:pPr>
+        <w:spacing w:after="0" w:line="240" w:lineRule="auto"/>
+      </w:pPr>
+    </w:p>
+    <w:p>
+      <w:pPr>
+        <w:spacing w:after="0" w:line="240" w:lineRule="auto"/>
+      </w:pPr>
+      <w:r>
+        <w:t xml:space="preserve">    </w:t>
       </w:r>
       <w:proofErr w:type="spellStart"/>
       <w:r>
@@ -56,15 +997,115 @@
       </w:r>
       <w:proofErr w:type="spellEnd"/>
       <w:r>
-        <w:t xml:space="preserve"> VARCHAR(255), status ENUM( 'draft', 'submitted', '</w:t>
-      </w:r>
-      <w:proofErr w:type="spellStart"/>
-      <w:r>
-        <w:t>revision_requested</w:t>
-      </w:r>
-      <w:proofErr w:type="spellEnd"/>
-      <w:r>
-        <w:t xml:space="preserve">', 'approved', 'published', 'unpublished' ) DEFAULT 'draft', </w:t>
+        <w:t xml:space="preserve"> </w:t>
+      </w:r>
+      <w:proofErr w:type="gramStart"/>
+      <w:r>
+        <w:t>VARCHAR(</w:t>
+      </w:r>
+      <w:proofErr w:type="gramEnd"/>
+      <w:r>
+        <w:t>255),</w:t>
+      </w:r>
+    </w:p>
+    <w:p>
+      <w:pPr>
+        <w:spacing w:after="0" w:line="240" w:lineRule="auto"/>
+      </w:pPr>
+    </w:p>
+    <w:p>
+      <w:pPr>
+        <w:spacing w:after="0" w:line="240" w:lineRule="auto"/>
+      </w:pPr>
+      <w:r>
+        <w:t xml:space="preserve">    status </w:t>
+      </w:r>
+      <w:proofErr w:type="gramStart"/>
+      <w:r>
+        <w:t>ENUM(</w:t>
+      </w:r>
+      <w:proofErr w:type="gramEnd"/>
+    </w:p>
+    <w:p>
+      <w:pPr>
+        <w:spacing w:after="0" w:line="240" w:lineRule="auto"/>
+      </w:pPr>
+      <w:r>
+        <w:t xml:space="preserve">        'draft',</w:t>
+      </w:r>
+    </w:p>
+    <w:p>
+      <w:pPr>
+        <w:spacing w:after="0" w:line="240" w:lineRule="auto"/>
+      </w:pPr>
+      <w:r>
+        <w:t xml:space="preserve">        'submitted',</w:t>
+      </w:r>
+    </w:p>
+    <w:p>
+      <w:pPr>
+        <w:spacing w:after="0" w:line="240" w:lineRule="auto"/>
+      </w:pPr>
+      <w:r>
+        <w:t xml:space="preserve">        '</w:t>
+      </w:r>
+      <w:proofErr w:type="spellStart"/>
+      <w:proofErr w:type="gramStart"/>
+      <w:r>
+        <w:t>revision</w:t>
+      </w:r>
+      <w:proofErr w:type="gramEnd"/>
+      <w:r>
+        <w:t>_requested</w:t>
+      </w:r>
+      <w:proofErr w:type="spellEnd"/>
+      <w:r>
+        <w:t>',</w:t>
+      </w:r>
+    </w:p>
+    <w:p>
+      <w:pPr>
+        <w:spacing w:after="0" w:line="240" w:lineRule="auto"/>
+      </w:pPr>
+      <w:r>
+        <w:t xml:space="preserve">        'approved',</w:t>
+      </w:r>
+    </w:p>
+    <w:p>
+      <w:pPr>
+        <w:spacing w:after="0" w:line="240" w:lineRule="auto"/>
+      </w:pPr>
+      <w:r>
+        <w:t xml:space="preserve">        'published',</w:t>
+      </w:r>
+    </w:p>
+    <w:p>
+      <w:pPr>
+        <w:spacing w:after="0" w:line="240" w:lineRule="auto"/>
+      </w:pPr>
+      <w:r>
+        <w:t xml:space="preserve">        'unpublished'</w:t>
+      </w:r>
+    </w:p>
+    <w:p>
+      <w:pPr>
+        <w:spacing w:after="0" w:line="240" w:lineRule="auto"/>
+      </w:pPr>
+      <w:r>
+        <w:t xml:space="preserve">    ) DEFAULT 'draft',</w:t>
+      </w:r>
+    </w:p>
+    <w:p>
+      <w:pPr>
+        <w:spacing w:after="0" w:line="240" w:lineRule="auto"/>
+      </w:pPr>
+    </w:p>
+    <w:p>
+      <w:pPr>
+        <w:spacing w:after="0" w:line="240" w:lineRule="auto"/>
+      </w:pPr>
+      <w:r>
+        <w:t xml:space="preserve">    </w:t>
       </w:r>
       <w:proofErr w:type="spellStart"/>
       <w:r>
@@ -72,7 +1113,20 @@
       </w:r>
       <w:proofErr w:type="spellEnd"/>
       <w:r>
-        <w:t xml:space="preserve"> TEXT, </w:t>
+        <w:t xml:space="preserve"> TEXT,</w:t>
+      </w:r>
+    </w:p>
+    <w:p>
+      <w:pPr>
+        <w:spacing w:after="0" w:line="240" w:lineRule="auto"/>
+      </w:pPr>
+    </w:p>
+    <w:p>
+      <w:pPr>
+        <w:spacing w:after="0" w:line="240" w:lineRule="auto"/>
+      </w:pPr>
+      <w:r>
+        <w:t xml:space="preserve">    </w:t>
       </w:r>
       <w:proofErr w:type="spellStart"/>
       <w:r>
@@ -80,7 +1134,20 @@
       </w:r>
       <w:proofErr w:type="spellEnd"/>
       <w:r>
-        <w:t xml:space="preserve"> DATETIME NULL, </w:t>
+        <w:t xml:space="preserve"> DATETIME NULL,</w:t>
+      </w:r>
+    </w:p>
+    <w:p>
+      <w:pPr>
+        <w:spacing w:after="0" w:line="240" w:lineRule="auto"/>
+      </w:pPr>
+    </w:p>
+    <w:p>
+      <w:pPr>
+        <w:spacing w:after="0" w:line="240" w:lineRule="auto"/>
+      </w:pPr>
+      <w:r>
+        <w:t xml:space="preserve">    </w:t>
       </w:r>
       <w:proofErr w:type="spellStart"/>
       <w:r>
@@ -88,7 +1155,20 @@
       </w:r>
       <w:proofErr w:type="spellEnd"/>
       <w:r>
-        <w:t xml:space="preserve"> DATETIME NULL, </w:t>
+        <w:t xml:space="preserve"> DATETIME NULL,</w:t>
+      </w:r>
+    </w:p>
+    <w:p>
+      <w:pPr>
+        <w:spacing w:after="0" w:line="240" w:lineRule="auto"/>
+      </w:pPr>
+    </w:p>
+    <w:p>
+      <w:pPr>
+        <w:spacing w:after="0" w:line="240" w:lineRule="auto"/>
+      </w:pPr>
+      <w:r>
+        <w:t xml:space="preserve">    </w:t>
       </w:r>
       <w:proofErr w:type="spellStart"/>
       <w:r>
@@ -96,7 +1176,20 @@
       </w:r>
       <w:proofErr w:type="spellEnd"/>
       <w:r>
-        <w:t xml:space="preserve"> INT DEFAULT 0, </w:t>
+        <w:t xml:space="preserve"> INT DEFAULT 0,</w:t>
+      </w:r>
+    </w:p>
+    <w:p>
+      <w:pPr>
+        <w:spacing w:after="0" w:line="240" w:lineRule="auto"/>
+      </w:pPr>
+    </w:p>
+    <w:p>
+      <w:pPr>
+        <w:spacing w:after="0" w:line="240" w:lineRule="auto"/>
+      </w:pPr>
+      <w:r>
+        <w:t xml:space="preserve">    </w:t>
       </w:r>
       <w:proofErr w:type="spellStart"/>
       <w:r>
@@ -104,7 +1197,20 @@
       </w:r>
       <w:proofErr w:type="spellEnd"/>
       <w:r>
-        <w:t xml:space="preserve"> TIMESTAMP DEFAULT CURRENT_TIMESTAMP, </w:t>
+        <w:t xml:space="preserve"> TIMESTAMP DEFAULT CURRENT_TIMESTAMP,</w:t>
+      </w:r>
+    </w:p>
+    <w:p>
+      <w:pPr>
+        <w:spacing w:after="0" w:line="240" w:lineRule="auto"/>
+      </w:pPr>
+    </w:p>
+    <w:p>
+      <w:pPr>
+        <w:spacing w:after="0" w:line="240" w:lineRule="auto"/>
+      </w:pPr>
+      <w:r>
+        <w:t xml:space="preserve">    </w:t>
       </w:r>
       <w:proofErr w:type="spellStart"/>
       <w:r>
@@ -112,8 +1218,1372 @@
       </w:r>
       <w:proofErr w:type="spellEnd"/>
       <w:r>
-        <w:t xml:space="preserve"> TIMESTAMP DEFAULT CURRENT_TIMESTAMP ON UPDATE CURRENT_TIMESTAMP );</w:t>
-      </w:r>
+        <w:t xml:space="preserve"> TIMESTAMP DEFAULT CURRENT_TIMESTAMP</w:t>
+      </w:r>
+    </w:p>
+    <w:p>
+      <w:pPr>
+        <w:spacing w:after="0" w:line="240" w:lineRule="auto"/>
+      </w:pPr>
+      <w:r>
+        <w:t xml:space="preserve">    ON UPDATE CURRENT_TIMESTAMP,</w:t>
+      </w:r>
+    </w:p>
+    <w:p>
+      <w:pPr>
+        <w:spacing w:after="0" w:line="240" w:lineRule="auto"/>
+      </w:pPr>
+    </w:p>
+    <w:p>
+      <w:pPr>
+        <w:spacing w:after="0" w:line="240" w:lineRule="auto"/>
+      </w:pPr>
+      <w:r>
+        <w:t xml:space="preserve">    FOREIGN </w:t>
+      </w:r>
+      <w:proofErr w:type="gramStart"/>
+      <w:r>
+        <w:t>KEY(</w:t>
+      </w:r>
+      <w:proofErr w:type="spellStart"/>
+      <w:proofErr w:type="gramEnd"/>
+      <w:r>
+        <w:t>author_id</w:t>
+      </w:r>
+      <w:proofErr w:type="spellEnd"/>
+      <w:r>
+        <w:t>)</w:t>
+      </w:r>
+    </w:p>
+    <w:p>
+      <w:pPr>
+        <w:spacing w:after="0" w:line="240" w:lineRule="auto"/>
+      </w:pPr>
+      <w:r>
+        <w:t xml:space="preserve">    REFERENCES users(id)</w:t>
+      </w:r>
+    </w:p>
+    <w:p>
+      <w:pPr>
+        <w:spacing w:after="0" w:line="240" w:lineRule="auto"/>
+      </w:pPr>
+      <w:r>
+        <w:t xml:space="preserve">    ON DELETE CASCADE,</w:t>
+      </w:r>
+    </w:p>
+    <w:p>
+      <w:pPr>
+        <w:spacing w:after="0" w:line="240" w:lineRule="auto"/>
+      </w:pPr>
+    </w:p>
+    <w:p>
+      <w:pPr>
+        <w:spacing w:after="0" w:line="240" w:lineRule="auto"/>
+      </w:pPr>
+      <w:r>
+        <w:t xml:space="preserve">    FOREIGN </w:t>
+      </w:r>
+      <w:proofErr w:type="gramStart"/>
+      <w:r>
+        <w:t>KEY(</w:t>
+      </w:r>
+      <w:proofErr w:type="spellStart"/>
+      <w:proofErr w:type="gramEnd"/>
+      <w:r>
+        <w:t>editor_id</w:t>
+      </w:r>
+      <w:proofErr w:type="spellEnd"/>
+      <w:r>
+        <w:t>)</w:t>
+      </w:r>
+    </w:p>
+    <w:p>
+      <w:pPr>
+        <w:spacing w:after="0" w:line="240" w:lineRule="auto"/>
+      </w:pPr>
+      <w:r>
+        <w:t xml:space="preserve">    REFERENCES users(id)</w:t>
+      </w:r>
+    </w:p>
+    <w:p>
+      <w:pPr>
+        <w:spacing w:after="0" w:line="240" w:lineRule="auto"/>
+      </w:pPr>
+      <w:r>
+        <w:t xml:space="preserve">    ON DELETE SET NULL,</w:t>
+      </w:r>
+    </w:p>
+    <w:p>
+      <w:pPr>
+        <w:spacing w:after="0" w:line="240" w:lineRule="auto"/>
+      </w:pPr>
+    </w:p>
+    <w:p>
+      <w:pPr>
+        <w:spacing w:after="0" w:line="240" w:lineRule="auto"/>
+      </w:pPr>
+      <w:r>
+        <w:t xml:space="preserve">    FOREIGN </w:t>
+      </w:r>
+      <w:proofErr w:type="gramStart"/>
+      <w:r>
+        <w:t>KEY(</w:t>
+      </w:r>
+      <w:proofErr w:type="spellStart"/>
+      <w:proofErr w:type="gramEnd"/>
+      <w:r>
+        <w:t>category_id</w:t>
+      </w:r>
+      <w:proofErr w:type="spellEnd"/>
+      <w:r>
+        <w:t>)</w:t>
+      </w:r>
+    </w:p>
+    <w:p>
+      <w:pPr>
+        <w:spacing w:after="0" w:line="240" w:lineRule="auto"/>
+      </w:pPr>
+      <w:r>
+        <w:t xml:space="preserve">    REFERENCES categories(id)</w:t>
+      </w:r>
+    </w:p>
+    <w:p>
+      <w:pPr>
+        <w:spacing w:after="0" w:line="240" w:lineRule="auto"/>
+      </w:pPr>
+      <w:r>
+        <w:lastRenderedPageBreak/>
+        <w:t xml:space="preserve">    ON DELETE CASCADE,</w:t>
+      </w:r>
+    </w:p>
+    <w:p>
+      <w:pPr>
+        <w:spacing w:after="0" w:line="240" w:lineRule="auto"/>
+      </w:pPr>
+    </w:p>
+    <w:p>
+      <w:pPr>
+        <w:spacing w:after="0" w:line="240" w:lineRule="auto"/>
+      </w:pPr>
+      <w:r>
+        <w:t xml:space="preserve">    FOREIGN </w:t>
+      </w:r>
+      <w:proofErr w:type="gramStart"/>
+      <w:r>
+        <w:t>KEY(</w:t>
+      </w:r>
+      <w:proofErr w:type="spellStart"/>
+      <w:proofErr w:type="gramEnd"/>
+      <w:r>
+        <w:t>series_id</w:t>
+      </w:r>
+      <w:proofErr w:type="spellEnd"/>
+      <w:r>
+        <w:t>)</w:t>
+      </w:r>
+    </w:p>
+    <w:p>
+      <w:pPr>
+        <w:spacing w:after="0" w:line="240" w:lineRule="auto"/>
+      </w:pPr>
+      <w:r>
+        <w:t xml:space="preserve">    REFERENCES series(id)</w:t>
+      </w:r>
+    </w:p>
+    <w:p>
+      <w:pPr>
+        <w:spacing w:after="0" w:line="240" w:lineRule="auto"/>
+      </w:pPr>
+      <w:r>
+        <w:t xml:space="preserve">    ON DELETE SET NULL</w:t>
+      </w:r>
+    </w:p>
+    <w:p>
+      <w:pPr>
+        <w:spacing w:after="0" w:line="240" w:lineRule="auto"/>
+      </w:pPr>
+    </w:p>
+    <w:p>
+      <w:pPr>
+        <w:spacing w:after="0" w:line="240" w:lineRule="auto"/>
+      </w:pPr>
+      <w:r>
+        <w:t>) ENGINE=</w:t>
+      </w:r>
+      <w:proofErr w:type="spellStart"/>
+      <w:r>
+        <w:t>InnoDB</w:t>
+      </w:r>
+      <w:proofErr w:type="spellEnd"/>
+      <w:r>
+        <w:t>;</w:t>
+      </w:r>
+    </w:p>
+    <w:p>
+      <w:pPr>
+        <w:spacing w:after="0" w:line="240" w:lineRule="auto"/>
+      </w:pPr>
+    </w:p>
+    <w:p>
+      <w:pPr>
+        <w:spacing w:after="0" w:line="240" w:lineRule="auto"/>
+        <w:rPr>
+          <w:b/>
+          <w:bCs/>
+          <w:u w:val="single"/>
+        </w:rPr>
+      </w:pPr>
+      <w:r>
+        <w:rPr>
+          <w:b/>
+          <w:bCs/>
+          <w:u w:val="single"/>
+        </w:rPr>
+        <w:t xml:space="preserve">5. </w:t>
+      </w:r>
+      <w:proofErr w:type="spellStart"/>
+      <w:r>
+        <w:rPr>
+          <w:b/>
+          <w:bCs/>
+          <w:u w:val="single"/>
+        </w:rPr>
+        <w:t>Aricle</w:t>
+      </w:r>
+      <w:proofErr w:type="spellEnd"/>
+      <w:r>
+        <w:rPr>
+          <w:b/>
+          <w:bCs/>
+          <w:u w:val="single"/>
+        </w:rPr>
+        <w:t xml:space="preserve"> Revision</w:t>
+      </w:r>
+    </w:p>
+    <w:p>
+      <w:pPr>
+        <w:spacing w:after="0" w:line="240" w:lineRule="auto"/>
+        <w:rPr>
+          <w:b/>
+          <w:bCs/>
+          <w:u w:val="single"/>
+        </w:rPr>
+      </w:pPr>
+    </w:p>
+    <w:p>
+      <w:pPr>
+        <w:spacing w:after="0" w:line="240" w:lineRule="auto"/>
+        <w:rPr>
+          <w:u w:val="single"/>
+        </w:rPr>
+      </w:pPr>
+      <w:r>
+        <w:rPr>
+          <w:u w:val="single"/>
+        </w:rPr>
+        <w:t xml:space="preserve">CREATE TABLE </w:t>
+      </w:r>
+      <w:proofErr w:type="spellStart"/>
+      <w:r>
+        <w:rPr>
+          <w:u w:val="single"/>
+        </w:rPr>
+        <w:t>article_</w:t>
+      </w:r>
+      <w:proofErr w:type="gramStart"/>
+      <w:r>
+        <w:rPr>
+          <w:u w:val="single"/>
+        </w:rPr>
+        <w:t>revisions</w:t>
+      </w:r>
+      <w:proofErr w:type="spellEnd"/>
+      <w:r>
+        <w:rPr>
+          <w:u w:val="single"/>
+        </w:rPr>
+        <w:t>(</w:t>
+      </w:r>
+      <w:proofErr w:type="gramEnd"/>
+    </w:p>
+    <w:p>
+      <w:pPr>
+        <w:spacing w:after="0" w:line="240" w:lineRule="auto"/>
+        <w:rPr>
+          <w:u w:val="single"/>
+        </w:rPr>
+      </w:pPr>
+    </w:p>
+    <w:p>
+      <w:pPr>
+        <w:spacing w:after="0" w:line="240" w:lineRule="auto"/>
+        <w:rPr>
+          <w:u w:val="single"/>
+        </w:rPr>
+      </w:pPr>
+      <w:r>
+        <w:rPr>
+          <w:u w:val="single"/>
+        </w:rPr>
+        <w:t xml:space="preserve">    id INT PRIMARY KEY AUTO_INCREMENT,</w:t>
+      </w:r>
+    </w:p>
+    <w:p>
+      <w:pPr>
+        <w:spacing w:after="0" w:line="240" w:lineRule="auto"/>
+        <w:rPr>
+          <w:u w:val="single"/>
+        </w:rPr>
+      </w:pPr>
+    </w:p>
+    <w:p>
+      <w:pPr>
+        <w:spacing w:after="0" w:line="240" w:lineRule="auto"/>
+        <w:rPr>
+          <w:u w:val="single"/>
+        </w:rPr>
+      </w:pPr>
+      <w:r>
+        <w:rPr>
+          <w:u w:val="single"/>
+        </w:rPr>
+        <w:t xml:space="preserve">    </w:t>
+      </w:r>
+      <w:proofErr w:type="spellStart"/>
+      <w:r>
+        <w:rPr>
+          <w:u w:val="single"/>
+        </w:rPr>
+        <w:t>article_id</w:t>
+      </w:r>
+      <w:proofErr w:type="spellEnd"/>
+      <w:r>
+        <w:rPr>
+          <w:u w:val="single"/>
+        </w:rPr>
+        <w:t xml:space="preserve"> INT NOT NULL,</w:t>
+      </w:r>
+    </w:p>
+    <w:p>
+      <w:pPr>
+        <w:spacing w:after="0" w:line="240" w:lineRule="auto"/>
+        <w:rPr>
+          <w:u w:val="single"/>
+        </w:rPr>
+      </w:pPr>
+    </w:p>
+    <w:p>
+      <w:pPr>
+        <w:spacing w:after="0" w:line="240" w:lineRule="auto"/>
+        <w:rPr>
+          <w:u w:val="single"/>
+        </w:rPr>
+      </w:pPr>
+      <w:r>
+        <w:rPr>
+          <w:u w:val="single"/>
+        </w:rPr>
+        <w:t xml:space="preserve">    </w:t>
+      </w:r>
+      <w:proofErr w:type="spellStart"/>
+      <w:r>
+        <w:rPr>
+          <w:u w:val="single"/>
+        </w:rPr>
+        <w:t>author_id</w:t>
+      </w:r>
+      <w:proofErr w:type="spellEnd"/>
+      <w:r>
+        <w:rPr>
+          <w:u w:val="single"/>
+        </w:rPr>
+        <w:t xml:space="preserve"> INT NOT NULL,</w:t>
+      </w:r>
+    </w:p>
+    <w:p>
+      <w:pPr>
+        <w:spacing w:after="0" w:line="240" w:lineRule="auto"/>
+        <w:rPr>
+          <w:u w:val="single"/>
+        </w:rPr>
+      </w:pPr>
+    </w:p>
+    <w:p>
+      <w:pPr>
+        <w:spacing w:after="0" w:line="240" w:lineRule="auto"/>
+        <w:rPr>
+          <w:u w:val="single"/>
+        </w:rPr>
+      </w:pPr>
+      <w:r>
+        <w:rPr>
+          <w:u w:val="single"/>
+        </w:rPr>
+        <w:t xml:space="preserve">    </w:t>
+      </w:r>
+      <w:proofErr w:type="spellStart"/>
+      <w:r>
+        <w:rPr>
+          <w:u w:val="single"/>
+        </w:rPr>
+        <w:t>body_snapshot</w:t>
+      </w:r>
+      <w:proofErr w:type="spellEnd"/>
+      <w:r>
+        <w:rPr>
+          <w:u w:val="single"/>
+        </w:rPr>
+        <w:t xml:space="preserve"> LONGTEXT,</w:t>
+      </w:r>
+    </w:p>
+    <w:p>
+      <w:pPr>
+        <w:spacing w:after="0" w:line="240" w:lineRule="auto"/>
+        <w:rPr>
+          <w:u w:val="single"/>
+        </w:rPr>
+      </w:pPr>
+    </w:p>
+    <w:p>
+      <w:pPr>
+        <w:spacing w:after="0" w:line="240" w:lineRule="auto"/>
+        <w:rPr>
+          <w:u w:val="single"/>
+        </w:rPr>
+      </w:pPr>
+      <w:r>
+        <w:rPr>
+          <w:u w:val="single"/>
+        </w:rPr>
+        <w:t xml:space="preserve">    </w:t>
+      </w:r>
+      <w:proofErr w:type="spellStart"/>
+      <w:r>
+        <w:rPr>
+          <w:u w:val="single"/>
+        </w:rPr>
+        <w:t>saved_at</w:t>
+      </w:r>
+      <w:proofErr w:type="spellEnd"/>
+      <w:r>
+        <w:rPr>
+          <w:u w:val="single"/>
+        </w:rPr>
+        <w:t xml:space="preserve"> TIMESTAMP DEFAULT CURRENT_TIMESTAMP,</w:t>
+      </w:r>
+    </w:p>
+    <w:p>
+      <w:pPr>
+        <w:spacing w:after="0" w:line="240" w:lineRule="auto"/>
+        <w:rPr>
+          <w:u w:val="single"/>
+        </w:rPr>
+      </w:pPr>
+    </w:p>
+    <w:p>
+      <w:pPr>
+        <w:spacing w:after="0" w:line="240" w:lineRule="auto"/>
+        <w:rPr>
+          <w:u w:val="single"/>
+        </w:rPr>
+      </w:pPr>
+      <w:r>
+        <w:rPr>
+          <w:u w:val="single"/>
+        </w:rPr>
+        <w:t xml:space="preserve">    FOREIGN </w:t>
+      </w:r>
+      <w:proofErr w:type="gramStart"/>
+      <w:r>
+        <w:rPr>
+          <w:u w:val="single"/>
+        </w:rPr>
+        <w:t>KEY(</w:t>
+      </w:r>
+      <w:proofErr w:type="spellStart"/>
+      <w:proofErr w:type="gramEnd"/>
+      <w:r>
+        <w:rPr>
+          <w:u w:val="single"/>
+        </w:rPr>
+        <w:t>article_id</w:t>
+      </w:r>
+      <w:proofErr w:type="spellEnd"/>
+      <w:r>
+        <w:rPr>
+          <w:u w:val="single"/>
+        </w:rPr>
+        <w:t>)</w:t>
+      </w:r>
+    </w:p>
+    <w:p>
+      <w:pPr>
+        <w:spacing w:after="0" w:line="240" w:lineRule="auto"/>
+        <w:rPr>
+          <w:u w:val="single"/>
+        </w:rPr>
+      </w:pPr>
+      <w:r>
+        <w:rPr>
+          <w:u w:val="single"/>
+        </w:rPr>
+        <w:t xml:space="preserve">    REFERENCES articles(id)</w:t>
+      </w:r>
+    </w:p>
+    <w:p>
+      <w:pPr>
+        <w:spacing w:after="0" w:line="240" w:lineRule="auto"/>
+        <w:rPr>
+          <w:u w:val="single"/>
+        </w:rPr>
+      </w:pPr>
+      <w:r>
+        <w:rPr>
+          <w:u w:val="single"/>
+        </w:rPr>
+        <w:t xml:space="preserve">    ON DELETE CASCADE,</w:t>
+      </w:r>
+    </w:p>
+    <w:p>
+      <w:pPr>
+        <w:spacing w:after="0" w:line="240" w:lineRule="auto"/>
+        <w:rPr>
+          <w:u w:val="single"/>
+        </w:rPr>
+      </w:pPr>
+    </w:p>
+    <w:p>
+      <w:pPr>
+        <w:spacing w:after="0" w:line="240" w:lineRule="auto"/>
+        <w:rPr>
+          <w:u w:val="single"/>
+        </w:rPr>
+      </w:pPr>
+      <w:r>
+        <w:rPr>
+          <w:u w:val="single"/>
+        </w:rPr>
+        <w:t xml:space="preserve">    FOREIGN </w:t>
+      </w:r>
+      <w:proofErr w:type="gramStart"/>
+      <w:r>
+        <w:rPr>
+          <w:u w:val="single"/>
+        </w:rPr>
+        <w:t>KEY(</w:t>
+      </w:r>
+      <w:proofErr w:type="spellStart"/>
+      <w:proofErr w:type="gramEnd"/>
+      <w:r>
+        <w:rPr>
+          <w:u w:val="single"/>
+        </w:rPr>
+        <w:t>author_id</w:t>
+      </w:r>
+      <w:proofErr w:type="spellEnd"/>
+      <w:r>
+        <w:rPr>
+          <w:u w:val="single"/>
+        </w:rPr>
+        <w:t>)</w:t>
+      </w:r>
+    </w:p>
+    <w:p>
+      <w:pPr>
+        <w:spacing w:after="0" w:line="240" w:lineRule="auto"/>
+        <w:rPr>
+          <w:u w:val="single"/>
+        </w:rPr>
+      </w:pPr>
+      <w:r>
+        <w:rPr>
+          <w:u w:val="single"/>
+        </w:rPr>
+        <w:t xml:space="preserve">    REFERENCES users(id)</w:t>
+      </w:r>
+    </w:p>
+    <w:p>
+      <w:pPr>
+        <w:spacing w:after="0" w:line="240" w:lineRule="auto"/>
+        <w:rPr>
+          <w:u w:val="single"/>
+        </w:rPr>
+      </w:pPr>
+      <w:r>
+        <w:rPr>
+          <w:u w:val="single"/>
+        </w:rPr>
+        <w:t xml:space="preserve">    ON DELETE CASCADE</w:t>
+      </w:r>
+    </w:p>
+    <w:p>
+      <w:pPr>
+        <w:spacing w:after="0" w:line="240" w:lineRule="auto"/>
+        <w:rPr>
+          <w:u w:val="single"/>
+        </w:rPr>
+      </w:pPr>
+    </w:p>
+    <w:p>
+      <w:pPr>
+        <w:spacing w:after="0" w:line="240" w:lineRule="auto"/>
+        <w:rPr>
+          <w:u w:val="single"/>
+        </w:rPr>
+      </w:pPr>
+      <w:r>
+        <w:rPr>
+          <w:u w:val="single"/>
+        </w:rPr>
+        <w:t>) ENGINE=</w:t>
+      </w:r>
+      <w:proofErr w:type="spellStart"/>
+      <w:r>
+        <w:rPr>
+          <w:u w:val="single"/>
+        </w:rPr>
+        <w:t>InnoDB</w:t>
+      </w:r>
+      <w:proofErr w:type="spellEnd"/>
+      <w:r>
+        <w:rPr>
+          <w:u w:val="single"/>
+        </w:rPr>
+        <w:t>;</w:t>
+      </w:r>
+    </w:p>
+    <w:p>
+      <w:pPr>
+        <w:spacing w:after="0" w:line="240" w:lineRule="auto"/>
+        <w:rPr>
+          <w:u w:val="single"/>
+        </w:rPr>
+      </w:pPr>
+    </w:p>
+    <w:p>
+      <w:pPr>
+        <w:spacing w:after="0" w:line="240" w:lineRule="auto"/>
+        <w:rPr>
+          <w:u w:val="single"/>
+        </w:rPr>
+      </w:pPr>
+    </w:p>
+    <w:p>
+      <w:pPr>
+        <w:spacing w:after="0" w:line="240" w:lineRule="auto"/>
+        <w:rPr>
+          <w:u w:val="single"/>
+        </w:rPr>
+      </w:pPr>
+    </w:p>
+    <w:p>
+      <w:pPr>
+        <w:spacing w:after="0" w:line="240" w:lineRule="auto"/>
+        <w:rPr>
+          <w:u w:val="single"/>
+        </w:rPr>
+      </w:pPr>
+    </w:p>
+    <w:p>
+      <w:pPr>
+        <w:spacing w:after="0" w:line="240" w:lineRule="auto"/>
+        <w:rPr>
+          <w:u w:val="single"/>
+        </w:rPr>
+      </w:pPr>
+    </w:p>
+    <w:p>
+      <w:pPr>
+        <w:spacing w:after="0" w:line="240" w:lineRule="auto"/>
+        <w:rPr>
+          <w:u w:val="single"/>
+        </w:rPr>
+      </w:pPr>
+    </w:p>
+    <w:p>
+      <w:pPr>
+        <w:spacing w:after="0" w:line="240" w:lineRule="auto"/>
+        <w:rPr>
+          <w:u w:val="single"/>
+        </w:rPr>
+      </w:pPr>
+    </w:p>
+    <w:p>
+      <w:pPr>
+        <w:spacing w:after="0" w:line="240" w:lineRule="auto"/>
+        <w:rPr>
+          <w:u w:val="single"/>
+        </w:rPr>
+      </w:pPr>
+    </w:p>
+    <w:p>
+      <w:pPr>
+        <w:spacing w:after="0" w:line="240" w:lineRule="auto"/>
+        <w:rPr>
+          <w:u w:val="single"/>
+        </w:rPr>
+      </w:pPr>
+    </w:p>
+    <w:p>
+      <w:pPr>
+        <w:spacing w:after="0" w:line="240" w:lineRule="auto"/>
+        <w:rPr>
+          <w:u w:val="single"/>
+        </w:rPr>
+      </w:pPr>
+    </w:p>
+    <w:p>
+      <w:pPr>
+        <w:spacing w:after="0" w:line="240" w:lineRule="auto"/>
+        <w:rPr>
+          <w:u w:val="single"/>
+        </w:rPr>
+      </w:pPr>
+    </w:p>
+    <w:p>
+      <w:pPr>
+        <w:spacing w:after="0" w:line="240" w:lineRule="auto"/>
+        <w:rPr>
+          <w:u w:val="single"/>
+        </w:rPr>
+      </w:pPr>
+    </w:p>
+    <w:p>
+      <w:pPr>
+        <w:spacing w:after="0" w:line="240" w:lineRule="auto"/>
+        <w:rPr>
+          <w:u w:val="single"/>
+        </w:rPr>
+      </w:pPr>
+    </w:p>
+    <w:p>
+      <w:pPr>
+        <w:spacing w:after="0" w:line="240" w:lineRule="auto"/>
+        <w:rPr>
+          <w:u w:val="single"/>
+        </w:rPr>
+      </w:pPr>
+      <w:r>
+        <w:rPr>
+          <w:u w:val="single"/>
+        </w:rPr>
+        <w:lastRenderedPageBreak/>
+        <w:sym w:font="Wingdings" w:char="F0E0"/>
+      </w:r>
+    </w:p>
+    <w:p>
+      <w:pPr>
+        <w:spacing w:after="0" w:line="240" w:lineRule="auto"/>
+        <w:rPr>
+          <w:u w:val="single"/>
+        </w:rPr>
+      </w:pPr>
+    </w:p>
+    <w:p>
+      <w:pPr>
+        <w:spacing w:after="0" w:line="240" w:lineRule="auto"/>
+        <w:rPr>
+          <w:u w:val="single"/>
+        </w:rPr>
+      </w:pPr>
+      <w:r>
+        <w:rPr>
+          <w:u w:val="single"/>
+        </w:rPr>
+        <w:t xml:space="preserve">INSERT INTO </w:t>
+      </w:r>
+      <w:proofErr w:type="gramStart"/>
+      <w:r>
+        <w:rPr>
+          <w:u w:val="single"/>
+        </w:rPr>
+        <w:t>categories(</w:t>
+      </w:r>
+      <w:proofErr w:type="gramEnd"/>
+    </w:p>
+    <w:p>
+      <w:pPr>
+        <w:spacing w:after="0" w:line="240" w:lineRule="auto"/>
+        <w:rPr>
+          <w:u w:val="single"/>
+        </w:rPr>
+      </w:pPr>
+      <w:r>
+        <w:rPr>
+          <w:u w:val="single"/>
+        </w:rPr>
+        <w:t>name,</w:t>
+      </w:r>
+    </w:p>
+    <w:p>
+      <w:pPr>
+        <w:spacing w:after="0" w:line="240" w:lineRule="auto"/>
+        <w:rPr>
+          <w:u w:val="single"/>
+        </w:rPr>
+      </w:pPr>
+      <w:r>
+        <w:rPr>
+          <w:u w:val="single"/>
+        </w:rPr>
+        <w:t>slug</w:t>
+      </w:r>
+    </w:p>
+    <w:p>
+      <w:pPr>
+        <w:spacing w:after="0" w:line="240" w:lineRule="auto"/>
+        <w:rPr>
+          <w:u w:val="single"/>
+        </w:rPr>
+      </w:pPr>
+      <w:r>
+        <w:rPr>
+          <w:u w:val="single"/>
+        </w:rPr>
+        <w:t>)</w:t>
+      </w:r>
+    </w:p>
+    <w:p>
+      <w:pPr>
+        <w:spacing w:after="0" w:line="240" w:lineRule="auto"/>
+        <w:rPr>
+          <w:u w:val="single"/>
+        </w:rPr>
+      </w:pPr>
+    </w:p>
+    <w:p>
+      <w:pPr>
+        <w:spacing w:after="0" w:line="240" w:lineRule="auto"/>
+        <w:rPr>
+          <w:u w:val="single"/>
+        </w:rPr>
+      </w:pPr>
+      <w:r>
+        <w:rPr>
+          <w:u w:val="single"/>
+        </w:rPr>
+        <w:t>VALUES</w:t>
+      </w:r>
+    </w:p>
+    <w:p>
+      <w:pPr>
+        <w:spacing w:after="0" w:line="240" w:lineRule="auto"/>
+        <w:rPr>
+          <w:u w:val="single"/>
+        </w:rPr>
+      </w:pPr>
+      <w:r>
+        <w:rPr>
+          <w:u w:val="single"/>
+        </w:rPr>
+        <w:t>('</w:t>
+      </w:r>
+      <w:proofErr w:type="spellStart"/>
+      <w:r>
+        <w:rPr>
+          <w:u w:val="single"/>
+        </w:rPr>
+        <w:t>Technology','technology</w:t>
+      </w:r>
+      <w:proofErr w:type="spellEnd"/>
+      <w:r>
+        <w:rPr>
+          <w:u w:val="single"/>
+        </w:rPr>
+        <w:t>'),</w:t>
+      </w:r>
+    </w:p>
+    <w:p>
+      <w:pPr>
+        <w:spacing w:after="0" w:line="240" w:lineRule="auto"/>
+        <w:rPr>
+          <w:u w:val="single"/>
+        </w:rPr>
+      </w:pPr>
+      <w:r>
+        <w:rPr>
+          <w:u w:val="single"/>
+        </w:rPr>
+        <w:t>('</w:t>
+      </w:r>
+      <w:proofErr w:type="spellStart"/>
+      <w:r>
+        <w:rPr>
+          <w:u w:val="single"/>
+        </w:rPr>
+        <w:t>Sports','sports</w:t>
+      </w:r>
+      <w:proofErr w:type="spellEnd"/>
+      <w:r>
+        <w:rPr>
+          <w:u w:val="single"/>
+        </w:rPr>
+        <w:t>'),</w:t>
+      </w:r>
+    </w:p>
+    <w:p>
+      <w:pPr>
+        <w:spacing w:after="0" w:line="240" w:lineRule="auto"/>
+        <w:rPr>
+          <w:u w:val="single"/>
+        </w:rPr>
+      </w:pPr>
+      <w:r>
+        <w:rPr>
+          <w:u w:val="single"/>
+        </w:rPr>
+        <w:t>('</w:t>
+      </w:r>
+      <w:proofErr w:type="spellStart"/>
+      <w:r>
+        <w:rPr>
+          <w:u w:val="single"/>
+        </w:rPr>
+        <w:t>News','news</w:t>
+      </w:r>
+      <w:proofErr w:type="spellEnd"/>
+      <w:r>
+        <w:rPr>
+          <w:u w:val="single"/>
+        </w:rPr>
+        <w:t>');</w:t>
+      </w:r>
+    </w:p>
+    <w:p>
+      <w:pPr>
+        <w:spacing w:after="0" w:line="240" w:lineRule="auto"/>
+        <w:rPr>
+          <w:u w:val="single"/>
+        </w:rPr>
+      </w:pPr>
+    </w:p>
+    <w:p>
+      <w:pPr>
+        <w:spacing w:after="0" w:line="240" w:lineRule="auto"/>
+        <w:rPr>
+          <w:u w:val="single"/>
+        </w:rPr>
+      </w:pPr>
+      <w:r>
+        <w:rPr>
+          <w:u w:val="single"/>
+        </w:rPr>
+        <w:sym w:font="Wingdings" w:char="F0E0"/>
+      </w:r>
+    </w:p>
+    <w:p>
+      <w:pPr>
+        <w:spacing w:after="0" w:line="240" w:lineRule="auto"/>
+        <w:rPr>
+          <w:u w:val="single"/>
+        </w:rPr>
+      </w:pPr>
+    </w:p>
+    <w:p>
+      <w:pPr>
+        <w:spacing w:after="0" w:line="240" w:lineRule="auto"/>
+        <w:rPr>
+          <w:u w:val="single"/>
+        </w:rPr>
+      </w:pPr>
+      <w:r>
+        <w:rPr>
+          <w:u w:val="single"/>
+        </w:rPr>
+        <w:t xml:space="preserve">INSERT INTO </w:t>
+      </w:r>
+      <w:proofErr w:type="gramStart"/>
+      <w:r>
+        <w:rPr>
+          <w:u w:val="single"/>
+        </w:rPr>
+        <w:t>users(</w:t>
+      </w:r>
+      <w:proofErr w:type="gramEnd"/>
+    </w:p>
+    <w:p>
+      <w:pPr>
+        <w:spacing w:after="0" w:line="240" w:lineRule="auto"/>
+        <w:rPr>
+          <w:u w:val="single"/>
+        </w:rPr>
+      </w:pPr>
+    </w:p>
+    <w:p>
+      <w:pPr>
+        <w:spacing w:after="0" w:line="240" w:lineRule="auto"/>
+        <w:rPr>
+          <w:u w:val="single"/>
+        </w:rPr>
+      </w:pPr>
+      <w:r>
+        <w:rPr>
+          <w:u w:val="single"/>
+        </w:rPr>
+        <w:t>name,</w:t>
+      </w:r>
+    </w:p>
+    <w:p>
+      <w:pPr>
+        <w:spacing w:after="0" w:line="240" w:lineRule="auto"/>
+        <w:rPr>
+          <w:u w:val="single"/>
+        </w:rPr>
+      </w:pPr>
+      <w:r>
+        <w:rPr>
+          <w:u w:val="single"/>
+        </w:rPr>
+        <w:t>username,</w:t>
+      </w:r>
+    </w:p>
+    <w:p>
+      <w:pPr>
+        <w:spacing w:after="0" w:line="240" w:lineRule="auto"/>
+        <w:rPr>
+          <w:u w:val="single"/>
+        </w:rPr>
+      </w:pPr>
+      <w:r>
+        <w:rPr>
+          <w:u w:val="single"/>
+        </w:rPr>
+        <w:t>email,</w:t>
+      </w:r>
+    </w:p>
+    <w:p>
+      <w:pPr>
+        <w:spacing w:after="0" w:line="240" w:lineRule="auto"/>
+        <w:rPr>
+          <w:u w:val="single"/>
+        </w:rPr>
+      </w:pPr>
+      <w:proofErr w:type="spellStart"/>
+      <w:r>
+        <w:rPr>
+          <w:u w:val="single"/>
+        </w:rPr>
+        <w:t>password_hash</w:t>
+      </w:r>
+      <w:proofErr w:type="spellEnd"/>
+      <w:r>
+        <w:rPr>
+          <w:u w:val="single"/>
+        </w:rPr>
+        <w:t>,</w:t>
+      </w:r>
+    </w:p>
+    <w:p>
+      <w:pPr>
+        <w:spacing w:after="0" w:line="240" w:lineRule="auto"/>
+        <w:rPr>
+          <w:u w:val="single"/>
+        </w:rPr>
+      </w:pPr>
+      <w:r>
+        <w:rPr>
+          <w:u w:val="single"/>
+        </w:rPr>
+        <w:t>role</w:t>
+      </w:r>
+    </w:p>
+    <w:p>
+      <w:pPr>
+        <w:spacing w:after="0" w:line="240" w:lineRule="auto"/>
+        <w:rPr>
+          <w:u w:val="single"/>
+        </w:rPr>
+      </w:pPr>
+    </w:p>
+    <w:p>
+      <w:pPr>
+        <w:spacing w:after="0" w:line="240" w:lineRule="auto"/>
+        <w:rPr>
+          <w:u w:val="single"/>
+        </w:rPr>
+      </w:pPr>
+      <w:r>
+        <w:rPr>
+          <w:u w:val="single"/>
+        </w:rPr>
+        <w:t>)</w:t>
+      </w:r>
+    </w:p>
+    <w:p>
+      <w:pPr>
+        <w:spacing w:after="0" w:line="240" w:lineRule="auto"/>
+        <w:rPr>
+          <w:u w:val="single"/>
+        </w:rPr>
+      </w:pPr>
+    </w:p>
+    <w:p>
+      <w:pPr>
+        <w:spacing w:after="0" w:line="240" w:lineRule="auto"/>
+        <w:rPr>
+          <w:u w:val="single"/>
+        </w:rPr>
+      </w:pPr>
+      <w:proofErr w:type="gramStart"/>
+      <w:r>
+        <w:rPr>
+          <w:u w:val="single"/>
+        </w:rPr>
+        <w:t>VALUES(</w:t>
+      </w:r>
+      <w:proofErr w:type="gramEnd"/>
+    </w:p>
+    <w:p>
+      <w:pPr>
+        <w:spacing w:after="0" w:line="240" w:lineRule="auto"/>
+        <w:rPr>
+          <w:u w:val="single"/>
+        </w:rPr>
+      </w:pPr>
+    </w:p>
+    <w:p>
+      <w:pPr>
+        <w:spacing w:after="0" w:line="240" w:lineRule="auto"/>
+        <w:rPr>
+          <w:u w:val="single"/>
+        </w:rPr>
+      </w:pPr>
+      <w:r>
+        <w:rPr>
+          <w:u w:val="single"/>
+        </w:rPr>
+        <w:t>'Nahid',</w:t>
+      </w:r>
+    </w:p>
+    <w:p>
+      <w:pPr>
+        <w:spacing w:after="0" w:line="240" w:lineRule="auto"/>
+        <w:rPr>
+          <w:u w:val="single"/>
+        </w:rPr>
+      </w:pPr>
+      <w:r>
+        <w:rPr>
+          <w:u w:val="single"/>
+        </w:rPr>
+        <w:t>'nahid123',</w:t>
+      </w:r>
+    </w:p>
+    <w:p>
+      <w:pPr>
+        <w:spacing w:after="0" w:line="240" w:lineRule="auto"/>
+        <w:rPr>
+          <w:u w:val="single"/>
+        </w:rPr>
+      </w:pPr>
+      <w:r>
+        <w:rPr>
+          <w:u w:val="single"/>
+        </w:rPr>
+        <w:t>'nahid@gmail.com',</w:t>
+      </w:r>
+    </w:p>
+    <w:p>
+      <w:pPr>
+        <w:spacing w:after="0" w:line="240" w:lineRule="auto"/>
+        <w:rPr>
+          <w:u w:val="single"/>
+        </w:rPr>
+      </w:pPr>
+      <w:r>
+        <w:rPr>
+          <w:u w:val="single"/>
+        </w:rPr>
+        <w:t>'123456',</w:t>
+      </w:r>
+    </w:p>
+    <w:p>
+      <w:pPr>
+        <w:spacing w:after="0" w:line="240" w:lineRule="auto"/>
+        <w:rPr>
+          <w:u w:val="single"/>
+        </w:rPr>
+      </w:pPr>
+      <w:r>
+        <w:rPr>
+          <w:u w:val="single"/>
+        </w:rPr>
+        <w:t>'author'</w:t>
+      </w:r>
+    </w:p>
+    <w:p>
+      <w:pPr>
+        <w:spacing w:after="0" w:line="240" w:lineRule="auto"/>
+        <w:rPr>
+          <w:u w:val="single"/>
+        </w:rPr>
+      </w:pPr>
+    </w:p>
+    <w:p>
+      <w:pPr>
+        <w:spacing w:after="0" w:line="240" w:lineRule="auto"/>
+        <w:rPr>
+          <w:u w:val="single"/>
+        </w:rPr>
+      </w:pPr>
+      <w:r>
+        <w:rPr>
+          <w:u w:val="single"/>
+        </w:rPr>
+        <w:t>);</w:t>
+      </w:r>
+    </w:p>
+    <w:p>
+      <w:pPr>
+        <w:spacing w:after="0" w:line="240" w:lineRule="auto"/>
+        <w:rPr>
+          <w:u w:val="single"/>
+        </w:rPr>
+      </w:pPr>
+    </w:p>
+    <w:p>
+      <w:pPr>
+        <w:spacing w:after="0" w:line="240" w:lineRule="auto"/>
+        <w:rPr>
+          <w:u w:val="single"/>
+        </w:rPr>
+      </w:pPr>
+      <w:r>
+        <w:rPr>
+          <w:u w:val="single"/>
+        </w:rPr>
+        <w:sym w:font="Wingdings" w:char="F0E0"/>
+      </w:r>
+    </w:p>
+    <w:p>
+      <w:pPr>
+        <w:spacing w:after="0" w:line="240" w:lineRule="auto"/>
+        <w:rPr>
+          <w:u w:val="single"/>
+        </w:rPr>
+      </w:pPr>
+    </w:p>
+    <w:p>
+      <w:pPr>
+        <w:spacing w:after="0" w:line="240" w:lineRule="auto"/>
+        <w:rPr>
+          <w:u w:val="single"/>
+        </w:rPr>
+      </w:pPr>
+      <w:r>
+        <w:rPr>
+          <w:u w:val="single"/>
+        </w:rPr>
+        <w:t xml:space="preserve">INSERT INTO </w:t>
+      </w:r>
+      <w:proofErr w:type="gramStart"/>
+      <w:r>
+        <w:rPr>
+          <w:u w:val="single"/>
+        </w:rPr>
+        <w:t>series(</w:t>
+      </w:r>
+      <w:proofErr w:type="gramEnd"/>
+    </w:p>
+    <w:p>
+      <w:pPr>
+        <w:spacing w:after="0" w:line="240" w:lineRule="auto"/>
+        <w:rPr>
+          <w:u w:val="single"/>
+        </w:rPr>
+      </w:pPr>
+      <w:proofErr w:type="spellStart"/>
+      <w:r>
+        <w:rPr>
+          <w:u w:val="single"/>
+        </w:rPr>
+        <w:t>author_id</w:t>
+      </w:r>
+      <w:proofErr w:type="spellEnd"/>
+      <w:r>
+        <w:rPr>
+          <w:u w:val="single"/>
+        </w:rPr>
+        <w:t>,</w:t>
+      </w:r>
+    </w:p>
+    <w:p>
+      <w:pPr>
+        <w:spacing w:after="0" w:line="240" w:lineRule="auto"/>
+        <w:rPr>
+          <w:u w:val="single"/>
+        </w:rPr>
+      </w:pPr>
+      <w:r>
+        <w:rPr>
+          <w:u w:val="single"/>
+        </w:rPr>
+        <w:t>title</w:t>
+      </w:r>
+    </w:p>
+    <w:p>
+      <w:pPr>
+        <w:spacing w:after="0" w:line="240" w:lineRule="auto"/>
+        <w:rPr>
+          <w:u w:val="single"/>
+        </w:rPr>
+      </w:pPr>
+      <w:r>
+        <w:rPr>
+          <w:u w:val="single"/>
+        </w:rPr>
+        <w:t>)</w:t>
+      </w:r>
+    </w:p>
+    <w:p>
+      <w:pPr>
+        <w:spacing w:after="0" w:line="240" w:lineRule="auto"/>
+        <w:rPr>
+          <w:u w:val="single"/>
+        </w:rPr>
+      </w:pPr>
+      <w:r>
+        <w:rPr>
+          <w:u w:val="single"/>
+        </w:rPr>
+        <w:t>VALUES</w:t>
+      </w:r>
+    </w:p>
+    <w:p>
+      <w:pPr>
+        <w:spacing w:after="0" w:line="240" w:lineRule="auto"/>
+        <w:rPr>
+          <w:u w:val="single"/>
+        </w:rPr>
+      </w:pPr>
+      <w:r>
+        <w:rPr>
+          <w:u w:val="single"/>
+        </w:rPr>
+        <w:t>(1,'Web Development'),</w:t>
+      </w:r>
+    </w:p>
+    <w:p>
+      <w:pPr>
+        <w:spacing w:after="0" w:line="240" w:lineRule="auto"/>
+        <w:rPr>
+          <w:u w:val="single"/>
+        </w:rPr>
+      </w:pPr>
+      <w:r>
+        <w:rPr>
+          <w:u w:val="single"/>
+        </w:rPr>
+        <w:t>(1,'Programming');</w:t>
+      </w:r>
+    </w:p>
+    <w:p>
+      <w:pPr>
+        <w:spacing w:after="0" w:line="240" w:lineRule="auto"/>
+        <w:rPr>
+          <w:u w:val="single"/>
+        </w:rPr>
+      </w:pPr>
     </w:p>
     <w:sectPr>
       <w:pgSz w:w="12240" w:h="15840"/>

</xml_diff>

<commit_message>
Fix some update and edit glitches
</commit_message>
<xml_diff>
--- a/blogPost/DB Quries/blogPost.docx
+++ b/blogPost/DB Quries/blogPost.docx
@@ -2575,6 +2575,97 @@
           <w:u w:val="single"/>
         </w:rPr>
         <w:t>(1,'Programming');</w:t>
+      </w:r>
+    </w:p>
+    <w:p>
+      <w:pPr>
+        <w:spacing w:after="0" w:line="240" w:lineRule="auto"/>
+        <w:rPr>
+          <w:u w:val="single"/>
+        </w:rPr>
+      </w:pPr>
+    </w:p>
+    <w:p>
+      <w:pPr>
+        <w:spacing w:after="0" w:line="240" w:lineRule="auto"/>
+        <w:rPr>
+          <w:u w:val="single"/>
+        </w:rPr>
+      </w:pPr>
+      <w:r>
+        <w:rPr>
+          <w:u w:val="single"/>
+        </w:rPr>
+        <w:lastRenderedPageBreak/>
+        <w:t>-</w:t>
+      </w:r>
+      <w:r>
+        <w:rPr>
+          <w:u w:val="single"/>
+        </w:rPr>
+        <w:sym w:font="Wingdings" w:char="F0E0"/>
+      </w:r>
+    </w:p>
+    <w:p>
+      <w:pPr>
+        <w:spacing w:after="0" w:line="240" w:lineRule="auto"/>
+        <w:rPr>
+          <w:u w:val="single"/>
+        </w:rPr>
+      </w:pPr>
+    </w:p>
+    <w:p>
+      <w:pPr>
+        <w:spacing w:after="0" w:line="240" w:lineRule="auto"/>
+        <w:rPr>
+          <w:b/>
+          <w:bCs/>
+          <w:u w:val="single"/>
+        </w:rPr>
+      </w:pPr>
+      <w:r>
+        <w:rPr>
+          <w:b/>
+          <w:bCs/>
+          <w:u w:val="single"/>
+        </w:rPr>
+        <w:t>ALTER TABLE articles</w:t>
+      </w:r>
+    </w:p>
+    <w:p>
+      <w:pPr>
+        <w:spacing w:after="0" w:line="240" w:lineRule="auto"/>
+        <w:rPr>
+          <w:b/>
+          <w:bCs/>
+          <w:u w:val="single"/>
+        </w:rPr>
+      </w:pPr>
+      <w:r>
+        <w:rPr>
+          <w:b/>
+          <w:bCs/>
+          <w:u w:val="single"/>
+        </w:rPr>
+        <w:t xml:space="preserve">ADD tags </w:t>
+      </w:r>
+      <w:proofErr w:type="gramStart"/>
+      <w:r>
+        <w:rPr>
+          <w:b/>
+          <w:bCs/>
+          <w:u w:val="single"/>
+        </w:rPr>
+        <w:t>VARCHAR(</w:t>
+      </w:r>
+      <w:proofErr w:type="gramEnd"/>
+      <w:r>
+        <w:rPr>
+          <w:b/>
+          <w:bCs/>
+          <w:u w:val="single"/>
+        </w:rPr>
+        <w:t>255);</w:t>
       </w:r>
     </w:p>
     <w:p>

</xml_diff>

<commit_message>
Fix some update and edit glitches (#9)
</commit_message>
<xml_diff>
--- a/blogPost/DB Quries/blogPost.docx
+++ b/blogPost/DB Quries/blogPost.docx
@@ -2575,6 +2575,97 @@
           <w:u w:val="single"/>
         </w:rPr>
         <w:t>(1,'Programming');</w:t>
+      </w:r>
+    </w:p>
+    <w:p>
+      <w:pPr>
+        <w:spacing w:after="0" w:line="240" w:lineRule="auto"/>
+        <w:rPr>
+          <w:u w:val="single"/>
+        </w:rPr>
+      </w:pPr>
+    </w:p>
+    <w:p>
+      <w:pPr>
+        <w:spacing w:after="0" w:line="240" w:lineRule="auto"/>
+        <w:rPr>
+          <w:u w:val="single"/>
+        </w:rPr>
+      </w:pPr>
+      <w:r>
+        <w:rPr>
+          <w:u w:val="single"/>
+        </w:rPr>
+        <w:lastRenderedPageBreak/>
+        <w:t>-</w:t>
+      </w:r>
+      <w:r>
+        <w:rPr>
+          <w:u w:val="single"/>
+        </w:rPr>
+        <w:sym w:font="Wingdings" w:char="F0E0"/>
+      </w:r>
+    </w:p>
+    <w:p>
+      <w:pPr>
+        <w:spacing w:after="0" w:line="240" w:lineRule="auto"/>
+        <w:rPr>
+          <w:u w:val="single"/>
+        </w:rPr>
+      </w:pPr>
+    </w:p>
+    <w:p>
+      <w:pPr>
+        <w:spacing w:after="0" w:line="240" w:lineRule="auto"/>
+        <w:rPr>
+          <w:b/>
+          <w:bCs/>
+          <w:u w:val="single"/>
+        </w:rPr>
+      </w:pPr>
+      <w:r>
+        <w:rPr>
+          <w:b/>
+          <w:bCs/>
+          <w:u w:val="single"/>
+        </w:rPr>
+        <w:t>ALTER TABLE articles</w:t>
+      </w:r>
+    </w:p>
+    <w:p>
+      <w:pPr>
+        <w:spacing w:after="0" w:line="240" w:lineRule="auto"/>
+        <w:rPr>
+          <w:b/>
+          <w:bCs/>
+          <w:u w:val="single"/>
+        </w:rPr>
+      </w:pPr>
+      <w:r>
+        <w:rPr>
+          <w:b/>
+          <w:bCs/>
+          <w:u w:val="single"/>
+        </w:rPr>
+        <w:t xml:space="preserve">ADD tags </w:t>
+      </w:r>
+      <w:proofErr w:type="gramStart"/>
+      <w:r>
+        <w:rPr>
+          <w:b/>
+          <w:bCs/>
+          <w:u w:val="single"/>
+        </w:rPr>
+        <w:t>VARCHAR(</w:t>
+      </w:r>
+      <w:proofErr w:type="gramEnd"/>
+      <w:r>
+        <w:rPr>
+          <w:b/>
+          <w:bCs/>
+          <w:u w:val="single"/>
+        </w:rPr>
+        <w:t>255);</w:t>
       </w:r>
     </w:p>
     <w:p>

</xml_diff>

<commit_message>
•	Manage article revisions: view the history of saved drafts for each article; restore a previous version
</commit_message>
<xml_diff>
--- a/blogPost/DB Quries/blogPost.docx
+++ b/blogPost/DB Quries/blogPost.docx
@@ -224,15 +224,28 @@
         <w:spacing w:after="0" w:line="240" w:lineRule="auto"/>
       </w:pPr>
       <w:r>
+        <w:t xml:space="preserve">    bio TEXT,</w:t>
+      </w:r>
+    </w:p>
+    <w:p>
+      <w:pPr>
+        <w:spacing w:after="0" w:line="240" w:lineRule="auto"/>
+      </w:pPr>
+    </w:p>
+    <w:p>
+      <w:pPr>
+        <w:spacing w:after="0" w:line="240" w:lineRule="auto"/>
+      </w:pPr>
+      <w:r>
         <w:t xml:space="preserve">    </w:t>
       </w:r>
-      <w:proofErr w:type="gramStart"/>
-      <w:r>
-        <w:t>bio TEXT</w:t>
-      </w:r>
-      <w:proofErr w:type="gramEnd"/>
-      <w:r>
-        <w:t>,</w:t>
+      <w:proofErr w:type="spellStart"/>
+      <w:r>
+        <w:t>profile_pic</w:t>
+      </w:r>
+      <w:proofErr w:type="spellEnd"/>
+      <w:r>
+        <w:t xml:space="preserve"> VARCHAR(255),</w:t>
       </w:r>
     </w:p>
     <w:p>
@@ -249,19 +262,11 @@
       </w:r>
       <w:proofErr w:type="spellStart"/>
       <w:r>
-        <w:t>profile_pic</w:t>
-      </w:r>
-      <w:proofErr w:type="spellEnd"/>
-      <w:r>
-        <w:t xml:space="preserve"> </w:t>
-      </w:r>
-      <w:proofErr w:type="gramStart"/>
-      <w:r>
-        <w:t>VARCHAR(</w:t>
-      </w:r>
-      <w:proofErr w:type="gramEnd"/>
-      <w:r>
-        <w:t>255),</w:t>
+        <w:t>social_links</w:t>
+      </w:r>
+      <w:proofErr w:type="spellEnd"/>
+      <w:r>
+        <w:t xml:space="preserve"> JSON,</w:t>
       </w:r>
     </w:p>
     <w:p>
@@ -278,11 +283,11 @@
       </w:r>
       <w:proofErr w:type="spellStart"/>
       <w:r>
-        <w:t>social_links</w:t>
-      </w:r>
-      <w:proofErr w:type="spellEnd"/>
-      <w:r>
-        <w:t xml:space="preserve"> JSON,</w:t>
+        <w:t>is_active</w:t>
+      </w:r>
+      <w:proofErr w:type="spellEnd"/>
+      <w:r>
+        <w:t xml:space="preserve"> BOOLEAN DEFAULT TRUE,</w:t>
       </w:r>
     </w:p>
     <w:p>
@@ -299,11 +304,11 @@
       </w:r>
       <w:proofErr w:type="spellStart"/>
       <w:r>
-        <w:t>is_active</w:t>
-      </w:r>
-      <w:proofErr w:type="spellEnd"/>
-      <w:r>
-        <w:t xml:space="preserve"> BOOLEAN DEFAULT TRUE,</w:t>
+        <w:t>is_author_approved</w:t>
+      </w:r>
+      <w:proofErr w:type="spellEnd"/>
+      <w:r>
+        <w:t xml:space="preserve"> BOOLEAN DEFAULT FALSE,</w:t>
       </w:r>
     </w:p>
     <w:p>
@@ -320,11 +325,125 @@
       </w:r>
       <w:proofErr w:type="spellStart"/>
       <w:r>
-        <w:t>is_author_approved</w:t>
-      </w:r>
-      <w:proofErr w:type="spellEnd"/>
-      <w:r>
-        <w:t xml:space="preserve"> BOOLEAN DEFAULT FALSE,</w:t>
+        <w:t>created_at</w:t>
+      </w:r>
+      <w:proofErr w:type="spellEnd"/>
+      <w:r>
+        <w:t xml:space="preserve"> TIMESTAMP DEFAULT CURRENT_TIMESTAMP</w:t>
+      </w:r>
+    </w:p>
+    <w:p>
+      <w:pPr>
+        <w:spacing w:after="0" w:line="240" w:lineRule="auto"/>
+      </w:pPr>
+    </w:p>
+    <w:p>
+      <w:pPr>
+        <w:spacing w:after="0" w:line="240" w:lineRule="auto"/>
+      </w:pPr>
+      <w:r>
+        <w:t>) ENGINE=</w:t>
+      </w:r>
+      <w:proofErr w:type="spellStart"/>
+      <w:r>
+        <w:t>InnoDB</w:t>
+      </w:r>
+      <w:proofErr w:type="spellEnd"/>
+      <w:r>
+        <w:t>;</w:t>
+      </w:r>
+    </w:p>
+    <w:p>
+      <w:pPr>
+        <w:spacing w:after="0" w:line="240" w:lineRule="auto"/>
+      </w:pPr>
+    </w:p>
+    <w:p>
+      <w:pPr>
+        <w:spacing w:after="0" w:line="240" w:lineRule="auto"/>
+        <w:rPr>
+          <w:b/>
+          <w:bCs/>
+          <w:u w:val="single"/>
+        </w:rPr>
+      </w:pPr>
+      <w:r>
+        <w:rPr>
+          <w:b/>
+          <w:bCs/>
+          <w:u w:val="single"/>
+        </w:rPr>
+        <w:t>2.Categories</w:t>
+      </w:r>
+    </w:p>
+    <w:p>
+      <w:pPr>
+        <w:spacing w:after="0" w:line="240" w:lineRule="auto"/>
+        <w:rPr>
+          <w:b/>
+          <w:bCs/>
+          <w:u w:val="single"/>
+        </w:rPr>
+      </w:pPr>
+    </w:p>
+    <w:p>
+      <w:pPr>
+        <w:spacing w:after="0" w:line="240" w:lineRule="auto"/>
+      </w:pPr>
+      <w:r>
+        <w:t>CREATE TABLE categories(</w:t>
+      </w:r>
+    </w:p>
+    <w:p>
+      <w:pPr>
+        <w:spacing w:after="0" w:line="240" w:lineRule="auto"/>
+      </w:pPr>
+    </w:p>
+    <w:p>
+      <w:pPr>
+        <w:spacing w:after="0" w:line="240" w:lineRule="auto"/>
+      </w:pPr>
+      <w:r>
+        <w:t xml:space="preserve">    id INT PRIMARY KEY AUTO_INCREMENT,</w:t>
+      </w:r>
+    </w:p>
+    <w:p>
+      <w:pPr>
+        <w:spacing w:after="0" w:line="240" w:lineRule="auto"/>
+      </w:pPr>
+    </w:p>
+    <w:p>
+      <w:pPr>
+        <w:spacing w:after="0" w:line="240" w:lineRule="auto"/>
+      </w:pPr>
+      <w:r>
+        <w:t xml:space="preserve">    name VARCHAR(100) NOT NULL,</w:t>
+      </w:r>
+    </w:p>
+    <w:p>
+      <w:pPr>
+        <w:spacing w:after="0" w:line="240" w:lineRule="auto"/>
+      </w:pPr>
+    </w:p>
+    <w:p>
+      <w:pPr>
+        <w:spacing w:after="0" w:line="240" w:lineRule="auto"/>
+      </w:pPr>
+      <w:r>
+        <w:t xml:space="preserve">    slug VARCHAR(100) UNIQUE NOT NULL,</w:t>
+      </w:r>
+    </w:p>
+    <w:p>
+      <w:pPr>
+        <w:spacing w:after="0" w:line="240" w:lineRule="auto"/>
+      </w:pPr>
+    </w:p>
+    <w:p>
+      <w:pPr>
+        <w:spacing w:after="0" w:line="240" w:lineRule="auto"/>
+      </w:pPr>
+      <w:r>
+        <w:t xml:space="preserve">    description TEXT,</w:t>
       </w:r>
     </w:p>
     <w:p>
@@ -341,11 +460,227 @@
       </w:r>
       <w:proofErr w:type="spellStart"/>
       <w:r>
+        <w:t>created_by</w:t>
+      </w:r>
+      <w:proofErr w:type="spellEnd"/>
+      <w:r>
+        <w:t xml:space="preserve"> INT</w:t>
+      </w:r>
+    </w:p>
+    <w:p>
+      <w:pPr>
+        <w:spacing w:after="0" w:line="240" w:lineRule="auto"/>
+      </w:pPr>
+    </w:p>
+    <w:p>
+      <w:pPr>
+        <w:spacing w:after="0" w:line="240" w:lineRule="auto"/>
+      </w:pPr>
+      <w:r>
+        <w:t>) ENGINE=</w:t>
+      </w:r>
+      <w:proofErr w:type="spellStart"/>
+      <w:r>
+        <w:t>InnoDB</w:t>
+      </w:r>
+      <w:proofErr w:type="spellEnd"/>
+      <w:r>
+        <w:t>;</w:t>
+      </w:r>
+    </w:p>
+    <w:p>
+      <w:pPr>
+        <w:spacing w:after="0" w:line="240" w:lineRule="auto"/>
+      </w:pPr>
+    </w:p>
+    <w:p>
+      <w:pPr>
+        <w:spacing w:after="0" w:line="240" w:lineRule="auto"/>
+      </w:pPr>
+    </w:p>
+    <w:p>
+      <w:pPr>
+        <w:spacing w:after="0" w:line="240" w:lineRule="auto"/>
+        <w:rPr>
+          <w:b/>
+          <w:bCs/>
+          <w:u w:val="single"/>
+        </w:rPr>
+      </w:pPr>
+      <w:r>
+        <w:rPr>
+          <w:b/>
+          <w:bCs/>
+          <w:u w:val="single"/>
+        </w:rPr>
+        <w:t>3.Series</w:t>
+      </w:r>
+    </w:p>
+    <w:p>
+      <w:pPr>
+        <w:spacing w:after="0" w:line="240" w:lineRule="auto"/>
+        <w:rPr>
+          <w:b/>
+          <w:bCs/>
+          <w:u w:val="single"/>
+        </w:rPr>
+      </w:pPr>
+    </w:p>
+    <w:p>
+      <w:pPr>
+        <w:spacing w:after="0" w:line="240" w:lineRule="auto"/>
+        <w:rPr>
+          <w:b/>
+          <w:bCs/>
+          <w:u w:val="single"/>
+        </w:rPr>
+      </w:pPr>
+    </w:p>
+    <w:p>
+      <w:pPr>
+        <w:spacing w:after="0" w:line="240" w:lineRule="auto"/>
+      </w:pPr>
+      <w:r>
+        <w:t>CREATE TABLE series(</w:t>
+      </w:r>
+    </w:p>
+    <w:p>
+      <w:pPr>
+        <w:spacing w:after="0" w:line="240" w:lineRule="auto"/>
+      </w:pPr>
+    </w:p>
+    <w:p>
+      <w:pPr>
+        <w:spacing w:after="0" w:line="240" w:lineRule="auto"/>
+      </w:pPr>
+      <w:r>
+        <w:t xml:space="preserve">    id INT PRIMARY KEY AUTO_INCREMENT,</w:t>
+      </w:r>
+    </w:p>
+    <w:p>
+      <w:pPr>
+        <w:spacing w:after="0" w:line="240" w:lineRule="auto"/>
+      </w:pPr>
+    </w:p>
+    <w:p>
+      <w:pPr>
+        <w:spacing w:after="0" w:line="240" w:lineRule="auto"/>
+      </w:pPr>
+      <w:r>
+        <w:t xml:space="preserve">    </w:t>
+      </w:r>
+      <w:proofErr w:type="spellStart"/>
+      <w:r>
+        <w:t>author_id</w:t>
+      </w:r>
+      <w:proofErr w:type="spellEnd"/>
+      <w:r>
+        <w:t xml:space="preserve"> INT NOT NULL,</w:t>
+      </w:r>
+    </w:p>
+    <w:p>
+      <w:pPr>
+        <w:spacing w:after="0" w:line="240" w:lineRule="auto"/>
+      </w:pPr>
+    </w:p>
+    <w:p>
+      <w:pPr>
+        <w:spacing w:after="0" w:line="240" w:lineRule="auto"/>
+      </w:pPr>
+      <w:r>
+        <w:t xml:space="preserve">    title VARCHAR(255) NOT NULL,</w:t>
+      </w:r>
+    </w:p>
+    <w:p>
+      <w:pPr>
+        <w:spacing w:after="0" w:line="240" w:lineRule="auto"/>
+      </w:pPr>
+    </w:p>
+    <w:p>
+      <w:pPr>
+        <w:spacing w:after="0" w:line="240" w:lineRule="auto"/>
+      </w:pPr>
+      <w:r>
+        <w:t xml:space="preserve">    description TEXT,</w:t>
+      </w:r>
+    </w:p>
+    <w:p>
+      <w:pPr>
+        <w:spacing w:after="0" w:line="240" w:lineRule="auto"/>
+      </w:pPr>
+    </w:p>
+    <w:p>
+      <w:pPr>
+        <w:spacing w:after="0" w:line="240" w:lineRule="auto"/>
+      </w:pPr>
+      <w:r>
+        <w:t xml:space="preserve">    </w:t>
+      </w:r>
+      <w:proofErr w:type="spellStart"/>
+      <w:r>
+        <w:t>cover_image_path</w:t>
+      </w:r>
+      <w:proofErr w:type="spellEnd"/>
+      <w:r>
+        <w:t xml:space="preserve"> VARCHAR(255),</w:t>
+      </w:r>
+    </w:p>
+    <w:p>
+      <w:pPr>
+        <w:spacing w:after="0" w:line="240" w:lineRule="auto"/>
+      </w:pPr>
+    </w:p>
+    <w:p>
+      <w:pPr>
+        <w:spacing w:after="0" w:line="240" w:lineRule="auto"/>
+      </w:pPr>
+      <w:r>
+        <w:t xml:space="preserve">    </w:t>
+      </w:r>
+      <w:proofErr w:type="spellStart"/>
+      <w:r>
         <w:t>created_at</w:t>
       </w:r>
       <w:proofErr w:type="spellEnd"/>
       <w:r>
-        <w:t xml:space="preserve"> TIMESTAMP DEFAULT CURRENT_TIMESTAMP</w:t>
+        <w:t xml:space="preserve"> TIMESTAMP DEFAULT CURRENT_TIMESTAMP,</w:t>
+      </w:r>
+    </w:p>
+    <w:p>
+      <w:pPr>
+        <w:spacing w:after="0" w:line="240" w:lineRule="auto"/>
+      </w:pPr>
+    </w:p>
+    <w:p>
+      <w:pPr>
+        <w:spacing w:after="0" w:line="240" w:lineRule="auto"/>
+      </w:pPr>
+      <w:r>
+        <w:t xml:space="preserve">    FOREIGN KEY(</w:t>
+      </w:r>
+      <w:proofErr w:type="spellStart"/>
+      <w:r>
+        <w:t>author_id</w:t>
+      </w:r>
+      <w:proofErr w:type="spellEnd"/>
+      <w:r>
+        <w:t>)</w:t>
+      </w:r>
+    </w:p>
+    <w:p>
+      <w:pPr>
+        <w:spacing w:after="0" w:line="240" w:lineRule="auto"/>
+      </w:pPr>
+      <w:r>
+        <w:t xml:space="preserve">    REFERENCES users(id)</w:t>
+      </w:r>
+    </w:p>
+    <w:p>
+      <w:pPr>
+        <w:spacing w:after="0" w:line="240" w:lineRule="auto"/>
+      </w:pPr>
+      <w:r>
+        <w:t xml:space="preserve">    ON DELETE CASCADE</w:t>
       </w:r>
     </w:p>
     <w:p>
@@ -377,404 +712,6 @@
     <w:p>
       <w:pPr>
         <w:spacing w:after="0" w:line="240" w:lineRule="auto"/>
-        <w:rPr>
-          <w:b/>
-          <w:bCs/>
-          <w:u w:val="single"/>
-        </w:rPr>
-      </w:pPr>
-      <w:r>
-        <w:rPr>
-          <w:b/>
-          <w:bCs/>
-          <w:u w:val="single"/>
-        </w:rPr>
-        <w:t>2.Categories</w:t>
-      </w:r>
-    </w:p>
-    <w:p>
-      <w:pPr>
-        <w:spacing w:after="0" w:line="240" w:lineRule="auto"/>
-        <w:rPr>
-          <w:b/>
-          <w:bCs/>
-          <w:u w:val="single"/>
-        </w:rPr>
-      </w:pPr>
-    </w:p>
-    <w:p>
-      <w:pPr>
-        <w:spacing w:after="0" w:line="240" w:lineRule="auto"/>
-      </w:pPr>
-      <w:r>
-        <w:t xml:space="preserve">CREATE TABLE </w:t>
-      </w:r>
-      <w:proofErr w:type="gramStart"/>
-      <w:r>
-        <w:t>categories(</w:t>
-      </w:r>
-      <w:proofErr w:type="gramEnd"/>
-    </w:p>
-    <w:p>
-      <w:pPr>
-        <w:spacing w:after="0" w:line="240" w:lineRule="auto"/>
-      </w:pPr>
-    </w:p>
-    <w:p>
-      <w:pPr>
-        <w:spacing w:after="0" w:line="240" w:lineRule="auto"/>
-      </w:pPr>
-      <w:r>
-        <w:t xml:space="preserve">    id INT PRIMARY KEY AUTO_INCREMENT,</w:t>
-      </w:r>
-    </w:p>
-    <w:p>
-      <w:pPr>
-        <w:spacing w:after="0" w:line="240" w:lineRule="auto"/>
-      </w:pPr>
-    </w:p>
-    <w:p>
-      <w:pPr>
-        <w:spacing w:after="0" w:line="240" w:lineRule="auto"/>
-      </w:pPr>
-      <w:r>
-        <w:t xml:space="preserve">    name </w:t>
-      </w:r>
-      <w:proofErr w:type="gramStart"/>
-      <w:r>
-        <w:t>VARCHAR(</w:t>
-      </w:r>
-      <w:proofErr w:type="gramEnd"/>
-      <w:r>
-        <w:t>100) NOT NULL,</w:t>
-      </w:r>
-    </w:p>
-    <w:p>
-      <w:pPr>
-        <w:spacing w:after="0" w:line="240" w:lineRule="auto"/>
-      </w:pPr>
-    </w:p>
-    <w:p>
-      <w:pPr>
-        <w:spacing w:after="0" w:line="240" w:lineRule="auto"/>
-      </w:pPr>
-      <w:r>
-        <w:t xml:space="preserve">    slug </w:t>
-      </w:r>
-      <w:proofErr w:type="gramStart"/>
-      <w:r>
-        <w:t>VARCHAR(</w:t>
-      </w:r>
-      <w:proofErr w:type="gramEnd"/>
-      <w:r>
-        <w:t>100) UNIQUE NOT NULL,</w:t>
-      </w:r>
-    </w:p>
-    <w:p>
-      <w:pPr>
-        <w:spacing w:after="0" w:line="240" w:lineRule="auto"/>
-      </w:pPr>
-    </w:p>
-    <w:p>
-      <w:pPr>
-        <w:spacing w:after="0" w:line="240" w:lineRule="auto"/>
-      </w:pPr>
-      <w:r>
-        <w:t xml:space="preserve">    description TEXT,</w:t>
-      </w:r>
-    </w:p>
-    <w:p>
-      <w:pPr>
-        <w:spacing w:after="0" w:line="240" w:lineRule="auto"/>
-      </w:pPr>
-    </w:p>
-    <w:p>
-      <w:pPr>
-        <w:spacing w:after="0" w:line="240" w:lineRule="auto"/>
-      </w:pPr>
-      <w:r>
-        <w:t xml:space="preserve">    </w:t>
-      </w:r>
-      <w:proofErr w:type="spellStart"/>
-      <w:r>
-        <w:t>created_by</w:t>
-      </w:r>
-      <w:proofErr w:type="spellEnd"/>
-      <w:r>
-        <w:t xml:space="preserve"> INT</w:t>
-      </w:r>
-    </w:p>
-    <w:p>
-      <w:pPr>
-        <w:spacing w:after="0" w:line="240" w:lineRule="auto"/>
-      </w:pPr>
-    </w:p>
-    <w:p>
-      <w:pPr>
-        <w:spacing w:after="0" w:line="240" w:lineRule="auto"/>
-      </w:pPr>
-      <w:r>
-        <w:t>) ENGINE=</w:t>
-      </w:r>
-      <w:proofErr w:type="spellStart"/>
-      <w:r>
-        <w:t>InnoDB</w:t>
-      </w:r>
-      <w:proofErr w:type="spellEnd"/>
-      <w:r>
-        <w:t>;</w:t>
-      </w:r>
-    </w:p>
-    <w:p>
-      <w:pPr>
-        <w:spacing w:after="0" w:line="240" w:lineRule="auto"/>
-      </w:pPr>
-    </w:p>
-    <w:p>
-      <w:pPr>
-        <w:spacing w:after="0" w:line="240" w:lineRule="auto"/>
-      </w:pPr>
-    </w:p>
-    <w:p>
-      <w:pPr>
-        <w:spacing w:after="0" w:line="240" w:lineRule="auto"/>
-        <w:rPr>
-          <w:b/>
-          <w:bCs/>
-          <w:u w:val="single"/>
-        </w:rPr>
-      </w:pPr>
-      <w:r>
-        <w:rPr>
-          <w:b/>
-          <w:bCs/>
-          <w:u w:val="single"/>
-        </w:rPr>
-        <w:t>3.Series</w:t>
-      </w:r>
-    </w:p>
-    <w:p>
-      <w:pPr>
-        <w:spacing w:after="0" w:line="240" w:lineRule="auto"/>
-        <w:rPr>
-          <w:b/>
-          <w:bCs/>
-          <w:u w:val="single"/>
-        </w:rPr>
-      </w:pPr>
-    </w:p>
-    <w:p>
-      <w:pPr>
-        <w:spacing w:after="0" w:line="240" w:lineRule="auto"/>
-        <w:rPr>
-          <w:b/>
-          <w:bCs/>
-          <w:u w:val="single"/>
-        </w:rPr>
-      </w:pPr>
-    </w:p>
-    <w:p>
-      <w:pPr>
-        <w:spacing w:after="0" w:line="240" w:lineRule="auto"/>
-      </w:pPr>
-      <w:r>
-        <w:t xml:space="preserve">CREATE TABLE </w:t>
-      </w:r>
-      <w:proofErr w:type="gramStart"/>
-      <w:r>
-        <w:t>series(</w:t>
-      </w:r>
-      <w:proofErr w:type="gramEnd"/>
-    </w:p>
-    <w:p>
-      <w:pPr>
-        <w:spacing w:after="0" w:line="240" w:lineRule="auto"/>
-      </w:pPr>
-    </w:p>
-    <w:p>
-      <w:pPr>
-        <w:spacing w:after="0" w:line="240" w:lineRule="auto"/>
-      </w:pPr>
-      <w:r>
-        <w:t xml:space="preserve">    id INT PRIMARY KEY AUTO_INCREMENT,</w:t>
-      </w:r>
-    </w:p>
-    <w:p>
-      <w:pPr>
-        <w:spacing w:after="0" w:line="240" w:lineRule="auto"/>
-      </w:pPr>
-    </w:p>
-    <w:p>
-      <w:pPr>
-        <w:spacing w:after="0" w:line="240" w:lineRule="auto"/>
-      </w:pPr>
-      <w:r>
-        <w:t xml:space="preserve">    </w:t>
-      </w:r>
-      <w:proofErr w:type="spellStart"/>
-      <w:r>
-        <w:t>author_id</w:t>
-      </w:r>
-      <w:proofErr w:type="spellEnd"/>
-      <w:r>
-        <w:t xml:space="preserve"> INT NOT NULL,</w:t>
-      </w:r>
-    </w:p>
-    <w:p>
-      <w:pPr>
-        <w:spacing w:after="0" w:line="240" w:lineRule="auto"/>
-      </w:pPr>
-    </w:p>
-    <w:p>
-      <w:pPr>
-        <w:spacing w:after="0" w:line="240" w:lineRule="auto"/>
-      </w:pPr>
-      <w:r>
-        <w:t xml:space="preserve">    title </w:t>
-      </w:r>
-      <w:proofErr w:type="gramStart"/>
-      <w:r>
-        <w:t>VARCHAR(</w:t>
-      </w:r>
-      <w:proofErr w:type="gramEnd"/>
-      <w:r>
-        <w:t>255) NOT NULL,</w:t>
-      </w:r>
-    </w:p>
-    <w:p>
-      <w:pPr>
-        <w:spacing w:after="0" w:line="240" w:lineRule="auto"/>
-      </w:pPr>
-    </w:p>
-    <w:p>
-      <w:pPr>
-        <w:spacing w:after="0" w:line="240" w:lineRule="auto"/>
-      </w:pPr>
-      <w:r>
-        <w:t xml:space="preserve">    description TEXT,</w:t>
-      </w:r>
-    </w:p>
-    <w:p>
-      <w:pPr>
-        <w:spacing w:after="0" w:line="240" w:lineRule="auto"/>
-      </w:pPr>
-    </w:p>
-    <w:p>
-      <w:pPr>
-        <w:spacing w:after="0" w:line="240" w:lineRule="auto"/>
-      </w:pPr>
-      <w:r>
-        <w:t xml:space="preserve">    </w:t>
-      </w:r>
-      <w:proofErr w:type="spellStart"/>
-      <w:r>
-        <w:t>cover_image_path</w:t>
-      </w:r>
-      <w:proofErr w:type="spellEnd"/>
-      <w:r>
-        <w:t xml:space="preserve"> </w:t>
-      </w:r>
-      <w:proofErr w:type="gramStart"/>
-      <w:r>
-        <w:t>VARCHAR(</w:t>
-      </w:r>
-      <w:proofErr w:type="gramEnd"/>
-      <w:r>
-        <w:t>255),</w:t>
-      </w:r>
-    </w:p>
-    <w:p>
-      <w:pPr>
-        <w:spacing w:after="0" w:line="240" w:lineRule="auto"/>
-      </w:pPr>
-    </w:p>
-    <w:p>
-      <w:pPr>
-        <w:spacing w:after="0" w:line="240" w:lineRule="auto"/>
-      </w:pPr>
-      <w:r>
-        <w:t xml:space="preserve">    </w:t>
-      </w:r>
-      <w:proofErr w:type="spellStart"/>
-      <w:r>
-        <w:t>created_at</w:t>
-      </w:r>
-      <w:proofErr w:type="spellEnd"/>
-      <w:r>
-        <w:t xml:space="preserve"> TIMESTAMP DEFAULT CURRENT_TIMESTAMP,</w:t>
-      </w:r>
-    </w:p>
-    <w:p>
-      <w:pPr>
-        <w:spacing w:after="0" w:line="240" w:lineRule="auto"/>
-      </w:pPr>
-    </w:p>
-    <w:p>
-      <w:pPr>
-        <w:spacing w:after="0" w:line="240" w:lineRule="auto"/>
-      </w:pPr>
-      <w:r>
-        <w:t xml:space="preserve">    FOREIGN </w:t>
-      </w:r>
-      <w:proofErr w:type="gramStart"/>
-      <w:r>
-        <w:t>KEY(</w:t>
-      </w:r>
-      <w:proofErr w:type="spellStart"/>
-      <w:proofErr w:type="gramEnd"/>
-      <w:r>
-        <w:t>author_id</w:t>
-      </w:r>
-      <w:proofErr w:type="spellEnd"/>
-      <w:r>
-        <w:t>)</w:t>
-      </w:r>
-    </w:p>
-    <w:p>
-      <w:pPr>
-        <w:spacing w:after="0" w:line="240" w:lineRule="auto"/>
-      </w:pPr>
-      <w:r>
-        <w:t xml:space="preserve">    REFERENCES users(id)</w:t>
-      </w:r>
-    </w:p>
-    <w:p>
-      <w:pPr>
-        <w:spacing w:after="0" w:line="240" w:lineRule="auto"/>
-      </w:pPr>
-      <w:r>
-        <w:t xml:space="preserve">    ON DELETE CASCADE</w:t>
-      </w:r>
-    </w:p>
-    <w:p>
-      <w:pPr>
-        <w:spacing w:after="0" w:line="240" w:lineRule="auto"/>
-      </w:pPr>
-    </w:p>
-    <w:p>
-      <w:pPr>
-        <w:spacing w:after="0" w:line="240" w:lineRule="auto"/>
-      </w:pPr>
-      <w:r>
-        <w:t>) ENGINE=</w:t>
-      </w:r>
-      <w:proofErr w:type="spellStart"/>
-      <w:r>
-        <w:t>InnoDB</w:t>
-      </w:r>
-      <w:proofErr w:type="spellEnd"/>
-      <w:r>
-        <w:t>;</w:t>
-      </w:r>
-    </w:p>
-    <w:p>
-      <w:pPr>
-        <w:spacing w:after="0" w:line="240" w:lineRule="auto"/>
-      </w:pPr>
-    </w:p>
-    <w:p>
-      <w:pPr>
-        <w:spacing w:after="0" w:line="240" w:lineRule="auto"/>
       </w:pPr>
     </w:p>
     <w:p>
@@ -805,13 +742,8 @@
         <w:spacing w:after="0" w:line="240" w:lineRule="auto"/>
       </w:pPr>
       <w:r>
-        <w:t xml:space="preserve">CREATE TABLE </w:t>
-      </w:r>
-      <w:proofErr w:type="gramStart"/>
-      <w:r>
-        <w:t>articles(</w:t>
-      </w:r>
-      <w:proofErr w:type="gramEnd"/>
+        <w:t>CREATE TABLE articles(</w:t>
+      </w:r>
     </w:p>
     <w:p>
       <w:pPr>
@@ -921,36 +853,20 @@
         <w:spacing w:after="0" w:line="240" w:lineRule="auto"/>
       </w:pPr>
       <w:r>
-        <w:t xml:space="preserve">    title </w:t>
-      </w:r>
-      <w:proofErr w:type="gramStart"/>
-      <w:r>
-        <w:t>VARCHAR(</w:t>
-      </w:r>
-      <w:proofErr w:type="gramEnd"/>
-      <w:r>
-        <w:t>255) NOT NULL,</w:t>
-      </w:r>
-    </w:p>
-    <w:p>
-      <w:pPr>
-        <w:spacing w:after="0" w:line="240" w:lineRule="auto"/>
-      </w:pPr>
-    </w:p>
-    <w:p>
-      <w:pPr>
-        <w:spacing w:after="0" w:line="240" w:lineRule="auto"/>
-      </w:pPr>
-      <w:r>
-        <w:t xml:space="preserve">    slug </w:t>
-      </w:r>
-      <w:proofErr w:type="gramStart"/>
-      <w:r>
-        <w:t>VARCHAR(</w:t>
-      </w:r>
-      <w:proofErr w:type="gramEnd"/>
-      <w:r>
-        <w:t>255) UNIQUE NOT NULL,</w:t>
+        <w:t xml:space="preserve">    title VARCHAR(255) NOT NULL,</w:t>
+      </w:r>
+    </w:p>
+    <w:p>
+      <w:pPr>
+        <w:spacing w:after="0" w:line="240" w:lineRule="auto"/>
+      </w:pPr>
+    </w:p>
+    <w:p>
+      <w:pPr>
+        <w:spacing w:after="0" w:line="240" w:lineRule="auto"/>
+      </w:pPr>
+      <w:r>
+        <w:t xml:space="preserve">    slug VARCHAR(255) UNIQUE NOT NULL,</w:t>
       </w:r>
     </w:p>
     <w:p>
@@ -997,34 +913,21 @@
       </w:r>
       <w:proofErr w:type="spellEnd"/>
       <w:r>
-        <w:t xml:space="preserve"> </w:t>
-      </w:r>
-      <w:proofErr w:type="gramStart"/>
-      <w:r>
-        <w:t>VARCHAR(</w:t>
-      </w:r>
-      <w:proofErr w:type="gramEnd"/>
-      <w:r>
-        <w:t>255),</w:t>
-      </w:r>
-    </w:p>
-    <w:p>
-      <w:pPr>
-        <w:spacing w:after="0" w:line="240" w:lineRule="auto"/>
-      </w:pPr>
-    </w:p>
-    <w:p>
-      <w:pPr>
-        <w:spacing w:after="0" w:line="240" w:lineRule="auto"/>
-      </w:pPr>
-      <w:r>
-        <w:t xml:space="preserve">    status </w:t>
-      </w:r>
-      <w:proofErr w:type="gramStart"/>
-      <w:r>
-        <w:t>ENUM(</w:t>
-      </w:r>
-      <w:proofErr w:type="gramEnd"/>
+        <w:t xml:space="preserve"> VARCHAR(255),</w:t>
+      </w:r>
+    </w:p>
+    <w:p>
+      <w:pPr>
+        <w:spacing w:after="0" w:line="240" w:lineRule="auto"/>
+      </w:pPr>
+    </w:p>
+    <w:p>
+      <w:pPr>
+        <w:spacing w:after="0" w:line="240" w:lineRule="auto"/>
+      </w:pPr>
+      <w:r>
+        <w:t xml:space="preserve">    status ENUM(</w:t>
+      </w:r>
     </w:p>
     <w:p>
       <w:pPr>
@@ -1050,13 +953,8 @@
         <w:t xml:space="preserve">        '</w:t>
       </w:r>
       <w:proofErr w:type="spellStart"/>
-      <w:proofErr w:type="gramStart"/>
-      <w:r>
-        <w:t>revision</w:t>
-      </w:r>
-      <w:proofErr w:type="gramEnd"/>
-      <w:r>
-        <w:t>_requested</w:t>
+      <w:r>
+        <w:t>revision_requested</w:t>
       </w:r>
       <w:proofErr w:type="spellEnd"/>
       <w:r>
@@ -1239,14 +1137,9 @@
         <w:spacing w:after="0" w:line="240" w:lineRule="auto"/>
       </w:pPr>
       <w:r>
-        <w:t xml:space="preserve">    FOREIGN </w:t>
-      </w:r>
-      <w:proofErr w:type="gramStart"/>
-      <w:r>
-        <w:t>KEY(</w:t>
-      </w:r>
-      <w:proofErr w:type="spellStart"/>
-      <w:proofErr w:type="gramEnd"/>
+        <w:t xml:space="preserve">    FOREIGN KEY(</w:t>
+      </w:r>
+      <w:proofErr w:type="spellStart"/>
       <w:r>
         <w:t>author_id</w:t>
       </w:r>
@@ -1281,14 +1174,9 @@
         <w:spacing w:after="0" w:line="240" w:lineRule="auto"/>
       </w:pPr>
       <w:r>
-        <w:t xml:space="preserve">    FOREIGN </w:t>
-      </w:r>
-      <w:proofErr w:type="gramStart"/>
-      <w:r>
-        <w:t>KEY(</w:t>
-      </w:r>
-      <w:proofErr w:type="spellStart"/>
-      <w:proofErr w:type="gramEnd"/>
+        <w:t xml:space="preserve">    FOREIGN KEY(</w:t>
+      </w:r>
+      <w:proofErr w:type="spellStart"/>
       <w:r>
         <w:t>editor_id</w:t>
       </w:r>
@@ -1323,14 +1211,9 @@
         <w:spacing w:after="0" w:line="240" w:lineRule="auto"/>
       </w:pPr>
       <w:r>
-        <w:t xml:space="preserve">    FOREIGN </w:t>
-      </w:r>
-      <w:proofErr w:type="gramStart"/>
-      <w:r>
-        <w:t>KEY(</w:t>
-      </w:r>
-      <w:proofErr w:type="spellStart"/>
-      <w:proofErr w:type="gramEnd"/>
+        <w:t xml:space="preserve">    FOREIGN KEY(</w:t>
+      </w:r>
+      <w:proofErr w:type="spellStart"/>
       <w:r>
         <w:t>category_id</w:t>
       </w:r>
@@ -1366,14 +1249,9 @@
         <w:spacing w:after="0" w:line="240" w:lineRule="auto"/>
       </w:pPr>
       <w:r>
-        <w:t xml:space="preserve">    FOREIGN </w:t>
-      </w:r>
-      <w:proofErr w:type="gramStart"/>
-      <w:r>
-        <w:t>KEY(</w:t>
-      </w:r>
-      <w:proofErr w:type="spellStart"/>
-      <w:proofErr w:type="gramEnd"/>
+        <w:t xml:space="preserve">    FOREIGN KEY(</w:t>
+      </w:r>
+      <w:proofErr w:type="spellStart"/>
       <w:r>
         <w:t>series_id</w:t>
       </w:r>
@@ -1488,14 +1366,7 @@
         <w:rPr>
           <w:u w:val="single"/>
         </w:rPr>
-        <w:t>article_</w:t>
-      </w:r>
-      <w:proofErr w:type="gramStart"/>
-      <w:r>
-        <w:rPr>
-          <w:u w:val="single"/>
-        </w:rPr>
-        <w:t>revisions</w:t>
+        <w:t>article_revisions</w:t>
       </w:r>
       <w:proofErr w:type="spellEnd"/>
       <w:r>
@@ -1504,7 +1375,6 @@
         </w:rPr>
         <w:t>(</w:t>
       </w:r>
-      <w:proofErr w:type="gramEnd"/>
     </w:p>
     <w:p>
       <w:pPr>
@@ -1691,17 +1561,9 @@
         <w:rPr>
           <w:u w:val="single"/>
         </w:rPr>
-        <w:t xml:space="preserve">    FOREIGN </w:t>
-      </w:r>
-      <w:proofErr w:type="gramStart"/>
-      <w:r>
-        <w:rPr>
-          <w:u w:val="single"/>
-        </w:rPr>
-        <w:t>KEY(</w:t>
-      </w:r>
-      <w:proofErr w:type="spellStart"/>
-      <w:proofErr w:type="gramEnd"/>
+        <w:t xml:space="preserve">    FOREIGN KEY(</w:t>
+      </w:r>
+      <w:proofErr w:type="spellStart"/>
       <w:r>
         <w:rPr>
           <w:u w:val="single"/>
@@ -1763,17 +1625,9 @@
         <w:rPr>
           <w:u w:val="single"/>
         </w:rPr>
-        <w:t xml:space="preserve">    FOREIGN </w:t>
-      </w:r>
-      <w:proofErr w:type="gramStart"/>
-      <w:r>
-        <w:rPr>
-          <w:u w:val="single"/>
-        </w:rPr>
-        <w:t>KEY(</w:t>
-      </w:r>
-      <w:proofErr w:type="spellStart"/>
-      <w:proofErr w:type="gramEnd"/>
+        <w:t xml:space="preserve">    FOREIGN KEY(</w:t>
+      </w:r>
+      <w:proofErr w:type="spellStart"/>
       <w:r>
         <w:rPr>
           <w:u w:val="single"/>
@@ -1990,16 +1844,8 @@
         <w:rPr>
           <w:u w:val="single"/>
         </w:rPr>
-        <w:t xml:space="preserve">INSERT INTO </w:t>
-      </w:r>
-      <w:proofErr w:type="gramStart"/>
-      <w:r>
-        <w:rPr>
-          <w:u w:val="single"/>
-        </w:rPr>
-        <w:t>categories(</w:t>
-      </w:r>
-      <w:proofErr w:type="gramEnd"/>
+        <w:t>INSERT INTO categories(</w:t>
+      </w:r>
     </w:p>
     <w:p>
       <w:pPr>
@@ -2190,16 +2036,8 @@
         <w:rPr>
           <w:u w:val="single"/>
         </w:rPr>
-        <w:t xml:space="preserve">INSERT INTO </w:t>
-      </w:r>
-      <w:proofErr w:type="gramStart"/>
-      <w:r>
-        <w:rPr>
-          <w:u w:val="single"/>
-        </w:rPr>
-        <w:t>users(</w:t>
-      </w:r>
-      <w:proofErr w:type="gramEnd"/>
+        <w:t>INSERT INTO users(</w:t>
+      </w:r>
     </w:p>
     <w:p>
       <w:pPr>
@@ -2324,14 +2162,12 @@
           <w:u w:val="single"/>
         </w:rPr>
       </w:pPr>
-      <w:proofErr w:type="gramStart"/>
       <w:r>
         <w:rPr>
           <w:u w:val="single"/>
         </w:rPr>
         <w:t>VALUES(</w:t>
       </w:r>
-      <w:proofErr w:type="gramEnd"/>
     </w:p>
     <w:p>
       <w:pPr>
@@ -2474,16 +2310,8 @@
         <w:rPr>
           <w:u w:val="single"/>
         </w:rPr>
-        <w:t xml:space="preserve">INSERT INTO </w:t>
-      </w:r>
-      <w:proofErr w:type="gramStart"/>
-      <w:r>
-        <w:rPr>
-          <w:u w:val="single"/>
-        </w:rPr>
-        <w:t>series(</w:t>
-      </w:r>
-      <w:proofErr w:type="gramEnd"/>
+        <w:t>INSERT INTO series(</w:t>
+      </w:r>
     </w:p>
     <w:p>
       <w:pPr>
@@ -2647,25 +2475,173 @@
           <w:bCs/>
           <w:u w:val="single"/>
         </w:rPr>
-        <w:t xml:space="preserve">ADD tags </w:t>
-      </w:r>
-      <w:proofErr w:type="gramStart"/>
-      <w:r>
-        <w:rPr>
-          <w:b/>
-          <w:bCs/>
-          <w:u w:val="single"/>
-        </w:rPr>
-        <w:t>VARCHAR(</w:t>
-      </w:r>
-      <w:proofErr w:type="gramEnd"/>
-      <w:r>
-        <w:rPr>
-          <w:b/>
-          <w:bCs/>
-          <w:u w:val="single"/>
-        </w:rPr>
-        <w:t>255);</w:t>
+        <w:t>ADD tags VARCHAR(255);</w:t>
+      </w:r>
+    </w:p>
+    <w:p>
+      <w:pPr>
+        <w:spacing w:after="0" w:line="240" w:lineRule="auto"/>
+        <w:rPr>
+          <w:b/>
+          <w:bCs/>
+          <w:u w:val="single"/>
+        </w:rPr>
+      </w:pPr>
+    </w:p>
+    <w:p>
+      <w:pPr>
+        <w:spacing w:after="0" w:line="240" w:lineRule="auto"/>
+        <w:rPr>
+          <w:b/>
+          <w:bCs/>
+          <w:u w:val="single"/>
+        </w:rPr>
+      </w:pPr>
+      <w:r>
+        <w:rPr>
+          <w:b/>
+          <w:bCs/>
+          <w:u w:val="single"/>
+        </w:rPr>
+        <w:sym w:font="Wingdings" w:char="F0E0"/>
+      </w:r>
+    </w:p>
+    <w:p>
+      <w:pPr>
+        <w:spacing w:after="0" w:line="240" w:lineRule="auto"/>
+        <w:rPr>
+          <w:b/>
+          <w:bCs/>
+          <w:u w:val="single"/>
+        </w:rPr>
+      </w:pPr>
+      <w:r>
+        <w:rPr>
+          <w:b/>
+          <w:bCs/>
+          <w:u w:val="single"/>
+        </w:rPr>
+        <w:t>UPDATE articles</w:t>
+      </w:r>
+    </w:p>
+    <w:p>
+      <w:pPr>
+        <w:spacing w:after="0" w:line="240" w:lineRule="auto"/>
+        <w:rPr>
+          <w:b/>
+          <w:bCs/>
+          <w:u w:val="single"/>
+        </w:rPr>
+      </w:pPr>
+    </w:p>
+    <w:p>
+      <w:pPr>
+        <w:spacing w:after="0" w:line="240" w:lineRule="auto"/>
+        <w:rPr>
+          <w:b/>
+          <w:bCs/>
+          <w:u w:val="single"/>
+        </w:rPr>
+      </w:pPr>
+      <w:r>
+        <w:rPr>
+          <w:b/>
+          <w:bCs/>
+          <w:u w:val="single"/>
+        </w:rPr>
+        <w:t>SET</w:t>
+      </w:r>
+    </w:p>
+    <w:p>
+      <w:pPr>
+        <w:spacing w:after="0" w:line="240" w:lineRule="auto"/>
+        <w:rPr>
+          <w:b/>
+          <w:bCs/>
+          <w:u w:val="single"/>
+        </w:rPr>
+      </w:pPr>
+      <w:r>
+        <w:rPr>
+          <w:b/>
+          <w:bCs/>
+          <w:u w:val="single"/>
+        </w:rPr>
+        <w:t>status='</w:t>
+      </w:r>
+      <w:proofErr w:type="spellStart"/>
+      <w:r>
+        <w:rPr>
+          <w:b/>
+          <w:bCs/>
+          <w:u w:val="single"/>
+        </w:rPr>
+        <w:t>revision_requested</w:t>
+      </w:r>
+      <w:proofErr w:type="spellEnd"/>
+      <w:r>
+        <w:rPr>
+          <w:b/>
+          <w:bCs/>
+          <w:u w:val="single"/>
+        </w:rPr>
+        <w:t>',</w:t>
+      </w:r>
+    </w:p>
+    <w:p>
+      <w:pPr>
+        <w:spacing w:after="0" w:line="240" w:lineRule="auto"/>
+        <w:rPr>
+          <w:b/>
+          <w:bCs/>
+          <w:u w:val="single"/>
+        </w:rPr>
+      </w:pPr>
+      <w:proofErr w:type="spellStart"/>
+      <w:r>
+        <w:rPr>
+          <w:b/>
+          <w:bCs/>
+          <w:u w:val="single"/>
+        </w:rPr>
+        <w:t>editor_feedback</w:t>
+      </w:r>
+      <w:proofErr w:type="spellEnd"/>
+      <w:r>
+        <w:rPr>
+          <w:b/>
+          <w:bCs/>
+          <w:u w:val="single"/>
+        </w:rPr>
+        <w:t>='Add more examples and improve introduction'</w:t>
+      </w:r>
+    </w:p>
+    <w:p>
+      <w:pPr>
+        <w:spacing w:after="0" w:line="240" w:lineRule="auto"/>
+        <w:rPr>
+          <w:b/>
+          <w:bCs/>
+          <w:u w:val="single"/>
+        </w:rPr>
+      </w:pPr>
+    </w:p>
+    <w:p>
+      <w:pPr>
+        <w:spacing w:after="0" w:line="240" w:lineRule="auto"/>
+        <w:rPr>
+          <w:b/>
+          <w:bCs/>
+          <w:u w:val="single"/>
+        </w:rPr>
+      </w:pPr>
+      <w:r>
+        <w:rPr>
+          <w:b/>
+          <w:bCs/>
+          <w:u w:val="single"/>
+        </w:rPr>
+        <w:t>WHERE id=1;</w:t>
       </w:r>
     </w:p>
     <w:p>

</xml_diff>

<commit_message>
View editor feedback when revision is requested and resubmit(#21)
</commit_message>
<xml_diff>
--- a/blogPost/DB Quries/blogPost.docx
+++ b/blogPost/DB Quries/blogPost.docx
@@ -224,15 +224,28 @@
         <w:spacing w:after="0" w:line="240" w:lineRule="auto"/>
       </w:pPr>
       <w:r>
+        <w:t xml:space="preserve">    bio TEXT,</w:t>
+      </w:r>
+    </w:p>
+    <w:p>
+      <w:pPr>
+        <w:spacing w:after="0" w:line="240" w:lineRule="auto"/>
+      </w:pPr>
+    </w:p>
+    <w:p>
+      <w:pPr>
+        <w:spacing w:after="0" w:line="240" w:lineRule="auto"/>
+      </w:pPr>
+      <w:r>
         <w:t xml:space="preserve">    </w:t>
       </w:r>
-      <w:proofErr w:type="gramStart"/>
-      <w:r>
-        <w:t>bio TEXT</w:t>
-      </w:r>
-      <w:proofErr w:type="gramEnd"/>
-      <w:r>
-        <w:t>,</w:t>
+      <w:proofErr w:type="spellStart"/>
+      <w:r>
+        <w:t>profile_pic</w:t>
+      </w:r>
+      <w:proofErr w:type="spellEnd"/>
+      <w:r>
+        <w:t xml:space="preserve"> VARCHAR(255),</w:t>
       </w:r>
     </w:p>
     <w:p>
@@ -249,19 +262,11 @@
       </w:r>
       <w:proofErr w:type="spellStart"/>
       <w:r>
-        <w:t>profile_pic</w:t>
-      </w:r>
-      <w:proofErr w:type="spellEnd"/>
-      <w:r>
-        <w:t xml:space="preserve"> </w:t>
-      </w:r>
-      <w:proofErr w:type="gramStart"/>
-      <w:r>
-        <w:t>VARCHAR(</w:t>
-      </w:r>
-      <w:proofErr w:type="gramEnd"/>
-      <w:r>
-        <w:t>255),</w:t>
+        <w:t>social_links</w:t>
+      </w:r>
+      <w:proofErr w:type="spellEnd"/>
+      <w:r>
+        <w:t xml:space="preserve"> JSON,</w:t>
       </w:r>
     </w:p>
     <w:p>
@@ -278,11 +283,11 @@
       </w:r>
       <w:proofErr w:type="spellStart"/>
       <w:r>
-        <w:t>social_links</w:t>
-      </w:r>
-      <w:proofErr w:type="spellEnd"/>
-      <w:r>
-        <w:t xml:space="preserve"> JSON,</w:t>
+        <w:t>is_active</w:t>
+      </w:r>
+      <w:proofErr w:type="spellEnd"/>
+      <w:r>
+        <w:t xml:space="preserve"> BOOLEAN DEFAULT TRUE,</w:t>
       </w:r>
     </w:p>
     <w:p>
@@ -299,11 +304,11 @@
       </w:r>
       <w:proofErr w:type="spellStart"/>
       <w:r>
-        <w:t>is_active</w:t>
-      </w:r>
-      <w:proofErr w:type="spellEnd"/>
-      <w:r>
-        <w:t xml:space="preserve"> BOOLEAN DEFAULT TRUE,</w:t>
+        <w:t>is_author_approved</w:t>
+      </w:r>
+      <w:proofErr w:type="spellEnd"/>
+      <w:r>
+        <w:t xml:space="preserve"> BOOLEAN DEFAULT FALSE,</w:t>
       </w:r>
     </w:p>
     <w:p>
@@ -320,11 +325,125 @@
       </w:r>
       <w:proofErr w:type="spellStart"/>
       <w:r>
-        <w:t>is_author_approved</w:t>
-      </w:r>
-      <w:proofErr w:type="spellEnd"/>
-      <w:r>
-        <w:t xml:space="preserve"> BOOLEAN DEFAULT FALSE,</w:t>
+        <w:t>created_at</w:t>
+      </w:r>
+      <w:proofErr w:type="spellEnd"/>
+      <w:r>
+        <w:t xml:space="preserve"> TIMESTAMP DEFAULT CURRENT_TIMESTAMP</w:t>
+      </w:r>
+    </w:p>
+    <w:p>
+      <w:pPr>
+        <w:spacing w:after="0" w:line="240" w:lineRule="auto"/>
+      </w:pPr>
+    </w:p>
+    <w:p>
+      <w:pPr>
+        <w:spacing w:after="0" w:line="240" w:lineRule="auto"/>
+      </w:pPr>
+      <w:r>
+        <w:t>) ENGINE=</w:t>
+      </w:r>
+      <w:proofErr w:type="spellStart"/>
+      <w:r>
+        <w:t>InnoDB</w:t>
+      </w:r>
+      <w:proofErr w:type="spellEnd"/>
+      <w:r>
+        <w:t>;</w:t>
+      </w:r>
+    </w:p>
+    <w:p>
+      <w:pPr>
+        <w:spacing w:after="0" w:line="240" w:lineRule="auto"/>
+      </w:pPr>
+    </w:p>
+    <w:p>
+      <w:pPr>
+        <w:spacing w:after="0" w:line="240" w:lineRule="auto"/>
+        <w:rPr>
+          <w:b/>
+          <w:bCs/>
+          <w:u w:val="single"/>
+        </w:rPr>
+      </w:pPr>
+      <w:r>
+        <w:rPr>
+          <w:b/>
+          <w:bCs/>
+          <w:u w:val="single"/>
+        </w:rPr>
+        <w:t>2.Categories</w:t>
+      </w:r>
+    </w:p>
+    <w:p>
+      <w:pPr>
+        <w:spacing w:after="0" w:line="240" w:lineRule="auto"/>
+        <w:rPr>
+          <w:b/>
+          <w:bCs/>
+          <w:u w:val="single"/>
+        </w:rPr>
+      </w:pPr>
+    </w:p>
+    <w:p>
+      <w:pPr>
+        <w:spacing w:after="0" w:line="240" w:lineRule="auto"/>
+      </w:pPr>
+      <w:r>
+        <w:t>CREATE TABLE categories(</w:t>
+      </w:r>
+    </w:p>
+    <w:p>
+      <w:pPr>
+        <w:spacing w:after="0" w:line="240" w:lineRule="auto"/>
+      </w:pPr>
+    </w:p>
+    <w:p>
+      <w:pPr>
+        <w:spacing w:after="0" w:line="240" w:lineRule="auto"/>
+      </w:pPr>
+      <w:r>
+        <w:t xml:space="preserve">    id INT PRIMARY KEY AUTO_INCREMENT,</w:t>
+      </w:r>
+    </w:p>
+    <w:p>
+      <w:pPr>
+        <w:spacing w:after="0" w:line="240" w:lineRule="auto"/>
+      </w:pPr>
+    </w:p>
+    <w:p>
+      <w:pPr>
+        <w:spacing w:after="0" w:line="240" w:lineRule="auto"/>
+      </w:pPr>
+      <w:r>
+        <w:t xml:space="preserve">    name VARCHAR(100) NOT NULL,</w:t>
+      </w:r>
+    </w:p>
+    <w:p>
+      <w:pPr>
+        <w:spacing w:after="0" w:line="240" w:lineRule="auto"/>
+      </w:pPr>
+    </w:p>
+    <w:p>
+      <w:pPr>
+        <w:spacing w:after="0" w:line="240" w:lineRule="auto"/>
+      </w:pPr>
+      <w:r>
+        <w:t xml:space="preserve">    slug VARCHAR(100) UNIQUE NOT NULL,</w:t>
+      </w:r>
+    </w:p>
+    <w:p>
+      <w:pPr>
+        <w:spacing w:after="0" w:line="240" w:lineRule="auto"/>
+      </w:pPr>
+    </w:p>
+    <w:p>
+      <w:pPr>
+        <w:spacing w:after="0" w:line="240" w:lineRule="auto"/>
+      </w:pPr>
+      <w:r>
+        <w:t xml:space="preserve">    description TEXT,</w:t>
       </w:r>
     </w:p>
     <w:p>
@@ -341,11 +460,227 @@
       </w:r>
       <w:proofErr w:type="spellStart"/>
       <w:r>
+        <w:t>created_by</w:t>
+      </w:r>
+      <w:proofErr w:type="spellEnd"/>
+      <w:r>
+        <w:t xml:space="preserve"> INT</w:t>
+      </w:r>
+    </w:p>
+    <w:p>
+      <w:pPr>
+        <w:spacing w:after="0" w:line="240" w:lineRule="auto"/>
+      </w:pPr>
+    </w:p>
+    <w:p>
+      <w:pPr>
+        <w:spacing w:after="0" w:line="240" w:lineRule="auto"/>
+      </w:pPr>
+      <w:r>
+        <w:t>) ENGINE=</w:t>
+      </w:r>
+      <w:proofErr w:type="spellStart"/>
+      <w:r>
+        <w:t>InnoDB</w:t>
+      </w:r>
+      <w:proofErr w:type="spellEnd"/>
+      <w:r>
+        <w:t>;</w:t>
+      </w:r>
+    </w:p>
+    <w:p>
+      <w:pPr>
+        <w:spacing w:after="0" w:line="240" w:lineRule="auto"/>
+      </w:pPr>
+    </w:p>
+    <w:p>
+      <w:pPr>
+        <w:spacing w:after="0" w:line="240" w:lineRule="auto"/>
+      </w:pPr>
+    </w:p>
+    <w:p>
+      <w:pPr>
+        <w:spacing w:after="0" w:line="240" w:lineRule="auto"/>
+        <w:rPr>
+          <w:b/>
+          <w:bCs/>
+          <w:u w:val="single"/>
+        </w:rPr>
+      </w:pPr>
+      <w:r>
+        <w:rPr>
+          <w:b/>
+          <w:bCs/>
+          <w:u w:val="single"/>
+        </w:rPr>
+        <w:t>3.Series</w:t>
+      </w:r>
+    </w:p>
+    <w:p>
+      <w:pPr>
+        <w:spacing w:after="0" w:line="240" w:lineRule="auto"/>
+        <w:rPr>
+          <w:b/>
+          <w:bCs/>
+          <w:u w:val="single"/>
+        </w:rPr>
+      </w:pPr>
+    </w:p>
+    <w:p>
+      <w:pPr>
+        <w:spacing w:after="0" w:line="240" w:lineRule="auto"/>
+        <w:rPr>
+          <w:b/>
+          <w:bCs/>
+          <w:u w:val="single"/>
+        </w:rPr>
+      </w:pPr>
+    </w:p>
+    <w:p>
+      <w:pPr>
+        <w:spacing w:after="0" w:line="240" w:lineRule="auto"/>
+      </w:pPr>
+      <w:r>
+        <w:t>CREATE TABLE series(</w:t>
+      </w:r>
+    </w:p>
+    <w:p>
+      <w:pPr>
+        <w:spacing w:after="0" w:line="240" w:lineRule="auto"/>
+      </w:pPr>
+    </w:p>
+    <w:p>
+      <w:pPr>
+        <w:spacing w:after="0" w:line="240" w:lineRule="auto"/>
+      </w:pPr>
+      <w:r>
+        <w:t xml:space="preserve">    id INT PRIMARY KEY AUTO_INCREMENT,</w:t>
+      </w:r>
+    </w:p>
+    <w:p>
+      <w:pPr>
+        <w:spacing w:after="0" w:line="240" w:lineRule="auto"/>
+      </w:pPr>
+    </w:p>
+    <w:p>
+      <w:pPr>
+        <w:spacing w:after="0" w:line="240" w:lineRule="auto"/>
+      </w:pPr>
+      <w:r>
+        <w:t xml:space="preserve">    </w:t>
+      </w:r>
+      <w:proofErr w:type="spellStart"/>
+      <w:r>
+        <w:t>author_id</w:t>
+      </w:r>
+      <w:proofErr w:type="spellEnd"/>
+      <w:r>
+        <w:t xml:space="preserve"> INT NOT NULL,</w:t>
+      </w:r>
+    </w:p>
+    <w:p>
+      <w:pPr>
+        <w:spacing w:after="0" w:line="240" w:lineRule="auto"/>
+      </w:pPr>
+    </w:p>
+    <w:p>
+      <w:pPr>
+        <w:spacing w:after="0" w:line="240" w:lineRule="auto"/>
+      </w:pPr>
+      <w:r>
+        <w:t xml:space="preserve">    title VARCHAR(255) NOT NULL,</w:t>
+      </w:r>
+    </w:p>
+    <w:p>
+      <w:pPr>
+        <w:spacing w:after="0" w:line="240" w:lineRule="auto"/>
+      </w:pPr>
+    </w:p>
+    <w:p>
+      <w:pPr>
+        <w:spacing w:after="0" w:line="240" w:lineRule="auto"/>
+      </w:pPr>
+      <w:r>
+        <w:t xml:space="preserve">    description TEXT,</w:t>
+      </w:r>
+    </w:p>
+    <w:p>
+      <w:pPr>
+        <w:spacing w:after="0" w:line="240" w:lineRule="auto"/>
+      </w:pPr>
+    </w:p>
+    <w:p>
+      <w:pPr>
+        <w:spacing w:after="0" w:line="240" w:lineRule="auto"/>
+      </w:pPr>
+      <w:r>
+        <w:t xml:space="preserve">    </w:t>
+      </w:r>
+      <w:proofErr w:type="spellStart"/>
+      <w:r>
+        <w:t>cover_image_path</w:t>
+      </w:r>
+      <w:proofErr w:type="spellEnd"/>
+      <w:r>
+        <w:t xml:space="preserve"> VARCHAR(255),</w:t>
+      </w:r>
+    </w:p>
+    <w:p>
+      <w:pPr>
+        <w:spacing w:after="0" w:line="240" w:lineRule="auto"/>
+      </w:pPr>
+    </w:p>
+    <w:p>
+      <w:pPr>
+        <w:spacing w:after="0" w:line="240" w:lineRule="auto"/>
+      </w:pPr>
+      <w:r>
+        <w:t xml:space="preserve">    </w:t>
+      </w:r>
+      <w:proofErr w:type="spellStart"/>
+      <w:r>
         <w:t>created_at</w:t>
       </w:r>
       <w:proofErr w:type="spellEnd"/>
       <w:r>
-        <w:t xml:space="preserve"> TIMESTAMP DEFAULT CURRENT_TIMESTAMP</w:t>
+        <w:t xml:space="preserve"> TIMESTAMP DEFAULT CURRENT_TIMESTAMP,</w:t>
+      </w:r>
+    </w:p>
+    <w:p>
+      <w:pPr>
+        <w:spacing w:after="0" w:line="240" w:lineRule="auto"/>
+      </w:pPr>
+    </w:p>
+    <w:p>
+      <w:pPr>
+        <w:spacing w:after="0" w:line="240" w:lineRule="auto"/>
+      </w:pPr>
+      <w:r>
+        <w:t xml:space="preserve">    FOREIGN KEY(</w:t>
+      </w:r>
+      <w:proofErr w:type="spellStart"/>
+      <w:r>
+        <w:t>author_id</w:t>
+      </w:r>
+      <w:proofErr w:type="spellEnd"/>
+      <w:r>
+        <w:t>)</w:t>
+      </w:r>
+    </w:p>
+    <w:p>
+      <w:pPr>
+        <w:spacing w:after="0" w:line="240" w:lineRule="auto"/>
+      </w:pPr>
+      <w:r>
+        <w:t xml:space="preserve">    REFERENCES users(id)</w:t>
+      </w:r>
+    </w:p>
+    <w:p>
+      <w:pPr>
+        <w:spacing w:after="0" w:line="240" w:lineRule="auto"/>
+      </w:pPr>
+      <w:r>
+        <w:t xml:space="preserve">    ON DELETE CASCADE</w:t>
       </w:r>
     </w:p>
     <w:p>
@@ -377,404 +712,6 @@
     <w:p>
       <w:pPr>
         <w:spacing w:after="0" w:line="240" w:lineRule="auto"/>
-        <w:rPr>
-          <w:b/>
-          <w:bCs/>
-          <w:u w:val="single"/>
-        </w:rPr>
-      </w:pPr>
-      <w:r>
-        <w:rPr>
-          <w:b/>
-          <w:bCs/>
-          <w:u w:val="single"/>
-        </w:rPr>
-        <w:t>2.Categories</w:t>
-      </w:r>
-    </w:p>
-    <w:p>
-      <w:pPr>
-        <w:spacing w:after="0" w:line="240" w:lineRule="auto"/>
-        <w:rPr>
-          <w:b/>
-          <w:bCs/>
-          <w:u w:val="single"/>
-        </w:rPr>
-      </w:pPr>
-    </w:p>
-    <w:p>
-      <w:pPr>
-        <w:spacing w:after="0" w:line="240" w:lineRule="auto"/>
-      </w:pPr>
-      <w:r>
-        <w:t xml:space="preserve">CREATE TABLE </w:t>
-      </w:r>
-      <w:proofErr w:type="gramStart"/>
-      <w:r>
-        <w:t>categories(</w:t>
-      </w:r>
-      <w:proofErr w:type="gramEnd"/>
-    </w:p>
-    <w:p>
-      <w:pPr>
-        <w:spacing w:after="0" w:line="240" w:lineRule="auto"/>
-      </w:pPr>
-    </w:p>
-    <w:p>
-      <w:pPr>
-        <w:spacing w:after="0" w:line="240" w:lineRule="auto"/>
-      </w:pPr>
-      <w:r>
-        <w:t xml:space="preserve">    id INT PRIMARY KEY AUTO_INCREMENT,</w:t>
-      </w:r>
-    </w:p>
-    <w:p>
-      <w:pPr>
-        <w:spacing w:after="0" w:line="240" w:lineRule="auto"/>
-      </w:pPr>
-    </w:p>
-    <w:p>
-      <w:pPr>
-        <w:spacing w:after="0" w:line="240" w:lineRule="auto"/>
-      </w:pPr>
-      <w:r>
-        <w:t xml:space="preserve">    name </w:t>
-      </w:r>
-      <w:proofErr w:type="gramStart"/>
-      <w:r>
-        <w:t>VARCHAR(</w:t>
-      </w:r>
-      <w:proofErr w:type="gramEnd"/>
-      <w:r>
-        <w:t>100) NOT NULL,</w:t>
-      </w:r>
-    </w:p>
-    <w:p>
-      <w:pPr>
-        <w:spacing w:after="0" w:line="240" w:lineRule="auto"/>
-      </w:pPr>
-    </w:p>
-    <w:p>
-      <w:pPr>
-        <w:spacing w:after="0" w:line="240" w:lineRule="auto"/>
-      </w:pPr>
-      <w:r>
-        <w:t xml:space="preserve">    slug </w:t>
-      </w:r>
-      <w:proofErr w:type="gramStart"/>
-      <w:r>
-        <w:t>VARCHAR(</w:t>
-      </w:r>
-      <w:proofErr w:type="gramEnd"/>
-      <w:r>
-        <w:t>100) UNIQUE NOT NULL,</w:t>
-      </w:r>
-    </w:p>
-    <w:p>
-      <w:pPr>
-        <w:spacing w:after="0" w:line="240" w:lineRule="auto"/>
-      </w:pPr>
-    </w:p>
-    <w:p>
-      <w:pPr>
-        <w:spacing w:after="0" w:line="240" w:lineRule="auto"/>
-      </w:pPr>
-      <w:r>
-        <w:t xml:space="preserve">    description TEXT,</w:t>
-      </w:r>
-    </w:p>
-    <w:p>
-      <w:pPr>
-        <w:spacing w:after="0" w:line="240" w:lineRule="auto"/>
-      </w:pPr>
-    </w:p>
-    <w:p>
-      <w:pPr>
-        <w:spacing w:after="0" w:line="240" w:lineRule="auto"/>
-      </w:pPr>
-      <w:r>
-        <w:t xml:space="preserve">    </w:t>
-      </w:r>
-      <w:proofErr w:type="spellStart"/>
-      <w:r>
-        <w:t>created_by</w:t>
-      </w:r>
-      <w:proofErr w:type="spellEnd"/>
-      <w:r>
-        <w:t xml:space="preserve"> INT</w:t>
-      </w:r>
-    </w:p>
-    <w:p>
-      <w:pPr>
-        <w:spacing w:after="0" w:line="240" w:lineRule="auto"/>
-      </w:pPr>
-    </w:p>
-    <w:p>
-      <w:pPr>
-        <w:spacing w:after="0" w:line="240" w:lineRule="auto"/>
-      </w:pPr>
-      <w:r>
-        <w:t>) ENGINE=</w:t>
-      </w:r>
-      <w:proofErr w:type="spellStart"/>
-      <w:r>
-        <w:t>InnoDB</w:t>
-      </w:r>
-      <w:proofErr w:type="spellEnd"/>
-      <w:r>
-        <w:t>;</w:t>
-      </w:r>
-    </w:p>
-    <w:p>
-      <w:pPr>
-        <w:spacing w:after="0" w:line="240" w:lineRule="auto"/>
-      </w:pPr>
-    </w:p>
-    <w:p>
-      <w:pPr>
-        <w:spacing w:after="0" w:line="240" w:lineRule="auto"/>
-      </w:pPr>
-    </w:p>
-    <w:p>
-      <w:pPr>
-        <w:spacing w:after="0" w:line="240" w:lineRule="auto"/>
-        <w:rPr>
-          <w:b/>
-          <w:bCs/>
-          <w:u w:val="single"/>
-        </w:rPr>
-      </w:pPr>
-      <w:r>
-        <w:rPr>
-          <w:b/>
-          <w:bCs/>
-          <w:u w:val="single"/>
-        </w:rPr>
-        <w:t>3.Series</w:t>
-      </w:r>
-    </w:p>
-    <w:p>
-      <w:pPr>
-        <w:spacing w:after="0" w:line="240" w:lineRule="auto"/>
-        <w:rPr>
-          <w:b/>
-          <w:bCs/>
-          <w:u w:val="single"/>
-        </w:rPr>
-      </w:pPr>
-    </w:p>
-    <w:p>
-      <w:pPr>
-        <w:spacing w:after="0" w:line="240" w:lineRule="auto"/>
-        <w:rPr>
-          <w:b/>
-          <w:bCs/>
-          <w:u w:val="single"/>
-        </w:rPr>
-      </w:pPr>
-    </w:p>
-    <w:p>
-      <w:pPr>
-        <w:spacing w:after="0" w:line="240" w:lineRule="auto"/>
-      </w:pPr>
-      <w:r>
-        <w:t xml:space="preserve">CREATE TABLE </w:t>
-      </w:r>
-      <w:proofErr w:type="gramStart"/>
-      <w:r>
-        <w:t>series(</w:t>
-      </w:r>
-      <w:proofErr w:type="gramEnd"/>
-    </w:p>
-    <w:p>
-      <w:pPr>
-        <w:spacing w:after="0" w:line="240" w:lineRule="auto"/>
-      </w:pPr>
-    </w:p>
-    <w:p>
-      <w:pPr>
-        <w:spacing w:after="0" w:line="240" w:lineRule="auto"/>
-      </w:pPr>
-      <w:r>
-        <w:t xml:space="preserve">    id INT PRIMARY KEY AUTO_INCREMENT,</w:t>
-      </w:r>
-    </w:p>
-    <w:p>
-      <w:pPr>
-        <w:spacing w:after="0" w:line="240" w:lineRule="auto"/>
-      </w:pPr>
-    </w:p>
-    <w:p>
-      <w:pPr>
-        <w:spacing w:after="0" w:line="240" w:lineRule="auto"/>
-      </w:pPr>
-      <w:r>
-        <w:t xml:space="preserve">    </w:t>
-      </w:r>
-      <w:proofErr w:type="spellStart"/>
-      <w:r>
-        <w:t>author_id</w:t>
-      </w:r>
-      <w:proofErr w:type="spellEnd"/>
-      <w:r>
-        <w:t xml:space="preserve"> INT NOT NULL,</w:t>
-      </w:r>
-    </w:p>
-    <w:p>
-      <w:pPr>
-        <w:spacing w:after="0" w:line="240" w:lineRule="auto"/>
-      </w:pPr>
-    </w:p>
-    <w:p>
-      <w:pPr>
-        <w:spacing w:after="0" w:line="240" w:lineRule="auto"/>
-      </w:pPr>
-      <w:r>
-        <w:t xml:space="preserve">    title </w:t>
-      </w:r>
-      <w:proofErr w:type="gramStart"/>
-      <w:r>
-        <w:t>VARCHAR(</w:t>
-      </w:r>
-      <w:proofErr w:type="gramEnd"/>
-      <w:r>
-        <w:t>255) NOT NULL,</w:t>
-      </w:r>
-    </w:p>
-    <w:p>
-      <w:pPr>
-        <w:spacing w:after="0" w:line="240" w:lineRule="auto"/>
-      </w:pPr>
-    </w:p>
-    <w:p>
-      <w:pPr>
-        <w:spacing w:after="0" w:line="240" w:lineRule="auto"/>
-      </w:pPr>
-      <w:r>
-        <w:t xml:space="preserve">    description TEXT,</w:t>
-      </w:r>
-    </w:p>
-    <w:p>
-      <w:pPr>
-        <w:spacing w:after="0" w:line="240" w:lineRule="auto"/>
-      </w:pPr>
-    </w:p>
-    <w:p>
-      <w:pPr>
-        <w:spacing w:after="0" w:line="240" w:lineRule="auto"/>
-      </w:pPr>
-      <w:r>
-        <w:t xml:space="preserve">    </w:t>
-      </w:r>
-      <w:proofErr w:type="spellStart"/>
-      <w:r>
-        <w:t>cover_image_path</w:t>
-      </w:r>
-      <w:proofErr w:type="spellEnd"/>
-      <w:r>
-        <w:t xml:space="preserve"> </w:t>
-      </w:r>
-      <w:proofErr w:type="gramStart"/>
-      <w:r>
-        <w:t>VARCHAR(</w:t>
-      </w:r>
-      <w:proofErr w:type="gramEnd"/>
-      <w:r>
-        <w:t>255),</w:t>
-      </w:r>
-    </w:p>
-    <w:p>
-      <w:pPr>
-        <w:spacing w:after="0" w:line="240" w:lineRule="auto"/>
-      </w:pPr>
-    </w:p>
-    <w:p>
-      <w:pPr>
-        <w:spacing w:after="0" w:line="240" w:lineRule="auto"/>
-      </w:pPr>
-      <w:r>
-        <w:t xml:space="preserve">    </w:t>
-      </w:r>
-      <w:proofErr w:type="spellStart"/>
-      <w:r>
-        <w:t>created_at</w:t>
-      </w:r>
-      <w:proofErr w:type="spellEnd"/>
-      <w:r>
-        <w:t xml:space="preserve"> TIMESTAMP DEFAULT CURRENT_TIMESTAMP,</w:t>
-      </w:r>
-    </w:p>
-    <w:p>
-      <w:pPr>
-        <w:spacing w:after="0" w:line="240" w:lineRule="auto"/>
-      </w:pPr>
-    </w:p>
-    <w:p>
-      <w:pPr>
-        <w:spacing w:after="0" w:line="240" w:lineRule="auto"/>
-      </w:pPr>
-      <w:r>
-        <w:t xml:space="preserve">    FOREIGN </w:t>
-      </w:r>
-      <w:proofErr w:type="gramStart"/>
-      <w:r>
-        <w:t>KEY(</w:t>
-      </w:r>
-      <w:proofErr w:type="spellStart"/>
-      <w:proofErr w:type="gramEnd"/>
-      <w:r>
-        <w:t>author_id</w:t>
-      </w:r>
-      <w:proofErr w:type="spellEnd"/>
-      <w:r>
-        <w:t>)</w:t>
-      </w:r>
-    </w:p>
-    <w:p>
-      <w:pPr>
-        <w:spacing w:after="0" w:line="240" w:lineRule="auto"/>
-      </w:pPr>
-      <w:r>
-        <w:t xml:space="preserve">    REFERENCES users(id)</w:t>
-      </w:r>
-    </w:p>
-    <w:p>
-      <w:pPr>
-        <w:spacing w:after="0" w:line="240" w:lineRule="auto"/>
-      </w:pPr>
-      <w:r>
-        <w:t xml:space="preserve">    ON DELETE CASCADE</w:t>
-      </w:r>
-    </w:p>
-    <w:p>
-      <w:pPr>
-        <w:spacing w:after="0" w:line="240" w:lineRule="auto"/>
-      </w:pPr>
-    </w:p>
-    <w:p>
-      <w:pPr>
-        <w:spacing w:after="0" w:line="240" w:lineRule="auto"/>
-      </w:pPr>
-      <w:r>
-        <w:t>) ENGINE=</w:t>
-      </w:r>
-      <w:proofErr w:type="spellStart"/>
-      <w:r>
-        <w:t>InnoDB</w:t>
-      </w:r>
-      <w:proofErr w:type="spellEnd"/>
-      <w:r>
-        <w:t>;</w:t>
-      </w:r>
-    </w:p>
-    <w:p>
-      <w:pPr>
-        <w:spacing w:after="0" w:line="240" w:lineRule="auto"/>
-      </w:pPr>
-    </w:p>
-    <w:p>
-      <w:pPr>
-        <w:spacing w:after="0" w:line="240" w:lineRule="auto"/>
       </w:pPr>
     </w:p>
     <w:p>
@@ -805,13 +742,8 @@
         <w:spacing w:after="0" w:line="240" w:lineRule="auto"/>
       </w:pPr>
       <w:r>
-        <w:t xml:space="preserve">CREATE TABLE </w:t>
-      </w:r>
-      <w:proofErr w:type="gramStart"/>
-      <w:r>
-        <w:t>articles(</w:t>
-      </w:r>
-      <w:proofErr w:type="gramEnd"/>
+        <w:t>CREATE TABLE articles(</w:t>
+      </w:r>
     </w:p>
     <w:p>
       <w:pPr>
@@ -921,36 +853,20 @@
         <w:spacing w:after="0" w:line="240" w:lineRule="auto"/>
       </w:pPr>
       <w:r>
-        <w:t xml:space="preserve">    title </w:t>
-      </w:r>
-      <w:proofErr w:type="gramStart"/>
-      <w:r>
-        <w:t>VARCHAR(</w:t>
-      </w:r>
-      <w:proofErr w:type="gramEnd"/>
-      <w:r>
-        <w:t>255) NOT NULL,</w:t>
-      </w:r>
-    </w:p>
-    <w:p>
-      <w:pPr>
-        <w:spacing w:after="0" w:line="240" w:lineRule="auto"/>
-      </w:pPr>
-    </w:p>
-    <w:p>
-      <w:pPr>
-        <w:spacing w:after="0" w:line="240" w:lineRule="auto"/>
-      </w:pPr>
-      <w:r>
-        <w:t xml:space="preserve">    slug </w:t>
-      </w:r>
-      <w:proofErr w:type="gramStart"/>
-      <w:r>
-        <w:t>VARCHAR(</w:t>
-      </w:r>
-      <w:proofErr w:type="gramEnd"/>
-      <w:r>
-        <w:t>255) UNIQUE NOT NULL,</w:t>
+        <w:t xml:space="preserve">    title VARCHAR(255) NOT NULL,</w:t>
+      </w:r>
+    </w:p>
+    <w:p>
+      <w:pPr>
+        <w:spacing w:after="0" w:line="240" w:lineRule="auto"/>
+      </w:pPr>
+    </w:p>
+    <w:p>
+      <w:pPr>
+        <w:spacing w:after="0" w:line="240" w:lineRule="auto"/>
+      </w:pPr>
+      <w:r>
+        <w:t xml:space="preserve">    slug VARCHAR(255) UNIQUE NOT NULL,</w:t>
       </w:r>
     </w:p>
     <w:p>
@@ -997,34 +913,21 @@
       </w:r>
       <w:proofErr w:type="spellEnd"/>
       <w:r>
-        <w:t xml:space="preserve"> </w:t>
-      </w:r>
-      <w:proofErr w:type="gramStart"/>
-      <w:r>
-        <w:t>VARCHAR(</w:t>
-      </w:r>
-      <w:proofErr w:type="gramEnd"/>
-      <w:r>
-        <w:t>255),</w:t>
-      </w:r>
-    </w:p>
-    <w:p>
-      <w:pPr>
-        <w:spacing w:after="0" w:line="240" w:lineRule="auto"/>
-      </w:pPr>
-    </w:p>
-    <w:p>
-      <w:pPr>
-        <w:spacing w:after="0" w:line="240" w:lineRule="auto"/>
-      </w:pPr>
-      <w:r>
-        <w:t xml:space="preserve">    status </w:t>
-      </w:r>
-      <w:proofErr w:type="gramStart"/>
-      <w:r>
-        <w:t>ENUM(</w:t>
-      </w:r>
-      <w:proofErr w:type="gramEnd"/>
+        <w:t xml:space="preserve"> VARCHAR(255),</w:t>
+      </w:r>
+    </w:p>
+    <w:p>
+      <w:pPr>
+        <w:spacing w:after="0" w:line="240" w:lineRule="auto"/>
+      </w:pPr>
+    </w:p>
+    <w:p>
+      <w:pPr>
+        <w:spacing w:after="0" w:line="240" w:lineRule="auto"/>
+      </w:pPr>
+      <w:r>
+        <w:t xml:space="preserve">    status ENUM(</w:t>
+      </w:r>
     </w:p>
     <w:p>
       <w:pPr>
@@ -1050,13 +953,8 @@
         <w:t xml:space="preserve">        '</w:t>
       </w:r>
       <w:proofErr w:type="spellStart"/>
-      <w:proofErr w:type="gramStart"/>
-      <w:r>
-        <w:t>revision</w:t>
-      </w:r>
-      <w:proofErr w:type="gramEnd"/>
-      <w:r>
-        <w:t>_requested</w:t>
+      <w:r>
+        <w:t>revision_requested</w:t>
       </w:r>
       <w:proofErr w:type="spellEnd"/>
       <w:r>
@@ -1239,14 +1137,9 @@
         <w:spacing w:after="0" w:line="240" w:lineRule="auto"/>
       </w:pPr>
       <w:r>
-        <w:t xml:space="preserve">    FOREIGN </w:t>
-      </w:r>
-      <w:proofErr w:type="gramStart"/>
-      <w:r>
-        <w:t>KEY(</w:t>
-      </w:r>
-      <w:proofErr w:type="spellStart"/>
-      <w:proofErr w:type="gramEnd"/>
+        <w:t xml:space="preserve">    FOREIGN KEY(</w:t>
+      </w:r>
+      <w:proofErr w:type="spellStart"/>
       <w:r>
         <w:t>author_id</w:t>
       </w:r>
@@ -1281,14 +1174,9 @@
         <w:spacing w:after="0" w:line="240" w:lineRule="auto"/>
       </w:pPr>
       <w:r>
-        <w:t xml:space="preserve">    FOREIGN </w:t>
-      </w:r>
-      <w:proofErr w:type="gramStart"/>
-      <w:r>
-        <w:t>KEY(</w:t>
-      </w:r>
-      <w:proofErr w:type="spellStart"/>
-      <w:proofErr w:type="gramEnd"/>
+        <w:t xml:space="preserve">    FOREIGN KEY(</w:t>
+      </w:r>
+      <w:proofErr w:type="spellStart"/>
       <w:r>
         <w:t>editor_id</w:t>
       </w:r>
@@ -1323,14 +1211,9 @@
         <w:spacing w:after="0" w:line="240" w:lineRule="auto"/>
       </w:pPr>
       <w:r>
-        <w:t xml:space="preserve">    FOREIGN </w:t>
-      </w:r>
-      <w:proofErr w:type="gramStart"/>
-      <w:r>
-        <w:t>KEY(</w:t>
-      </w:r>
-      <w:proofErr w:type="spellStart"/>
-      <w:proofErr w:type="gramEnd"/>
+        <w:t xml:space="preserve">    FOREIGN KEY(</w:t>
+      </w:r>
+      <w:proofErr w:type="spellStart"/>
       <w:r>
         <w:t>category_id</w:t>
       </w:r>
@@ -1366,14 +1249,9 @@
         <w:spacing w:after="0" w:line="240" w:lineRule="auto"/>
       </w:pPr>
       <w:r>
-        <w:t xml:space="preserve">    FOREIGN </w:t>
-      </w:r>
-      <w:proofErr w:type="gramStart"/>
-      <w:r>
-        <w:t>KEY(</w:t>
-      </w:r>
-      <w:proofErr w:type="spellStart"/>
-      <w:proofErr w:type="gramEnd"/>
+        <w:t xml:space="preserve">    FOREIGN KEY(</w:t>
+      </w:r>
+      <w:proofErr w:type="spellStart"/>
       <w:r>
         <w:t>series_id</w:t>
       </w:r>
@@ -1488,14 +1366,7 @@
         <w:rPr>
           <w:u w:val="single"/>
         </w:rPr>
-        <w:t>article_</w:t>
-      </w:r>
-      <w:proofErr w:type="gramStart"/>
-      <w:r>
-        <w:rPr>
-          <w:u w:val="single"/>
-        </w:rPr>
-        <w:t>revisions</w:t>
+        <w:t>article_revisions</w:t>
       </w:r>
       <w:proofErr w:type="spellEnd"/>
       <w:r>
@@ -1504,7 +1375,6 @@
         </w:rPr>
         <w:t>(</w:t>
       </w:r>
-      <w:proofErr w:type="gramEnd"/>
     </w:p>
     <w:p>
       <w:pPr>
@@ -1691,17 +1561,9 @@
         <w:rPr>
           <w:u w:val="single"/>
         </w:rPr>
-        <w:t xml:space="preserve">    FOREIGN </w:t>
-      </w:r>
-      <w:proofErr w:type="gramStart"/>
-      <w:r>
-        <w:rPr>
-          <w:u w:val="single"/>
-        </w:rPr>
-        <w:t>KEY(</w:t>
-      </w:r>
-      <w:proofErr w:type="spellStart"/>
-      <w:proofErr w:type="gramEnd"/>
+        <w:t xml:space="preserve">    FOREIGN KEY(</w:t>
+      </w:r>
+      <w:proofErr w:type="spellStart"/>
       <w:r>
         <w:rPr>
           <w:u w:val="single"/>
@@ -1763,17 +1625,9 @@
         <w:rPr>
           <w:u w:val="single"/>
         </w:rPr>
-        <w:t xml:space="preserve">    FOREIGN </w:t>
-      </w:r>
-      <w:proofErr w:type="gramStart"/>
-      <w:r>
-        <w:rPr>
-          <w:u w:val="single"/>
-        </w:rPr>
-        <w:t>KEY(</w:t>
-      </w:r>
-      <w:proofErr w:type="spellStart"/>
-      <w:proofErr w:type="gramEnd"/>
+        <w:t xml:space="preserve">    FOREIGN KEY(</w:t>
+      </w:r>
+      <w:proofErr w:type="spellStart"/>
       <w:r>
         <w:rPr>
           <w:u w:val="single"/>
@@ -1990,16 +1844,8 @@
         <w:rPr>
           <w:u w:val="single"/>
         </w:rPr>
-        <w:t xml:space="preserve">INSERT INTO </w:t>
-      </w:r>
-      <w:proofErr w:type="gramStart"/>
-      <w:r>
-        <w:rPr>
-          <w:u w:val="single"/>
-        </w:rPr>
-        <w:t>categories(</w:t>
-      </w:r>
-      <w:proofErr w:type="gramEnd"/>
+        <w:t>INSERT INTO categories(</w:t>
+      </w:r>
     </w:p>
     <w:p>
       <w:pPr>
@@ -2190,16 +2036,8 @@
         <w:rPr>
           <w:u w:val="single"/>
         </w:rPr>
-        <w:t xml:space="preserve">INSERT INTO </w:t>
-      </w:r>
-      <w:proofErr w:type="gramStart"/>
-      <w:r>
-        <w:rPr>
-          <w:u w:val="single"/>
-        </w:rPr>
-        <w:t>users(</w:t>
-      </w:r>
-      <w:proofErr w:type="gramEnd"/>
+        <w:t>INSERT INTO users(</w:t>
+      </w:r>
     </w:p>
     <w:p>
       <w:pPr>
@@ -2324,14 +2162,12 @@
           <w:u w:val="single"/>
         </w:rPr>
       </w:pPr>
-      <w:proofErr w:type="gramStart"/>
       <w:r>
         <w:rPr>
           <w:u w:val="single"/>
         </w:rPr>
         <w:t>VALUES(</w:t>
       </w:r>
-      <w:proofErr w:type="gramEnd"/>
     </w:p>
     <w:p>
       <w:pPr>
@@ -2474,16 +2310,8 @@
         <w:rPr>
           <w:u w:val="single"/>
         </w:rPr>
-        <w:t xml:space="preserve">INSERT INTO </w:t>
-      </w:r>
-      <w:proofErr w:type="gramStart"/>
-      <w:r>
-        <w:rPr>
-          <w:u w:val="single"/>
-        </w:rPr>
-        <w:t>series(</w:t>
-      </w:r>
-      <w:proofErr w:type="gramEnd"/>
+        <w:t>INSERT INTO series(</w:t>
+      </w:r>
     </w:p>
     <w:p>
       <w:pPr>
@@ -2647,25 +2475,173 @@
           <w:bCs/>
           <w:u w:val="single"/>
         </w:rPr>
-        <w:t xml:space="preserve">ADD tags </w:t>
-      </w:r>
-      <w:proofErr w:type="gramStart"/>
-      <w:r>
-        <w:rPr>
-          <w:b/>
-          <w:bCs/>
-          <w:u w:val="single"/>
-        </w:rPr>
-        <w:t>VARCHAR(</w:t>
-      </w:r>
-      <w:proofErr w:type="gramEnd"/>
-      <w:r>
-        <w:rPr>
-          <w:b/>
-          <w:bCs/>
-          <w:u w:val="single"/>
-        </w:rPr>
-        <w:t>255);</w:t>
+        <w:t>ADD tags VARCHAR(255);</w:t>
+      </w:r>
+    </w:p>
+    <w:p>
+      <w:pPr>
+        <w:spacing w:after="0" w:line="240" w:lineRule="auto"/>
+        <w:rPr>
+          <w:b/>
+          <w:bCs/>
+          <w:u w:val="single"/>
+        </w:rPr>
+      </w:pPr>
+    </w:p>
+    <w:p>
+      <w:pPr>
+        <w:spacing w:after="0" w:line="240" w:lineRule="auto"/>
+        <w:rPr>
+          <w:b/>
+          <w:bCs/>
+          <w:u w:val="single"/>
+        </w:rPr>
+      </w:pPr>
+      <w:r>
+        <w:rPr>
+          <w:b/>
+          <w:bCs/>
+          <w:u w:val="single"/>
+        </w:rPr>
+        <w:sym w:font="Wingdings" w:char="F0E0"/>
+      </w:r>
+    </w:p>
+    <w:p>
+      <w:pPr>
+        <w:spacing w:after="0" w:line="240" w:lineRule="auto"/>
+        <w:rPr>
+          <w:b/>
+          <w:bCs/>
+          <w:u w:val="single"/>
+        </w:rPr>
+      </w:pPr>
+      <w:r>
+        <w:rPr>
+          <w:b/>
+          <w:bCs/>
+          <w:u w:val="single"/>
+        </w:rPr>
+        <w:t>UPDATE articles</w:t>
+      </w:r>
+    </w:p>
+    <w:p>
+      <w:pPr>
+        <w:spacing w:after="0" w:line="240" w:lineRule="auto"/>
+        <w:rPr>
+          <w:b/>
+          <w:bCs/>
+          <w:u w:val="single"/>
+        </w:rPr>
+      </w:pPr>
+    </w:p>
+    <w:p>
+      <w:pPr>
+        <w:spacing w:after="0" w:line="240" w:lineRule="auto"/>
+        <w:rPr>
+          <w:b/>
+          <w:bCs/>
+          <w:u w:val="single"/>
+        </w:rPr>
+      </w:pPr>
+      <w:r>
+        <w:rPr>
+          <w:b/>
+          <w:bCs/>
+          <w:u w:val="single"/>
+        </w:rPr>
+        <w:t>SET</w:t>
+      </w:r>
+    </w:p>
+    <w:p>
+      <w:pPr>
+        <w:spacing w:after="0" w:line="240" w:lineRule="auto"/>
+        <w:rPr>
+          <w:b/>
+          <w:bCs/>
+          <w:u w:val="single"/>
+        </w:rPr>
+      </w:pPr>
+      <w:r>
+        <w:rPr>
+          <w:b/>
+          <w:bCs/>
+          <w:u w:val="single"/>
+        </w:rPr>
+        <w:t>status='</w:t>
+      </w:r>
+      <w:proofErr w:type="spellStart"/>
+      <w:r>
+        <w:rPr>
+          <w:b/>
+          <w:bCs/>
+          <w:u w:val="single"/>
+        </w:rPr>
+        <w:t>revision_requested</w:t>
+      </w:r>
+      <w:proofErr w:type="spellEnd"/>
+      <w:r>
+        <w:rPr>
+          <w:b/>
+          <w:bCs/>
+          <w:u w:val="single"/>
+        </w:rPr>
+        <w:t>',</w:t>
+      </w:r>
+    </w:p>
+    <w:p>
+      <w:pPr>
+        <w:spacing w:after="0" w:line="240" w:lineRule="auto"/>
+        <w:rPr>
+          <w:b/>
+          <w:bCs/>
+          <w:u w:val="single"/>
+        </w:rPr>
+      </w:pPr>
+      <w:proofErr w:type="spellStart"/>
+      <w:r>
+        <w:rPr>
+          <w:b/>
+          <w:bCs/>
+          <w:u w:val="single"/>
+        </w:rPr>
+        <w:t>editor_feedback</w:t>
+      </w:r>
+      <w:proofErr w:type="spellEnd"/>
+      <w:r>
+        <w:rPr>
+          <w:b/>
+          <w:bCs/>
+          <w:u w:val="single"/>
+        </w:rPr>
+        <w:t>='Add more examples and improve introduction'</w:t>
+      </w:r>
+    </w:p>
+    <w:p>
+      <w:pPr>
+        <w:spacing w:after="0" w:line="240" w:lineRule="auto"/>
+        <w:rPr>
+          <w:b/>
+          <w:bCs/>
+          <w:u w:val="single"/>
+        </w:rPr>
+      </w:pPr>
+    </w:p>
+    <w:p>
+      <w:pPr>
+        <w:spacing w:after="0" w:line="240" w:lineRule="auto"/>
+        <w:rPr>
+          <w:b/>
+          <w:bCs/>
+          <w:u w:val="single"/>
+        </w:rPr>
+      </w:pPr>
+      <w:r>
+        <w:rPr>
+          <w:b/>
+          <w:bCs/>
+          <w:u w:val="single"/>
+        </w:rPr>
+        <w:t>WHERE id=1;</w:t>
       </w:r>
     </w:p>
     <w:p>

</xml_diff>

<commit_message>
View performance analytics per article: total views, total likes, total comments, reads per day over time
</commit_message>
<xml_diff>
--- a/blogPost/DB Quries/blogPost.docx
+++ b/blogPost/DB Quries/blogPost.docx
@@ -1308,42 +1308,300 @@
         <w:rPr>
           <w:b/>
           <w:bCs/>
+        </w:rPr>
+      </w:pPr>
+      <w:r>
+        <w:rPr>
+          <w:b/>
+          <w:bCs/>
+        </w:rPr>
+        <w:t xml:space="preserve">5. </w:t>
+      </w:r>
+      <w:proofErr w:type="spellStart"/>
+      <w:r>
+        <w:rPr>
+          <w:b/>
+          <w:bCs/>
+        </w:rPr>
+        <w:t>Aricle</w:t>
+      </w:r>
+      <w:proofErr w:type="spellEnd"/>
+      <w:r>
+        <w:rPr>
+          <w:b/>
+          <w:bCs/>
+        </w:rPr>
+        <w:t xml:space="preserve"> Revision</w:t>
+      </w:r>
+    </w:p>
+    <w:p>
+      <w:pPr>
+        <w:spacing w:after="0" w:line="240" w:lineRule="auto"/>
+        <w:rPr>
+          <w:b/>
+          <w:bCs/>
+        </w:rPr>
+      </w:pPr>
+    </w:p>
+    <w:p>
+      <w:pPr>
+        <w:spacing w:after="0" w:line="240" w:lineRule="auto"/>
+      </w:pPr>
+      <w:r>
+        <w:t xml:space="preserve">CREATE TABLE </w:t>
+      </w:r>
+      <w:proofErr w:type="spellStart"/>
+      <w:r>
+        <w:t>article_</w:t>
+      </w:r>
+      <w:proofErr w:type="gramStart"/>
+      <w:r>
+        <w:t>revisions</w:t>
+      </w:r>
+      <w:proofErr w:type="spellEnd"/>
+      <w:r>
+        <w:t>(</w:t>
+      </w:r>
+      <w:proofErr w:type="gramEnd"/>
+    </w:p>
+    <w:p>
+      <w:pPr>
+        <w:spacing w:after="0" w:line="240" w:lineRule="auto"/>
+      </w:pPr>
+    </w:p>
+    <w:p>
+      <w:pPr>
+        <w:spacing w:after="0" w:line="240" w:lineRule="auto"/>
+      </w:pPr>
+      <w:r>
+        <w:t xml:space="preserve">    id INT PRIMARY KEY AUTO_INCREMENT,</w:t>
+      </w:r>
+    </w:p>
+    <w:p>
+      <w:pPr>
+        <w:spacing w:after="0" w:line="240" w:lineRule="auto"/>
+      </w:pPr>
+    </w:p>
+    <w:p>
+      <w:pPr>
+        <w:spacing w:after="0" w:line="240" w:lineRule="auto"/>
+      </w:pPr>
+      <w:r>
+        <w:t xml:space="preserve">    </w:t>
+      </w:r>
+      <w:proofErr w:type="spellStart"/>
+      <w:r>
+        <w:t>article_id</w:t>
+      </w:r>
+      <w:proofErr w:type="spellEnd"/>
+      <w:r>
+        <w:t xml:space="preserve"> INT NOT NULL,</w:t>
+      </w:r>
+    </w:p>
+    <w:p>
+      <w:pPr>
+        <w:spacing w:after="0" w:line="240" w:lineRule="auto"/>
+      </w:pPr>
+    </w:p>
+    <w:p>
+      <w:pPr>
+        <w:spacing w:after="0" w:line="240" w:lineRule="auto"/>
+      </w:pPr>
+      <w:r>
+        <w:t xml:space="preserve">    </w:t>
+      </w:r>
+      <w:proofErr w:type="spellStart"/>
+      <w:r>
+        <w:t>author_id</w:t>
+      </w:r>
+      <w:proofErr w:type="spellEnd"/>
+      <w:r>
+        <w:t xml:space="preserve"> INT NOT NULL,</w:t>
+      </w:r>
+    </w:p>
+    <w:p>
+      <w:pPr>
+        <w:spacing w:after="0" w:line="240" w:lineRule="auto"/>
+      </w:pPr>
+    </w:p>
+    <w:p>
+      <w:pPr>
+        <w:spacing w:after="0" w:line="240" w:lineRule="auto"/>
+      </w:pPr>
+      <w:r>
+        <w:t xml:space="preserve">    </w:t>
+      </w:r>
+      <w:proofErr w:type="spellStart"/>
+      <w:r>
+        <w:t>body_snapshot</w:t>
+      </w:r>
+      <w:proofErr w:type="spellEnd"/>
+      <w:r>
+        <w:t xml:space="preserve"> LONGTEXT,</w:t>
+      </w:r>
+    </w:p>
+    <w:p>
+      <w:pPr>
+        <w:spacing w:after="0" w:line="240" w:lineRule="auto"/>
+      </w:pPr>
+    </w:p>
+    <w:p>
+      <w:pPr>
+        <w:spacing w:after="0" w:line="240" w:lineRule="auto"/>
+      </w:pPr>
+      <w:r>
+        <w:t xml:space="preserve">    </w:t>
+      </w:r>
+      <w:proofErr w:type="spellStart"/>
+      <w:r>
+        <w:t>saved_at</w:t>
+      </w:r>
+      <w:proofErr w:type="spellEnd"/>
+      <w:r>
+        <w:t xml:space="preserve"> TIMESTAMP DEFAULT CURRENT_TIMESTAMP,</w:t>
+      </w:r>
+    </w:p>
+    <w:p>
+      <w:pPr>
+        <w:spacing w:after="0" w:line="240" w:lineRule="auto"/>
+      </w:pPr>
+    </w:p>
+    <w:p>
+      <w:pPr>
+        <w:spacing w:after="0" w:line="240" w:lineRule="auto"/>
+      </w:pPr>
+      <w:r>
+        <w:t xml:space="preserve">    FOREIGN </w:t>
+      </w:r>
+      <w:proofErr w:type="gramStart"/>
+      <w:r>
+        <w:t>KEY(</w:t>
+      </w:r>
+      <w:proofErr w:type="spellStart"/>
+      <w:proofErr w:type="gramEnd"/>
+      <w:r>
+        <w:t>article_id</w:t>
+      </w:r>
+      <w:proofErr w:type="spellEnd"/>
+      <w:r>
+        <w:t>)</w:t>
+      </w:r>
+    </w:p>
+    <w:p>
+      <w:pPr>
+        <w:spacing w:after="0" w:line="240" w:lineRule="auto"/>
+      </w:pPr>
+      <w:r>
+        <w:t xml:space="preserve">    REFERENCES articles(id)</w:t>
+      </w:r>
+    </w:p>
+    <w:p>
+      <w:pPr>
+        <w:spacing w:after="0" w:line="240" w:lineRule="auto"/>
+      </w:pPr>
+      <w:r>
+        <w:t xml:space="preserve">    ON DELETE CASCADE,</w:t>
+      </w:r>
+    </w:p>
+    <w:p>
+      <w:pPr>
+        <w:spacing w:after="0" w:line="240" w:lineRule="auto"/>
+      </w:pPr>
+    </w:p>
+    <w:p>
+      <w:pPr>
+        <w:spacing w:after="0" w:line="240" w:lineRule="auto"/>
+      </w:pPr>
+      <w:r>
+        <w:t xml:space="preserve">    FOREIGN </w:t>
+      </w:r>
+      <w:proofErr w:type="gramStart"/>
+      <w:r>
+        <w:t>KEY(</w:t>
+      </w:r>
+      <w:proofErr w:type="spellStart"/>
+      <w:proofErr w:type="gramEnd"/>
+      <w:r>
+        <w:t>author_id</w:t>
+      </w:r>
+      <w:proofErr w:type="spellEnd"/>
+      <w:r>
+        <w:t>)</w:t>
+      </w:r>
+    </w:p>
+    <w:p>
+      <w:pPr>
+        <w:spacing w:after="0" w:line="240" w:lineRule="auto"/>
+      </w:pPr>
+      <w:r>
+        <w:t xml:space="preserve">    REFERENCES users(id)</w:t>
+      </w:r>
+    </w:p>
+    <w:p>
+      <w:pPr>
+        <w:spacing w:after="0" w:line="240" w:lineRule="auto"/>
+      </w:pPr>
+      <w:r>
+        <w:t xml:space="preserve">    ON DELETE CASCADE</w:t>
+      </w:r>
+    </w:p>
+    <w:p>
+      <w:pPr>
+        <w:spacing w:after="0" w:line="240" w:lineRule="auto"/>
+      </w:pPr>
+    </w:p>
+    <w:p>
+      <w:pPr>
+        <w:spacing w:after="0" w:line="240" w:lineRule="auto"/>
+      </w:pPr>
+      <w:r>
+        <w:t>) ENGINE=</w:t>
+      </w:r>
+      <w:proofErr w:type="spellStart"/>
+      <w:r>
+        <w:t>InnoDB</w:t>
+      </w:r>
+      <w:proofErr w:type="spellEnd"/>
+      <w:r>
+        <w:t>;</w:t>
+      </w:r>
+    </w:p>
+    <w:p>
+      <w:pPr>
+        <w:spacing w:after="0" w:line="240" w:lineRule="auto"/>
+        <w:rPr>
           <w:u w:val="single"/>
         </w:rPr>
       </w:pPr>
-      <w:r>
-        <w:rPr>
-          <w:b/>
-          <w:bCs/>
+    </w:p>
+    <w:p>
+      <w:pPr>
+        <w:spacing w:after="0" w:line="240" w:lineRule="auto"/>
+        <w:rPr>
           <w:u w:val="single"/>
         </w:rPr>
-        <w:t xml:space="preserve">5. </w:t>
-      </w:r>
-      <w:proofErr w:type="spellStart"/>
-      <w:r>
-        <w:rPr>
-          <w:b/>
-          <w:bCs/>
+      </w:pPr>
+    </w:p>
+    <w:p>
+      <w:pPr>
+        <w:spacing w:after="0" w:line="240" w:lineRule="auto"/>
+        <w:rPr>
           <w:u w:val="single"/>
         </w:rPr>
-        <w:t>Aricle</w:t>
-      </w:r>
-      <w:proofErr w:type="spellEnd"/>
-      <w:r>
-        <w:rPr>
-          <w:b/>
-          <w:bCs/>
+      </w:pPr>
+    </w:p>
+    <w:p>
+      <w:pPr>
+        <w:spacing w:after="0" w:line="240" w:lineRule="auto"/>
+        <w:rPr>
           <w:u w:val="single"/>
         </w:rPr>
-        <w:t xml:space="preserve"> Revision</w:t>
-      </w:r>
-    </w:p>
-    <w:p>
-      <w:pPr>
-        <w:spacing w:after="0" w:line="240" w:lineRule="auto"/>
-        <w:rPr>
-          <w:b/>
-          <w:bCs/>
+      </w:pPr>
+    </w:p>
+    <w:p>
+      <w:pPr>
+        <w:spacing w:after="0" w:line="240" w:lineRule="auto"/>
+        <w:rPr>
           <w:u w:val="single"/>
         </w:rPr>
       </w:pPr>
@@ -1355,26 +1613,30 @@
           <w:u w:val="single"/>
         </w:rPr>
       </w:pPr>
-      <w:r>
+    </w:p>
+    <w:p>
+      <w:pPr>
+        <w:spacing w:after="0" w:line="240" w:lineRule="auto"/>
         <w:rPr>
           <w:u w:val="single"/>
         </w:rPr>
-        <w:t xml:space="preserve">CREATE TABLE </w:t>
-      </w:r>
-      <w:proofErr w:type="spellStart"/>
-      <w:r>
+      </w:pPr>
+    </w:p>
+    <w:p>
+      <w:pPr>
+        <w:spacing w:after="0" w:line="240" w:lineRule="auto"/>
         <w:rPr>
           <w:u w:val="single"/>
         </w:rPr>
-        <w:t>article_revisions</w:t>
-      </w:r>
-      <w:proofErr w:type="spellEnd"/>
-      <w:r>
+      </w:pPr>
+    </w:p>
+    <w:p>
+      <w:pPr>
+        <w:spacing w:after="0" w:line="240" w:lineRule="auto"/>
         <w:rPr>
           <w:u w:val="single"/>
         </w:rPr>
-        <w:t>(</w:t>
-      </w:r>
+      </w:pPr>
     </w:p>
     <w:p>
       <w:pPr>
@@ -1391,12 +1653,14 @@
           <w:u w:val="single"/>
         </w:rPr>
       </w:pPr>
-      <w:r>
+    </w:p>
+    <w:p>
+      <w:pPr>
+        <w:spacing w:after="0" w:line="240" w:lineRule="auto"/>
         <w:rPr>
           <w:u w:val="single"/>
         </w:rPr>
-        <w:t xml:space="preserve">    id INT PRIMARY KEY AUTO_INCREMENT,</w:t>
-      </w:r>
+      </w:pPr>
     </w:p>
     <w:p>
       <w:pPr>
@@ -1409,418 +1673,8 @@
     <w:p>
       <w:pPr>
         <w:spacing w:after="0" w:line="240" w:lineRule="auto"/>
-        <w:rPr>
-          <w:u w:val="single"/>
-        </w:rPr>
-      </w:pPr>
-      <w:r>
-        <w:rPr>
-          <w:u w:val="single"/>
-        </w:rPr>
-        <w:t xml:space="preserve">    </w:t>
-      </w:r>
-      <w:proofErr w:type="spellStart"/>
-      <w:r>
-        <w:rPr>
-          <w:u w:val="single"/>
-        </w:rPr>
-        <w:t>article_id</w:t>
-      </w:r>
-      <w:proofErr w:type="spellEnd"/>
-      <w:r>
-        <w:rPr>
-          <w:u w:val="single"/>
-        </w:rPr>
-        <w:t xml:space="preserve"> INT NOT NULL,</w:t>
-      </w:r>
-    </w:p>
-    <w:p>
-      <w:pPr>
-        <w:spacing w:after="0" w:line="240" w:lineRule="auto"/>
-        <w:rPr>
-          <w:u w:val="single"/>
-        </w:rPr>
-      </w:pPr>
-    </w:p>
-    <w:p>
-      <w:pPr>
-        <w:spacing w:after="0" w:line="240" w:lineRule="auto"/>
-        <w:rPr>
-          <w:u w:val="single"/>
-        </w:rPr>
-      </w:pPr>
-      <w:r>
-        <w:rPr>
-          <w:u w:val="single"/>
-        </w:rPr>
-        <w:t xml:space="preserve">    </w:t>
-      </w:r>
-      <w:proofErr w:type="spellStart"/>
-      <w:r>
-        <w:rPr>
-          <w:u w:val="single"/>
-        </w:rPr>
-        <w:t>author_id</w:t>
-      </w:r>
-      <w:proofErr w:type="spellEnd"/>
-      <w:r>
-        <w:rPr>
-          <w:u w:val="single"/>
-        </w:rPr>
-        <w:t xml:space="preserve"> INT NOT NULL,</w:t>
-      </w:r>
-    </w:p>
-    <w:p>
-      <w:pPr>
-        <w:spacing w:after="0" w:line="240" w:lineRule="auto"/>
-        <w:rPr>
-          <w:u w:val="single"/>
-        </w:rPr>
-      </w:pPr>
-    </w:p>
-    <w:p>
-      <w:pPr>
-        <w:spacing w:after="0" w:line="240" w:lineRule="auto"/>
-        <w:rPr>
-          <w:u w:val="single"/>
-        </w:rPr>
-      </w:pPr>
-      <w:r>
-        <w:rPr>
-          <w:u w:val="single"/>
-        </w:rPr>
-        <w:t xml:space="preserve">    </w:t>
-      </w:r>
-      <w:proofErr w:type="spellStart"/>
-      <w:r>
-        <w:rPr>
-          <w:u w:val="single"/>
-        </w:rPr>
-        <w:t>body_snapshot</w:t>
-      </w:r>
-      <w:proofErr w:type="spellEnd"/>
-      <w:r>
-        <w:rPr>
-          <w:u w:val="single"/>
-        </w:rPr>
-        <w:t xml:space="preserve"> LONGTEXT,</w:t>
-      </w:r>
-    </w:p>
-    <w:p>
-      <w:pPr>
-        <w:spacing w:after="0" w:line="240" w:lineRule="auto"/>
-        <w:rPr>
-          <w:u w:val="single"/>
-        </w:rPr>
-      </w:pPr>
-    </w:p>
-    <w:p>
-      <w:pPr>
-        <w:spacing w:after="0" w:line="240" w:lineRule="auto"/>
-        <w:rPr>
-          <w:u w:val="single"/>
-        </w:rPr>
-      </w:pPr>
-      <w:r>
-        <w:rPr>
-          <w:u w:val="single"/>
-        </w:rPr>
-        <w:t xml:space="preserve">    </w:t>
-      </w:r>
-      <w:proofErr w:type="spellStart"/>
-      <w:r>
-        <w:rPr>
-          <w:u w:val="single"/>
-        </w:rPr>
-        <w:t>saved_at</w:t>
-      </w:r>
-      <w:proofErr w:type="spellEnd"/>
-      <w:r>
-        <w:rPr>
-          <w:u w:val="single"/>
-        </w:rPr>
-        <w:t xml:space="preserve"> TIMESTAMP DEFAULT CURRENT_TIMESTAMP,</w:t>
-      </w:r>
-    </w:p>
-    <w:p>
-      <w:pPr>
-        <w:spacing w:after="0" w:line="240" w:lineRule="auto"/>
-        <w:rPr>
-          <w:u w:val="single"/>
-        </w:rPr>
-      </w:pPr>
-    </w:p>
-    <w:p>
-      <w:pPr>
-        <w:spacing w:after="0" w:line="240" w:lineRule="auto"/>
-        <w:rPr>
-          <w:u w:val="single"/>
-        </w:rPr>
-      </w:pPr>
-      <w:r>
-        <w:rPr>
-          <w:u w:val="single"/>
-        </w:rPr>
-        <w:t xml:space="preserve">    FOREIGN KEY(</w:t>
-      </w:r>
-      <w:proofErr w:type="spellStart"/>
-      <w:r>
-        <w:rPr>
-          <w:u w:val="single"/>
-        </w:rPr>
-        <w:t>article_id</w:t>
-      </w:r>
-      <w:proofErr w:type="spellEnd"/>
-      <w:r>
-        <w:rPr>
-          <w:u w:val="single"/>
-        </w:rPr>
-        <w:t>)</w:t>
-      </w:r>
-    </w:p>
-    <w:p>
-      <w:pPr>
-        <w:spacing w:after="0" w:line="240" w:lineRule="auto"/>
-        <w:rPr>
-          <w:u w:val="single"/>
-        </w:rPr>
-      </w:pPr>
-      <w:r>
-        <w:rPr>
-          <w:u w:val="single"/>
-        </w:rPr>
-        <w:t xml:space="preserve">    REFERENCES articles(id)</w:t>
-      </w:r>
-    </w:p>
-    <w:p>
-      <w:pPr>
-        <w:spacing w:after="0" w:line="240" w:lineRule="auto"/>
-        <w:rPr>
-          <w:u w:val="single"/>
-        </w:rPr>
-      </w:pPr>
-      <w:r>
-        <w:rPr>
-          <w:u w:val="single"/>
-        </w:rPr>
-        <w:t xml:space="preserve">    ON DELETE CASCADE,</w:t>
-      </w:r>
-    </w:p>
-    <w:p>
-      <w:pPr>
-        <w:spacing w:after="0" w:line="240" w:lineRule="auto"/>
-        <w:rPr>
-          <w:u w:val="single"/>
-        </w:rPr>
-      </w:pPr>
-    </w:p>
-    <w:p>
-      <w:pPr>
-        <w:spacing w:after="0" w:line="240" w:lineRule="auto"/>
-        <w:rPr>
-          <w:u w:val="single"/>
-        </w:rPr>
-      </w:pPr>
-      <w:r>
-        <w:rPr>
-          <w:u w:val="single"/>
-        </w:rPr>
-        <w:t xml:space="preserve">    FOREIGN KEY(</w:t>
-      </w:r>
-      <w:proofErr w:type="spellStart"/>
-      <w:r>
-        <w:rPr>
-          <w:u w:val="single"/>
-        </w:rPr>
-        <w:t>author_id</w:t>
-      </w:r>
-      <w:proofErr w:type="spellEnd"/>
-      <w:r>
-        <w:rPr>
-          <w:u w:val="single"/>
-        </w:rPr>
-        <w:t>)</w:t>
-      </w:r>
-    </w:p>
-    <w:p>
-      <w:pPr>
-        <w:spacing w:after="0" w:line="240" w:lineRule="auto"/>
-        <w:rPr>
-          <w:u w:val="single"/>
-        </w:rPr>
-      </w:pPr>
-      <w:r>
-        <w:rPr>
-          <w:u w:val="single"/>
-        </w:rPr>
-        <w:t xml:space="preserve">    REFERENCES users(id)</w:t>
-      </w:r>
-    </w:p>
-    <w:p>
-      <w:pPr>
-        <w:spacing w:after="0" w:line="240" w:lineRule="auto"/>
-        <w:rPr>
-          <w:u w:val="single"/>
-        </w:rPr>
-      </w:pPr>
-      <w:r>
-        <w:rPr>
-          <w:u w:val="single"/>
-        </w:rPr>
-        <w:t xml:space="preserve">    ON DELETE CASCADE</w:t>
-      </w:r>
-    </w:p>
-    <w:p>
-      <w:pPr>
-        <w:spacing w:after="0" w:line="240" w:lineRule="auto"/>
-        <w:rPr>
-          <w:u w:val="single"/>
-        </w:rPr>
-      </w:pPr>
-    </w:p>
-    <w:p>
-      <w:pPr>
-        <w:spacing w:after="0" w:line="240" w:lineRule="auto"/>
-        <w:rPr>
-          <w:u w:val="single"/>
-        </w:rPr>
-      </w:pPr>
-      <w:r>
-        <w:rPr>
-          <w:u w:val="single"/>
-        </w:rPr>
-        <w:t>) ENGINE=</w:t>
-      </w:r>
-      <w:proofErr w:type="spellStart"/>
-      <w:r>
-        <w:rPr>
-          <w:u w:val="single"/>
-        </w:rPr>
-        <w:t>InnoDB</w:t>
-      </w:r>
-      <w:proofErr w:type="spellEnd"/>
-      <w:r>
-        <w:rPr>
-          <w:u w:val="single"/>
-        </w:rPr>
-        <w:t>;</w:t>
-      </w:r>
-    </w:p>
-    <w:p>
-      <w:pPr>
-        <w:spacing w:after="0" w:line="240" w:lineRule="auto"/>
-        <w:rPr>
-          <w:u w:val="single"/>
-        </w:rPr>
-      </w:pPr>
-    </w:p>
-    <w:p>
-      <w:pPr>
-        <w:spacing w:after="0" w:line="240" w:lineRule="auto"/>
-        <w:rPr>
-          <w:u w:val="single"/>
-        </w:rPr>
-      </w:pPr>
-    </w:p>
-    <w:p>
-      <w:pPr>
-        <w:spacing w:after="0" w:line="240" w:lineRule="auto"/>
-        <w:rPr>
-          <w:u w:val="single"/>
-        </w:rPr>
-      </w:pPr>
-    </w:p>
-    <w:p>
-      <w:pPr>
-        <w:spacing w:after="0" w:line="240" w:lineRule="auto"/>
-        <w:rPr>
-          <w:u w:val="single"/>
-        </w:rPr>
-      </w:pPr>
-    </w:p>
-    <w:p>
-      <w:pPr>
-        <w:spacing w:after="0" w:line="240" w:lineRule="auto"/>
-        <w:rPr>
-          <w:u w:val="single"/>
-        </w:rPr>
-      </w:pPr>
-    </w:p>
-    <w:p>
-      <w:pPr>
-        <w:spacing w:after="0" w:line="240" w:lineRule="auto"/>
-        <w:rPr>
-          <w:u w:val="single"/>
-        </w:rPr>
-      </w:pPr>
-    </w:p>
-    <w:p>
-      <w:pPr>
-        <w:spacing w:after="0" w:line="240" w:lineRule="auto"/>
-        <w:rPr>
-          <w:u w:val="single"/>
-        </w:rPr>
-      </w:pPr>
-    </w:p>
-    <w:p>
-      <w:pPr>
-        <w:spacing w:after="0" w:line="240" w:lineRule="auto"/>
-        <w:rPr>
-          <w:u w:val="single"/>
-        </w:rPr>
-      </w:pPr>
-    </w:p>
-    <w:p>
-      <w:pPr>
-        <w:spacing w:after="0" w:line="240" w:lineRule="auto"/>
-        <w:rPr>
-          <w:u w:val="single"/>
-        </w:rPr>
-      </w:pPr>
-    </w:p>
-    <w:p>
-      <w:pPr>
-        <w:spacing w:after="0" w:line="240" w:lineRule="auto"/>
-        <w:rPr>
-          <w:u w:val="single"/>
-        </w:rPr>
-      </w:pPr>
-    </w:p>
-    <w:p>
-      <w:pPr>
-        <w:spacing w:after="0" w:line="240" w:lineRule="auto"/>
-        <w:rPr>
-          <w:u w:val="single"/>
-        </w:rPr>
-      </w:pPr>
-    </w:p>
-    <w:p>
-      <w:pPr>
-        <w:spacing w:after="0" w:line="240" w:lineRule="auto"/>
-        <w:rPr>
-          <w:u w:val="single"/>
-        </w:rPr>
-      </w:pPr>
-    </w:p>
-    <w:p>
-      <w:pPr>
-        <w:spacing w:after="0" w:line="240" w:lineRule="auto"/>
-        <w:rPr>
-          <w:u w:val="single"/>
-        </w:rPr>
-      </w:pPr>
-    </w:p>
-    <w:p>
-      <w:pPr>
-        <w:spacing w:after="0" w:line="240" w:lineRule="auto"/>
-        <w:rPr>
-          <w:u w:val="single"/>
-        </w:rPr>
-      </w:pPr>
-      <w:r>
-        <w:rPr>
-          <w:u w:val="single"/>
-        </w:rPr>
+      </w:pPr>
+      <w:r>
         <w:lastRenderedPageBreak/>
         <w:sym w:font="Wingdings" w:char="F0E0"/>
       </w:r>
@@ -1828,6 +1682,122 @@
     <w:p>
       <w:pPr>
         <w:spacing w:after="0" w:line="240" w:lineRule="auto"/>
+      </w:pPr>
+    </w:p>
+    <w:p>
+      <w:pPr>
+        <w:spacing w:after="0" w:line="240" w:lineRule="auto"/>
+      </w:pPr>
+      <w:r>
+        <w:t xml:space="preserve">INSERT INTO </w:t>
+      </w:r>
+      <w:proofErr w:type="gramStart"/>
+      <w:r>
+        <w:t>categories(</w:t>
+      </w:r>
+      <w:proofErr w:type="gramEnd"/>
+    </w:p>
+    <w:p>
+      <w:pPr>
+        <w:spacing w:after="0" w:line="240" w:lineRule="auto"/>
+      </w:pPr>
+      <w:r>
+        <w:t>name,</w:t>
+      </w:r>
+    </w:p>
+    <w:p>
+      <w:pPr>
+        <w:spacing w:after="0" w:line="240" w:lineRule="auto"/>
+      </w:pPr>
+      <w:r>
+        <w:t>slug</w:t>
+      </w:r>
+    </w:p>
+    <w:p>
+      <w:pPr>
+        <w:spacing w:after="0" w:line="240" w:lineRule="auto"/>
+      </w:pPr>
+      <w:r>
+        <w:t>)</w:t>
+      </w:r>
+    </w:p>
+    <w:p>
+      <w:pPr>
+        <w:spacing w:after="0" w:line="240" w:lineRule="auto"/>
+      </w:pPr>
+    </w:p>
+    <w:p>
+      <w:pPr>
+        <w:spacing w:after="0" w:line="240" w:lineRule="auto"/>
+      </w:pPr>
+      <w:r>
+        <w:t>VALUES</w:t>
+      </w:r>
+    </w:p>
+    <w:p>
+      <w:pPr>
+        <w:spacing w:after="0" w:line="240" w:lineRule="auto"/>
+      </w:pPr>
+      <w:r>
+        <w:t>('</w:t>
+      </w:r>
+      <w:proofErr w:type="spellStart"/>
+      <w:r>
+        <w:t>Technology','technology</w:t>
+      </w:r>
+      <w:proofErr w:type="spellEnd"/>
+      <w:r>
+        <w:t>'),</w:t>
+      </w:r>
+    </w:p>
+    <w:p>
+      <w:pPr>
+        <w:spacing w:after="0" w:line="240" w:lineRule="auto"/>
+      </w:pPr>
+      <w:r>
+        <w:t>('</w:t>
+      </w:r>
+      <w:proofErr w:type="spellStart"/>
+      <w:r>
+        <w:t>Sports','sports</w:t>
+      </w:r>
+      <w:proofErr w:type="spellEnd"/>
+      <w:r>
+        <w:t>'),</w:t>
+      </w:r>
+    </w:p>
+    <w:p>
+      <w:pPr>
+        <w:spacing w:after="0" w:line="240" w:lineRule="auto"/>
+      </w:pPr>
+      <w:r>
+        <w:t>('</w:t>
+      </w:r>
+      <w:proofErr w:type="spellStart"/>
+      <w:r>
+        <w:t>News','news</w:t>
+      </w:r>
+      <w:proofErr w:type="spellEnd"/>
+      <w:r>
+        <w:t>');</w:t>
+      </w:r>
+    </w:p>
+    <w:p>
+      <w:pPr>
+        <w:spacing w:after="0" w:line="240" w:lineRule="auto"/>
+      </w:pPr>
+    </w:p>
+    <w:p>
+      <w:pPr>
+        <w:spacing w:after="0" w:line="240" w:lineRule="auto"/>
+      </w:pPr>
+      <w:r>
+        <w:sym w:font="Wingdings" w:char="F0E0"/>
+      </w:r>
+    </w:p>
+    <w:p>
+      <w:pPr>
+        <w:spacing w:after="0" w:line="240" w:lineRule="auto"/>
         <w:rPr>
           <w:u w:val="single"/>
         </w:rPr>
@@ -1836,15 +1806,240 @@
     <w:p>
       <w:pPr>
         <w:spacing w:after="0" w:line="240" w:lineRule="auto"/>
+      </w:pPr>
+      <w:r>
+        <w:t xml:space="preserve">INSERT INTO </w:t>
+      </w:r>
+      <w:proofErr w:type="gramStart"/>
+      <w:r>
+        <w:t>users(</w:t>
+      </w:r>
+      <w:proofErr w:type="gramEnd"/>
+    </w:p>
+    <w:p>
+      <w:pPr>
+        <w:spacing w:after="0" w:line="240" w:lineRule="auto"/>
+      </w:pPr>
+    </w:p>
+    <w:p>
+      <w:pPr>
+        <w:spacing w:after="0" w:line="240" w:lineRule="auto"/>
+      </w:pPr>
+      <w:r>
+        <w:t>name,</w:t>
+      </w:r>
+    </w:p>
+    <w:p>
+      <w:pPr>
+        <w:spacing w:after="0" w:line="240" w:lineRule="auto"/>
+      </w:pPr>
+      <w:r>
+        <w:t>username,</w:t>
+      </w:r>
+    </w:p>
+    <w:p>
+      <w:pPr>
+        <w:spacing w:after="0" w:line="240" w:lineRule="auto"/>
+      </w:pPr>
+      <w:r>
+        <w:t>email,</w:t>
+      </w:r>
+    </w:p>
+    <w:p>
+      <w:pPr>
+        <w:spacing w:after="0" w:line="240" w:lineRule="auto"/>
+      </w:pPr>
+      <w:proofErr w:type="spellStart"/>
+      <w:r>
+        <w:t>password_hash</w:t>
+      </w:r>
+      <w:proofErr w:type="spellEnd"/>
+      <w:r>
+        <w:t>,</w:t>
+      </w:r>
+    </w:p>
+    <w:p>
+      <w:pPr>
+        <w:spacing w:after="0" w:line="240" w:lineRule="auto"/>
+      </w:pPr>
+      <w:r>
+        <w:t>role</w:t>
+      </w:r>
+    </w:p>
+    <w:p>
+      <w:pPr>
+        <w:spacing w:after="0" w:line="240" w:lineRule="auto"/>
+      </w:pPr>
+    </w:p>
+    <w:p>
+      <w:pPr>
+        <w:spacing w:after="0" w:line="240" w:lineRule="auto"/>
+      </w:pPr>
+      <w:r>
+        <w:t>)</w:t>
+      </w:r>
+    </w:p>
+    <w:p>
+      <w:pPr>
+        <w:spacing w:after="0" w:line="240" w:lineRule="auto"/>
+      </w:pPr>
+    </w:p>
+    <w:p>
+      <w:pPr>
+        <w:spacing w:after="0" w:line="240" w:lineRule="auto"/>
+      </w:pPr>
+      <w:proofErr w:type="gramStart"/>
+      <w:r>
+        <w:t>VALUES(</w:t>
+      </w:r>
+      <w:proofErr w:type="gramEnd"/>
+    </w:p>
+    <w:p>
+      <w:pPr>
+        <w:spacing w:after="0" w:line="240" w:lineRule="auto"/>
+      </w:pPr>
+    </w:p>
+    <w:p>
+      <w:pPr>
+        <w:spacing w:after="0" w:line="240" w:lineRule="auto"/>
+      </w:pPr>
+      <w:r>
+        <w:t>'Nahid',</w:t>
+      </w:r>
+    </w:p>
+    <w:p>
+      <w:pPr>
+        <w:spacing w:after="0" w:line="240" w:lineRule="auto"/>
+      </w:pPr>
+      <w:r>
+        <w:t>'nahid123',</w:t>
+      </w:r>
+    </w:p>
+    <w:p>
+      <w:pPr>
+        <w:spacing w:after="0" w:line="240" w:lineRule="auto"/>
+      </w:pPr>
+      <w:r>
+        <w:t>'nahid@gmail.com',</w:t>
+      </w:r>
+    </w:p>
+    <w:p>
+      <w:pPr>
+        <w:spacing w:after="0" w:line="240" w:lineRule="auto"/>
+      </w:pPr>
+      <w:r>
+        <w:t>'123456',</w:t>
+      </w:r>
+    </w:p>
+    <w:p>
+      <w:pPr>
+        <w:spacing w:after="0" w:line="240" w:lineRule="auto"/>
+      </w:pPr>
+      <w:r>
+        <w:t>'author'</w:t>
+      </w:r>
+    </w:p>
+    <w:p>
+      <w:pPr>
+        <w:spacing w:after="0" w:line="240" w:lineRule="auto"/>
+      </w:pPr>
+    </w:p>
+    <w:p>
+      <w:pPr>
+        <w:spacing w:after="0" w:line="240" w:lineRule="auto"/>
+      </w:pPr>
+      <w:r>
+        <w:t>);</w:t>
+      </w:r>
+    </w:p>
+    <w:p>
+      <w:pPr>
+        <w:spacing w:after="0" w:line="240" w:lineRule="auto"/>
         <w:rPr>
           <w:u w:val="single"/>
         </w:rPr>
       </w:pPr>
-      <w:r>
+    </w:p>
+    <w:p>
+      <w:pPr>
+        <w:spacing w:after="0" w:line="240" w:lineRule="auto"/>
+      </w:pPr>
+      <w:r>
+        <w:sym w:font="Wingdings" w:char="F0E0"/>
+      </w:r>
+    </w:p>
+    <w:p>
+      <w:pPr>
+        <w:spacing w:after="0" w:line="240" w:lineRule="auto"/>
         <w:rPr>
           <w:u w:val="single"/>
         </w:rPr>
-        <w:t>INSERT INTO categories(</w:t>
+      </w:pPr>
+    </w:p>
+    <w:p>
+      <w:pPr>
+        <w:spacing w:after="0" w:line="240" w:lineRule="auto"/>
+      </w:pPr>
+      <w:r>
+        <w:t xml:space="preserve">INSERT INTO </w:t>
+      </w:r>
+      <w:proofErr w:type="gramStart"/>
+      <w:r>
+        <w:t>series(</w:t>
+      </w:r>
+      <w:proofErr w:type="gramEnd"/>
+    </w:p>
+    <w:p>
+      <w:pPr>
+        <w:spacing w:after="0" w:line="240" w:lineRule="auto"/>
+      </w:pPr>
+      <w:proofErr w:type="spellStart"/>
+      <w:r>
+        <w:t>author_id</w:t>
+      </w:r>
+      <w:proofErr w:type="spellEnd"/>
+      <w:r>
+        <w:t>,</w:t>
+      </w:r>
+    </w:p>
+    <w:p>
+      <w:pPr>
+        <w:spacing w:after="0" w:line="240" w:lineRule="auto"/>
+      </w:pPr>
+      <w:r>
+        <w:t>title</w:t>
+      </w:r>
+    </w:p>
+    <w:p>
+      <w:pPr>
+        <w:spacing w:after="0" w:line="240" w:lineRule="auto"/>
+      </w:pPr>
+      <w:r>
+        <w:t>)</w:t>
+      </w:r>
+    </w:p>
+    <w:p>
+      <w:pPr>
+        <w:spacing w:after="0" w:line="240" w:lineRule="auto"/>
+      </w:pPr>
+      <w:r>
+        <w:t>VALUES</w:t>
+      </w:r>
+    </w:p>
+    <w:p>
+      <w:pPr>
+        <w:spacing w:after="0" w:line="240" w:lineRule="auto"/>
+      </w:pPr>
+      <w:r>
+        <w:t>(1,'Web Development'),</w:t>
+      </w:r>
+    </w:p>
+    <w:p>
+      <w:pPr>
+        <w:spacing w:after="0" w:line="240" w:lineRule="auto"/>
+      </w:pPr>
+      <w:r>
+        <w:t>(1,'Programming');</w:t>
       </w:r>
     </w:p>
     <w:p>
@@ -1854,802 +2049,1214 @@
           <w:u w:val="single"/>
         </w:rPr>
       </w:pPr>
-      <w:r>
-        <w:rPr>
-          <w:u w:val="single"/>
-        </w:rPr>
-        <w:t>name,</w:t>
-      </w:r>
-    </w:p>
-    <w:p>
-      <w:pPr>
-        <w:spacing w:after="0" w:line="240" w:lineRule="auto"/>
-        <w:rPr>
-          <w:u w:val="single"/>
-        </w:rPr>
-      </w:pPr>
-      <w:r>
-        <w:rPr>
-          <w:u w:val="single"/>
-        </w:rPr>
-        <w:t>slug</w:t>
-      </w:r>
-    </w:p>
-    <w:p>
-      <w:pPr>
-        <w:spacing w:after="0" w:line="240" w:lineRule="auto"/>
-        <w:rPr>
-          <w:u w:val="single"/>
-        </w:rPr>
-      </w:pPr>
-      <w:r>
-        <w:rPr>
-          <w:u w:val="single"/>
-        </w:rPr>
-        <w:t>)</w:t>
-      </w:r>
-    </w:p>
-    <w:p>
-      <w:pPr>
-        <w:spacing w:after="0" w:line="240" w:lineRule="auto"/>
-        <w:rPr>
-          <w:u w:val="single"/>
-        </w:rPr>
-      </w:pPr>
-    </w:p>
-    <w:p>
-      <w:pPr>
-        <w:spacing w:after="0" w:line="240" w:lineRule="auto"/>
-        <w:rPr>
-          <w:u w:val="single"/>
-        </w:rPr>
-      </w:pPr>
-      <w:r>
-        <w:rPr>
-          <w:u w:val="single"/>
-        </w:rPr>
-        <w:t>VALUES</w:t>
-      </w:r>
-    </w:p>
-    <w:p>
-      <w:pPr>
-        <w:spacing w:after="0" w:line="240" w:lineRule="auto"/>
-        <w:rPr>
-          <w:u w:val="single"/>
-        </w:rPr>
-      </w:pPr>
-      <w:r>
-        <w:rPr>
-          <w:u w:val="single"/>
-        </w:rPr>
-        <w:t>('</w:t>
-      </w:r>
-      <w:proofErr w:type="spellStart"/>
-      <w:r>
-        <w:rPr>
-          <w:u w:val="single"/>
-        </w:rPr>
-        <w:t>Technology','technology</w:t>
-      </w:r>
-      <w:proofErr w:type="spellEnd"/>
-      <w:r>
-        <w:rPr>
-          <w:u w:val="single"/>
-        </w:rPr>
-        <w:t>'),</w:t>
-      </w:r>
-    </w:p>
-    <w:p>
-      <w:pPr>
-        <w:spacing w:after="0" w:line="240" w:lineRule="auto"/>
-        <w:rPr>
-          <w:u w:val="single"/>
-        </w:rPr>
-      </w:pPr>
-      <w:r>
-        <w:rPr>
-          <w:u w:val="single"/>
-        </w:rPr>
-        <w:t>('</w:t>
-      </w:r>
-      <w:proofErr w:type="spellStart"/>
-      <w:r>
-        <w:rPr>
-          <w:u w:val="single"/>
-        </w:rPr>
-        <w:t>Sports','sports</w:t>
-      </w:r>
-      <w:proofErr w:type="spellEnd"/>
-      <w:r>
-        <w:rPr>
-          <w:u w:val="single"/>
-        </w:rPr>
-        <w:t>'),</w:t>
-      </w:r>
-    </w:p>
-    <w:p>
-      <w:pPr>
-        <w:spacing w:after="0" w:line="240" w:lineRule="auto"/>
-        <w:rPr>
-          <w:u w:val="single"/>
-        </w:rPr>
-      </w:pPr>
-      <w:r>
-        <w:rPr>
-          <w:u w:val="single"/>
-        </w:rPr>
-        <w:t>('</w:t>
-      </w:r>
-      <w:proofErr w:type="spellStart"/>
-      <w:r>
-        <w:rPr>
-          <w:u w:val="single"/>
-        </w:rPr>
-        <w:t>News','news</w:t>
-      </w:r>
-      <w:proofErr w:type="spellEnd"/>
-      <w:r>
-        <w:rPr>
-          <w:u w:val="single"/>
-        </w:rPr>
-        <w:t>');</w:t>
-      </w:r>
-    </w:p>
-    <w:p>
-      <w:pPr>
-        <w:spacing w:after="0" w:line="240" w:lineRule="auto"/>
-        <w:rPr>
-          <w:u w:val="single"/>
-        </w:rPr>
-      </w:pPr>
-    </w:p>
-    <w:p>
-      <w:pPr>
-        <w:spacing w:after="0" w:line="240" w:lineRule="auto"/>
-        <w:rPr>
-          <w:u w:val="single"/>
-        </w:rPr>
-      </w:pPr>
-      <w:r>
-        <w:rPr>
-          <w:u w:val="single"/>
-        </w:rPr>
-        <w:sym w:font="Wingdings" w:char="F0E0"/>
-      </w:r>
-    </w:p>
-    <w:p>
-      <w:pPr>
-        <w:spacing w:after="0" w:line="240" w:lineRule="auto"/>
-        <w:rPr>
-          <w:u w:val="single"/>
-        </w:rPr>
-      </w:pPr>
-    </w:p>
-    <w:p>
-      <w:pPr>
-        <w:spacing w:after="0" w:line="240" w:lineRule="auto"/>
-        <w:rPr>
-          <w:u w:val="single"/>
-        </w:rPr>
-      </w:pPr>
-      <w:r>
-        <w:rPr>
-          <w:u w:val="single"/>
-        </w:rPr>
-        <w:t>INSERT INTO users(</w:t>
-      </w:r>
-    </w:p>
-    <w:p>
-      <w:pPr>
-        <w:spacing w:after="0" w:line="240" w:lineRule="auto"/>
-        <w:rPr>
-          <w:u w:val="single"/>
-        </w:rPr>
-      </w:pPr>
-    </w:p>
-    <w:p>
-      <w:pPr>
-        <w:spacing w:after="0" w:line="240" w:lineRule="auto"/>
-        <w:rPr>
-          <w:u w:val="single"/>
-        </w:rPr>
-      </w:pPr>
-      <w:r>
-        <w:rPr>
-          <w:u w:val="single"/>
-        </w:rPr>
-        <w:t>name,</w:t>
-      </w:r>
-    </w:p>
-    <w:p>
-      <w:pPr>
-        <w:spacing w:after="0" w:line="240" w:lineRule="auto"/>
-        <w:rPr>
-          <w:u w:val="single"/>
-        </w:rPr>
-      </w:pPr>
-      <w:r>
-        <w:rPr>
-          <w:u w:val="single"/>
-        </w:rPr>
-        <w:t>username,</w:t>
-      </w:r>
-    </w:p>
-    <w:p>
-      <w:pPr>
-        <w:spacing w:after="0" w:line="240" w:lineRule="auto"/>
-        <w:rPr>
-          <w:u w:val="single"/>
-        </w:rPr>
-      </w:pPr>
-      <w:r>
-        <w:rPr>
-          <w:u w:val="single"/>
-        </w:rPr>
-        <w:t>email,</w:t>
-      </w:r>
-    </w:p>
-    <w:p>
-      <w:pPr>
-        <w:spacing w:after="0" w:line="240" w:lineRule="auto"/>
-        <w:rPr>
-          <w:u w:val="single"/>
-        </w:rPr>
-      </w:pPr>
-      <w:proofErr w:type="spellStart"/>
-      <w:r>
-        <w:rPr>
-          <w:u w:val="single"/>
-        </w:rPr>
-        <w:t>password_hash</w:t>
-      </w:r>
-      <w:proofErr w:type="spellEnd"/>
-      <w:r>
-        <w:rPr>
-          <w:u w:val="single"/>
-        </w:rPr>
-        <w:t>,</w:t>
-      </w:r>
-    </w:p>
-    <w:p>
-      <w:pPr>
-        <w:spacing w:after="0" w:line="240" w:lineRule="auto"/>
-        <w:rPr>
-          <w:u w:val="single"/>
-        </w:rPr>
-      </w:pPr>
-      <w:r>
-        <w:rPr>
-          <w:u w:val="single"/>
-        </w:rPr>
-        <w:t>role</w:t>
-      </w:r>
-    </w:p>
-    <w:p>
-      <w:pPr>
-        <w:spacing w:after="0" w:line="240" w:lineRule="auto"/>
-        <w:rPr>
-          <w:u w:val="single"/>
-        </w:rPr>
-      </w:pPr>
-    </w:p>
-    <w:p>
-      <w:pPr>
-        <w:spacing w:after="0" w:line="240" w:lineRule="auto"/>
-        <w:rPr>
-          <w:u w:val="single"/>
-        </w:rPr>
-      </w:pPr>
-      <w:r>
-        <w:rPr>
-          <w:u w:val="single"/>
-        </w:rPr>
-        <w:t>)</w:t>
-      </w:r>
-    </w:p>
-    <w:p>
-      <w:pPr>
-        <w:spacing w:after="0" w:line="240" w:lineRule="auto"/>
-        <w:rPr>
-          <w:u w:val="single"/>
-        </w:rPr>
-      </w:pPr>
-    </w:p>
-    <w:p>
-      <w:pPr>
-        <w:spacing w:after="0" w:line="240" w:lineRule="auto"/>
-        <w:rPr>
-          <w:u w:val="single"/>
-        </w:rPr>
-      </w:pPr>
-      <w:r>
-        <w:rPr>
-          <w:u w:val="single"/>
-        </w:rPr>
-        <w:t>VALUES(</w:t>
-      </w:r>
-    </w:p>
-    <w:p>
-      <w:pPr>
-        <w:spacing w:after="0" w:line="240" w:lineRule="auto"/>
-        <w:rPr>
-          <w:u w:val="single"/>
-        </w:rPr>
-      </w:pPr>
-    </w:p>
-    <w:p>
-      <w:pPr>
-        <w:spacing w:after="0" w:line="240" w:lineRule="auto"/>
-        <w:rPr>
-          <w:u w:val="single"/>
-        </w:rPr>
-      </w:pPr>
-      <w:r>
-        <w:rPr>
-          <w:u w:val="single"/>
-        </w:rPr>
-        <w:t>'Nahid',</w:t>
-      </w:r>
-    </w:p>
-    <w:p>
-      <w:pPr>
-        <w:spacing w:after="0" w:line="240" w:lineRule="auto"/>
-        <w:rPr>
-          <w:u w:val="single"/>
-        </w:rPr>
-      </w:pPr>
-      <w:r>
-        <w:rPr>
-          <w:u w:val="single"/>
-        </w:rPr>
-        <w:t>'nahid123',</w:t>
-      </w:r>
-    </w:p>
-    <w:p>
-      <w:pPr>
-        <w:spacing w:after="0" w:line="240" w:lineRule="auto"/>
-        <w:rPr>
-          <w:u w:val="single"/>
-        </w:rPr>
-      </w:pPr>
-      <w:r>
-        <w:rPr>
-          <w:u w:val="single"/>
-        </w:rPr>
-        <w:t>'nahid@gmail.com',</w:t>
-      </w:r>
-    </w:p>
-    <w:p>
-      <w:pPr>
-        <w:spacing w:after="0" w:line="240" w:lineRule="auto"/>
-        <w:rPr>
-          <w:u w:val="single"/>
-        </w:rPr>
-      </w:pPr>
-      <w:r>
-        <w:rPr>
-          <w:u w:val="single"/>
-        </w:rPr>
-        <w:t>'123456',</w:t>
-      </w:r>
-    </w:p>
-    <w:p>
-      <w:pPr>
-        <w:spacing w:after="0" w:line="240" w:lineRule="auto"/>
-        <w:rPr>
-          <w:u w:val="single"/>
-        </w:rPr>
-      </w:pPr>
-      <w:r>
-        <w:rPr>
-          <w:u w:val="single"/>
-        </w:rPr>
-        <w:t>'author'</w:t>
-      </w:r>
-    </w:p>
-    <w:p>
-      <w:pPr>
-        <w:spacing w:after="0" w:line="240" w:lineRule="auto"/>
-        <w:rPr>
-          <w:u w:val="single"/>
-        </w:rPr>
-      </w:pPr>
-    </w:p>
-    <w:p>
-      <w:pPr>
-        <w:spacing w:after="0" w:line="240" w:lineRule="auto"/>
-        <w:rPr>
-          <w:u w:val="single"/>
-        </w:rPr>
-      </w:pPr>
-      <w:r>
-        <w:rPr>
-          <w:u w:val="single"/>
-        </w:rPr>
-        <w:t>);</w:t>
-      </w:r>
-    </w:p>
-    <w:p>
-      <w:pPr>
-        <w:spacing w:after="0" w:line="240" w:lineRule="auto"/>
-        <w:rPr>
-          <w:u w:val="single"/>
-        </w:rPr>
-      </w:pPr>
-    </w:p>
-    <w:p>
-      <w:pPr>
-        <w:spacing w:after="0" w:line="240" w:lineRule="auto"/>
-        <w:rPr>
-          <w:u w:val="single"/>
-        </w:rPr>
-      </w:pPr>
-      <w:r>
-        <w:rPr>
-          <w:u w:val="single"/>
-        </w:rPr>
-        <w:sym w:font="Wingdings" w:char="F0E0"/>
-      </w:r>
-    </w:p>
-    <w:p>
-      <w:pPr>
-        <w:spacing w:after="0" w:line="240" w:lineRule="auto"/>
-        <w:rPr>
-          <w:u w:val="single"/>
-        </w:rPr>
-      </w:pPr>
-    </w:p>
-    <w:p>
-      <w:pPr>
-        <w:spacing w:after="0" w:line="240" w:lineRule="auto"/>
-        <w:rPr>
-          <w:u w:val="single"/>
-        </w:rPr>
-      </w:pPr>
-      <w:r>
-        <w:rPr>
-          <w:u w:val="single"/>
-        </w:rPr>
-        <w:t>INSERT INTO series(</w:t>
-      </w:r>
-    </w:p>
-    <w:p>
-      <w:pPr>
-        <w:spacing w:after="0" w:line="240" w:lineRule="auto"/>
-        <w:rPr>
-          <w:u w:val="single"/>
-        </w:rPr>
-      </w:pPr>
-      <w:proofErr w:type="spellStart"/>
-      <w:r>
-        <w:rPr>
-          <w:u w:val="single"/>
-        </w:rPr>
-        <w:t>author_id</w:t>
-      </w:r>
-      <w:proofErr w:type="spellEnd"/>
-      <w:r>
-        <w:rPr>
-          <w:u w:val="single"/>
-        </w:rPr>
-        <w:t>,</w:t>
-      </w:r>
-    </w:p>
-    <w:p>
-      <w:pPr>
-        <w:spacing w:after="0" w:line="240" w:lineRule="auto"/>
-        <w:rPr>
-          <w:u w:val="single"/>
-        </w:rPr>
-      </w:pPr>
-      <w:r>
-        <w:rPr>
-          <w:u w:val="single"/>
-        </w:rPr>
-        <w:t>title</w:t>
-      </w:r>
-    </w:p>
-    <w:p>
-      <w:pPr>
-        <w:spacing w:after="0" w:line="240" w:lineRule="auto"/>
-        <w:rPr>
-          <w:u w:val="single"/>
-        </w:rPr>
-      </w:pPr>
-      <w:r>
-        <w:rPr>
-          <w:u w:val="single"/>
-        </w:rPr>
-        <w:t>)</w:t>
-      </w:r>
-    </w:p>
-    <w:p>
-      <w:pPr>
-        <w:spacing w:after="0" w:line="240" w:lineRule="auto"/>
-        <w:rPr>
-          <w:u w:val="single"/>
-        </w:rPr>
-      </w:pPr>
-      <w:r>
-        <w:rPr>
-          <w:u w:val="single"/>
-        </w:rPr>
-        <w:t>VALUES</w:t>
-      </w:r>
-    </w:p>
-    <w:p>
-      <w:pPr>
-        <w:spacing w:after="0" w:line="240" w:lineRule="auto"/>
-        <w:rPr>
-          <w:u w:val="single"/>
-        </w:rPr>
-      </w:pPr>
-      <w:r>
-        <w:rPr>
-          <w:u w:val="single"/>
-        </w:rPr>
-        <w:t>(1,'Web Development'),</w:t>
-      </w:r>
-    </w:p>
-    <w:p>
-      <w:pPr>
-        <w:spacing w:after="0" w:line="240" w:lineRule="auto"/>
-        <w:rPr>
-          <w:u w:val="single"/>
-        </w:rPr>
-      </w:pPr>
-      <w:r>
-        <w:rPr>
-          <w:u w:val="single"/>
-        </w:rPr>
-        <w:t>(1,'Programming');</w:t>
-      </w:r>
-    </w:p>
-    <w:p>
-      <w:pPr>
-        <w:spacing w:after="0" w:line="240" w:lineRule="auto"/>
-        <w:rPr>
-          <w:u w:val="single"/>
-        </w:rPr>
-      </w:pPr>
-    </w:p>
-    <w:p>
-      <w:pPr>
-        <w:spacing w:after="0" w:line="240" w:lineRule="auto"/>
-        <w:rPr>
-          <w:u w:val="single"/>
-        </w:rPr>
-      </w:pPr>
-      <w:r>
-        <w:rPr>
-          <w:u w:val="single"/>
-        </w:rPr>
+    </w:p>
+    <w:p>
+      <w:pPr>
+        <w:spacing w:after="0" w:line="240" w:lineRule="auto"/>
+      </w:pPr>
+      <w:r>
         <w:lastRenderedPageBreak/>
         <w:t>-</w:t>
       </w:r>
       <w:r>
-        <w:rPr>
+        <w:sym w:font="Wingdings" w:char="F0E0"/>
+      </w:r>
+    </w:p>
+    <w:p>
+      <w:pPr>
+        <w:spacing w:after="0" w:line="240" w:lineRule="auto"/>
+      </w:pPr>
+    </w:p>
+    <w:p>
+      <w:pPr>
+        <w:spacing w:after="0" w:line="240" w:lineRule="auto"/>
+        <w:rPr>
+          <w:b/>
+          <w:bCs/>
+        </w:rPr>
+      </w:pPr>
+      <w:r>
+        <w:rPr>
+          <w:b/>
+          <w:bCs/>
+        </w:rPr>
+        <w:t>ALTER TABLE articles</w:t>
+      </w:r>
+    </w:p>
+    <w:p>
+      <w:pPr>
+        <w:spacing w:after="0" w:line="240" w:lineRule="auto"/>
+        <w:rPr>
+          <w:b/>
+          <w:bCs/>
+        </w:rPr>
+      </w:pPr>
+      <w:r>
+        <w:rPr>
+          <w:b/>
+          <w:bCs/>
+        </w:rPr>
+        <w:t xml:space="preserve">ADD tags </w:t>
+      </w:r>
+      <w:proofErr w:type="gramStart"/>
+      <w:r>
+        <w:rPr>
+          <w:b/>
+          <w:bCs/>
+        </w:rPr>
+        <w:t>VARCHAR(</w:t>
+      </w:r>
+      <w:proofErr w:type="gramEnd"/>
+      <w:r>
+        <w:rPr>
+          <w:b/>
+          <w:bCs/>
+        </w:rPr>
+        <w:t>255);</w:t>
+      </w:r>
+    </w:p>
+    <w:p>
+      <w:pPr>
+        <w:spacing w:after="0" w:line="240" w:lineRule="auto"/>
+        <w:rPr>
+          <w:b/>
+          <w:bCs/>
+        </w:rPr>
+      </w:pPr>
+    </w:p>
+    <w:p>
+      <w:pPr>
+        <w:spacing w:after="0" w:line="240" w:lineRule="auto"/>
+        <w:rPr>
+          <w:b/>
+          <w:bCs/>
+        </w:rPr>
+      </w:pPr>
+      <w:r>
+        <w:rPr>
+          <w:b/>
+          <w:bCs/>
+        </w:rPr>
+        <w:sym w:font="Wingdings" w:char="F0E0"/>
+      </w:r>
+    </w:p>
+    <w:p>
+      <w:pPr>
+        <w:spacing w:after="0" w:line="240" w:lineRule="auto"/>
+        <w:rPr>
+          <w:b/>
+          <w:bCs/>
+        </w:rPr>
+      </w:pPr>
+      <w:r>
+        <w:rPr>
+          <w:b/>
+          <w:bCs/>
+        </w:rPr>
+        <w:t>UPDATE articles</w:t>
+      </w:r>
+    </w:p>
+    <w:p>
+      <w:pPr>
+        <w:spacing w:after="0" w:line="240" w:lineRule="auto"/>
+        <w:rPr>
+          <w:b/>
+          <w:bCs/>
+        </w:rPr>
+      </w:pPr>
+    </w:p>
+    <w:p>
+      <w:pPr>
+        <w:spacing w:after="0" w:line="240" w:lineRule="auto"/>
+        <w:rPr>
+          <w:b/>
+          <w:bCs/>
+        </w:rPr>
+      </w:pPr>
+      <w:r>
+        <w:rPr>
+          <w:b/>
+          <w:bCs/>
+        </w:rPr>
+        <w:t>SET</w:t>
+      </w:r>
+    </w:p>
+    <w:p>
+      <w:pPr>
+        <w:spacing w:after="0" w:line="240" w:lineRule="auto"/>
+        <w:rPr>
+          <w:b/>
+          <w:bCs/>
+        </w:rPr>
+      </w:pPr>
+      <w:r>
+        <w:rPr>
+          <w:b/>
+          <w:bCs/>
+        </w:rPr>
+        <w:t>status='</w:t>
+      </w:r>
+      <w:proofErr w:type="spellStart"/>
+      <w:r>
+        <w:rPr>
+          <w:b/>
+          <w:bCs/>
+        </w:rPr>
+        <w:t>revision_requested</w:t>
+      </w:r>
+      <w:proofErr w:type="spellEnd"/>
+      <w:r>
+        <w:rPr>
+          <w:b/>
+          <w:bCs/>
+        </w:rPr>
+        <w:t>',</w:t>
+      </w:r>
+    </w:p>
+    <w:p>
+      <w:pPr>
+        <w:spacing w:after="0" w:line="240" w:lineRule="auto"/>
+        <w:rPr>
+          <w:b/>
+          <w:bCs/>
+        </w:rPr>
+      </w:pPr>
+      <w:proofErr w:type="spellStart"/>
+      <w:r>
+        <w:rPr>
+          <w:b/>
+          <w:bCs/>
+        </w:rPr>
+        <w:t>editor_feedback</w:t>
+      </w:r>
+      <w:proofErr w:type="spellEnd"/>
+      <w:r>
+        <w:rPr>
+          <w:b/>
+          <w:bCs/>
+        </w:rPr>
+        <w:t>='Add more examples and improve introduction'</w:t>
+      </w:r>
+    </w:p>
+    <w:p>
+      <w:pPr>
+        <w:spacing w:after="0" w:line="240" w:lineRule="auto"/>
+        <w:rPr>
+          <w:b/>
+          <w:bCs/>
+        </w:rPr>
+      </w:pPr>
+    </w:p>
+    <w:p>
+      <w:pPr>
+        <w:spacing w:after="0" w:line="240" w:lineRule="auto"/>
+        <w:rPr>
+          <w:b/>
+          <w:bCs/>
+        </w:rPr>
+      </w:pPr>
+      <w:r>
+        <w:rPr>
+          <w:b/>
+          <w:bCs/>
+        </w:rPr>
+        <w:t>WHERE id=1;</w:t>
+      </w:r>
+    </w:p>
+    <w:p>
+      <w:pPr>
+        <w:spacing w:after="0" w:line="240" w:lineRule="auto"/>
+        <w:rPr>
+          <w:b/>
+          <w:bCs/>
+        </w:rPr>
+      </w:pPr>
+    </w:p>
+    <w:p>
+      <w:pPr>
+        <w:spacing w:after="0" w:line="240" w:lineRule="auto"/>
+        <w:rPr>
+          <w:b/>
+          <w:bCs/>
+        </w:rPr>
+      </w:pPr>
+    </w:p>
+    <w:p>
+      <w:pPr>
+        <w:spacing w:after="0" w:line="240" w:lineRule="auto"/>
+        <w:rPr>
+          <w:b/>
+          <w:bCs/>
+        </w:rPr>
+      </w:pPr>
+      <w:r>
+        <w:rPr>
+          <w:b/>
+          <w:bCs/>
+        </w:rPr>
+        <w:t>6. Like Table</w:t>
+      </w:r>
+    </w:p>
+    <w:p>
+      <w:pPr>
+        <w:spacing w:after="0" w:line="240" w:lineRule="auto"/>
+        <w:rPr>
+          <w:b/>
+          <w:bCs/>
           <w:u w:val="single"/>
         </w:rPr>
+      </w:pPr>
+    </w:p>
+    <w:p>
+      <w:pPr>
+        <w:spacing w:after="0" w:line="240" w:lineRule="auto"/>
+      </w:pPr>
+      <w:r>
+        <w:t xml:space="preserve">CREATE TABLE </w:t>
+      </w:r>
+      <w:proofErr w:type="spellStart"/>
+      <w:r>
+        <w:t>article_</w:t>
+      </w:r>
+      <w:proofErr w:type="gramStart"/>
+      <w:r>
+        <w:t>likes</w:t>
+      </w:r>
+      <w:proofErr w:type="spellEnd"/>
+      <w:r>
+        <w:t>(</w:t>
+      </w:r>
+      <w:proofErr w:type="gramEnd"/>
+    </w:p>
+    <w:p>
+      <w:pPr>
+        <w:spacing w:after="0" w:line="240" w:lineRule="auto"/>
+      </w:pPr>
+    </w:p>
+    <w:p>
+      <w:pPr>
+        <w:spacing w:after="0" w:line="240" w:lineRule="auto"/>
+      </w:pPr>
+      <w:r>
+        <w:t>id INT PRIMARY KEY AUTO_INCREMENT,</w:t>
+      </w:r>
+    </w:p>
+    <w:p>
+      <w:pPr>
+        <w:spacing w:after="0" w:line="240" w:lineRule="auto"/>
+      </w:pPr>
+    </w:p>
+    <w:p>
+      <w:pPr>
+        <w:spacing w:after="0" w:line="240" w:lineRule="auto"/>
+      </w:pPr>
+      <w:proofErr w:type="spellStart"/>
+      <w:r>
+        <w:t>article_id</w:t>
+      </w:r>
+      <w:proofErr w:type="spellEnd"/>
+      <w:r>
+        <w:t xml:space="preserve"> INT NOT NULL,</w:t>
+      </w:r>
+    </w:p>
+    <w:p>
+      <w:pPr>
+        <w:spacing w:after="0" w:line="240" w:lineRule="auto"/>
+      </w:pPr>
+    </w:p>
+    <w:p>
+      <w:pPr>
+        <w:spacing w:after="0" w:line="240" w:lineRule="auto"/>
+      </w:pPr>
+      <w:proofErr w:type="spellStart"/>
+      <w:r>
+        <w:t>user_id</w:t>
+      </w:r>
+      <w:proofErr w:type="spellEnd"/>
+      <w:r>
+        <w:t xml:space="preserve"> INT NOT NULL,</w:t>
+      </w:r>
+    </w:p>
+    <w:p>
+      <w:pPr>
+        <w:spacing w:after="0" w:line="240" w:lineRule="auto"/>
+      </w:pPr>
+    </w:p>
+    <w:p>
+      <w:pPr>
+        <w:spacing w:after="0" w:line="240" w:lineRule="auto"/>
+      </w:pPr>
+      <w:proofErr w:type="spellStart"/>
+      <w:r>
+        <w:t>created_at</w:t>
+      </w:r>
+      <w:proofErr w:type="spellEnd"/>
+      <w:r>
+        <w:t xml:space="preserve"> TIMESTAMP DEFAULT CURRENT_TIMESTAMP,</w:t>
+      </w:r>
+    </w:p>
+    <w:p>
+      <w:pPr>
+        <w:spacing w:after="0" w:line="240" w:lineRule="auto"/>
+      </w:pPr>
+    </w:p>
+    <w:p>
+      <w:pPr>
+        <w:spacing w:after="0" w:line="240" w:lineRule="auto"/>
+      </w:pPr>
+      <w:r>
+        <w:t xml:space="preserve">FOREIGN </w:t>
+      </w:r>
+      <w:proofErr w:type="gramStart"/>
+      <w:r>
+        <w:t>KEY(</w:t>
+      </w:r>
+      <w:proofErr w:type="spellStart"/>
+      <w:proofErr w:type="gramEnd"/>
+      <w:r>
+        <w:t>article_id</w:t>
+      </w:r>
+      <w:proofErr w:type="spellEnd"/>
+      <w:r>
+        <w:t>)</w:t>
+      </w:r>
+    </w:p>
+    <w:p>
+      <w:pPr>
+        <w:spacing w:after="0" w:line="240" w:lineRule="auto"/>
+      </w:pPr>
+      <w:r>
+        <w:t>REFERENCES articles(id)</w:t>
+      </w:r>
+    </w:p>
+    <w:p>
+      <w:pPr>
+        <w:spacing w:after="0" w:line="240" w:lineRule="auto"/>
+      </w:pPr>
+      <w:r>
+        <w:t>ON DELETE CASCADE,</w:t>
+      </w:r>
+    </w:p>
+    <w:p>
+      <w:pPr>
+        <w:spacing w:after="0" w:line="240" w:lineRule="auto"/>
+      </w:pPr>
+    </w:p>
+    <w:p>
+      <w:pPr>
+        <w:spacing w:after="0" w:line="240" w:lineRule="auto"/>
+      </w:pPr>
+      <w:r>
+        <w:t xml:space="preserve">FOREIGN </w:t>
+      </w:r>
+      <w:proofErr w:type="gramStart"/>
+      <w:r>
+        <w:t>KEY(</w:t>
+      </w:r>
+      <w:proofErr w:type="spellStart"/>
+      <w:proofErr w:type="gramEnd"/>
+      <w:r>
+        <w:t>user_id</w:t>
+      </w:r>
+      <w:proofErr w:type="spellEnd"/>
+      <w:r>
+        <w:t>)</w:t>
+      </w:r>
+    </w:p>
+    <w:p>
+      <w:pPr>
+        <w:spacing w:after="0" w:line="240" w:lineRule="auto"/>
+      </w:pPr>
+      <w:r>
+        <w:t>REFERENCES users(id)</w:t>
+      </w:r>
+    </w:p>
+    <w:p>
+      <w:pPr>
+        <w:spacing w:after="0" w:line="240" w:lineRule="auto"/>
+      </w:pPr>
+      <w:r>
+        <w:t>ON DELETE CASCADE</w:t>
+      </w:r>
+    </w:p>
+    <w:p>
+      <w:pPr>
+        <w:spacing w:after="0" w:line="240" w:lineRule="auto"/>
+        <w:rPr>
+          <w:u w:val="single"/>
+        </w:rPr>
+      </w:pPr>
+    </w:p>
+    <w:p>
+      <w:pPr>
+        <w:spacing w:after="0" w:line="240" w:lineRule="auto"/>
+        <w:rPr>
+          <w:u w:val="single"/>
+        </w:rPr>
+      </w:pPr>
+      <w:r>
+        <w:rPr>
+          <w:u w:val="single"/>
+        </w:rPr>
+        <w:t>);</w:t>
+      </w:r>
+    </w:p>
+    <w:p>
+      <w:pPr>
+        <w:spacing w:after="0" w:line="240" w:lineRule="auto"/>
+        <w:rPr>
+          <w:u w:val="single"/>
+        </w:rPr>
+      </w:pPr>
+    </w:p>
+    <w:p>
+      <w:pPr>
+        <w:spacing w:after="0" w:line="240" w:lineRule="auto"/>
+        <w:rPr>
+          <w:b/>
+          <w:bCs/>
+        </w:rPr>
+      </w:pPr>
+      <w:r>
+        <w:rPr>
+          <w:b/>
+          <w:bCs/>
+        </w:rPr>
+        <w:t>7. Comments Table</w:t>
+      </w:r>
+    </w:p>
+    <w:p>
+      <w:pPr>
+        <w:spacing w:after="0" w:line="240" w:lineRule="auto"/>
+      </w:pPr>
+    </w:p>
+    <w:p>
+      <w:pPr>
+        <w:spacing w:after="0" w:line="240" w:lineRule="auto"/>
+      </w:pPr>
+      <w:r>
+        <w:t xml:space="preserve">CREATE TABLE </w:t>
+      </w:r>
+      <w:proofErr w:type="gramStart"/>
+      <w:r>
+        <w:t>comments(</w:t>
+      </w:r>
+      <w:proofErr w:type="gramEnd"/>
+    </w:p>
+    <w:p>
+      <w:pPr>
+        <w:spacing w:after="0" w:line="240" w:lineRule="auto"/>
+      </w:pPr>
+    </w:p>
+    <w:p>
+      <w:pPr>
+        <w:spacing w:after="0" w:line="240" w:lineRule="auto"/>
+      </w:pPr>
+      <w:r>
+        <w:t>id INT PRIMARY KEY AUTO_INCREMENT,</w:t>
+      </w:r>
+    </w:p>
+    <w:p>
+      <w:pPr>
+        <w:spacing w:after="0" w:line="240" w:lineRule="auto"/>
+      </w:pPr>
+    </w:p>
+    <w:p>
+      <w:pPr>
+        <w:spacing w:after="0" w:line="240" w:lineRule="auto"/>
+      </w:pPr>
+      <w:proofErr w:type="spellStart"/>
+      <w:r>
+        <w:t>article_id</w:t>
+      </w:r>
+      <w:proofErr w:type="spellEnd"/>
+      <w:r>
+        <w:t xml:space="preserve"> INT NOT NULL,</w:t>
+      </w:r>
+    </w:p>
+    <w:p>
+      <w:pPr>
+        <w:spacing w:after="0" w:line="240" w:lineRule="auto"/>
+      </w:pPr>
+    </w:p>
+    <w:p>
+      <w:pPr>
+        <w:spacing w:after="0" w:line="240" w:lineRule="auto"/>
+      </w:pPr>
+      <w:proofErr w:type="spellStart"/>
+      <w:r>
+        <w:t>user_id</w:t>
+      </w:r>
+      <w:proofErr w:type="spellEnd"/>
+      <w:r>
+        <w:t xml:space="preserve"> INT NOT NULL,</w:t>
+      </w:r>
+    </w:p>
+    <w:p>
+      <w:pPr>
+        <w:spacing w:after="0" w:line="240" w:lineRule="auto"/>
+      </w:pPr>
+    </w:p>
+    <w:p>
+      <w:pPr>
+        <w:spacing w:after="0" w:line="240" w:lineRule="auto"/>
+      </w:pPr>
+      <w:r>
+        <w:t>content TEXT NOT NULL,</w:t>
+      </w:r>
+    </w:p>
+    <w:p>
+      <w:pPr>
+        <w:spacing w:after="0" w:line="240" w:lineRule="auto"/>
+      </w:pPr>
+    </w:p>
+    <w:p>
+      <w:pPr>
+        <w:spacing w:after="0" w:line="240" w:lineRule="auto"/>
+      </w:pPr>
+      <w:proofErr w:type="spellStart"/>
+      <w:r>
+        <w:t>created_at</w:t>
+      </w:r>
+      <w:proofErr w:type="spellEnd"/>
+      <w:r>
+        <w:t xml:space="preserve"> TIMESTAMP DEFAULT CURRENT_TIMESTAMP,</w:t>
+      </w:r>
+    </w:p>
+    <w:p>
+      <w:pPr>
+        <w:spacing w:after="0" w:line="240" w:lineRule="auto"/>
+      </w:pPr>
+    </w:p>
+    <w:p>
+      <w:pPr>
+        <w:spacing w:after="0" w:line="240" w:lineRule="auto"/>
+      </w:pPr>
+      <w:r>
+        <w:t xml:space="preserve">FOREIGN </w:t>
+      </w:r>
+      <w:proofErr w:type="gramStart"/>
+      <w:r>
+        <w:t>KEY(</w:t>
+      </w:r>
+      <w:proofErr w:type="spellStart"/>
+      <w:proofErr w:type="gramEnd"/>
+      <w:r>
+        <w:t>article_id</w:t>
+      </w:r>
+      <w:proofErr w:type="spellEnd"/>
+      <w:r>
+        <w:t>)</w:t>
+      </w:r>
+    </w:p>
+    <w:p>
+      <w:pPr>
+        <w:spacing w:after="0" w:line="240" w:lineRule="auto"/>
+      </w:pPr>
+      <w:r>
+        <w:t>REFERENCES articles(id)</w:t>
+      </w:r>
+    </w:p>
+    <w:p>
+      <w:pPr>
+        <w:spacing w:after="0" w:line="240" w:lineRule="auto"/>
+      </w:pPr>
+      <w:r>
+        <w:t>ON DELETE CASCADE,</w:t>
+      </w:r>
+    </w:p>
+    <w:p>
+      <w:pPr>
+        <w:spacing w:after="0" w:line="240" w:lineRule="auto"/>
+      </w:pPr>
+    </w:p>
+    <w:p>
+      <w:pPr>
+        <w:spacing w:after="0" w:line="240" w:lineRule="auto"/>
+      </w:pPr>
+      <w:r>
+        <w:t xml:space="preserve">FOREIGN </w:t>
+      </w:r>
+      <w:proofErr w:type="gramStart"/>
+      <w:r>
+        <w:t>KEY(</w:t>
+      </w:r>
+      <w:proofErr w:type="spellStart"/>
+      <w:proofErr w:type="gramEnd"/>
+      <w:r>
+        <w:t>user_id</w:t>
+      </w:r>
+      <w:proofErr w:type="spellEnd"/>
+      <w:r>
+        <w:t>)</w:t>
+      </w:r>
+    </w:p>
+    <w:p>
+      <w:pPr>
+        <w:spacing w:after="0" w:line="240" w:lineRule="auto"/>
+      </w:pPr>
+      <w:r>
+        <w:t>REFERENCES users(id)</w:t>
+      </w:r>
+    </w:p>
+    <w:p>
+      <w:pPr>
+        <w:spacing w:after="0" w:line="240" w:lineRule="auto"/>
+      </w:pPr>
+      <w:r>
+        <w:t>ON DELETE CASCADE</w:t>
+      </w:r>
+    </w:p>
+    <w:p>
+      <w:pPr>
+        <w:spacing w:after="0" w:line="240" w:lineRule="auto"/>
+      </w:pPr>
+    </w:p>
+    <w:p>
+      <w:pPr>
+        <w:spacing w:after="0" w:line="240" w:lineRule="auto"/>
+      </w:pPr>
+      <w:r>
+        <w:t>);</w:t>
+      </w:r>
+    </w:p>
+    <w:p>
+      <w:pPr>
+        <w:spacing w:after="0" w:line="240" w:lineRule="auto"/>
+        <w:rPr>
+          <w:u w:val="single"/>
+        </w:rPr>
+      </w:pPr>
+    </w:p>
+    <w:p>
+      <w:pPr>
+        <w:spacing w:after="0" w:line="240" w:lineRule="auto"/>
+        <w:rPr>
+          <w:b/>
+          <w:bCs/>
+        </w:rPr>
+      </w:pPr>
+      <w:r>
+        <w:rPr>
+          <w:b/>
+          <w:bCs/>
+        </w:rPr>
+        <w:t>8. Article View History table</w:t>
+      </w:r>
+    </w:p>
+    <w:p>
+      <w:pPr>
+        <w:spacing w:after="0" w:line="240" w:lineRule="auto"/>
+        <w:rPr>
+          <w:u w:val="single"/>
+        </w:rPr>
+      </w:pPr>
+    </w:p>
+    <w:p>
+      <w:pPr>
+        <w:spacing w:after="0" w:line="240" w:lineRule="auto"/>
+      </w:pPr>
+      <w:r>
+        <w:t xml:space="preserve">CREATE TABLE </w:t>
+      </w:r>
+      <w:proofErr w:type="spellStart"/>
+      <w:r>
+        <w:t>article_</w:t>
+      </w:r>
+      <w:proofErr w:type="gramStart"/>
+      <w:r>
+        <w:t>views</w:t>
+      </w:r>
+      <w:proofErr w:type="spellEnd"/>
+      <w:r>
+        <w:t>(</w:t>
+      </w:r>
+      <w:proofErr w:type="gramEnd"/>
+    </w:p>
+    <w:p>
+      <w:pPr>
+        <w:spacing w:after="0" w:line="240" w:lineRule="auto"/>
+      </w:pPr>
+    </w:p>
+    <w:p>
+      <w:pPr>
+        <w:spacing w:after="0" w:line="240" w:lineRule="auto"/>
+      </w:pPr>
+      <w:r>
+        <w:t>id INT PRIMARY KEY AUTO_INCREMENT,</w:t>
+      </w:r>
+    </w:p>
+    <w:p>
+      <w:pPr>
+        <w:spacing w:after="0" w:line="240" w:lineRule="auto"/>
+      </w:pPr>
+    </w:p>
+    <w:p>
+      <w:pPr>
+        <w:spacing w:after="0" w:line="240" w:lineRule="auto"/>
+      </w:pPr>
+      <w:proofErr w:type="spellStart"/>
+      <w:r>
+        <w:t>article_id</w:t>
+      </w:r>
+      <w:proofErr w:type="spellEnd"/>
+      <w:r>
+        <w:t xml:space="preserve"> INT NOT NULL,</w:t>
+      </w:r>
+    </w:p>
+    <w:p>
+      <w:pPr>
+        <w:spacing w:after="0" w:line="240" w:lineRule="auto"/>
+      </w:pPr>
+    </w:p>
+    <w:p>
+      <w:pPr>
+        <w:spacing w:after="0" w:line="240" w:lineRule="auto"/>
+      </w:pPr>
+      <w:proofErr w:type="spellStart"/>
+      <w:r>
+        <w:t>view_date</w:t>
+      </w:r>
+      <w:proofErr w:type="spellEnd"/>
+      <w:r>
+        <w:t xml:space="preserve"> DATE,</w:t>
+      </w:r>
+    </w:p>
+    <w:p>
+      <w:pPr>
+        <w:spacing w:after="0" w:line="240" w:lineRule="auto"/>
+      </w:pPr>
+    </w:p>
+    <w:p>
+      <w:pPr>
+        <w:spacing w:after="0" w:line="240" w:lineRule="auto"/>
+      </w:pPr>
+      <w:r>
+        <w:t>views INT DEFAULT 1,</w:t>
+      </w:r>
+    </w:p>
+    <w:p>
+      <w:pPr>
+        <w:spacing w:after="0" w:line="240" w:lineRule="auto"/>
+      </w:pPr>
+    </w:p>
+    <w:p>
+      <w:pPr>
+        <w:spacing w:after="0" w:line="240" w:lineRule="auto"/>
+      </w:pPr>
+      <w:r>
+        <w:t xml:space="preserve">FOREIGN </w:t>
+      </w:r>
+      <w:proofErr w:type="gramStart"/>
+      <w:r>
+        <w:t>KEY(</w:t>
+      </w:r>
+      <w:proofErr w:type="spellStart"/>
+      <w:proofErr w:type="gramEnd"/>
+      <w:r>
+        <w:t>article_id</w:t>
+      </w:r>
+      <w:proofErr w:type="spellEnd"/>
+      <w:r>
+        <w:t>)</w:t>
+      </w:r>
+    </w:p>
+    <w:p>
+      <w:pPr>
+        <w:spacing w:after="0" w:line="240" w:lineRule="auto"/>
+      </w:pPr>
+      <w:r>
+        <w:t>REFERENCES articles(id)</w:t>
+      </w:r>
+    </w:p>
+    <w:p>
+      <w:pPr>
+        <w:spacing w:after="0" w:line="240" w:lineRule="auto"/>
+      </w:pPr>
+      <w:r>
+        <w:t>ON DELETE CASCADE</w:t>
+      </w:r>
+    </w:p>
+    <w:p>
+      <w:pPr>
+        <w:spacing w:after="0" w:line="240" w:lineRule="auto"/>
+      </w:pPr>
+    </w:p>
+    <w:p>
+      <w:pPr>
+        <w:spacing w:after="0" w:line="240" w:lineRule="auto"/>
+      </w:pPr>
+      <w:r>
+        <w:t>);</w:t>
+      </w:r>
+    </w:p>
+    <w:p>
+      <w:pPr>
+        <w:spacing w:after="0" w:line="240" w:lineRule="auto"/>
+      </w:pPr>
+    </w:p>
+    <w:p>
+      <w:pPr>
+        <w:spacing w:after="0" w:line="240" w:lineRule="auto"/>
+      </w:pPr>
+      <w:r>
         <w:sym w:font="Wingdings" w:char="F0E0"/>
       </w:r>
     </w:p>
     <w:p>
       <w:pPr>
         <w:spacing w:after="0" w:line="240" w:lineRule="auto"/>
-        <w:rPr>
-          <w:u w:val="single"/>
-        </w:rPr>
-      </w:pPr>
-    </w:p>
-    <w:p>
-      <w:pPr>
-        <w:spacing w:after="0" w:line="240" w:lineRule="auto"/>
-        <w:rPr>
-          <w:b/>
-          <w:bCs/>
-          <w:u w:val="single"/>
-        </w:rPr>
-      </w:pPr>
-      <w:r>
-        <w:rPr>
-          <w:b/>
-          <w:bCs/>
-          <w:u w:val="single"/>
-        </w:rPr>
-        <w:t>ALTER TABLE articles</w:t>
-      </w:r>
-    </w:p>
-    <w:p>
-      <w:pPr>
-        <w:spacing w:after="0" w:line="240" w:lineRule="auto"/>
-        <w:rPr>
-          <w:b/>
-          <w:bCs/>
-          <w:u w:val="single"/>
-        </w:rPr>
-      </w:pPr>
-      <w:r>
-        <w:rPr>
-          <w:b/>
-          <w:bCs/>
-          <w:u w:val="single"/>
-        </w:rPr>
-        <w:t>ADD tags VARCHAR(255);</w:t>
-      </w:r>
-    </w:p>
-    <w:p>
-      <w:pPr>
-        <w:spacing w:after="0" w:line="240" w:lineRule="auto"/>
-        <w:rPr>
-          <w:b/>
-          <w:bCs/>
-          <w:u w:val="single"/>
-        </w:rPr>
-      </w:pPr>
-    </w:p>
-    <w:p>
-      <w:pPr>
-        <w:spacing w:after="0" w:line="240" w:lineRule="auto"/>
-        <w:rPr>
-          <w:b/>
-          <w:bCs/>
-          <w:u w:val="single"/>
-        </w:rPr>
-      </w:pPr>
-      <w:r>
-        <w:rPr>
-          <w:b/>
-          <w:bCs/>
-          <w:u w:val="single"/>
-        </w:rPr>
+      </w:pPr>
+    </w:p>
+    <w:p>
+      <w:pPr>
+        <w:spacing w:after="0" w:line="240" w:lineRule="auto"/>
+      </w:pPr>
+      <w:r>
+        <w:t xml:space="preserve">INSERT INTO </w:t>
+      </w:r>
+      <w:proofErr w:type="spellStart"/>
+      <w:r>
+        <w:t>article_</w:t>
+      </w:r>
+      <w:proofErr w:type="gramStart"/>
+      <w:r>
+        <w:t>likes</w:t>
+      </w:r>
+      <w:proofErr w:type="spellEnd"/>
+      <w:r>
+        <w:t>(</w:t>
+      </w:r>
+      <w:proofErr w:type="gramEnd"/>
+    </w:p>
+    <w:p>
+      <w:pPr>
+        <w:spacing w:after="0" w:line="240" w:lineRule="auto"/>
+      </w:pPr>
+    </w:p>
+    <w:p>
+      <w:pPr>
+        <w:spacing w:after="0" w:line="240" w:lineRule="auto"/>
+      </w:pPr>
+      <w:proofErr w:type="spellStart"/>
+      <w:r>
+        <w:t>article_id</w:t>
+      </w:r>
+      <w:proofErr w:type="spellEnd"/>
+      <w:r>
+        <w:t>,</w:t>
+      </w:r>
+    </w:p>
+    <w:p>
+      <w:pPr>
+        <w:spacing w:after="0" w:line="240" w:lineRule="auto"/>
+      </w:pPr>
+      <w:proofErr w:type="spellStart"/>
+      <w:r>
+        <w:t>user_id</w:t>
+      </w:r>
+      <w:proofErr w:type="spellEnd"/>
+    </w:p>
+    <w:p>
+      <w:pPr>
+        <w:spacing w:after="0" w:line="240" w:lineRule="auto"/>
+      </w:pPr>
+    </w:p>
+    <w:p>
+      <w:pPr>
+        <w:spacing w:after="0" w:line="240" w:lineRule="auto"/>
+      </w:pPr>
+      <w:r>
+        <w:t>)</w:t>
+      </w:r>
+    </w:p>
+    <w:p>
+      <w:pPr>
+        <w:spacing w:after="0" w:line="240" w:lineRule="auto"/>
+      </w:pPr>
+    </w:p>
+    <w:p>
+      <w:pPr>
+        <w:spacing w:after="0" w:line="240" w:lineRule="auto"/>
+      </w:pPr>
+      <w:r>
+        <w:lastRenderedPageBreak/>
+        <w:t>VALUES</w:t>
+      </w:r>
+    </w:p>
+    <w:p>
+      <w:pPr>
+        <w:spacing w:after="0" w:line="240" w:lineRule="auto"/>
+      </w:pPr>
+      <w:r>
+        <w:t>(1,1),</w:t>
+      </w:r>
+    </w:p>
+    <w:p>
+      <w:pPr>
+        <w:spacing w:after="0" w:line="240" w:lineRule="auto"/>
+      </w:pPr>
+      <w:r>
+        <w:t>(1,</w:t>
+      </w:r>
+      <w:r>
+        <w:t>1</w:t>
+      </w:r>
+      <w:r>
+        <w:t>),</w:t>
+      </w:r>
+    </w:p>
+    <w:p>
+      <w:pPr>
+        <w:spacing w:after="0" w:line="240" w:lineRule="auto"/>
+      </w:pPr>
+      <w:r>
+        <w:t>(1,</w:t>
+      </w:r>
+      <w:r>
+        <w:t>1</w:t>
+      </w:r>
+      <w:r>
+        <w:t>),</w:t>
+      </w:r>
+    </w:p>
+    <w:p>
+      <w:pPr>
+        <w:spacing w:after="0" w:line="240" w:lineRule="auto"/>
+      </w:pPr>
+      <w:r>
+        <w:t>(1,</w:t>
+      </w:r>
+      <w:r>
+        <w:t>1</w:t>
+      </w:r>
+      <w:r>
+        <w:t>),</w:t>
+      </w:r>
+    </w:p>
+    <w:p>
+      <w:pPr>
+        <w:spacing w:after="0" w:line="240" w:lineRule="auto"/>
+      </w:pPr>
+      <w:r>
+        <w:t>(1,</w:t>
+      </w:r>
+      <w:r>
+        <w:t>1</w:t>
+      </w:r>
+      <w:r>
+        <w:t>);</w:t>
+      </w:r>
+    </w:p>
+    <w:p>
+      <w:pPr>
+        <w:spacing w:after="0" w:line="240" w:lineRule="auto"/>
+      </w:pPr>
+    </w:p>
+    <w:p>
+      <w:pPr>
+        <w:spacing w:after="0" w:line="240" w:lineRule="auto"/>
+      </w:pPr>
+      <w:r>
         <w:sym w:font="Wingdings" w:char="F0E0"/>
       </w:r>
     </w:p>
     <w:p>
       <w:pPr>
         <w:spacing w:after="0" w:line="240" w:lineRule="auto"/>
-        <w:rPr>
-          <w:b/>
-          <w:bCs/>
-          <w:u w:val="single"/>
-        </w:rPr>
-      </w:pPr>
-      <w:r>
-        <w:rPr>
-          <w:b/>
-          <w:bCs/>
-          <w:u w:val="single"/>
-        </w:rPr>
+      </w:pPr>
+    </w:p>
+    <w:p>
+      <w:pPr>
+        <w:spacing w:after="0" w:line="240" w:lineRule="auto"/>
+      </w:pPr>
+      <w:r>
+        <w:t xml:space="preserve">INSERT INTO </w:t>
+      </w:r>
+      <w:proofErr w:type="gramStart"/>
+      <w:r>
+        <w:t>comments(</w:t>
+      </w:r>
+      <w:proofErr w:type="gramEnd"/>
+    </w:p>
+    <w:p>
+      <w:pPr>
+        <w:spacing w:after="0" w:line="240" w:lineRule="auto"/>
+      </w:pPr>
+    </w:p>
+    <w:p>
+      <w:pPr>
+        <w:spacing w:after="0" w:line="240" w:lineRule="auto"/>
+      </w:pPr>
+      <w:proofErr w:type="spellStart"/>
+      <w:r>
+        <w:t>article_id</w:t>
+      </w:r>
+      <w:proofErr w:type="spellEnd"/>
+      <w:r>
+        <w:t>,</w:t>
+      </w:r>
+    </w:p>
+    <w:p>
+      <w:pPr>
+        <w:spacing w:after="0" w:line="240" w:lineRule="auto"/>
+      </w:pPr>
+      <w:proofErr w:type="spellStart"/>
+      <w:r>
+        <w:t>user_id</w:t>
+      </w:r>
+      <w:proofErr w:type="spellEnd"/>
+      <w:r>
+        <w:t>,</w:t>
+      </w:r>
+    </w:p>
+    <w:p>
+      <w:pPr>
+        <w:spacing w:after="0" w:line="240" w:lineRule="auto"/>
+      </w:pPr>
+      <w:r>
+        <w:t>content</w:t>
+      </w:r>
+    </w:p>
+    <w:p>
+      <w:pPr>
+        <w:spacing w:after="0" w:line="240" w:lineRule="auto"/>
+      </w:pPr>
+    </w:p>
+    <w:p>
+      <w:pPr>
+        <w:spacing w:after="0" w:line="240" w:lineRule="auto"/>
+      </w:pPr>
+      <w:r>
+        <w:t>)</w:t>
+      </w:r>
+    </w:p>
+    <w:p>
+      <w:pPr>
+        <w:spacing w:after="0" w:line="240" w:lineRule="auto"/>
+      </w:pPr>
+    </w:p>
+    <w:p>
+      <w:pPr>
+        <w:spacing w:after="0" w:line="240" w:lineRule="auto"/>
+      </w:pPr>
+      <w:r>
+        <w:t>VALUES</w:t>
+      </w:r>
+    </w:p>
+    <w:p>
+      <w:pPr>
+        <w:spacing w:after="0" w:line="240" w:lineRule="auto"/>
+      </w:pPr>
+    </w:p>
+    <w:p>
+      <w:pPr>
+        <w:spacing w:after="0" w:line="240" w:lineRule="auto"/>
+      </w:pPr>
+      <w:r>
+        <w:t>(1,1,'Great article'),</w:t>
+      </w:r>
+    </w:p>
+    <w:p>
+      <w:pPr>
+        <w:spacing w:after="0" w:line="240" w:lineRule="auto"/>
+      </w:pPr>
+      <w:r>
+        <w:t>(1,2,'Very helpful'),</w:t>
+      </w:r>
+    </w:p>
+    <w:p>
+      <w:pPr>
+        <w:spacing w:after="0" w:line="240" w:lineRule="auto"/>
+      </w:pPr>
+      <w:r>
+        <w:t>(1,3,'Add more examples'),</w:t>
+      </w:r>
+    </w:p>
+    <w:p>
+      <w:pPr>
+        <w:spacing w:after="0" w:line="240" w:lineRule="auto"/>
+      </w:pPr>
+      <w:r>
+        <w:t>(1,4,'Nice explanation'),</w:t>
+      </w:r>
+    </w:p>
+    <w:p>
+      <w:pPr>
+        <w:spacing w:after="0" w:line="240" w:lineRule="auto"/>
+      </w:pPr>
+      <w:r>
+        <w:t>(1,5,'Thanks for sharing');</w:t>
+      </w:r>
+    </w:p>
+    <w:p>
+      <w:pPr>
+        <w:spacing w:after="0" w:line="240" w:lineRule="auto"/>
+      </w:pPr>
+    </w:p>
+    <w:p>
+      <w:pPr>
+        <w:spacing w:after="0" w:line="240" w:lineRule="auto"/>
+      </w:pPr>
+      <w:r>
+        <w:sym w:font="Wingdings" w:char="F0E0"/>
+      </w:r>
+    </w:p>
+    <w:p>
+      <w:pPr>
+        <w:spacing w:after="0" w:line="240" w:lineRule="auto"/>
+      </w:pPr>
+    </w:p>
+    <w:p>
+      <w:pPr>
+        <w:spacing w:after="0" w:line="240" w:lineRule="auto"/>
+      </w:pPr>
+      <w:r>
         <w:t>UPDATE articles</w:t>
       </w:r>
     </w:p>
     <w:p>
       <w:pPr>
         <w:spacing w:after="0" w:line="240" w:lineRule="auto"/>
-        <w:rPr>
-          <w:b/>
-          <w:bCs/>
-          <w:u w:val="single"/>
-        </w:rPr>
-      </w:pPr>
-    </w:p>
-    <w:p>
-      <w:pPr>
-        <w:spacing w:after="0" w:line="240" w:lineRule="auto"/>
-        <w:rPr>
-          <w:b/>
-          <w:bCs/>
-          <w:u w:val="single"/>
-        </w:rPr>
-      </w:pPr>
-      <w:r>
-        <w:rPr>
-          <w:b/>
-          <w:bCs/>
-          <w:u w:val="single"/>
-        </w:rPr>
-        <w:t>SET</w:t>
-      </w:r>
-    </w:p>
-    <w:p>
-      <w:pPr>
-        <w:spacing w:after="0" w:line="240" w:lineRule="auto"/>
-        <w:rPr>
-          <w:b/>
-          <w:bCs/>
-          <w:u w:val="single"/>
-        </w:rPr>
-      </w:pPr>
-      <w:r>
-        <w:rPr>
-          <w:b/>
-          <w:bCs/>
-          <w:u w:val="single"/>
-        </w:rPr>
-        <w:t>status='</w:t>
-      </w:r>
-      <w:proofErr w:type="spellStart"/>
-      <w:r>
-        <w:rPr>
-          <w:b/>
-          <w:bCs/>
-          <w:u w:val="single"/>
-        </w:rPr>
-        <w:t>revision_requested</w:t>
-      </w:r>
-      <w:proofErr w:type="spellEnd"/>
-      <w:r>
-        <w:rPr>
-          <w:b/>
-          <w:bCs/>
-          <w:u w:val="single"/>
-        </w:rPr>
-        <w:t>',</w:t>
-      </w:r>
-    </w:p>
-    <w:p>
-      <w:pPr>
-        <w:spacing w:after="0" w:line="240" w:lineRule="auto"/>
-        <w:rPr>
-          <w:b/>
-          <w:bCs/>
-          <w:u w:val="single"/>
-        </w:rPr>
-      </w:pPr>
-      <w:proofErr w:type="spellStart"/>
-      <w:r>
-        <w:rPr>
-          <w:b/>
-          <w:bCs/>
-          <w:u w:val="single"/>
-        </w:rPr>
-        <w:t>editor_feedback</w:t>
-      </w:r>
-      <w:proofErr w:type="spellEnd"/>
-      <w:r>
-        <w:rPr>
-          <w:b/>
-          <w:bCs/>
-          <w:u w:val="single"/>
-        </w:rPr>
-        <w:t>='Add more examples and improve introduction'</w:t>
-      </w:r>
-    </w:p>
-    <w:p>
-      <w:pPr>
-        <w:spacing w:after="0" w:line="240" w:lineRule="auto"/>
-        <w:rPr>
-          <w:b/>
-          <w:bCs/>
-          <w:u w:val="single"/>
-        </w:rPr>
-      </w:pPr>
-    </w:p>
-    <w:p>
-      <w:pPr>
-        <w:spacing w:after="0" w:line="240" w:lineRule="auto"/>
-        <w:rPr>
-          <w:b/>
-          <w:bCs/>
-          <w:u w:val="single"/>
-        </w:rPr>
-      </w:pPr>
-      <w:r>
-        <w:rPr>
-          <w:b/>
-          <w:bCs/>
-          <w:u w:val="single"/>
-        </w:rPr>
-        <w:t>WHERE id=1;</w:t>
-      </w:r>
-    </w:p>
-    <w:p>
-      <w:pPr>
-        <w:spacing w:after="0" w:line="240" w:lineRule="auto"/>
-        <w:rPr>
-          <w:u w:val="single"/>
-        </w:rPr>
+      </w:pPr>
+    </w:p>
+    <w:p>
+      <w:pPr>
+        <w:spacing w:after="0" w:line="240" w:lineRule="auto"/>
+      </w:pPr>
+      <w:r>
+        <w:t xml:space="preserve">SET </w:t>
+      </w:r>
+      <w:proofErr w:type="spellStart"/>
+      <w:r>
+        <w:t>view_count</w:t>
+      </w:r>
+      <w:proofErr w:type="spellEnd"/>
+      <w:r>
+        <w:t xml:space="preserve"> = 120</w:t>
+      </w:r>
+    </w:p>
+    <w:p>
+      <w:pPr>
+        <w:spacing w:after="0" w:line="240" w:lineRule="auto"/>
+      </w:pPr>
+    </w:p>
+    <w:p>
+      <w:pPr>
+        <w:spacing w:after="0" w:line="240" w:lineRule="auto"/>
+      </w:pPr>
+      <w:r>
+        <w:t>WHERE id = 1;</w:t>
+      </w:r>
+    </w:p>
+    <w:p>
+      <w:pPr>
+        <w:spacing w:after="0" w:line="240" w:lineRule="auto"/>
+      </w:pPr>
+    </w:p>
+    <w:p>
+      <w:pPr>
+        <w:spacing w:after="0" w:line="240" w:lineRule="auto"/>
       </w:pPr>
     </w:p>
     <w:sectPr>

</xml_diff>

<commit_message>
View performance analytics per article: total views, total likes, total comments, reads per day over time (#34)
</commit_message>
<xml_diff>
--- a/blogPost/DB Quries/blogPost.docx
+++ b/blogPost/DB Quries/blogPost.docx
@@ -1308,42 +1308,300 @@
         <w:rPr>
           <w:b/>
           <w:bCs/>
+        </w:rPr>
+      </w:pPr>
+      <w:r>
+        <w:rPr>
+          <w:b/>
+          <w:bCs/>
+        </w:rPr>
+        <w:t xml:space="preserve">5. </w:t>
+      </w:r>
+      <w:proofErr w:type="spellStart"/>
+      <w:r>
+        <w:rPr>
+          <w:b/>
+          <w:bCs/>
+        </w:rPr>
+        <w:t>Aricle</w:t>
+      </w:r>
+      <w:proofErr w:type="spellEnd"/>
+      <w:r>
+        <w:rPr>
+          <w:b/>
+          <w:bCs/>
+        </w:rPr>
+        <w:t xml:space="preserve"> Revision</w:t>
+      </w:r>
+    </w:p>
+    <w:p>
+      <w:pPr>
+        <w:spacing w:after="0" w:line="240" w:lineRule="auto"/>
+        <w:rPr>
+          <w:b/>
+          <w:bCs/>
+        </w:rPr>
+      </w:pPr>
+    </w:p>
+    <w:p>
+      <w:pPr>
+        <w:spacing w:after="0" w:line="240" w:lineRule="auto"/>
+      </w:pPr>
+      <w:r>
+        <w:t xml:space="preserve">CREATE TABLE </w:t>
+      </w:r>
+      <w:proofErr w:type="spellStart"/>
+      <w:r>
+        <w:t>article_</w:t>
+      </w:r>
+      <w:proofErr w:type="gramStart"/>
+      <w:r>
+        <w:t>revisions</w:t>
+      </w:r>
+      <w:proofErr w:type="spellEnd"/>
+      <w:r>
+        <w:t>(</w:t>
+      </w:r>
+      <w:proofErr w:type="gramEnd"/>
+    </w:p>
+    <w:p>
+      <w:pPr>
+        <w:spacing w:after="0" w:line="240" w:lineRule="auto"/>
+      </w:pPr>
+    </w:p>
+    <w:p>
+      <w:pPr>
+        <w:spacing w:after="0" w:line="240" w:lineRule="auto"/>
+      </w:pPr>
+      <w:r>
+        <w:t xml:space="preserve">    id INT PRIMARY KEY AUTO_INCREMENT,</w:t>
+      </w:r>
+    </w:p>
+    <w:p>
+      <w:pPr>
+        <w:spacing w:after="0" w:line="240" w:lineRule="auto"/>
+      </w:pPr>
+    </w:p>
+    <w:p>
+      <w:pPr>
+        <w:spacing w:after="0" w:line="240" w:lineRule="auto"/>
+      </w:pPr>
+      <w:r>
+        <w:t xml:space="preserve">    </w:t>
+      </w:r>
+      <w:proofErr w:type="spellStart"/>
+      <w:r>
+        <w:t>article_id</w:t>
+      </w:r>
+      <w:proofErr w:type="spellEnd"/>
+      <w:r>
+        <w:t xml:space="preserve"> INT NOT NULL,</w:t>
+      </w:r>
+    </w:p>
+    <w:p>
+      <w:pPr>
+        <w:spacing w:after="0" w:line="240" w:lineRule="auto"/>
+      </w:pPr>
+    </w:p>
+    <w:p>
+      <w:pPr>
+        <w:spacing w:after="0" w:line="240" w:lineRule="auto"/>
+      </w:pPr>
+      <w:r>
+        <w:t xml:space="preserve">    </w:t>
+      </w:r>
+      <w:proofErr w:type="spellStart"/>
+      <w:r>
+        <w:t>author_id</w:t>
+      </w:r>
+      <w:proofErr w:type="spellEnd"/>
+      <w:r>
+        <w:t xml:space="preserve"> INT NOT NULL,</w:t>
+      </w:r>
+    </w:p>
+    <w:p>
+      <w:pPr>
+        <w:spacing w:after="0" w:line="240" w:lineRule="auto"/>
+      </w:pPr>
+    </w:p>
+    <w:p>
+      <w:pPr>
+        <w:spacing w:after="0" w:line="240" w:lineRule="auto"/>
+      </w:pPr>
+      <w:r>
+        <w:t xml:space="preserve">    </w:t>
+      </w:r>
+      <w:proofErr w:type="spellStart"/>
+      <w:r>
+        <w:t>body_snapshot</w:t>
+      </w:r>
+      <w:proofErr w:type="spellEnd"/>
+      <w:r>
+        <w:t xml:space="preserve"> LONGTEXT,</w:t>
+      </w:r>
+    </w:p>
+    <w:p>
+      <w:pPr>
+        <w:spacing w:after="0" w:line="240" w:lineRule="auto"/>
+      </w:pPr>
+    </w:p>
+    <w:p>
+      <w:pPr>
+        <w:spacing w:after="0" w:line="240" w:lineRule="auto"/>
+      </w:pPr>
+      <w:r>
+        <w:t xml:space="preserve">    </w:t>
+      </w:r>
+      <w:proofErr w:type="spellStart"/>
+      <w:r>
+        <w:t>saved_at</w:t>
+      </w:r>
+      <w:proofErr w:type="spellEnd"/>
+      <w:r>
+        <w:t xml:space="preserve"> TIMESTAMP DEFAULT CURRENT_TIMESTAMP,</w:t>
+      </w:r>
+    </w:p>
+    <w:p>
+      <w:pPr>
+        <w:spacing w:after="0" w:line="240" w:lineRule="auto"/>
+      </w:pPr>
+    </w:p>
+    <w:p>
+      <w:pPr>
+        <w:spacing w:after="0" w:line="240" w:lineRule="auto"/>
+      </w:pPr>
+      <w:r>
+        <w:t xml:space="preserve">    FOREIGN </w:t>
+      </w:r>
+      <w:proofErr w:type="gramStart"/>
+      <w:r>
+        <w:t>KEY(</w:t>
+      </w:r>
+      <w:proofErr w:type="spellStart"/>
+      <w:proofErr w:type="gramEnd"/>
+      <w:r>
+        <w:t>article_id</w:t>
+      </w:r>
+      <w:proofErr w:type="spellEnd"/>
+      <w:r>
+        <w:t>)</w:t>
+      </w:r>
+    </w:p>
+    <w:p>
+      <w:pPr>
+        <w:spacing w:after="0" w:line="240" w:lineRule="auto"/>
+      </w:pPr>
+      <w:r>
+        <w:t xml:space="preserve">    REFERENCES articles(id)</w:t>
+      </w:r>
+    </w:p>
+    <w:p>
+      <w:pPr>
+        <w:spacing w:after="0" w:line="240" w:lineRule="auto"/>
+      </w:pPr>
+      <w:r>
+        <w:t xml:space="preserve">    ON DELETE CASCADE,</w:t>
+      </w:r>
+    </w:p>
+    <w:p>
+      <w:pPr>
+        <w:spacing w:after="0" w:line="240" w:lineRule="auto"/>
+      </w:pPr>
+    </w:p>
+    <w:p>
+      <w:pPr>
+        <w:spacing w:after="0" w:line="240" w:lineRule="auto"/>
+      </w:pPr>
+      <w:r>
+        <w:t xml:space="preserve">    FOREIGN </w:t>
+      </w:r>
+      <w:proofErr w:type="gramStart"/>
+      <w:r>
+        <w:t>KEY(</w:t>
+      </w:r>
+      <w:proofErr w:type="spellStart"/>
+      <w:proofErr w:type="gramEnd"/>
+      <w:r>
+        <w:t>author_id</w:t>
+      </w:r>
+      <w:proofErr w:type="spellEnd"/>
+      <w:r>
+        <w:t>)</w:t>
+      </w:r>
+    </w:p>
+    <w:p>
+      <w:pPr>
+        <w:spacing w:after="0" w:line="240" w:lineRule="auto"/>
+      </w:pPr>
+      <w:r>
+        <w:t xml:space="preserve">    REFERENCES users(id)</w:t>
+      </w:r>
+    </w:p>
+    <w:p>
+      <w:pPr>
+        <w:spacing w:after="0" w:line="240" w:lineRule="auto"/>
+      </w:pPr>
+      <w:r>
+        <w:t xml:space="preserve">    ON DELETE CASCADE</w:t>
+      </w:r>
+    </w:p>
+    <w:p>
+      <w:pPr>
+        <w:spacing w:after="0" w:line="240" w:lineRule="auto"/>
+      </w:pPr>
+    </w:p>
+    <w:p>
+      <w:pPr>
+        <w:spacing w:after="0" w:line="240" w:lineRule="auto"/>
+      </w:pPr>
+      <w:r>
+        <w:t>) ENGINE=</w:t>
+      </w:r>
+      <w:proofErr w:type="spellStart"/>
+      <w:r>
+        <w:t>InnoDB</w:t>
+      </w:r>
+      <w:proofErr w:type="spellEnd"/>
+      <w:r>
+        <w:t>;</w:t>
+      </w:r>
+    </w:p>
+    <w:p>
+      <w:pPr>
+        <w:spacing w:after="0" w:line="240" w:lineRule="auto"/>
+        <w:rPr>
           <w:u w:val="single"/>
         </w:rPr>
       </w:pPr>
-      <w:r>
-        <w:rPr>
-          <w:b/>
-          <w:bCs/>
+    </w:p>
+    <w:p>
+      <w:pPr>
+        <w:spacing w:after="0" w:line="240" w:lineRule="auto"/>
+        <w:rPr>
           <w:u w:val="single"/>
         </w:rPr>
-        <w:t xml:space="preserve">5. </w:t>
-      </w:r>
-      <w:proofErr w:type="spellStart"/>
-      <w:r>
-        <w:rPr>
-          <w:b/>
-          <w:bCs/>
+      </w:pPr>
+    </w:p>
+    <w:p>
+      <w:pPr>
+        <w:spacing w:after="0" w:line="240" w:lineRule="auto"/>
+        <w:rPr>
           <w:u w:val="single"/>
         </w:rPr>
-        <w:t>Aricle</w:t>
-      </w:r>
-      <w:proofErr w:type="spellEnd"/>
-      <w:r>
-        <w:rPr>
-          <w:b/>
-          <w:bCs/>
+      </w:pPr>
+    </w:p>
+    <w:p>
+      <w:pPr>
+        <w:spacing w:after="0" w:line="240" w:lineRule="auto"/>
+        <w:rPr>
           <w:u w:val="single"/>
         </w:rPr>
-        <w:t xml:space="preserve"> Revision</w:t>
-      </w:r>
-    </w:p>
-    <w:p>
-      <w:pPr>
-        <w:spacing w:after="0" w:line="240" w:lineRule="auto"/>
-        <w:rPr>
-          <w:b/>
-          <w:bCs/>
+      </w:pPr>
+    </w:p>
+    <w:p>
+      <w:pPr>
+        <w:spacing w:after="0" w:line="240" w:lineRule="auto"/>
+        <w:rPr>
           <w:u w:val="single"/>
         </w:rPr>
       </w:pPr>
@@ -1355,26 +1613,30 @@
           <w:u w:val="single"/>
         </w:rPr>
       </w:pPr>
-      <w:r>
+    </w:p>
+    <w:p>
+      <w:pPr>
+        <w:spacing w:after="0" w:line="240" w:lineRule="auto"/>
         <w:rPr>
           <w:u w:val="single"/>
         </w:rPr>
-        <w:t xml:space="preserve">CREATE TABLE </w:t>
-      </w:r>
-      <w:proofErr w:type="spellStart"/>
-      <w:r>
+      </w:pPr>
+    </w:p>
+    <w:p>
+      <w:pPr>
+        <w:spacing w:after="0" w:line="240" w:lineRule="auto"/>
         <w:rPr>
           <w:u w:val="single"/>
         </w:rPr>
-        <w:t>article_revisions</w:t>
-      </w:r>
-      <w:proofErr w:type="spellEnd"/>
-      <w:r>
+      </w:pPr>
+    </w:p>
+    <w:p>
+      <w:pPr>
+        <w:spacing w:after="0" w:line="240" w:lineRule="auto"/>
         <w:rPr>
           <w:u w:val="single"/>
         </w:rPr>
-        <w:t>(</w:t>
-      </w:r>
+      </w:pPr>
     </w:p>
     <w:p>
       <w:pPr>
@@ -1391,12 +1653,14 @@
           <w:u w:val="single"/>
         </w:rPr>
       </w:pPr>
-      <w:r>
+    </w:p>
+    <w:p>
+      <w:pPr>
+        <w:spacing w:after="0" w:line="240" w:lineRule="auto"/>
         <w:rPr>
           <w:u w:val="single"/>
         </w:rPr>
-        <w:t xml:space="preserve">    id INT PRIMARY KEY AUTO_INCREMENT,</w:t>
-      </w:r>
+      </w:pPr>
     </w:p>
     <w:p>
       <w:pPr>
@@ -1409,418 +1673,8 @@
     <w:p>
       <w:pPr>
         <w:spacing w:after="0" w:line="240" w:lineRule="auto"/>
-        <w:rPr>
-          <w:u w:val="single"/>
-        </w:rPr>
-      </w:pPr>
-      <w:r>
-        <w:rPr>
-          <w:u w:val="single"/>
-        </w:rPr>
-        <w:t xml:space="preserve">    </w:t>
-      </w:r>
-      <w:proofErr w:type="spellStart"/>
-      <w:r>
-        <w:rPr>
-          <w:u w:val="single"/>
-        </w:rPr>
-        <w:t>article_id</w:t>
-      </w:r>
-      <w:proofErr w:type="spellEnd"/>
-      <w:r>
-        <w:rPr>
-          <w:u w:val="single"/>
-        </w:rPr>
-        <w:t xml:space="preserve"> INT NOT NULL,</w:t>
-      </w:r>
-    </w:p>
-    <w:p>
-      <w:pPr>
-        <w:spacing w:after="0" w:line="240" w:lineRule="auto"/>
-        <w:rPr>
-          <w:u w:val="single"/>
-        </w:rPr>
-      </w:pPr>
-    </w:p>
-    <w:p>
-      <w:pPr>
-        <w:spacing w:after="0" w:line="240" w:lineRule="auto"/>
-        <w:rPr>
-          <w:u w:val="single"/>
-        </w:rPr>
-      </w:pPr>
-      <w:r>
-        <w:rPr>
-          <w:u w:val="single"/>
-        </w:rPr>
-        <w:t xml:space="preserve">    </w:t>
-      </w:r>
-      <w:proofErr w:type="spellStart"/>
-      <w:r>
-        <w:rPr>
-          <w:u w:val="single"/>
-        </w:rPr>
-        <w:t>author_id</w:t>
-      </w:r>
-      <w:proofErr w:type="spellEnd"/>
-      <w:r>
-        <w:rPr>
-          <w:u w:val="single"/>
-        </w:rPr>
-        <w:t xml:space="preserve"> INT NOT NULL,</w:t>
-      </w:r>
-    </w:p>
-    <w:p>
-      <w:pPr>
-        <w:spacing w:after="0" w:line="240" w:lineRule="auto"/>
-        <w:rPr>
-          <w:u w:val="single"/>
-        </w:rPr>
-      </w:pPr>
-    </w:p>
-    <w:p>
-      <w:pPr>
-        <w:spacing w:after="0" w:line="240" w:lineRule="auto"/>
-        <w:rPr>
-          <w:u w:val="single"/>
-        </w:rPr>
-      </w:pPr>
-      <w:r>
-        <w:rPr>
-          <w:u w:val="single"/>
-        </w:rPr>
-        <w:t xml:space="preserve">    </w:t>
-      </w:r>
-      <w:proofErr w:type="spellStart"/>
-      <w:r>
-        <w:rPr>
-          <w:u w:val="single"/>
-        </w:rPr>
-        <w:t>body_snapshot</w:t>
-      </w:r>
-      <w:proofErr w:type="spellEnd"/>
-      <w:r>
-        <w:rPr>
-          <w:u w:val="single"/>
-        </w:rPr>
-        <w:t xml:space="preserve"> LONGTEXT,</w:t>
-      </w:r>
-    </w:p>
-    <w:p>
-      <w:pPr>
-        <w:spacing w:after="0" w:line="240" w:lineRule="auto"/>
-        <w:rPr>
-          <w:u w:val="single"/>
-        </w:rPr>
-      </w:pPr>
-    </w:p>
-    <w:p>
-      <w:pPr>
-        <w:spacing w:after="0" w:line="240" w:lineRule="auto"/>
-        <w:rPr>
-          <w:u w:val="single"/>
-        </w:rPr>
-      </w:pPr>
-      <w:r>
-        <w:rPr>
-          <w:u w:val="single"/>
-        </w:rPr>
-        <w:t xml:space="preserve">    </w:t>
-      </w:r>
-      <w:proofErr w:type="spellStart"/>
-      <w:r>
-        <w:rPr>
-          <w:u w:val="single"/>
-        </w:rPr>
-        <w:t>saved_at</w:t>
-      </w:r>
-      <w:proofErr w:type="spellEnd"/>
-      <w:r>
-        <w:rPr>
-          <w:u w:val="single"/>
-        </w:rPr>
-        <w:t xml:space="preserve"> TIMESTAMP DEFAULT CURRENT_TIMESTAMP,</w:t>
-      </w:r>
-    </w:p>
-    <w:p>
-      <w:pPr>
-        <w:spacing w:after="0" w:line="240" w:lineRule="auto"/>
-        <w:rPr>
-          <w:u w:val="single"/>
-        </w:rPr>
-      </w:pPr>
-    </w:p>
-    <w:p>
-      <w:pPr>
-        <w:spacing w:after="0" w:line="240" w:lineRule="auto"/>
-        <w:rPr>
-          <w:u w:val="single"/>
-        </w:rPr>
-      </w:pPr>
-      <w:r>
-        <w:rPr>
-          <w:u w:val="single"/>
-        </w:rPr>
-        <w:t xml:space="preserve">    FOREIGN KEY(</w:t>
-      </w:r>
-      <w:proofErr w:type="spellStart"/>
-      <w:r>
-        <w:rPr>
-          <w:u w:val="single"/>
-        </w:rPr>
-        <w:t>article_id</w:t>
-      </w:r>
-      <w:proofErr w:type="spellEnd"/>
-      <w:r>
-        <w:rPr>
-          <w:u w:val="single"/>
-        </w:rPr>
-        <w:t>)</w:t>
-      </w:r>
-    </w:p>
-    <w:p>
-      <w:pPr>
-        <w:spacing w:after="0" w:line="240" w:lineRule="auto"/>
-        <w:rPr>
-          <w:u w:val="single"/>
-        </w:rPr>
-      </w:pPr>
-      <w:r>
-        <w:rPr>
-          <w:u w:val="single"/>
-        </w:rPr>
-        <w:t xml:space="preserve">    REFERENCES articles(id)</w:t>
-      </w:r>
-    </w:p>
-    <w:p>
-      <w:pPr>
-        <w:spacing w:after="0" w:line="240" w:lineRule="auto"/>
-        <w:rPr>
-          <w:u w:val="single"/>
-        </w:rPr>
-      </w:pPr>
-      <w:r>
-        <w:rPr>
-          <w:u w:val="single"/>
-        </w:rPr>
-        <w:t xml:space="preserve">    ON DELETE CASCADE,</w:t>
-      </w:r>
-    </w:p>
-    <w:p>
-      <w:pPr>
-        <w:spacing w:after="0" w:line="240" w:lineRule="auto"/>
-        <w:rPr>
-          <w:u w:val="single"/>
-        </w:rPr>
-      </w:pPr>
-    </w:p>
-    <w:p>
-      <w:pPr>
-        <w:spacing w:after="0" w:line="240" w:lineRule="auto"/>
-        <w:rPr>
-          <w:u w:val="single"/>
-        </w:rPr>
-      </w:pPr>
-      <w:r>
-        <w:rPr>
-          <w:u w:val="single"/>
-        </w:rPr>
-        <w:t xml:space="preserve">    FOREIGN KEY(</w:t>
-      </w:r>
-      <w:proofErr w:type="spellStart"/>
-      <w:r>
-        <w:rPr>
-          <w:u w:val="single"/>
-        </w:rPr>
-        <w:t>author_id</w:t>
-      </w:r>
-      <w:proofErr w:type="spellEnd"/>
-      <w:r>
-        <w:rPr>
-          <w:u w:val="single"/>
-        </w:rPr>
-        <w:t>)</w:t>
-      </w:r>
-    </w:p>
-    <w:p>
-      <w:pPr>
-        <w:spacing w:after="0" w:line="240" w:lineRule="auto"/>
-        <w:rPr>
-          <w:u w:val="single"/>
-        </w:rPr>
-      </w:pPr>
-      <w:r>
-        <w:rPr>
-          <w:u w:val="single"/>
-        </w:rPr>
-        <w:t xml:space="preserve">    REFERENCES users(id)</w:t>
-      </w:r>
-    </w:p>
-    <w:p>
-      <w:pPr>
-        <w:spacing w:after="0" w:line="240" w:lineRule="auto"/>
-        <w:rPr>
-          <w:u w:val="single"/>
-        </w:rPr>
-      </w:pPr>
-      <w:r>
-        <w:rPr>
-          <w:u w:val="single"/>
-        </w:rPr>
-        <w:t xml:space="preserve">    ON DELETE CASCADE</w:t>
-      </w:r>
-    </w:p>
-    <w:p>
-      <w:pPr>
-        <w:spacing w:after="0" w:line="240" w:lineRule="auto"/>
-        <w:rPr>
-          <w:u w:val="single"/>
-        </w:rPr>
-      </w:pPr>
-    </w:p>
-    <w:p>
-      <w:pPr>
-        <w:spacing w:after="0" w:line="240" w:lineRule="auto"/>
-        <w:rPr>
-          <w:u w:val="single"/>
-        </w:rPr>
-      </w:pPr>
-      <w:r>
-        <w:rPr>
-          <w:u w:val="single"/>
-        </w:rPr>
-        <w:t>) ENGINE=</w:t>
-      </w:r>
-      <w:proofErr w:type="spellStart"/>
-      <w:r>
-        <w:rPr>
-          <w:u w:val="single"/>
-        </w:rPr>
-        <w:t>InnoDB</w:t>
-      </w:r>
-      <w:proofErr w:type="spellEnd"/>
-      <w:r>
-        <w:rPr>
-          <w:u w:val="single"/>
-        </w:rPr>
-        <w:t>;</w:t>
-      </w:r>
-    </w:p>
-    <w:p>
-      <w:pPr>
-        <w:spacing w:after="0" w:line="240" w:lineRule="auto"/>
-        <w:rPr>
-          <w:u w:val="single"/>
-        </w:rPr>
-      </w:pPr>
-    </w:p>
-    <w:p>
-      <w:pPr>
-        <w:spacing w:after="0" w:line="240" w:lineRule="auto"/>
-        <w:rPr>
-          <w:u w:val="single"/>
-        </w:rPr>
-      </w:pPr>
-    </w:p>
-    <w:p>
-      <w:pPr>
-        <w:spacing w:after="0" w:line="240" w:lineRule="auto"/>
-        <w:rPr>
-          <w:u w:val="single"/>
-        </w:rPr>
-      </w:pPr>
-    </w:p>
-    <w:p>
-      <w:pPr>
-        <w:spacing w:after="0" w:line="240" w:lineRule="auto"/>
-        <w:rPr>
-          <w:u w:val="single"/>
-        </w:rPr>
-      </w:pPr>
-    </w:p>
-    <w:p>
-      <w:pPr>
-        <w:spacing w:after="0" w:line="240" w:lineRule="auto"/>
-        <w:rPr>
-          <w:u w:val="single"/>
-        </w:rPr>
-      </w:pPr>
-    </w:p>
-    <w:p>
-      <w:pPr>
-        <w:spacing w:after="0" w:line="240" w:lineRule="auto"/>
-        <w:rPr>
-          <w:u w:val="single"/>
-        </w:rPr>
-      </w:pPr>
-    </w:p>
-    <w:p>
-      <w:pPr>
-        <w:spacing w:after="0" w:line="240" w:lineRule="auto"/>
-        <w:rPr>
-          <w:u w:val="single"/>
-        </w:rPr>
-      </w:pPr>
-    </w:p>
-    <w:p>
-      <w:pPr>
-        <w:spacing w:after="0" w:line="240" w:lineRule="auto"/>
-        <w:rPr>
-          <w:u w:val="single"/>
-        </w:rPr>
-      </w:pPr>
-    </w:p>
-    <w:p>
-      <w:pPr>
-        <w:spacing w:after="0" w:line="240" w:lineRule="auto"/>
-        <w:rPr>
-          <w:u w:val="single"/>
-        </w:rPr>
-      </w:pPr>
-    </w:p>
-    <w:p>
-      <w:pPr>
-        <w:spacing w:after="0" w:line="240" w:lineRule="auto"/>
-        <w:rPr>
-          <w:u w:val="single"/>
-        </w:rPr>
-      </w:pPr>
-    </w:p>
-    <w:p>
-      <w:pPr>
-        <w:spacing w:after="0" w:line="240" w:lineRule="auto"/>
-        <w:rPr>
-          <w:u w:val="single"/>
-        </w:rPr>
-      </w:pPr>
-    </w:p>
-    <w:p>
-      <w:pPr>
-        <w:spacing w:after="0" w:line="240" w:lineRule="auto"/>
-        <w:rPr>
-          <w:u w:val="single"/>
-        </w:rPr>
-      </w:pPr>
-    </w:p>
-    <w:p>
-      <w:pPr>
-        <w:spacing w:after="0" w:line="240" w:lineRule="auto"/>
-        <w:rPr>
-          <w:u w:val="single"/>
-        </w:rPr>
-      </w:pPr>
-    </w:p>
-    <w:p>
-      <w:pPr>
-        <w:spacing w:after="0" w:line="240" w:lineRule="auto"/>
-        <w:rPr>
-          <w:u w:val="single"/>
-        </w:rPr>
-      </w:pPr>
-      <w:r>
-        <w:rPr>
-          <w:u w:val="single"/>
-        </w:rPr>
+      </w:pPr>
+      <w:r>
         <w:lastRenderedPageBreak/>
         <w:sym w:font="Wingdings" w:char="F0E0"/>
       </w:r>
@@ -1828,6 +1682,122 @@
     <w:p>
       <w:pPr>
         <w:spacing w:after="0" w:line="240" w:lineRule="auto"/>
+      </w:pPr>
+    </w:p>
+    <w:p>
+      <w:pPr>
+        <w:spacing w:after="0" w:line="240" w:lineRule="auto"/>
+      </w:pPr>
+      <w:r>
+        <w:t xml:space="preserve">INSERT INTO </w:t>
+      </w:r>
+      <w:proofErr w:type="gramStart"/>
+      <w:r>
+        <w:t>categories(</w:t>
+      </w:r>
+      <w:proofErr w:type="gramEnd"/>
+    </w:p>
+    <w:p>
+      <w:pPr>
+        <w:spacing w:after="0" w:line="240" w:lineRule="auto"/>
+      </w:pPr>
+      <w:r>
+        <w:t>name,</w:t>
+      </w:r>
+    </w:p>
+    <w:p>
+      <w:pPr>
+        <w:spacing w:after="0" w:line="240" w:lineRule="auto"/>
+      </w:pPr>
+      <w:r>
+        <w:t>slug</w:t>
+      </w:r>
+    </w:p>
+    <w:p>
+      <w:pPr>
+        <w:spacing w:after="0" w:line="240" w:lineRule="auto"/>
+      </w:pPr>
+      <w:r>
+        <w:t>)</w:t>
+      </w:r>
+    </w:p>
+    <w:p>
+      <w:pPr>
+        <w:spacing w:after="0" w:line="240" w:lineRule="auto"/>
+      </w:pPr>
+    </w:p>
+    <w:p>
+      <w:pPr>
+        <w:spacing w:after="0" w:line="240" w:lineRule="auto"/>
+      </w:pPr>
+      <w:r>
+        <w:t>VALUES</w:t>
+      </w:r>
+    </w:p>
+    <w:p>
+      <w:pPr>
+        <w:spacing w:after="0" w:line="240" w:lineRule="auto"/>
+      </w:pPr>
+      <w:r>
+        <w:t>('</w:t>
+      </w:r>
+      <w:proofErr w:type="spellStart"/>
+      <w:r>
+        <w:t>Technology','technology</w:t>
+      </w:r>
+      <w:proofErr w:type="spellEnd"/>
+      <w:r>
+        <w:t>'),</w:t>
+      </w:r>
+    </w:p>
+    <w:p>
+      <w:pPr>
+        <w:spacing w:after="0" w:line="240" w:lineRule="auto"/>
+      </w:pPr>
+      <w:r>
+        <w:t>('</w:t>
+      </w:r>
+      <w:proofErr w:type="spellStart"/>
+      <w:r>
+        <w:t>Sports','sports</w:t>
+      </w:r>
+      <w:proofErr w:type="spellEnd"/>
+      <w:r>
+        <w:t>'),</w:t>
+      </w:r>
+    </w:p>
+    <w:p>
+      <w:pPr>
+        <w:spacing w:after="0" w:line="240" w:lineRule="auto"/>
+      </w:pPr>
+      <w:r>
+        <w:t>('</w:t>
+      </w:r>
+      <w:proofErr w:type="spellStart"/>
+      <w:r>
+        <w:t>News','news</w:t>
+      </w:r>
+      <w:proofErr w:type="spellEnd"/>
+      <w:r>
+        <w:t>');</w:t>
+      </w:r>
+    </w:p>
+    <w:p>
+      <w:pPr>
+        <w:spacing w:after="0" w:line="240" w:lineRule="auto"/>
+      </w:pPr>
+    </w:p>
+    <w:p>
+      <w:pPr>
+        <w:spacing w:after="0" w:line="240" w:lineRule="auto"/>
+      </w:pPr>
+      <w:r>
+        <w:sym w:font="Wingdings" w:char="F0E0"/>
+      </w:r>
+    </w:p>
+    <w:p>
+      <w:pPr>
+        <w:spacing w:after="0" w:line="240" w:lineRule="auto"/>
         <w:rPr>
           <w:u w:val="single"/>
         </w:rPr>
@@ -1836,15 +1806,240 @@
     <w:p>
       <w:pPr>
         <w:spacing w:after="0" w:line="240" w:lineRule="auto"/>
+      </w:pPr>
+      <w:r>
+        <w:t xml:space="preserve">INSERT INTO </w:t>
+      </w:r>
+      <w:proofErr w:type="gramStart"/>
+      <w:r>
+        <w:t>users(</w:t>
+      </w:r>
+      <w:proofErr w:type="gramEnd"/>
+    </w:p>
+    <w:p>
+      <w:pPr>
+        <w:spacing w:after="0" w:line="240" w:lineRule="auto"/>
+      </w:pPr>
+    </w:p>
+    <w:p>
+      <w:pPr>
+        <w:spacing w:after="0" w:line="240" w:lineRule="auto"/>
+      </w:pPr>
+      <w:r>
+        <w:t>name,</w:t>
+      </w:r>
+    </w:p>
+    <w:p>
+      <w:pPr>
+        <w:spacing w:after="0" w:line="240" w:lineRule="auto"/>
+      </w:pPr>
+      <w:r>
+        <w:t>username,</w:t>
+      </w:r>
+    </w:p>
+    <w:p>
+      <w:pPr>
+        <w:spacing w:after="0" w:line="240" w:lineRule="auto"/>
+      </w:pPr>
+      <w:r>
+        <w:t>email,</w:t>
+      </w:r>
+    </w:p>
+    <w:p>
+      <w:pPr>
+        <w:spacing w:after="0" w:line="240" w:lineRule="auto"/>
+      </w:pPr>
+      <w:proofErr w:type="spellStart"/>
+      <w:r>
+        <w:t>password_hash</w:t>
+      </w:r>
+      <w:proofErr w:type="spellEnd"/>
+      <w:r>
+        <w:t>,</w:t>
+      </w:r>
+    </w:p>
+    <w:p>
+      <w:pPr>
+        <w:spacing w:after="0" w:line="240" w:lineRule="auto"/>
+      </w:pPr>
+      <w:r>
+        <w:t>role</w:t>
+      </w:r>
+    </w:p>
+    <w:p>
+      <w:pPr>
+        <w:spacing w:after="0" w:line="240" w:lineRule="auto"/>
+      </w:pPr>
+    </w:p>
+    <w:p>
+      <w:pPr>
+        <w:spacing w:after="0" w:line="240" w:lineRule="auto"/>
+      </w:pPr>
+      <w:r>
+        <w:t>)</w:t>
+      </w:r>
+    </w:p>
+    <w:p>
+      <w:pPr>
+        <w:spacing w:after="0" w:line="240" w:lineRule="auto"/>
+      </w:pPr>
+    </w:p>
+    <w:p>
+      <w:pPr>
+        <w:spacing w:after="0" w:line="240" w:lineRule="auto"/>
+      </w:pPr>
+      <w:proofErr w:type="gramStart"/>
+      <w:r>
+        <w:t>VALUES(</w:t>
+      </w:r>
+      <w:proofErr w:type="gramEnd"/>
+    </w:p>
+    <w:p>
+      <w:pPr>
+        <w:spacing w:after="0" w:line="240" w:lineRule="auto"/>
+      </w:pPr>
+    </w:p>
+    <w:p>
+      <w:pPr>
+        <w:spacing w:after="0" w:line="240" w:lineRule="auto"/>
+      </w:pPr>
+      <w:r>
+        <w:t>'Nahid',</w:t>
+      </w:r>
+    </w:p>
+    <w:p>
+      <w:pPr>
+        <w:spacing w:after="0" w:line="240" w:lineRule="auto"/>
+      </w:pPr>
+      <w:r>
+        <w:t>'nahid123',</w:t>
+      </w:r>
+    </w:p>
+    <w:p>
+      <w:pPr>
+        <w:spacing w:after="0" w:line="240" w:lineRule="auto"/>
+      </w:pPr>
+      <w:r>
+        <w:t>'nahid@gmail.com',</w:t>
+      </w:r>
+    </w:p>
+    <w:p>
+      <w:pPr>
+        <w:spacing w:after="0" w:line="240" w:lineRule="auto"/>
+      </w:pPr>
+      <w:r>
+        <w:t>'123456',</w:t>
+      </w:r>
+    </w:p>
+    <w:p>
+      <w:pPr>
+        <w:spacing w:after="0" w:line="240" w:lineRule="auto"/>
+      </w:pPr>
+      <w:r>
+        <w:t>'author'</w:t>
+      </w:r>
+    </w:p>
+    <w:p>
+      <w:pPr>
+        <w:spacing w:after="0" w:line="240" w:lineRule="auto"/>
+      </w:pPr>
+    </w:p>
+    <w:p>
+      <w:pPr>
+        <w:spacing w:after="0" w:line="240" w:lineRule="auto"/>
+      </w:pPr>
+      <w:r>
+        <w:t>);</w:t>
+      </w:r>
+    </w:p>
+    <w:p>
+      <w:pPr>
+        <w:spacing w:after="0" w:line="240" w:lineRule="auto"/>
         <w:rPr>
           <w:u w:val="single"/>
         </w:rPr>
       </w:pPr>
-      <w:r>
+    </w:p>
+    <w:p>
+      <w:pPr>
+        <w:spacing w:after="0" w:line="240" w:lineRule="auto"/>
+      </w:pPr>
+      <w:r>
+        <w:sym w:font="Wingdings" w:char="F0E0"/>
+      </w:r>
+    </w:p>
+    <w:p>
+      <w:pPr>
+        <w:spacing w:after="0" w:line="240" w:lineRule="auto"/>
         <w:rPr>
           <w:u w:val="single"/>
         </w:rPr>
-        <w:t>INSERT INTO categories(</w:t>
+      </w:pPr>
+    </w:p>
+    <w:p>
+      <w:pPr>
+        <w:spacing w:after="0" w:line="240" w:lineRule="auto"/>
+      </w:pPr>
+      <w:r>
+        <w:t xml:space="preserve">INSERT INTO </w:t>
+      </w:r>
+      <w:proofErr w:type="gramStart"/>
+      <w:r>
+        <w:t>series(</w:t>
+      </w:r>
+      <w:proofErr w:type="gramEnd"/>
+    </w:p>
+    <w:p>
+      <w:pPr>
+        <w:spacing w:after="0" w:line="240" w:lineRule="auto"/>
+      </w:pPr>
+      <w:proofErr w:type="spellStart"/>
+      <w:r>
+        <w:t>author_id</w:t>
+      </w:r>
+      <w:proofErr w:type="spellEnd"/>
+      <w:r>
+        <w:t>,</w:t>
+      </w:r>
+    </w:p>
+    <w:p>
+      <w:pPr>
+        <w:spacing w:after="0" w:line="240" w:lineRule="auto"/>
+      </w:pPr>
+      <w:r>
+        <w:t>title</w:t>
+      </w:r>
+    </w:p>
+    <w:p>
+      <w:pPr>
+        <w:spacing w:after="0" w:line="240" w:lineRule="auto"/>
+      </w:pPr>
+      <w:r>
+        <w:t>)</w:t>
+      </w:r>
+    </w:p>
+    <w:p>
+      <w:pPr>
+        <w:spacing w:after="0" w:line="240" w:lineRule="auto"/>
+      </w:pPr>
+      <w:r>
+        <w:t>VALUES</w:t>
+      </w:r>
+    </w:p>
+    <w:p>
+      <w:pPr>
+        <w:spacing w:after="0" w:line="240" w:lineRule="auto"/>
+      </w:pPr>
+      <w:r>
+        <w:t>(1,'Web Development'),</w:t>
+      </w:r>
+    </w:p>
+    <w:p>
+      <w:pPr>
+        <w:spacing w:after="0" w:line="240" w:lineRule="auto"/>
+      </w:pPr>
+      <w:r>
+        <w:t>(1,'Programming');</w:t>
       </w:r>
     </w:p>
     <w:p>
@@ -1854,802 +2049,1214 @@
           <w:u w:val="single"/>
         </w:rPr>
       </w:pPr>
-      <w:r>
-        <w:rPr>
-          <w:u w:val="single"/>
-        </w:rPr>
-        <w:t>name,</w:t>
-      </w:r>
-    </w:p>
-    <w:p>
-      <w:pPr>
-        <w:spacing w:after="0" w:line="240" w:lineRule="auto"/>
-        <w:rPr>
-          <w:u w:val="single"/>
-        </w:rPr>
-      </w:pPr>
-      <w:r>
-        <w:rPr>
-          <w:u w:val="single"/>
-        </w:rPr>
-        <w:t>slug</w:t>
-      </w:r>
-    </w:p>
-    <w:p>
-      <w:pPr>
-        <w:spacing w:after="0" w:line="240" w:lineRule="auto"/>
-        <w:rPr>
-          <w:u w:val="single"/>
-        </w:rPr>
-      </w:pPr>
-      <w:r>
-        <w:rPr>
-          <w:u w:val="single"/>
-        </w:rPr>
-        <w:t>)</w:t>
-      </w:r>
-    </w:p>
-    <w:p>
-      <w:pPr>
-        <w:spacing w:after="0" w:line="240" w:lineRule="auto"/>
-        <w:rPr>
-          <w:u w:val="single"/>
-        </w:rPr>
-      </w:pPr>
-    </w:p>
-    <w:p>
-      <w:pPr>
-        <w:spacing w:after="0" w:line="240" w:lineRule="auto"/>
-        <w:rPr>
-          <w:u w:val="single"/>
-        </w:rPr>
-      </w:pPr>
-      <w:r>
-        <w:rPr>
-          <w:u w:val="single"/>
-        </w:rPr>
-        <w:t>VALUES</w:t>
-      </w:r>
-    </w:p>
-    <w:p>
-      <w:pPr>
-        <w:spacing w:after="0" w:line="240" w:lineRule="auto"/>
-        <w:rPr>
-          <w:u w:val="single"/>
-        </w:rPr>
-      </w:pPr>
-      <w:r>
-        <w:rPr>
-          <w:u w:val="single"/>
-        </w:rPr>
-        <w:t>('</w:t>
-      </w:r>
-      <w:proofErr w:type="spellStart"/>
-      <w:r>
-        <w:rPr>
-          <w:u w:val="single"/>
-        </w:rPr>
-        <w:t>Technology','technology</w:t>
-      </w:r>
-      <w:proofErr w:type="spellEnd"/>
-      <w:r>
-        <w:rPr>
-          <w:u w:val="single"/>
-        </w:rPr>
-        <w:t>'),</w:t>
-      </w:r>
-    </w:p>
-    <w:p>
-      <w:pPr>
-        <w:spacing w:after="0" w:line="240" w:lineRule="auto"/>
-        <w:rPr>
-          <w:u w:val="single"/>
-        </w:rPr>
-      </w:pPr>
-      <w:r>
-        <w:rPr>
-          <w:u w:val="single"/>
-        </w:rPr>
-        <w:t>('</w:t>
-      </w:r>
-      <w:proofErr w:type="spellStart"/>
-      <w:r>
-        <w:rPr>
-          <w:u w:val="single"/>
-        </w:rPr>
-        <w:t>Sports','sports</w:t>
-      </w:r>
-      <w:proofErr w:type="spellEnd"/>
-      <w:r>
-        <w:rPr>
-          <w:u w:val="single"/>
-        </w:rPr>
-        <w:t>'),</w:t>
-      </w:r>
-    </w:p>
-    <w:p>
-      <w:pPr>
-        <w:spacing w:after="0" w:line="240" w:lineRule="auto"/>
-        <w:rPr>
-          <w:u w:val="single"/>
-        </w:rPr>
-      </w:pPr>
-      <w:r>
-        <w:rPr>
-          <w:u w:val="single"/>
-        </w:rPr>
-        <w:t>('</w:t>
-      </w:r>
-      <w:proofErr w:type="spellStart"/>
-      <w:r>
-        <w:rPr>
-          <w:u w:val="single"/>
-        </w:rPr>
-        <w:t>News','news</w:t>
-      </w:r>
-      <w:proofErr w:type="spellEnd"/>
-      <w:r>
-        <w:rPr>
-          <w:u w:val="single"/>
-        </w:rPr>
-        <w:t>');</w:t>
-      </w:r>
-    </w:p>
-    <w:p>
-      <w:pPr>
-        <w:spacing w:after="0" w:line="240" w:lineRule="auto"/>
-        <w:rPr>
-          <w:u w:val="single"/>
-        </w:rPr>
-      </w:pPr>
-    </w:p>
-    <w:p>
-      <w:pPr>
-        <w:spacing w:after="0" w:line="240" w:lineRule="auto"/>
-        <w:rPr>
-          <w:u w:val="single"/>
-        </w:rPr>
-      </w:pPr>
-      <w:r>
-        <w:rPr>
-          <w:u w:val="single"/>
-        </w:rPr>
-        <w:sym w:font="Wingdings" w:char="F0E0"/>
-      </w:r>
-    </w:p>
-    <w:p>
-      <w:pPr>
-        <w:spacing w:after="0" w:line="240" w:lineRule="auto"/>
-        <w:rPr>
-          <w:u w:val="single"/>
-        </w:rPr>
-      </w:pPr>
-    </w:p>
-    <w:p>
-      <w:pPr>
-        <w:spacing w:after="0" w:line="240" w:lineRule="auto"/>
-        <w:rPr>
-          <w:u w:val="single"/>
-        </w:rPr>
-      </w:pPr>
-      <w:r>
-        <w:rPr>
-          <w:u w:val="single"/>
-        </w:rPr>
-        <w:t>INSERT INTO users(</w:t>
-      </w:r>
-    </w:p>
-    <w:p>
-      <w:pPr>
-        <w:spacing w:after="0" w:line="240" w:lineRule="auto"/>
-        <w:rPr>
-          <w:u w:val="single"/>
-        </w:rPr>
-      </w:pPr>
-    </w:p>
-    <w:p>
-      <w:pPr>
-        <w:spacing w:after="0" w:line="240" w:lineRule="auto"/>
-        <w:rPr>
-          <w:u w:val="single"/>
-        </w:rPr>
-      </w:pPr>
-      <w:r>
-        <w:rPr>
-          <w:u w:val="single"/>
-        </w:rPr>
-        <w:t>name,</w:t>
-      </w:r>
-    </w:p>
-    <w:p>
-      <w:pPr>
-        <w:spacing w:after="0" w:line="240" w:lineRule="auto"/>
-        <w:rPr>
-          <w:u w:val="single"/>
-        </w:rPr>
-      </w:pPr>
-      <w:r>
-        <w:rPr>
-          <w:u w:val="single"/>
-        </w:rPr>
-        <w:t>username,</w:t>
-      </w:r>
-    </w:p>
-    <w:p>
-      <w:pPr>
-        <w:spacing w:after="0" w:line="240" w:lineRule="auto"/>
-        <w:rPr>
-          <w:u w:val="single"/>
-        </w:rPr>
-      </w:pPr>
-      <w:r>
-        <w:rPr>
-          <w:u w:val="single"/>
-        </w:rPr>
-        <w:t>email,</w:t>
-      </w:r>
-    </w:p>
-    <w:p>
-      <w:pPr>
-        <w:spacing w:after="0" w:line="240" w:lineRule="auto"/>
-        <w:rPr>
-          <w:u w:val="single"/>
-        </w:rPr>
-      </w:pPr>
-      <w:proofErr w:type="spellStart"/>
-      <w:r>
-        <w:rPr>
-          <w:u w:val="single"/>
-        </w:rPr>
-        <w:t>password_hash</w:t>
-      </w:r>
-      <w:proofErr w:type="spellEnd"/>
-      <w:r>
-        <w:rPr>
-          <w:u w:val="single"/>
-        </w:rPr>
-        <w:t>,</w:t>
-      </w:r>
-    </w:p>
-    <w:p>
-      <w:pPr>
-        <w:spacing w:after="0" w:line="240" w:lineRule="auto"/>
-        <w:rPr>
-          <w:u w:val="single"/>
-        </w:rPr>
-      </w:pPr>
-      <w:r>
-        <w:rPr>
-          <w:u w:val="single"/>
-        </w:rPr>
-        <w:t>role</w:t>
-      </w:r>
-    </w:p>
-    <w:p>
-      <w:pPr>
-        <w:spacing w:after="0" w:line="240" w:lineRule="auto"/>
-        <w:rPr>
-          <w:u w:val="single"/>
-        </w:rPr>
-      </w:pPr>
-    </w:p>
-    <w:p>
-      <w:pPr>
-        <w:spacing w:after="0" w:line="240" w:lineRule="auto"/>
-        <w:rPr>
-          <w:u w:val="single"/>
-        </w:rPr>
-      </w:pPr>
-      <w:r>
-        <w:rPr>
-          <w:u w:val="single"/>
-        </w:rPr>
-        <w:t>)</w:t>
-      </w:r>
-    </w:p>
-    <w:p>
-      <w:pPr>
-        <w:spacing w:after="0" w:line="240" w:lineRule="auto"/>
-        <w:rPr>
-          <w:u w:val="single"/>
-        </w:rPr>
-      </w:pPr>
-    </w:p>
-    <w:p>
-      <w:pPr>
-        <w:spacing w:after="0" w:line="240" w:lineRule="auto"/>
-        <w:rPr>
-          <w:u w:val="single"/>
-        </w:rPr>
-      </w:pPr>
-      <w:r>
-        <w:rPr>
-          <w:u w:val="single"/>
-        </w:rPr>
-        <w:t>VALUES(</w:t>
-      </w:r>
-    </w:p>
-    <w:p>
-      <w:pPr>
-        <w:spacing w:after="0" w:line="240" w:lineRule="auto"/>
-        <w:rPr>
-          <w:u w:val="single"/>
-        </w:rPr>
-      </w:pPr>
-    </w:p>
-    <w:p>
-      <w:pPr>
-        <w:spacing w:after="0" w:line="240" w:lineRule="auto"/>
-        <w:rPr>
-          <w:u w:val="single"/>
-        </w:rPr>
-      </w:pPr>
-      <w:r>
-        <w:rPr>
-          <w:u w:val="single"/>
-        </w:rPr>
-        <w:t>'Nahid',</w:t>
-      </w:r>
-    </w:p>
-    <w:p>
-      <w:pPr>
-        <w:spacing w:after="0" w:line="240" w:lineRule="auto"/>
-        <w:rPr>
-          <w:u w:val="single"/>
-        </w:rPr>
-      </w:pPr>
-      <w:r>
-        <w:rPr>
-          <w:u w:val="single"/>
-        </w:rPr>
-        <w:t>'nahid123',</w:t>
-      </w:r>
-    </w:p>
-    <w:p>
-      <w:pPr>
-        <w:spacing w:after="0" w:line="240" w:lineRule="auto"/>
-        <w:rPr>
-          <w:u w:val="single"/>
-        </w:rPr>
-      </w:pPr>
-      <w:r>
-        <w:rPr>
-          <w:u w:val="single"/>
-        </w:rPr>
-        <w:t>'nahid@gmail.com',</w:t>
-      </w:r>
-    </w:p>
-    <w:p>
-      <w:pPr>
-        <w:spacing w:after="0" w:line="240" w:lineRule="auto"/>
-        <w:rPr>
-          <w:u w:val="single"/>
-        </w:rPr>
-      </w:pPr>
-      <w:r>
-        <w:rPr>
-          <w:u w:val="single"/>
-        </w:rPr>
-        <w:t>'123456',</w:t>
-      </w:r>
-    </w:p>
-    <w:p>
-      <w:pPr>
-        <w:spacing w:after="0" w:line="240" w:lineRule="auto"/>
-        <w:rPr>
-          <w:u w:val="single"/>
-        </w:rPr>
-      </w:pPr>
-      <w:r>
-        <w:rPr>
-          <w:u w:val="single"/>
-        </w:rPr>
-        <w:t>'author'</w:t>
-      </w:r>
-    </w:p>
-    <w:p>
-      <w:pPr>
-        <w:spacing w:after="0" w:line="240" w:lineRule="auto"/>
-        <w:rPr>
-          <w:u w:val="single"/>
-        </w:rPr>
-      </w:pPr>
-    </w:p>
-    <w:p>
-      <w:pPr>
-        <w:spacing w:after="0" w:line="240" w:lineRule="auto"/>
-        <w:rPr>
-          <w:u w:val="single"/>
-        </w:rPr>
-      </w:pPr>
-      <w:r>
-        <w:rPr>
-          <w:u w:val="single"/>
-        </w:rPr>
-        <w:t>);</w:t>
-      </w:r>
-    </w:p>
-    <w:p>
-      <w:pPr>
-        <w:spacing w:after="0" w:line="240" w:lineRule="auto"/>
-        <w:rPr>
-          <w:u w:val="single"/>
-        </w:rPr>
-      </w:pPr>
-    </w:p>
-    <w:p>
-      <w:pPr>
-        <w:spacing w:after="0" w:line="240" w:lineRule="auto"/>
-        <w:rPr>
-          <w:u w:val="single"/>
-        </w:rPr>
-      </w:pPr>
-      <w:r>
-        <w:rPr>
-          <w:u w:val="single"/>
-        </w:rPr>
-        <w:sym w:font="Wingdings" w:char="F0E0"/>
-      </w:r>
-    </w:p>
-    <w:p>
-      <w:pPr>
-        <w:spacing w:after="0" w:line="240" w:lineRule="auto"/>
-        <w:rPr>
-          <w:u w:val="single"/>
-        </w:rPr>
-      </w:pPr>
-    </w:p>
-    <w:p>
-      <w:pPr>
-        <w:spacing w:after="0" w:line="240" w:lineRule="auto"/>
-        <w:rPr>
-          <w:u w:val="single"/>
-        </w:rPr>
-      </w:pPr>
-      <w:r>
-        <w:rPr>
-          <w:u w:val="single"/>
-        </w:rPr>
-        <w:t>INSERT INTO series(</w:t>
-      </w:r>
-    </w:p>
-    <w:p>
-      <w:pPr>
-        <w:spacing w:after="0" w:line="240" w:lineRule="auto"/>
-        <w:rPr>
-          <w:u w:val="single"/>
-        </w:rPr>
-      </w:pPr>
-      <w:proofErr w:type="spellStart"/>
-      <w:r>
-        <w:rPr>
-          <w:u w:val="single"/>
-        </w:rPr>
-        <w:t>author_id</w:t>
-      </w:r>
-      <w:proofErr w:type="spellEnd"/>
-      <w:r>
-        <w:rPr>
-          <w:u w:val="single"/>
-        </w:rPr>
-        <w:t>,</w:t>
-      </w:r>
-    </w:p>
-    <w:p>
-      <w:pPr>
-        <w:spacing w:after="0" w:line="240" w:lineRule="auto"/>
-        <w:rPr>
-          <w:u w:val="single"/>
-        </w:rPr>
-      </w:pPr>
-      <w:r>
-        <w:rPr>
-          <w:u w:val="single"/>
-        </w:rPr>
-        <w:t>title</w:t>
-      </w:r>
-    </w:p>
-    <w:p>
-      <w:pPr>
-        <w:spacing w:after="0" w:line="240" w:lineRule="auto"/>
-        <w:rPr>
-          <w:u w:val="single"/>
-        </w:rPr>
-      </w:pPr>
-      <w:r>
-        <w:rPr>
-          <w:u w:val="single"/>
-        </w:rPr>
-        <w:t>)</w:t>
-      </w:r>
-    </w:p>
-    <w:p>
-      <w:pPr>
-        <w:spacing w:after="0" w:line="240" w:lineRule="auto"/>
-        <w:rPr>
-          <w:u w:val="single"/>
-        </w:rPr>
-      </w:pPr>
-      <w:r>
-        <w:rPr>
-          <w:u w:val="single"/>
-        </w:rPr>
-        <w:t>VALUES</w:t>
-      </w:r>
-    </w:p>
-    <w:p>
-      <w:pPr>
-        <w:spacing w:after="0" w:line="240" w:lineRule="auto"/>
-        <w:rPr>
-          <w:u w:val="single"/>
-        </w:rPr>
-      </w:pPr>
-      <w:r>
-        <w:rPr>
-          <w:u w:val="single"/>
-        </w:rPr>
-        <w:t>(1,'Web Development'),</w:t>
-      </w:r>
-    </w:p>
-    <w:p>
-      <w:pPr>
-        <w:spacing w:after="0" w:line="240" w:lineRule="auto"/>
-        <w:rPr>
-          <w:u w:val="single"/>
-        </w:rPr>
-      </w:pPr>
-      <w:r>
-        <w:rPr>
-          <w:u w:val="single"/>
-        </w:rPr>
-        <w:t>(1,'Programming');</w:t>
-      </w:r>
-    </w:p>
-    <w:p>
-      <w:pPr>
-        <w:spacing w:after="0" w:line="240" w:lineRule="auto"/>
-        <w:rPr>
-          <w:u w:val="single"/>
-        </w:rPr>
-      </w:pPr>
-    </w:p>
-    <w:p>
-      <w:pPr>
-        <w:spacing w:after="0" w:line="240" w:lineRule="auto"/>
-        <w:rPr>
-          <w:u w:val="single"/>
-        </w:rPr>
-      </w:pPr>
-      <w:r>
-        <w:rPr>
-          <w:u w:val="single"/>
-        </w:rPr>
+    </w:p>
+    <w:p>
+      <w:pPr>
+        <w:spacing w:after="0" w:line="240" w:lineRule="auto"/>
+      </w:pPr>
+      <w:r>
         <w:lastRenderedPageBreak/>
         <w:t>-</w:t>
       </w:r>
       <w:r>
-        <w:rPr>
+        <w:sym w:font="Wingdings" w:char="F0E0"/>
+      </w:r>
+    </w:p>
+    <w:p>
+      <w:pPr>
+        <w:spacing w:after="0" w:line="240" w:lineRule="auto"/>
+      </w:pPr>
+    </w:p>
+    <w:p>
+      <w:pPr>
+        <w:spacing w:after="0" w:line="240" w:lineRule="auto"/>
+        <w:rPr>
+          <w:b/>
+          <w:bCs/>
+        </w:rPr>
+      </w:pPr>
+      <w:r>
+        <w:rPr>
+          <w:b/>
+          <w:bCs/>
+        </w:rPr>
+        <w:t>ALTER TABLE articles</w:t>
+      </w:r>
+    </w:p>
+    <w:p>
+      <w:pPr>
+        <w:spacing w:after="0" w:line="240" w:lineRule="auto"/>
+        <w:rPr>
+          <w:b/>
+          <w:bCs/>
+        </w:rPr>
+      </w:pPr>
+      <w:r>
+        <w:rPr>
+          <w:b/>
+          <w:bCs/>
+        </w:rPr>
+        <w:t xml:space="preserve">ADD tags </w:t>
+      </w:r>
+      <w:proofErr w:type="gramStart"/>
+      <w:r>
+        <w:rPr>
+          <w:b/>
+          <w:bCs/>
+        </w:rPr>
+        <w:t>VARCHAR(</w:t>
+      </w:r>
+      <w:proofErr w:type="gramEnd"/>
+      <w:r>
+        <w:rPr>
+          <w:b/>
+          <w:bCs/>
+        </w:rPr>
+        <w:t>255);</w:t>
+      </w:r>
+    </w:p>
+    <w:p>
+      <w:pPr>
+        <w:spacing w:after="0" w:line="240" w:lineRule="auto"/>
+        <w:rPr>
+          <w:b/>
+          <w:bCs/>
+        </w:rPr>
+      </w:pPr>
+    </w:p>
+    <w:p>
+      <w:pPr>
+        <w:spacing w:after="0" w:line="240" w:lineRule="auto"/>
+        <w:rPr>
+          <w:b/>
+          <w:bCs/>
+        </w:rPr>
+      </w:pPr>
+      <w:r>
+        <w:rPr>
+          <w:b/>
+          <w:bCs/>
+        </w:rPr>
+        <w:sym w:font="Wingdings" w:char="F0E0"/>
+      </w:r>
+    </w:p>
+    <w:p>
+      <w:pPr>
+        <w:spacing w:after="0" w:line="240" w:lineRule="auto"/>
+        <w:rPr>
+          <w:b/>
+          <w:bCs/>
+        </w:rPr>
+      </w:pPr>
+      <w:r>
+        <w:rPr>
+          <w:b/>
+          <w:bCs/>
+        </w:rPr>
+        <w:t>UPDATE articles</w:t>
+      </w:r>
+    </w:p>
+    <w:p>
+      <w:pPr>
+        <w:spacing w:after="0" w:line="240" w:lineRule="auto"/>
+        <w:rPr>
+          <w:b/>
+          <w:bCs/>
+        </w:rPr>
+      </w:pPr>
+    </w:p>
+    <w:p>
+      <w:pPr>
+        <w:spacing w:after="0" w:line="240" w:lineRule="auto"/>
+        <w:rPr>
+          <w:b/>
+          <w:bCs/>
+        </w:rPr>
+      </w:pPr>
+      <w:r>
+        <w:rPr>
+          <w:b/>
+          <w:bCs/>
+        </w:rPr>
+        <w:t>SET</w:t>
+      </w:r>
+    </w:p>
+    <w:p>
+      <w:pPr>
+        <w:spacing w:after="0" w:line="240" w:lineRule="auto"/>
+        <w:rPr>
+          <w:b/>
+          <w:bCs/>
+        </w:rPr>
+      </w:pPr>
+      <w:r>
+        <w:rPr>
+          <w:b/>
+          <w:bCs/>
+        </w:rPr>
+        <w:t>status='</w:t>
+      </w:r>
+      <w:proofErr w:type="spellStart"/>
+      <w:r>
+        <w:rPr>
+          <w:b/>
+          <w:bCs/>
+        </w:rPr>
+        <w:t>revision_requested</w:t>
+      </w:r>
+      <w:proofErr w:type="spellEnd"/>
+      <w:r>
+        <w:rPr>
+          <w:b/>
+          <w:bCs/>
+        </w:rPr>
+        <w:t>',</w:t>
+      </w:r>
+    </w:p>
+    <w:p>
+      <w:pPr>
+        <w:spacing w:after="0" w:line="240" w:lineRule="auto"/>
+        <w:rPr>
+          <w:b/>
+          <w:bCs/>
+        </w:rPr>
+      </w:pPr>
+      <w:proofErr w:type="spellStart"/>
+      <w:r>
+        <w:rPr>
+          <w:b/>
+          <w:bCs/>
+        </w:rPr>
+        <w:t>editor_feedback</w:t>
+      </w:r>
+      <w:proofErr w:type="spellEnd"/>
+      <w:r>
+        <w:rPr>
+          <w:b/>
+          <w:bCs/>
+        </w:rPr>
+        <w:t>='Add more examples and improve introduction'</w:t>
+      </w:r>
+    </w:p>
+    <w:p>
+      <w:pPr>
+        <w:spacing w:after="0" w:line="240" w:lineRule="auto"/>
+        <w:rPr>
+          <w:b/>
+          <w:bCs/>
+        </w:rPr>
+      </w:pPr>
+    </w:p>
+    <w:p>
+      <w:pPr>
+        <w:spacing w:after="0" w:line="240" w:lineRule="auto"/>
+        <w:rPr>
+          <w:b/>
+          <w:bCs/>
+        </w:rPr>
+      </w:pPr>
+      <w:r>
+        <w:rPr>
+          <w:b/>
+          <w:bCs/>
+        </w:rPr>
+        <w:t>WHERE id=1;</w:t>
+      </w:r>
+    </w:p>
+    <w:p>
+      <w:pPr>
+        <w:spacing w:after="0" w:line="240" w:lineRule="auto"/>
+        <w:rPr>
+          <w:b/>
+          <w:bCs/>
+        </w:rPr>
+      </w:pPr>
+    </w:p>
+    <w:p>
+      <w:pPr>
+        <w:spacing w:after="0" w:line="240" w:lineRule="auto"/>
+        <w:rPr>
+          <w:b/>
+          <w:bCs/>
+        </w:rPr>
+      </w:pPr>
+    </w:p>
+    <w:p>
+      <w:pPr>
+        <w:spacing w:after="0" w:line="240" w:lineRule="auto"/>
+        <w:rPr>
+          <w:b/>
+          <w:bCs/>
+        </w:rPr>
+      </w:pPr>
+      <w:r>
+        <w:rPr>
+          <w:b/>
+          <w:bCs/>
+        </w:rPr>
+        <w:t>6. Like Table</w:t>
+      </w:r>
+    </w:p>
+    <w:p>
+      <w:pPr>
+        <w:spacing w:after="0" w:line="240" w:lineRule="auto"/>
+        <w:rPr>
+          <w:b/>
+          <w:bCs/>
           <w:u w:val="single"/>
         </w:rPr>
+      </w:pPr>
+    </w:p>
+    <w:p>
+      <w:pPr>
+        <w:spacing w:after="0" w:line="240" w:lineRule="auto"/>
+      </w:pPr>
+      <w:r>
+        <w:t xml:space="preserve">CREATE TABLE </w:t>
+      </w:r>
+      <w:proofErr w:type="spellStart"/>
+      <w:r>
+        <w:t>article_</w:t>
+      </w:r>
+      <w:proofErr w:type="gramStart"/>
+      <w:r>
+        <w:t>likes</w:t>
+      </w:r>
+      <w:proofErr w:type="spellEnd"/>
+      <w:r>
+        <w:t>(</w:t>
+      </w:r>
+      <w:proofErr w:type="gramEnd"/>
+    </w:p>
+    <w:p>
+      <w:pPr>
+        <w:spacing w:after="0" w:line="240" w:lineRule="auto"/>
+      </w:pPr>
+    </w:p>
+    <w:p>
+      <w:pPr>
+        <w:spacing w:after="0" w:line="240" w:lineRule="auto"/>
+      </w:pPr>
+      <w:r>
+        <w:t>id INT PRIMARY KEY AUTO_INCREMENT,</w:t>
+      </w:r>
+    </w:p>
+    <w:p>
+      <w:pPr>
+        <w:spacing w:after="0" w:line="240" w:lineRule="auto"/>
+      </w:pPr>
+    </w:p>
+    <w:p>
+      <w:pPr>
+        <w:spacing w:after="0" w:line="240" w:lineRule="auto"/>
+      </w:pPr>
+      <w:proofErr w:type="spellStart"/>
+      <w:r>
+        <w:t>article_id</w:t>
+      </w:r>
+      <w:proofErr w:type="spellEnd"/>
+      <w:r>
+        <w:t xml:space="preserve"> INT NOT NULL,</w:t>
+      </w:r>
+    </w:p>
+    <w:p>
+      <w:pPr>
+        <w:spacing w:after="0" w:line="240" w:lineRule="auto"/>
+      </w:pPr>
+    </w:p>
+    <w:p>
+      <w:pPr>
+        <w:spacing w:after="0" w:line="240" w:lineRule="auto"/>
+      </w:pPr>
+      <w:proofErr w:type="spellStart"/>
+      <w:r>
+        <w:t>user_id</w:t>
+      </w:r>
+      <w:proofErr w:type="spellEnd"/>
+      <w:r>
+        <w:t xml:space="preserve"> INT NOT NULL,</w:t>
+      </w:r>
+    </w:p>
+    <w:p>
+      <w:pPr>
+        <w:spacing w:after="0" w:line="240" w:lineRule="auto"/>
+      </w:pPr>
+    </w:p>
+    <w:p>
+      <w:pPr>
+        <w:spacing w:after="0" w:line="240" w:lineRule="auto"/>
+      </w:pPr>
+      <w:proofErr w:type="spellStart"/>
+      <w:r>
+        <w:t>created_at</w:t>
+      </w:r>
+      <w:proofErr w:type="spellEnd"/>
+      <w:r>
+        <w:t xml:space="preserve"> TIMESTAMP DEFAULT CURRENT_TIMESTAMP,</w:t>
+      </w:r>
+    </w:p>
+    <w:p>
+      <w:pPr>
+        <w:spacing w:after="0" w:line="240" w:lineRule="auto"/>
+      </w:pPr>
+    </w:p>
+    <w:p>
+      <w:pPr>
+        <w:spacing w:after="0" w:line="240" w:lineRule="auto"/>
+      </w:pPr>
+      <w:r>
+        <w:t xml:space="preserve">FOREIGN </w:t>
+      </w:r>
+      <w:proofErr w:type="gramStart"/>
+      <w:r>
+        <w:t>KEY(</w:t>
+      </w:r>
+      <w:proofErr w:type="spellStart"/>
+      <w:proofErr w:type="gramEnd"/>
+      <w:r>
+        <w:t>article_id</w:t>
+      </w:r>
+      <w:proofErr w:type="spellEnd"/>
+      <w:r>
+        <w:t>)</w:t>
+      </w:r>
+    </w:p>
+    <w:p>
+      <w:pPr>
+        <w:spacing w:after="0" w:line="240" w:lineRule="auto"/>
+      </w:pPr>
+      <w:r>
+        <w:t>REFERENCES articles(id)</w:t>
+      </w:r>
+    </w:p>
+    <w:p>
+      <w:pPr>
+        <w:spacing w:after="0" w:line="240" w:lineRule="auto"/>
+      </w:pPr>
+      <w:r>
+        <w:t>ON DELETE CASCADE,</w:t>
+      </w:r>
+    </w:p>
+    <w:p>
+      <w:pPr>
+        <w:spacing w:after="0" w:line="240" w:lineRule="auto"/>
+      </w:pPr>
+    </w:p>
+    <w:p>
+      <w:pPr>
+        <w:spacing w:after="0" w:line="240" w:lineRule="auto"/>
+      </w:pPr>
+      <w:r>
+        <w:t xml:space="preserve">FOREIGN </w:t>
+      </w:r>
+      <w:proofErr w:type="gramStart"/>
+      <w:r>
+        <w:t>KEY(</w:t>
+      </w:r>
+      <w:proofErr w:type="spellStart"/>
+      <w:proofErr w:type="gramEnd"/>
+      <w:r>
+        <w:t>user_id</w:t>
+      </w:r>
+      <w:proofErr w:type="spellEnd"/>
+      <w:r>
+        <w:t>)</w:t>
+      </w:r>
+    </w:p>
+    <w:p>
+      <w:pPr>
+        <w:spacing w:after="0" w:line="240" w:lineRule="auto"/>
+      </w:pPr>
+      <w:r>
+        <w:t>REFERENCES users(id)</w:t>
+      </w:r>
+    </w:p>
+    <w:p>
+      <w:pPr>
+        <w:spacing w:after="0" w:line="240" w:lineRule="auto"/>
+      </w:pPr>
+      <w:r>
+        <w:t>ON DELETE CASCADE</w:t>
+      </w:r>
+    </w:p>
+    <w:p>
+      <w:pPr>
+        <w:spacing w:after="0" w:line="240" w:lineRule="auto"/>
+        <w:rPr>
+          <w:u w:val="single"/>
+        </w:rPr>
+      </w:pPr>
+    </w:p>
+    <w:p>
+      <w:pPr>
+        <w:spacing w:after="0" w:line="240" w:lineRule="auto"/>
+        <w:rPr>
+          <w:u w:val="single"/>
+        </w:rPr>
+      </w:pPr>
+      <w:r>
+        <w:rPr>
+          <w:u w:val="single"/>
+        </w:rPr>
+        <w:t>);</w:t>
+      </w:r>
+    </w:p>
+    <w:p>
+      <w:pPr>
+        <w:spacing w:after="0" w:line="240" w:lineRule="auto"/>
+        <w:rPr>
+          <w:u w:val="single"/>
+        </w:rPr>
+      </w:pPr>
+    </w:p>
+    <w:p>
+      <w:pPr>
+        <w:spacing w:after="0" w:line="240" w:lineRule="auto"/>
+        <w:rPr>
+          <w:b/>
+          <w:bCs/>
+        </w:rPr>
+      </w:pPr>
+      <w:r>
+        <w:rPr>
+          <w:b/>
+          <w:bCs/>
+        </w:rPr>
+        <w:t>7. Comments Table</w:t>
+      </w:r>
+    </w:p>
+    <w:p>
+      <w:pPr>
+        <w:spacing w:after="0" w:line="240" w:lineRule="auto"/>
+      </w:pPr>
+    </w:p>
+    <w:p>
+      <w:pPr>
+        <w:spacing w:after="0" w:line="240" w:lineRule="auto"/>
+      </w:pPr>
+      <w:r>
+        <w:t xml:space="preserve">CREATE TABLE </w:t>
+      </w:r>
+      <w:proofErr w:type="gramStart"/>
+      <w:r>
+        <w:t>comments(</w:t>
+      </w:r>
+      <w:proofErr w:type="gramEnd"/>
+    </w:p>
+    <w:p>
+      <w:pPr>
+        <w:spacing w:after="0" w:line="240" w:lineRule="auto"/>
+      </w:pPr>
+    </w:p>
+    <w:p>
+      <w:pPr>
+        <w:spacing w:after="0" w:line="240" w:lineRule="auto"/>
+      </w:pPr>
+      <w:r>
+        <w:t>id INT PRIMARY KEY AUTO_INCREMENT,</w:t>
+      </w:r>
+    </w:p>
+    <w:p>
+      <w:pPr>
+        <w:spacing w:after="0" w:line="240" w:lineRule="auto"/>
+      </w:pPr>
+    </w:p>
+    <w:p>
+      <w:pPr>
+        <w:spacing w:after="0" w:line="240" w:lineRule="auto"/>
+      </w:pPr>
+      <w:proofErr w:type="spellStart"/>
+      <w:r>
+        <w:t>article_id</w:t>
+      </w:r>
+      <w:proofErr w:type="spellEnd"/>
+      <w:r>
+        <w:t xml:space="preserve"> INT NOT NULL,</w:t>
+      </w:r>
+    </w:p>
+    <w:p>
+      <w:pPr>
+        <w:spacing w:after="0" w:line="240" w:lineRule="auto"/>
+      </w:pPr>
+    </w:p>
+    <w:p>
+      <w:pPr>
+        <w:spacing w:after="0" w:line="240" w:lineRule="auto"/>
+      </w:pPr>
+      <w:proofErr w:type="spellStart"/>
+      <w:r>
+        <w:t>user_id</w:t>
+      </w:r>
+      <w:proofErr w:type="spellEnd"/>
+      <w:r>
+        <w:t xml:space="preserve"> INT NOT NULL,</w:t>
+      </w:r>
+    </w:p>
+    <w:p>
+      <w:pPr>
+        <w:spacing w:after="0" w:line="240" w:lineRule="auto"/>
+      </w:pPr>
+    </w:p>
+    <w:p>
+      <w:pPr>
+        <w:spacing w:after="0" w:line="240" w:lineRule="auto"/>
+      </w:pPr>
+      <w:r>
+        <w:t>content TEXT NOT NULL,</w:t>
+      </w:r>
+    </w:p>
+    <w:p>
+      <w:pPr>
+        <w:spacing w:after="0" w:line="240" w:lineRule="auto"/>
+      </w:pPr>
+    </w:p>
+    <w:p>
+      <w:pPr>
+        <w:spacing w:after="0" w:line="240" w:lineRule="auto"/>
+      </w:pPr>
+      <w:proofErr w:type="spellStart"/>
+      <w:r>
+        <w:t>created_at</w:t>
+      </w:r>
+      <w:proofErr w:type="spellEnd"/>
+      <w:r>
+        <w:t xml:space="preserve"> TIMESTAMP DEFAULT CURRENT_TIMESTAMP,</w:t>
+      </w:r>
+    </w:p>
+    <w:p>
+      <w:pPr>
+        <w:spacing w:after="0" w:line="240" w:lineRule="auto"/>
+      </w:pPr>
+    </w:p>
+    <w:p>
+      <w:pPr>
+        <w:spacing w:after="0" w:line="240" w:lineRule="auto"/>
+      </w:pPr>
+      <w:r>
+        <w:t xml:space="preserve">FOREIGN </w:t>
+      </w:r>
+      <w:proofErr w:type="gramStart"/>
+      <w:r>
+        <w:t>KEY(</w:t>
+      </w:r>
+      <w:proofErr w:type="spellStart"/>
+      <w:proofErr w:type="gramEnd"/>
+      <w:r>
+        <w:t>article_id</w:t>
+      </w:r>
+      <w:proofErr w:type="spellEnd"/>
+      <w:r>
+        <w:t>)</w:t>
+      </w:r>
+    </w:p>
+    <w:p>
+      <w:pPr>
+        <w:spacing w:after="0" w:line="240" w:lineRule="auto"/>
+      </w:pPr>
+      <w:r>
+        <w:t>REFERENCES articles(id)</w:t>
+      </w:r>
+    </w:p>
+    <w:p>
+      <w:pPr>
+        <w:spacing w:after="0" w:line="240" w:lineRule="auto"/>
+      </w:pPr>
+      <w:r>
+        <w:t>ON DELETE CASCADE,</w:t>
+      </w:r>
+    </w:p>
+    <w:p>
+      <w:pPr>
+        <w:spacing w:after="0" w:line="240" w:lineRule="auto"/>
+      </w:pPr>
+    </w:p>
+    <w:p>
+      <w:pPr>
+        <w:spacing w:after="0" w:line="240" w:lineRule="auto"/>
+      </w:pPr>
+      <w:r>
+        <w:t xml:space="preserve">FOREIGN </w:t>
+      </w:r>
+      <w:proofErr w:type="gramStart"/>
+      <w:r>
+        <w:t>KEY(</w:t>
+      </w:r>
+      <w:proofErr w:type="spellStart"/>
+      <w:proofErr w:type="gramEnd"/>
+      <w:r>
+        <w:t>user_id</w:t>
+      </w:r>
+      <w:proofErr w:type="spellEnd"/>
+      <w:r>
+        <w:t>)</w:t>
+      </w:r>
+    </w:p>
+    <w:p>
+      <w:pPr>
+        <w:spacing w:after="0" w:line="240" w:lineRule="auto"/>
+      </w:pPr>
+      <w:r>
+        <w:t>REFERENCES users(id)</w:t>
+      </w:r>
+    </w:p>
+    <w:p>
+      <w:pPr>
+        <w:spacing w:after="0" w:line="240" w:lineRule="auto"/>
+      </w:pPr>
+      <w:r>
+        <w:t>ON DELETE CASCADE</w:t>
+      </w:r>
+    </w:p>
+    <w:p>
+      <w:pPr>
+        <w:spacing w:after="0" w:line="240" w:lineRule="auto"/>
+      </w:pPr>
+    </w:p>
+    <w:p>
+      <w:pPr>
+        <w:spacing w:after="0" w:line="240" w:lineRule="auto"/>
+      </w:pPr>
+      <w:r>
+        <w:t>);</w:t>
+      </w:r>
+    </w:p>
+    <w:p>
+      <w:pPr>
+        <w:spacing w:after="0" w:line="240" w:lineRule="auto"/>
+        <w:rPr>
+          <w:u w:val="single"/>
+        </w:rPr>
+      </w:pPr>
+    </w:p>
+    <w:p>
+      <w:pPr>
+        <w:spacing w:after="0" w:line="240" w:lineRule="auto"/>
+        <w:rPr>
+          <w:b/>
+          <w:bCs/>
+        </w:rPr>
+      </w:pPr>
+      <w:r>
+        <w:rPr>
+          <w:b/>
+          <w:bCs/>
+        </w:rPr>
+        <w:t>8. Article View History table</w:t>
+      </w:r>
+    </w:p>
+    <w:p>
+      <w:pPr>
+        <w:spacing w:after="0" w:line="240" w:lineRule="auto"/>
+        <w:rPr>
+          <w:u w:val="single"/>
+        </w:rPr>
+      </w:pPr>
+    </w:p>
+    <w:p>
+      <w:pPr>
+        <w:spacing w:after="0" w:line="240" w:lineRule="auto"/>
+      </w:pPr>
+      <w:r>
+        <w:t xml:space="preserve">CREATE TABLE </w:t>
+      </w:r>
+      <w:proofErr w:type="spellStart"/>
+      <w:r>
+        <w:t>article_</w:t>
+      </w:r>
+      <w:proofErr w:type="gramStart"/>
+      <w:r>
+        <w:t>views</w:t>
+      </w:r>
+      <w:proofErr w:type="spellEnd"/>
+      <w:r>
+        <w:t>(</w:t>
+      </w:r>
+      <w:proofErr w:type="gramEnd"/>
+    </w:p>
+    <w:p>
+      <w:pPr>
+        <w:spacing w:after="0" w:line="240" w:lineRule="auto"/>
+      </w:pPr>
+    </w:p>
+    <w:p>
+      <w:pPr>
+        <w:spacing w:after="0" w:line="240" w:lineRule="auto"/>
+      </w:pPr>
+      <w:r>
+        <w:t>id INT PRIMARY KEY AUTO_INCREMENT,</w:t>
+      </w:r>
+    </w:p>
+    <w:p>
+      <w:pPr>
+        <w:spacing w:after="0" w:line="240" w:lineRule="auto"/>
+      </w:pPr>
+    </w:p>
+    <w:p>
+      <w:pPr>
+        <w:spacing w:after="0" w:line="240" w:lineRule="auto"/>
+      </w:pPr>
+      <w:proofErr w:type="spellStart"/>
+      <w:r>
+        <w:t>article_id</w:t>
+      </w:r>
+      <w:proofErr w:type="spellEnd"/>
+      <w:r>
+        <w:t xml:space="preserve"> INT NOT NULL,</w:t>
+      </w:r>
+    </w:p>
+    <w:p>
+      <w:pPr>
+        <w:spacing w:after="0" w:line="240" w:lineRule="auto"/>
+      </w:pPr>
+    </w:p>
+    <w:p>
+      <w:pPr>
+        <w:spacing w:after="0" w:line="240" w:lineRule="auto"/>
+      </w:pPr>
+      <w:proofErr w:type="spellStart"/>
+      <w:r>
+        <w:t>view_date</w:t>
+      </w:r>
+      <w:proofErr w:type="spellEnd"/>
+      <w:r>
+        <w:t xml:space="preserve"> DATE,</w:t>
+      </w:r>
+    </w:p>
+    <w:p>
+      <w:pPr>
+        <w:spacing w:after="0" w:line="240" w:lineRule="auto"/>
+      </w:pPr>
+    </w:p>
+    <w:p>
+      <w:pPr>
+        <w:spacing w:after="0" w:line="240" w:lineRule="auto"/>
+      </w:pPr>
+      <w:r>
+        <w:t>views INT DEFAULT 1,</w:t>
+      </w:r>
+    </w:p>
+    <w:p>
+      <w:pPr>
+        <w:spacing w:after="0" w:line="240" w:lineRule="auto"/>
+      </w:pPr>
+    </w:p>
+    <w:p>
+      <w:pPr>
+        <w:spacing w:after="0" w:line="240" w:lineRule="auto"/>
+      </w:pPr>
+      <w:r>
+        <w:t xml:space="preserve">FOREIGN </w:t>
+      </w:r>
+      <w:proofErr w:type="gramStart"/>
+      <w:r>
+        <w:t>KEY(</w:t>
+      </w:r>
+      <w:proofErr w:type="spellStart"/>
+      <w:proofErr w:type="gramEnd"/>
+      <w:r>
+        <w:t>article_id</w:t>
+      </w:r>
+      <w:proofErr w:type="spellEnd"/>
+      <w:r>
+        <w:t>)</w:t>
+      </w:r>
+    </w:p>
+    <w:p>
+      <w:pPr>
+        <w:spacing w:after="0" w:line="240" w:lineRule="auto"/>
+      </w:pPr>
+      <w:r>
+        <w:t>REFERENCES articles(id)</w:t>
+      </w:r>
+    </w:p>
+    <w:p>
+      <w:pPr>
+        <w:spacing w:after="0" w:line="240" w:lineRule="auto"/>
+      </w:pPr>
+      <w:r>
+        <w:t>ON DELETE CASCADE</w:t>
+      </w:r>
+    </w:p>
+    <w:p>
+      <w:pPr>
+        <w:spacing w:after="0" w:line="240" w:lineRule="auto"/>
+      </w:pPr>
+    </w:p>
+    <w:p>
+      <w:pPr>
+        <w:spacing w:after="0" w:line="240" w:lineRule="auto"/>
+      </w:pPr>
+      <w:r>
+        <w:t>);</w:t>
+      </w:r>
+    </w:p>
+    <w:p>
+      <w:pPr>
+        <w:spacing w:after="0" w:line="240" w:lineRule="auto"/>
+      </w:pPr>
+    </w:p>
+    <w:p>
+      <w:pPr>
+        <w:spacing w:after="0" w:line="240" w:lineRule="auto"/>
+      </w:pPr>
+      <w:r>
         <w:sym w:font="Wingdings" w:char="F0E0"/>
       </w:r>
     </w:p>
     <w:p>
       <w:pPr>
         <w:spacing w:after="0" w:line="240" w:lineRule="auto"/>
-        <w:rPr>
-          <w:u w:val="single"/>
-        </w:rPr>
-      </w:pPr>
-    </w:p>
-    <w:p>
-      <w:pPr>
-        <w:spacing w:after="0" w:line="240" w:lineRule="auto"/>
-        <w:rPr>
-          <w:b/>
-          <w:bCs/>
-          <w:u w:val="single"/>
-        </w:rPr>
-      </w:pPr>
-      <w:r>
-        <w:rPr>
-          <w:b/>
-          <w:bCs/>
-          <w:u w:val="single"/>
-        </w:rPr>
-        <w:t>ALTER TABLE articles</w:t>
-      </w:r>
-    </w:p>
-    <w:p>
-      <w:pPr>
-        <w:spacing w:after="0" w:line="240" w:lineRule="auto"/>
-        <w:rPr>
-          <w:b/>
-          <w:bCs/>
-          <w:u w:val="single"/>
-        </w:rPr>
-      </w:pPr>
-      <w:r>
-        <w:rPr>
-          <w:b/>
-          <w:bCs/>
-          <w:u w:val="single"/>
-        </w:rPr>
-        <w:t>ADD tags VARCHAR(255);</w:t>
-      </w:r>
-    </w:p>
-    <w:p>
-      <w:pPr>
-        <w:spacing w:after="0" w:line="240" w:lineRule="auto"/>
-        <w:rPr>
-          <w:b/>
-          <w:bCs/>
-          <w:u w:val="single"/>
-        </w:rPr>
-      </w:pPr>
-    </w:p>
-    <w:p>
-      <w:pPr>
-        <w:spacing w:after="0" w:line="240" w:lineRule="auto"/>
-        <w:rPr>
-          <w:b/>
-          <w:bCs/>
-          <w:u w:val="single"/>
-        </w:rPr>
-      </w:pPr>
-      <w:r>
-        <w:rPr>
-          <w:b/>
-          <w:bCs/>
-          <w:u w:val="single"/>
-        </w:rPr>
+      </w:pPr>
+    </w:p>
+    <w:p>
+      <w:pPr>
+        <w:spacing w:after="0" w:line="240" w:lineRule="auto"/>
+      </w:pPr>
+      <w:r>
+        <w:t xml:space="preserve">INSERT INTO </w:t>
+      </w:r>
+      <w:proofErr w:type="spellStart"/>
+      <w:r>
+        <w:t>article_</w:t>
+      </w:r>
+      <w:proofErr w:type="gramStart"/>
+      <w:r>
+        <w:t>likes</w:t>
+      </w:r>
+      <w:proofErr w:type="spellEnd"/>
+      <w:r>
+        <w:t>(</w:t>
+      </w:r>
+      <w:proofErr w:type="gramEnd"/>
+    </w:p>
+    <w:p>
+      <w:pPr>
+        <w:spacing w:after="0" w:line="240" w:lineRule="auto"/>
+      </w:pPr>
+    </w:p>
+    <w:p>
+      <w:pPr>
+        <w:spacing w:after="0" w:line="240" w:lineRule="auto"/>
+      </w:pPr>
+      <w:proofErr w:type="spellStart"/>
+      <w:r>
+        <w:t>article_id</w:t>
+      </w:r>
+      <w:proofErr w:type="spellEnd"/>
+      <w:r>
+        <w:t>,</w:t>
+      </w:r>
+    </w:p>
+    <w:p>
+      <w:pPr>
+        <w:spacing w:after="0" w:line="240" w:lineRule="auto"/>
+      </w:pPr>
+      <w:proofErr w:type="spellStart"/>
+      <w:r>
+        <w:t>user_id</w:t>
+      </w:r>
+      <w:proofErr w:type="spellEnd"/>
+    </w:p>
+    <w:p>
+      <w:pPr>
+        <w:spacing w:after="0" w:line="240" w:lineRule="auto"/>
+      </w:pPr>
+    </w:p>
+    <w:p>
+      <w:pPr>
+        <w:spacing w:after="0" w:line="240" w:lineRule="auto"/>
+      </w:pPr>
+      <w:r>
+        <w:t>)</w:t>
+      </w:r>
+    </w:p>
+    <w:p>
+      <w:pPr>
+        <w:spacing w:after="0" w:line="240" w:lineRule="auto"/>
+      </w:pPr>
+    </w:p>
+    <w:p>
+      <w:pPr>
+        <w:spacing w:after="0" w:line="240" w:lineRule="auto"/>
+      </w:pPr>
+      <w:r>
+        <w:lastRenderedPageBreak/>
+        <w:t>VALUES</w:t>
+      </w:r>
+    </w:p>
+    <w:p>
+      <w:pPr>
+        <w:spacing w:after="0" w:line="240" w:lineRule="auto"/>
+      </w:pPr>
+      <w:r>
+        <w:t>(1,1),</w:t>
+      </w:r>
+    </w:p>
+    <w:p>
+      <w:pPr>
+        <w:spacing w:after="0" w:line="240" w:lineRule="auto"/>
+      </w:pPr>
+      <w:r>
+        <w:t>(1,</w:t>
+      </w:r>
+      <w:r>
+        <w:t>1</w:t>
+      </w:r>
+      <w:r>
+        <w:t>),</w:t>
+      </w:r>
+    </w:p>
+    <w:p>
+      <w:pPr>
+        <w:spacing w:after="0" w:line="240" w:lineRule="auto"/>
+      </w:pPr>
+      <w:r>
+        <w:t>(1,</w:t>
+      </w:r>
+      <w:r>
+        <w:t>1</w:t>
+      </w:r>
+      <w:r>
+        <w:t>),</w:t>
+      </w:r>
+    </w:p>
+    <w:p>
+      <w:pPr>
+        <w:spacing w:after="0" w:line="240" w:lineRule="auto"/>
+      </w:pPr>
+      <w:r>
+        <w:t>(1,</w:t>
+      </w:r>
+      <w:r>
+        <w:t>1</w:t>
+      </w:r>
+      <w:r>
+        <w:t>),</w:t>
+      </w:r>
+    </w:p>
+    <w:p>
+      <w:pPr>
+        <w:spacing w:after="0" w:line="240" w:lineRule="auto"/>
+      </w:pPr>
+      <w:r>
+        <w:t>(1,</w:t>
+      </w:r>
+      <w:r>
+        <w:t>1</w:t>
+      </w:r>
+      <w:r>
+        <w:t>);</w:t>
+      </w:r>
+    </w:p>
+    <w:p>
+      <w:pPr>
+        <w:spacing w:after="0" w:line="240" w:lineRule="auto"/>
+      </w:pPr>
+    </w:p>
+    <w:p>
+      <w:pPr>
+        <w:spacing w:after="0" w:line="240" w:lineRule="auto"/>
+      </w:pPr>
+      <w:r>
         <w:sym w:font="Wingdings" w:char="F0E0"/>
       </w:r>
     </w:p>
     <w:p>
       <w:pPr>
         <w:spacing w:after="0" w:line="240" w:lineRule="auto"/>
-        <w:rPr>
-          <w:b/>
-          <w:bCs/>
-          <w:u w:val="single"/>
-        </w:rPr>
-      </w:pPr>
-      <w:r>
-        <w:rPr>
-          <w:b/>
-          <w:bCs/>
-          <w:u w:val="single"/>
-        </w:rPr>
+      </w:pPr>
+    </w:p>
+    <w:p>
+      <w:pPr>
+        <w:spacing w:after="0" w:line="240" w:lineRule="auto"/>
+      </w:pPr>
+      <w:r>
+        <w:t xml:space="preserve">INSERT INTO </w:t>
+      </w:r>
+      <w:proofErr w:type="gramStart"/>
+      <w:r>
+        <w:t>comments(</w:t>
+      </w:r>
+      <w:proofErr w:type="gramEnd"/>
+    </w:p>
+    <w:p>
+      <w:pPr>
+        <w:spacing w:after="0" w:line="240" w:lineRule="auto"/>
+      </w:pPr>
+    </w:p>
+    <w:p>
+      <w:pPr>
+        <w:spacing w:after="0" w:line="240" w:lineRule="auto"/>
+      </w:pPr>
+      <w:proofErr w:type="spellStart"/>
+      <w:r>
+        <w:t>article_id</w:t>
+      </w:r>
+      <w:proofErr w:type="spellEnd"/>
+      <w:r>
+        <w:t>,</w:t>
+      </w:r>
+    </w:p>
+    <w:p>
+      <w:pPr>
+        <w:spacing w:after="0" w:line="240" w:lineRule="auto"/>
+      </w:pPr>
+      <w:proofErr w:type="spellStart"/>
+      <w:r>
+        <w:t>user_id</w:t>
+      </w:r>
+      <w:proofErr w:type="spellEnd"/>
+      <w:r>
+        <w:t>,</w:t>
+      </w:r>
+    </w:p>
+    <w:p>
+      <w:pPr>
+        <w:spacing w:after="0" w:line="240" w:lineRule="auto"/>
+      </w:pPr>
+      <w:r>
+        <w:t>content</w:t>
+      </w:r>
+    </w:p>
+    <w:p>
+      <w:pPr>
+        <w:spacing w:after="0" w:line="240" w:lineRule="auto"/>
+      </w:pPr>
+    </w:p>
+    <w:p>
+      <w:pPr>
+        <w:spacing w:after="0" w:line="240" w:lineRule="auto"/>
+      </w:pPr>
+      <w:r>
+        <w:t>)</w:t>
+      </w:r>
+    </w:p>
+    <w:p>
+      <w:pPr>
+        <w:spacing w:after="0" w:line="240" w:lineRule="auto"/>
+      </w:pPr>
+    </w:p>
+    <w:p>
+      <w:pPr>
+        <w:spacing w:after="0" w:line="240" w:lineRule="auto"/>
+      </w:pPr>
+      <w:r>
+        <w:t>VALUES</w:t>
+      </w:r>
+    </w:p>
+    <w:p>
+      <w:pPr>
+        <w:spacing w:after="0" w:line="240" w:lineRule="auto"/>
+      </w:pPr>
+    </w:p>
+    <w:p>
+      <w:pPr>
+        <w:spacing w:after="0" w:line="240" w:lineRule="auto"/>
+      </w:pPr>
+      <w:r>
+        <w:t>(1,1,'Great article'),</w:t>
+      </w:r>
+    </w:p>
+    <w:p>
+      <w:pPr>
+        <w:spacing w:after="0" w:line="240" w:lineRule="auto"/>
+      </w:pPr>
+      <w:r>
+        <w:t>(1,2,'Very helpful'),</w:t>
+      </w:r>
+    </w:p>
+    <w:p>
+      <w:pPr>
+        <w:spacing w:after="0" w:line="240" w:lineRule="auto"/>
+      </w:pPr>
+      <w:r>
+        <w:t>(1,3,'Add more examples'),</w:t>
+      </w:r>
+    </w:p>
+    <w:p>
+      <w:pPr>
+        <w:spacing w:after="0" w:line="240" w:lineRule="auto"/>
+      </w:pPr>
+      <w:r>
+        <w:t>(1,4,'Nice explanation'),</w:t>
+      </w:r>
+    </w:p>
+    <w:p>
+      <w:pPr>
+        <w:spacing w:after="0" w:line="240" w:lineRule="auto"/>
+      </w:pPr>
+      <w:r>
+        <w:t>(1,5,'Thanks for sharing');</w:t>
+      </w:r>
+    </w:p>
+    <w:p>
+      <w:pPr>
+        <w:spacing w:after="0" w:line="240" w:lineRule="auto"/>
+      </w:pPr>
+    </w:p>
+    <w:p>
+      <w:pPr>
+        <w:spacing w:after="0" w:line="240" w:lineRule="auto"/>
+      </w:pPr>
+      <w:r>
+        <w:sym w:font="Wingdings" w:char="F0E0"/>
+      </w:r>
+    </w:p>
+    <w:p>
+      <w:pPr>
+        <w:spacing w:after="0" w:line="240" w:lineRule="auto"/>
+      </w:pPr>
+    </w:p>
+    <w:p>
+      <w:pPr>
+        <w:spacing w:after="0" w:line="240" w:lineRule="auto"/>
+      </w:pPr>
+      <w:r>
         <w:t>UPDATE articles</w:t>
       </w:r>
     </w:p>
     <w:p>
       <w:pPr>
         <w:spacing w:after="0" w:line="240" w:lineRule="auto"/>
-        <w:rPr>
-          <w:b/>
-          <w:bCs/>
-          <w:u w:val="single"/>
-        </w:rPr>
-      </w:pPr>
-    </w:p>
-    <w:p>
-      <w:pPr>
-        <w:spacing w:after="0" w:line="240" w:lineRule="auto"/>
-        <w:rPr>
-          <w:b/>
-          <w:bCs/>
-          <w:u w:val="single"/>
-        </w:rPr>
-      </w:pPr>
-      <w:r>
-        <w:rPr>
-          <w:b/>
-          <w:bCs/>
-          <w:u w:val="single"/>
-        </w:rPr>
-        <w:t>SET</w:t>
-      </w:r>
-    </w:p>
-    <w:p>
-      <w:pPr>
-        <w:spacing w:after="0" w:line="240" w:lineRule="auto"/>
-        <w:rPr>
-          <w:b/>
-          <w:bCs/>
-          <w:u w:val="single"/>
-        </w:rPr>
-      </w:pPr>
-      <w:r>
-        <w:rPr>
-          <w:b/>
-          <w:bCs/>
-          <w:u w:val="single"/>
-        </w:rPr>
-        <w:t>status='</w:t>
-      </w:r>
-      <w:proofErr w:type="spellStart"/>
-      <w:r>
-        <w:rPr>
-          <w:b/>
-          <w:bCs/>
-          <w:u w:val="single"/>
-        </w:rPr>
-        <w:t>revision_requested</w:t>
-      </w:r>
-      <w:proofErr w:type="spellEnd"/>
-      <w:r>
-        <w:rPr>
-          <w:b/>
-          <w:bCs/>
-          <w:u w:val="single"/>
-        </w:rPr>
-        <w:t>',</w:t>
-      </w:r>
-    </w:p>
-    <w:p>
-      <w:pPr>
-        <w:spacing w:after="0" w:line="240" w:lineRule="auto"/>
-        <w:rPr>
-          <w:b/>
-          <w:bCs/>
-          <w:u w:val="single"/>
-        </w:rPr>
-      </w:pPr>
-      <w:proofErr w:type="spellStart"/>
-      <w:r>
-        <w:rPr>
-          <w:b/>
-          <w:bCs/>
-          <w:u w:val="single"/>
-        </w:rPr>
-        <w:t>editor_feedback</w:t>
-      </w:r>
-      <w:proofErr w:type="spellEnd"/>
-      <w:r>
-        <w:rPr>
-          <w:b/>
-          <w:bCs/>
-          <w:u w:val="single"/>
-        </w:rPr>
-        <w:t>='Add more examples and improve introduction'</w:t>
-      </w:r>
-    </w:p>
-    <w:p>
-      <w:pPr>
-        <w:spacing w:after="0" w:line="240" w:lineRule="auto"/>
-        <w:rPr>
-          <w:b/>
-          <w:bCs/>
-          <w:u w:val="single"/>
-        </w:rPr>
-      </w:pPr>
-    </w:p>
-    <w:p>
-      <w:pPr>
-        <w:spacing w:after="0" w:line="240" w:lineRule="auto"/>
-        <w:rPr>
-          <w:b/>
-          <w:bCs/>
-          <w:u w:val="single"/>
-        </w:rPr>
-      </w:pPr>
-      <w:r>
-        <w:rPr>
-          <w:b/>
-          <w:bCs/>
-          <w:u w:val="single"/>
-        </w:rPr>
-        <w:t>WHERE id=1;</w:t>
-      </w:r>
-    </w:p>
-    <w:p>
-      <w:pPr>
-        <w:spacing w:after="0" w:line="240" w:lineRule="auto"/>
-        <w:rPr>
-          <w:u w:val="single"/>
-        </w:rPr>
+      </w:pPr>
+    </w:p>
+    <w:p>
+      <w:pPr>
+        <w:spacing w:after="0" w:line="240" w:lineRule="auto"/>
+      </w:pPr>
+      <w:r>
+        <w:t xml:space="preserve">SET </w:t>
+      </w:r>
+      <w:proofErr w:type="spellStart"/>
+      <w:r>
+        <w:t>view_count</w:t>
+      </w:r>
+      <w:proofErr w:type="spellEnd"/>
+      <w:r>
+        <w:t xml:space="preserve"> = 120</w:t>
+      </w:r>
+    </w:p>
+    <w:p>
+      <w:pPr>
+        <w:spacing w:after="0" w:line="240" w:lineRule="auto"/>
+      </w:pPr>
+    </w:p>
+    <w:p>
+      <w:pPr>
+        <w:spacing w:after="0" w:line="240" w:lineRule="auto"/>
+      </w:pPr>
+      <w:r>
+        <w:t>WHERE id = 1;</w:t>
+      </w:r>
+    </w:p>
+    <w:p>
+      <w:pPr>
+        <w:spacing w:after="0" w:line="240" w:lineRule="auto"/>
+      </w:pPr>
+    </w:p>
+    <w:p>
+      <w:pPr>
+        <w:spacing w:after="0" w:line="240" w:lineRule="auto"/>
       </w:pPr>
     </w:p>
     <w:sectPr>

</xml_diff>

<commit_message>
Reply or Delete Comments using Ajax
</commit_message>
<xml_diff>
--- a/blogPost/DB Quries/blogPost.docx
+++ b/blogPost/DB Quries/blogPost.docx
@@ -2168,98 +2168,50 @@
     <w:p>
       <w:pPr>
         <w:spacing w:after="0" w:line="240" w:lineRule="auto"/>
-        <w:rPr>
-          <w:b/>
-          <w:bCs/>
-        </w:rPr>
-      </w:pPr>
-      <w:r>
-        <w:rPr>
-          <w:b/>
-          <w:bCs/>
-        </w:rPr>
+      </w:pPr>
+      <w:r>
         <w:t>SET</w:t>
       </w:r>
     </w:p>
     <w:p>
       <w:pPr>
         <w:spacing w:after="0" w:line="240" w:lineRule="auto"/>
-        <w:rPr>
-          <w:b/>
-          <w:bCs/>
-        </w:rPr>
-      </w:pPr>
-      <w:r>
-        <w:rPr>
-          <w:b/>
-          <w:bCs/>
-        </w:rPr>
+      </w:pPr>
+      <w:r>
         <w:t>status='</w:t>
       </w:r>
       <w:proofErr w:type="spellStart"/>
       <w:r>
-        <w:rPr>
-          <w:b/>
-          <w:bCs/>
-        </w:rPr>
         <w:t>revision_requested</w:t>
       </w:r>
       <w:proofErr w:type="spellEnd"/>
       <w:r>
-        <w:rPr>
-          <w:b/>
-          <w:bCs/>
-        </w:rPr>
         <w:t>',</w:t>
       </w:r>
     </w:p>
     <w:p>
       <w:pPr>
         <w:spacing w:after="0" w:line="240" w:lineRule="auto"/>
-        <w:rPr>
-          <w:b/>
-          <w:bCs/>
-        </w:rPr>
-      </w:pPr>
-      <w:proofErr w:type="spellStart"/>
-      <w:r>
-        <w:rPr>
-          <w:b/>
-          <w:bCs/>
-        </w:rPr>
+      </w:pPr>
+      <w:proofErr w:type="spellStart"/>
+      <w:r>
         <w:t>editor_feedback</w:t>
       </w:r>
       <w:proofErr w:type="spellEnd"/>
       <w:r>
-        <w:rPr>
-          <w:b/>
-          <w:bCs/>
-        </w:rPr>
         <w:t>='Add more examples and improve introduction'</w:t>
       </w:r>
     </w:p>
     <w:p>
       <w:pPr>
         <w:spacing w:after="0" w:line="240" w:lineRule="auto"/>
-        <w:rPr>
-          <w:b/>
-          <w:bCs/>
-        </w:rPr>
-      </w:pPr>
-    </w:p>
-    <w:p>
-      <w:pPr>
-        <w:spacing w:after="0" w:line="240" w:lineRule="auto"/>
-        <w:rPr>
-          <w:b/>
-          <w:bCs/>
-        </w:rPr>
-      </w:pPr>
-      <w:r>
-        <w:rPr>
-          <w:b/>
-          <w:bCs/>
-        </w:rPr>
+      </w:pPr>
+    </w:p>
+    <w:p>
+      <w:pPr>
+        <w:spacing w:after="0" w:line="240" w:lineRule="auto"/>
+      </w:pPr>
+      <w:r>
         <w:t>WHERE id=1;</w:t>
       </w:r>
     </w:p>
@@ -2997,55 +2949,31 @@
         <w:spacing w:after="0" w:line="240" w:lineRule="auto"/>
       </w:pPr>
       <w:r>
-        <w:t>(1,</w:t>
-      </w:r>
-      <w:r>
-        <w:t>1</w:t>
-      </w:r>
-      <w:r>
-        <w:t>),</w:t>
-      </w:r>
-    </w:p>
-    <w:p>
-      <w:pPr>
-        <w:spacing w:after="0" w:line="240" w:lineRule="auto"/>
-      </w:pPr>
-      <w:r>
-        <w:t>(1,</w:t>
-      </w:r>
-      <w:r>
-        <w:t>1</w:t>
-      </w:r>
-      <w:r>
-        <w:t>),</w:t>
-      </w:r>
-    </w:p>
-    <w:p>
-      <w:pPr>
-        <w:spacing w:after="0" w:line="240" w:lineRule="auto"/>
-      </w:pPr>
-      <w:r>
-        <w:t>(1,</w:t>
-      </w:r>
-      <w:r>
-        <w:t>1</w:t>
-      </w:r>
-      <w:r>
-        <w:t>),</w:t>
-      </w:r>
-    </w:p>
-    <w:p>
-      <w:pPr>
-        <w:spacing w:after="0" w:line="240" w:lineRule="auto"/>
-      </w:pPr>
-      <w:r>
-        <w:t>(1,</w:t>
-      </w:r>
-      <w:r>
-        <w:t>1</w:t>
-      </w:r>
-      <w:r>
-        <w:t>);</w:t>
+        <w:t>(1,1),</w:t>
+      </w:r>
+    </w:p>
+    <w:p>
+      <w:pPr>
+        <w:spacing w:after="0" w:line="240" w:lineRule="auto"/>
+      </w:pPr>
+      <w:r>
+        <w:t>(1,1),</w:t>
+      </w:r>
+    </w:p>
+    <w:p>
+      <w:pPr>
+        <w:spacing w:after="0" w:line="240" w:lineRule="auto"/>
+      </w:pPr>
+      <w:r>
+        <w:t>(1,1),</w:t>
+      </w:r>
+    </w:p>
+    <w:p>
+      <w:pPr>
+        <w:spacing w:after="0" w:line="240" w:lineRule="auto"/>
+      </w:pPr>
+      <w:r>
+        <w:t>(1,1);</w:t>
       </w:r>
     </w:p>
     <w:p>

</xml_diff>

<commit_message>
Reply or Delete Comments using Ajax (#35)
</commit_message>
<xml_diff>
--- a/blogPost/DB Quries/blogPost.docx
+++ b/blogPost/DB Quries/blogPost.docx
@@ -2168,98 +2168,50 @@
     <w:p>
       <w:pPr>
         <w:spacing w:after="0" w:line="240" w:lineRule="auto"/>
-        <w:rPr>
-          <w:b/>
-          <w:bCs/>
-        </w:rPr>
-      </w:pPr>
-      <w:r>
-        <w:rPr>
-          <w:b/>
-          <w:bCs/>
-        </w:rPr>
+      </w:pPr>
+      <w:r>
         <w:t>SET</w:t>
       </w:r>
     </w:p>
     <w:p>
       <w:pPr>
         <w:spacing w:after="0" w:line="240" w:lineRule="auto"/>
-        <w:rPr>
-          <w:b/>
-          <w:bCs/>
-        </w:rPr>
-      </w:pPr>
-      <w:r>
-        <w:rPr>
-          <w:b/>
-          <w:bCs/>
-        </w:rPr>
+      </w:pPr>
+      <w:r>
         <w:t>status='</w:t>
       </w:r>
       <w:proofErr w:type="spellStart"/>
       <w:r>
-        <w:rPr>
-          <w:b/>
-          <w:bCs/>
-        </w:rPr>
         <w:t>revision_requested</w:t>
       </w:r>
       <w:proofErr w:type="spellEnd"/>
       <w:r>
-        <w:rPr>
-          <w:b/>
-          <w:bCs/>
-        </w:rPr>
         <w:t>',</w:t>
       </w:r>
     </w:p>
     <w:p>
       <w:pPr>
         <w:spacing w:after="0" w:line="240" w:lineRule="auto"/>
-        <w:rPr>
-          <w:b/>
-          <w:bCs/>
-        </w:rPr>
-      </w:pPr>
-      <w:proofErr w:type="spellStart"/>
-      <w:r>
-        <w:rPr>
-          <w:b/>
-          <w:bCs/>
-        </w:rPr>
+      </w:pPr>
+      <w:proofErr w:type="spellStart"/>
+      <w:r>
         <w:t>editor_feedback</w:t>
       </w:r>
       <w:proofErr w:type="spellEnd"/>
       <w:r>
-        <w:rPr>
-          <w:b/>
-          <w:bCs/>
-        </w:rPr>
         <w:t>='Add more examples and improve introduction'</w:t>
       </w:r>
     </w:p>
     <w:p>
       <w:pPr>
         <w:spacing w:after="0" w:line="240" w:lineRule="auto"/>
-        <w:rPr>
-          <w:b/>
-          <w:bCs/>
-        </w:rPr>
-      </w:pPr>
-    </w:p>
-    <w:p>
-      <w:pPr>
-        <w:spacing w:after="0" w:line="240" w:lineRule="auto"/>
-        <w:rPr>
-          <w:b/>
-          <w:bCs/>
-        </w:rPr>
-      </w:pPr>
-      <w:r>
-        <w:rPr>
-          <w:b/>
-          <w:bCs/>
-        </w:rPr>
+      </w:pPr>
+    </w:p>
+    <w:p>
+      <w:pPr>
+        <w:spacing w:after="0" w:line="240" w:lineRule="auto"/>
+      </w:pPr>
+      <w:r>
         <w:t>WHERE id=1;</w:t>
       </w:r>
     </w:p>
@@ -2997,55 +2949,31 @@
         <w:spacing w:after="0" w:line="240" w:lineRule="auto"/>
       </w:pPr>
       <w:r>
-        <w:t>(1,</w:t>
-      </w:r>
-      <w:r>
-        <w:t>1</w:t>
-      </w:r>
-      <w:r>
-        <w:t>),</w:t>
-      </w:r>
-    </w:p>
-    <w:p>
-      <w:pPr>
-        <w:spacing w:after="0" w:line="240" w:lineRule="auto"/>
-      </w:pPr>
-      <w:r>
-        <w:t>(1,</w:t>
-      </w:r>
-      <w:r>
-        <w:t>1</w:t>
-      </w:r>
-      <w:r>
-        <w:t>),</w:t>
-      </w:r>
-    </w:p>
-    <w:p>
-      <w:pPr>
-        <w:spacing w:after="0" w:line="240" w:lineRule="auto"/>
-      </w:pPr>
-      <w:r>
-        <w:t>(1,</w:t>
-      </w:r>
-      <w:r>
-        <w:t>1</w:t>
-      </w:r>
-      <w:r>
-        <w:t>),</w:t>
-      </w:r>
-    </w:p>
-    <w:p>
-      <w:pPr>
-        <w:spacing w:after="0" w:line="240" w:lineRule="auto"/>
-      </w:pPr>
-      <w:r>
-        <w:t>(1,</w:t>
-      </w:r>
-      <w:r>
-        <w:t>1</w:t>
-      </w:r>
-      <w:r>
-        <w:t>);</w:t>
+        <w:t>(1,1),</w:t>
+      </w:r>
+    </w:p>
+    <w:p>
+      <w:pPr>
+        <w:spacing w:after="0" w:line="240" w:lineRule="auto"/>
+      </w:pPr>
+      <w:r>
+        <w:t>(1,1),</w:t>
+      </w:r>
+    </w:p>
+    <w:p>
+      <w:pPr>
+        <w:spacing w:after="0" w:line="240" w:lineRule="auto"/>
+      </w:pPr>
+      <w:r>
+        <w:t>(1,1),</w:t>
+      </w:r>
+    </w:p>
+    <w:p>
+      <w:pPr>
+        <w:spacing w:after="0" w:line="240" w:lineRule="auto"/>
+      </w:pPr>
+      <w:r>
+        <w:t>(1,1);</w:t>
       </w:r>
     </w:p>
     <w:p>

</xml_diff>